<commit_message>
Add observed Florida 2023 heatwave endpoint
</commit_message>
<xml_diff>
--- a/paper/output/acropora_palmata_demography_manuscript.docx
+++ b/paper/output/acropora_palmata_demography_manuscript.docx
@@ -1087,6 +1087,65 @@
         <w:t xml:space="preserve">We constructed a five-class, recruitment-free Lefkovitch transition matrix from the prepared natural-colony transition data. The dominant eigenvalue (lambda) represented conditional annual growth of the observed post-settlement transition subsystem, not a full population forecast. Matrix support was uneven: five studies contributed survival, three contributed growth, SC5 survival was predominantly supported by NOAA records, and fragmentation was represented by Vardi (2011). We quantified the elasticity of lambda to stasis, growth, retrogression, and fragmentation transitions, and propagated sampling uncertainty through hierarchical bootstrap resampling: studies were resampled first, then observations within sampled studies. We used 2,000 valid bootstrap replicates and leave-one-study-out analyses to characterize dependence on the contributing datasets; 43 bootstrap replicates imputed at least one missing size-class survival value, and the resampling did not propagate survival–growth covariance.</w:t>
       </w:r>
     </w:p>
+    <w:p>
+      <w:pPr>
+        <w:pStyle w:val="BodyText"/>
+      </w:pPr>
+      <w:r>
+        <w:t xml:space="preserve">We treated the 2023 Florida heatwave as an episodic, Florida-specific survival pulse rather than as a replacement for the chronic-regime matrix. We first used the</w:t>
+      </w:r>
+      <w:r>
+        <w:t xml:space="preserve"> </w:t>
+      </w:r>
+      <w:r>
+        <w:rPr>
+          <w:i/>
+          <w:iCs/>
+        </w:rPr>
+        <w:t xml:space="preserve">A. palmata</w:t>
+      </w:r>
+      <w:r>
+        <w:t xml:space="preserve"> </w:t>
+      </w:r>
+      <w:r>
+        <w:t xml:space="preserve">dose-response thresholds reported by Manzello et al.</w:t>
+      </w:r>
+      <w:r>
+        <w:t xml:space="preserve"> </w:t>
+      </w:r>
+      <w:r>
+        <w:t xml:space="preserve">(</w:t>
+      </w:r>
+      <w:hyperlink w:anchor="ref-manzello2025">
+        <w:r>
+          <w:rPr>
+            <w:rStyle w:val="Hyperlink"/>
+          </w:rPr>
+          <w:t xml:space="preserve">Manzello et al.</w:t>
+        </w:r>
+        <w:r>
+          <w:rPr>
+            <w:rStyle w:val="Hyperlink"/>
+          </w:rPr>
+          <w:t xml:space="preserve"> </w:t>
+        </w:r>
+        <w:r>
+          <w:rPr>
+            <w:rStyle w:val="Hyperlink"/>
+          </w:rPr>
+          <w:t xml:space="preserve">2025</w:t>
+        </w:r>
+      </w:hyperlink>
+      <w:r>
+        <w:t xml:space="preserve">)</w:t>
+      </w:r>
+      <w:r>
+        <w:t xml:space="preserve"> </w:t>
+      </w:r>
+      <w:r>
+        <w:t xml:space="preserve">(ED50 = 7.8 degree-heating weeks [DHW], ED95 = 17.6 DHW) to define 8-, 12-, and 18-DHW sensitivity scenarios. We then added an observed-2023 Florida endpoint: 97.8–100% mortality, represented by a 0–2.2% heatwave-year survival multiplier. The deterministic projection used the midpoint of that range; Monte Carlo projections sampled uniformly across it at each prescribed event. Heatwave pulses were applied after the annual matrix transition to all size classes, consistent with the reported absence of size refuge during the Florida event. We report the geometric mean of annual abundance ratios as effective lambda under recurrence intervals of 5, 10, 20, and 50 years. These scenarios are stress tests for a Florida-like event sequence, not estimates of a Caribbean-wide thermal mortality rate or full population viability.</w:t>
+      </w:r>
+    </w:p>
     <w:bookmarkEnd w:id="14"/>
     <w:bookmarkStart w:id="15" w:name="reproducibility"/>
     <w:p>
@@ -1107,7 +1166,7 @@
     </w:p>
     <w:bookmarkEnd w:id="15"/>
     <w:bookmarkEnd w:id="16"/>
-    <w:bookmarkStart w:id="24" w:name="results"/>
+    <w:bookmarkStart w:id="25" w:name="results"/>
     <w:p>
       <w:pPr>
         <w:pStyle w:val="Heading2"/>
@@ -1258,8 +1317,26 @@
       </w:r>
     </w:p>
     <w:bookmarkEnd w:id="23"/>
+    <w:bookmarkStart w:id="24" w:name="X7ebd0a5d040b16158344b984013688c3b87d306"/>
+    <w:p>
+      <w:pPr>
+        <w:pStyle w:val="Heading3"/>
+      </w:pPr>
+      <w:r>
+        <w:t xml:space="preserve">Florida-scale heatwaves sharply reduced effective lambda</w:t>
+      </w:r>
+    </w:p>
+    <w:p>
+      <w:pPr>
+        <w:pStyle w:val="FirstParagraph"/>
+      </w:pPr>
+      <w:r>
+        <w:t xml:space="preserve">The thermal-event layer did not alter the chronic-regime matrix lambda; it estimated the conditional consequence of recurrent survival pulses. Under the observed 2023 Florida endpoint, effective lambda was 0.355, 0.576, 0.769, and 0.846 when a Florida-like event recurred every 5, 10, 20, and 50 years, respectively (Fig. S22). The corresponding 50-year quasi-extinction probabilities were 100% in these simulations because the baseline subsystem was already declining. The 18-DHW dose-response sensitivity scenario was less severe than the observed endpoint because its fitted mortality was 95.5%, rather than the 97.8–100% mortality reported from the Florida Keys and Dry Tortugas. These results should not be extrapolated as a Caribbean-wide forecast: they show that recovery trajectories conditional on the compiled post-settlement matrix are highly vulnerable to recurrence of an event of the observed Florida magnitude.</w:t>
+      </w:r>
+    </w:p>
     <w:bookmarkEnd w:id="24"/>
-    <w:bookmarkStart w:id="25" w:name="discussion"/>
+    <w:bookmarkEnd w:id="25"/>
+    <w:bookmarkStart w:id="26" w:name="discussion"/>
     <w:p>
       <w:pPr>
         <w:pStyle w:val="Heading2"/>
@@ -1313,7 +1390,7 @@
         <w:pStyle w:val="BodyText"/>
       </w:pPr>
       <w:r>
-        <w:t xml:space="preserve">Most intervals in the synthesis overlapped a documented event or chronic pressure, and the size–survival relationship differed among disturbance states. The disturbance layer does not identify a single causal effect of storms, disease, or heat because the underlying studies were not designed as a common experiment and their event histories differed. The evidence therefore supports a narrower conclusion: transition analyses should retain disturbance history as part of the context in which observed size-dependent rates were generated. The 2023 heatwave makes this boundary especially important. Our estimates describe a chronic regime preceding the recent Florida collapse, and they should not be interpreted as forecasts under severe contemporary thermal stress (Manzello et al. 2025).</w:t>
+        <w:t xml:space="preserve">Most intervals in the synthesis overlapped a documented event or chronic pressure, and the size–survival relationship differed among disturbance states. The disturbance layer does not identify a single causal effect of storms, disease, or heat because the underlying studies were not designed as a common experiment and their event histories differed. The evidence therefore supports a narrower conclusion: transition analyses should retain disturbance history as part of the context in which observed size-dependent rates were generated. The 2023 heatwave makes this boundary especially important. Our chronic-regime matrix is not a forecast under severe contemporary thermal stress; the separate Florida event-pulse scenarios show how quickly its conditional trajectories deteriorate when Florida-scale mortality recurs (Manzello et al. 2025).</w:t>
       </w:r>
     </w:p>
     <w:p>
@@ -1361,8 +1438,8 @@
         <w:t xml:space="preserve">, that pathway cannot be represented by outplant counts or average survival alone. It is shaped by the size of colonies, the tissue they retain after disturbance, and the environmental and restoration contexts in which they move through the population. A transparent synthesis of those processes provides a defensible starting point for conditional transition analysis and for restoration strategies that seek persistent coral habitat rather than short-lived planting records.</w:t>
       </w:r>
     </w:p>
-    <w:bookmarkEnd w:id="25"/>
-    <w:bookmarkStart w:id="34" w:name="statements-and-declarations"/>
+    <w:bookmarkEnd w:id="26"/>
+    <w:bookmarkStart w:id="35" w:name="statements-and-declarations"/>
     <w:p>
       <w:pPr>
         <w:pStyle w:val="Heading2"/>
@@ -1371,7 +1448,7 @@
         <w:t xml:space="preserve">Statements and Declarations</w:t>
       </w:r>
     </w:p>
-    <w:bookmarkStart w:id="26" w:name="funding"/>
+    <w:bookmarkStart w:id="27" w:name="funding"/>
     <w:p>
       <w:pPr>
         <w:pStyle w:val="Heading3"/>
@@ -1388,8 +1465,8 @@
         <w:t xml:space="preserve">This work was supported by The Nature Conservancy.</w:t>
       </w:r>
     </w:p>
-    <w:bookmarkEnd w:id="26"/>
-    <w:bookmarkStart w:id="27" w:name="competing-interests"/>
+    <w:bookmarkEnd w:id="27"/>
+    <w:bookmarkStart w:id="28" w:name="competing-interests"/>
     <w:p>
       <w:pPr>
         <w:pStyle w:val="Heading3"/>
@@ -1406,8 +1483,8 @@
         <w:t xml:space="preserve">The authors declare no competing interests.</w:t>
       </w:r>
     </w:p>
-    <w:bookmarkEnd w:id="27"/>
-    <w:bookmarkStart w:id="28" w:name="ethics-approval-and-permits"/>
+    <w:bookmarkEnd w:id="28"/>
+    <w:bookmarkStart w:id="29" w:name="ethics-approval-and-permits"/>
     <w:p>
       <w:pPr>
         <w:pStyle w:val="Heading3"/>
@@ -1436,8 +1513,8 @@
         <w:t xml:space="preserve">field collection requiring ethical approval or permits.</w:t>
       </w:r>
     </w:p>
-    <w:bookmarkEnd w:id="28"/>
-    <w:bookmarkStart w:id="29" w:name="consent-to-participate"/>
+    <w:bookmarkEnd w:id="29"/>
+    <w:bookmarkStart w:id="30" w:name="consent-to-participate"/>
     <w:p>
       <w:pPr>
         <w:pStyle w:val="Heading3"/>
@@ -1454,8 +1531,8 @@
         <w:t xml:space="preserve">Not applicable.</w:t>
       </w:r>
     </w:p>
-    <w:bookmarkEnd w:id="29"/>
-    <w:bookmarkStart w:id="30" w:name="consent-to-publish"/>
+    <w:bookmarkEnd w:id="30"/>
+    <w:bookmarkStart w:id="31" w:name="consent-to-publish"/>
     <w:p>
       <w:pPr>
         <w:pStyle w:val="Heading3"/>
@@ -1472,8 +1549,8 @@
         <w:t xml:space="preserve">Not applicable.</w:t>
       </w:r>
     </w:p>
-    <w:bookmarkEnd w:id="30"/>
-    <w:bookmarkStart w:id="32" w:name="data-availability"/>
+    <w:bookmarkEnd w:id="31"/>
+    <w:bookmarkStart w:id="33" w:name="data-availability"/>
     <w:p>
       <w:pPr>
         <w:pStyle w:val="Heading3"/>
@@ -1492,7 +1569,7 @@
       <w:r>
         <w:t xml:space="preserve"> </w:t>
       </w:r>
-      <w:hyperlink r:id="rId31">
+      <w:hyperlink r:id="rId32">
         <w:r>
           <w:rPr>
             <w:rStyle w:val="Hyperlink"/>
@@ -1510,8 +1587,8 @@
         <w:t xml:space="preserve">archival release will be deposited upon acceptance.</w:t>
       </w:r>
     </w:p>
-    <w:bookmarkEnd w:id="32"/>
-    <w:bookmarkStart w:id="33" w:name="author-contributions"/>
+    <w:bookmarkEnd w:id="33"/>
+    <w:bookmarkStart w:id="34" w:name="author-contributions"/>
     <w:p>
       <w:pPr>
         <w:pStyle w:val="Heading3"/>
@@ -1546,9 +1623,9 @@
         <w:t xml:space="preserve">approved the manuscript.</w:t>
       </w:r>
     </w:p>
-    <w:bookmarkEnd w:id="33"/>
     <w:bookmarkEnd w:id="34"/>
-    <w:bookmarkStart w:id="35" w:name="X49e23a8fc8a8d9cb284ad4fa4cf2a5036bfb028"/>
+    <w:bookmarkEnd w:id="35"/>
+    <w:bookmarkStart w:id="36" w:name="X49e23a8fc8a8d9cb284ad4fa4cf2a5036bfb028"/>
     <w:p>
       <w:pPr>
         <w:pStyle w:val="Heading1"/>
@@ -2855,8 +2932,8 @@
         <w:t xml:space="preserve">context; they do not identify a single causal effect for each event.</w:t>
       </w:r>
     </w:p>
-    <w:bookmarkEnd w:id="35"/>
-    <w:bookmarkStart w:id="36" w:name="X233dfcf836878d74c22e8d4fc4a52b66ad121b1"/>
+    <w:bookmarkEnd w:id="36"/>
+    <w:bookmarkStart w:id="37" w:name="X233dfcf836878d74c22e8d4fc4a52b66ad121b1"/>
     <w:p>
       <w:pPr>
         <w:pStyle w:val="Heading1"/>
@@ -4022,8 +4099,8 @@
         <w:t xml:space="preserve">intervals were undisturbed.</w:t>
       </w:r>
     </w:p>
-    <w:bookmarkEnd w:id="36"/>
-    <w:bookmarkStart w:id="75" w:name="X58cc7afffcc1205d30b9bae8f108893f395cd59"/>
+    <w:bookmarkEnd w:id="37"/>
+    <w:bookmarkStart w:id="76" w:name="X58cc7afffcc1205d30b9bae8f108893f395cd59"/>
     <w:p>
       <w:pPr>
         <w:pStyle w:val="Heading1"/>
@@ -4452,7 +4529,7 @@
         </w:tc>
       </w:tr>
     </w:tbl>
-    <w:bookmarkStart w:id="37" w:name="figure-legends"/>
+    <w:bookmarkStart w:id="38" w:name="figure-legends"/>
     <w:p>
       <w:pPr>
         <w:pStyle w:val="Heading2"/>
@@ -4659,8 +4736,8 @@
         <w:t xml:space="preserve">+ 1; colour encodes probability. (b) Elasticity decomposition by source size class. Stacked bars show stasis, growth, and retrogression; orange points show fragmentation elasticity, which is displayed separately because it is a component of retrogression rather than an additional transition class. (c) Distribution of lambda from 2,000 hierarchical-bootstrap replicates. Orange bars denote replicates with lambda &lt; 1 and blue bars replicates with lambda at least 1; the distribution characterizes uncertainty in the compiled transition rates, not the probability of real-world decline. The dashed line is the deterministic estimate and the solid line marks replacement. (d) Leave-one-study-out lambda estimates. The dashed and dotted lines mark the full-data estimate and replacement, respectively; orange identifies exclusion of the NOAA survey.</w:t>
       </w:r>
     </w:p>
-    <w:bookmarkEnd w:id="37"/>
-    <w:bookmarkStart w:id="50" w:name="figures"/>
+    <w:bookmarkEnd w:id="38"/>
+    <w:bookmarkStart w:id="51" w:name="figures"/>
     <w:p>
       <w:pPr>
         <w:pStyle w:val="Heading2"/>
@@ -4678,18 +4755,18 @@
           <wp:inline>
             <wp:extent cx="5334000" cy="5363849"/>
             <wp:effectExtent b="0" l="0" r="0" t="0"/>
-            <wp:docPr descr="" title="" id="39" name="Picture"/>
+            <wp:docPr descr="" title="" id="40" name="Picture"/>
             <a:graphic>
               <a:graphicData uri="http://schemas.openxmlformats.org/drawingml/2006/picture">
                 <pic:pic>
                   <pic:nvPicPr>
-                    <pic:cNvPr descr="06_analysis/figures/manuscript/Fig1_study_landscape.png" id="40" name="Picture"/>
+                    <pic:cNvPr descr="06_analysis/figures/manuscript/Fig1_study_landscape.png" id="41" name="Picture"/>
                     <pic:cNvPicPr>
                       <a:picLocks noChangeArrowheads="1" noChangeAspect="1"/>
                     </pic:cNvPicPr>
                   </pic:nvPicPr>
                   <pic:blipFill>
-                    <a:blip r:embed="rId38"/>
+                    <a:blip r:embed="rId39"/>
                     <a:stretch>
                       <a:fillRect/>
                     </a:stretch>
@@ -4767,18 +4844,18 @@
           <wp:inline>
             <wp:extent cx="5334000" cy="6743421"/>
             <wp:effectExtent b="0" l="0" r="0" t="0"/>
-            <wp:docPr descr="" title="" id="42" name="Picture"/>
+            <wp:docPr descr="" title="" id="43" name="Picture"/>
             <a:graphic>
               <a:graphicData uri="http://schemas.openxmlformats.org/drawingml/2006/picture">
                 <pic:pic>
                   <pic:nvPicPr>
-                    <pic:cNvPr descr="06_analysis/figures/manuscript/Fig2_demographic_rates.png" id="43" name="Picture"/>
+                    <pic:cNvPr descr="06_analysis/figures/manuscript/Fig2_demographic_rates.png" id="44" name="Picture"/>
                     <pic:cNvPicPr>
                       <a:picLocks noChangeArrowheads="1" noChangeAspect="1"/>
                     </pic:cNvPicPr>
                   </pic:nvPicPr>
                   <pic:blipFill>
-                    <a:blip r:embed="rId41"/>
+                    <a:blip r:embed="rId42"/>
                     <a:stretch>
                       <a:fillRect/>
                     </a:stretch>
@@ -4849,18 +4926,18 @@
           <wp:inline>
             <wp:extent cx="5334000" cy="7051002"/>
             <wp:effectExtent b="0" l="0" r="0" t="0"/>
-            <wp:docPr descr="" title="" id="45" name="Picture"/>
+            <wp:docPr descr="" title="" id="46" name="Picture"/>
             <a:graphic>
               <a:graphicData uri="http://schemas.openxmlformats.org/drawingml/2006/picture">
                 <pic:pic>
                   <pic:nvPicPr>
-                    <pic:cNvPr descr="06_analysis/figures/manuscript/Fig3_caribbean_synthesis.png" id="46" name="Picture"/>
+                    <pic:cNvPr descr="06_analysis/figures/manuscript/Fig3_caribbean_synthesis.png" id="47" name="Picture"/>
                     <pic:cNvPicPr>
                       <a:picLocks noChangeArrowheads="1" noChangeAspect="1"/>
                     </pic:cNvPicPr>
                   </pic:nvPicPr>
                   <pic:blipFill>
-                    <a:blip r:embed="rId44"/>
+                    <a:blip r:embed="rId45"/>
                     <a:stretch>
                       <a:fillRect/>
                     </a:stretch>
@@ -4931,18 +5008,18 @@
           <wp:inline>
             <wp:extent cx="5334000" cy="5516991"/>
             <wp:effectExtent b="0" l="0" r="0" t="0"/>
-            <wp:docPr descr="" title="" id="48" name="Picture"/>
+            <wp:docPr descr="" title="" id="49" name="Picture"/>
             <a:graphic>
               <a:graphicData uri="http://schemas.openxmlformats.org/drawingml/2006/picture">
                 <pic:pic>
                   <pic:nvPicPr>
-                    <pic:cNvPr descr="06_analysis/figures/manuscript/Fig4_population_model.png" id="49" name="Picture"/>
+                    <pic:cNvPr descr="06_analysis/figures/manuscript/Fig4_population_model.png" id="50" name="Picture"/>
                     <pic:cNvPicPr>
                       <a:picLocks noChangeArrowheads="1" noChangeAspect="1"/>
                     </pic:cNvPicPr>
                   </pic:nvPicPr>
                   <pic:blipFill>
-                    <a:blip r:embed="rId47"/>
+                    <a:blip r:embed="rId48"/>
                     <a:stretch>
                       <a:fillRect/>
                     </a:stretch>
@@ -5004,18 +5081,18 @@
         <w:t xml:space="preserve">.</w:t>
       </w:r>
     </w:p>
-    <w:bookmarkEnd w:id="50"/>
+    <w:bookmarkEnd w:id="51"/>
+    <w:bookmarkStart w:id="75" w:name="refs"/>
+    <w:p>
+      <w:pPr>
+        <w:pStyle w:val="Heading2"/>
+      </w:pPr>
+      <w:r>
+        <w:t xml:space="preserve">References</w:t>
+      </w:r>
+    </w:p>
     <w:bookmarkStart w:id="74" w:name="refs"/>
-    <w:p>
-      <w:pPr>
-        <w:pStyle w:val="Heading2"/>
-      </w:pPr>
-      <w:r>
-        <w:t xml:space="preserve">References</w:t>
-      </w:r>
-    </w:p>
-    <w:bookmarkStart w:id="73" w:name="refs"/>
-    <w:bookmarkStart w:id="52" w:name="ref-banister2024"/>
+    <w:bookmarkStart w:id="53" w:name="ref-banister2024"/>
     <w:p>
       <w:pPr>
         <w:pStyle w:val="Bibliography"/>
@@ -5054,7 +5131,7 @@
       <w:r>
         <w:t xml:space="preserve"> </w:t>
       </w:r>
-      <w:hyperlink r:id="rId51">
+      <w:hyperlink r:id="rId52">
         <w:r>
           <w:rPr>
             <w:rStyle w:val="Hyperlink"/>
@@ -5066,8 +5143,8 @@
         <w:t xml:space="preserve">.</w:t>
       </w:r>
     </w:p>
-    <w:bookmarkEnd w:id="52"/>
-    <w:bookmarkStart w:id="54" w:name="ref-forrester2012"/>
+    <w:bookmarkEnd w:id="53"/>
+    <w:bookmarkStart w:id="55" w:name="ref-forrester2012"/>
     <w:p>
       <w:pPr>
         <w:pStyle w:val="Bibliography"/>
@@ -5109,7 +5186,7 @@
       <w:r>
         <w:t xml:space="preserve"> </w:t>
       </w:r>
-      <w:hyperlink r:id="rId53">
+      <w:hyperlink r:id="rId54">
         <w:r>
           <w:rPr>
             <w:rStyle w:val="Hyperlink"/>
@@ -5121,8 +5198,8 @@
         <w:t xml:space="preserve">.</w:t>
       </w:r>
     </w:p>
-    <w:bookmarkEnd w:id="54"/>
-    <w:bookmarkStart w:id="56" w:name="ref-gardner2003"/>
+    <w:bookmarkEnd w:id="55"/>
+    <w:bookmarkStart w:id="57" w:name="ref-gardner2003"/>
     <w:p>
       <w:pPr>
         <w:pStyle w:val="Bibliography"/>
@@ -5167,7 +5244,7 @@
       <w:r>
         <w:t xml:space="preserve"> </w:t>
       </w:r>
-      <w:hyperlink r:id="rId55">
+      <w:hyperlink r:id="rId56">
         <w:r>
           <w:rPr>
             <w:rStyle w:val="Hyperlink"/>
@@ -5179,8 +5256,8 @@
         <w:t xml:space="preserve">.</w:t>
       </w:r>
     </w:p>
-    <w:bookmarkEnd w:id="56"/>
-    <w:bookmarkStart w:id="58" w:name="ref-knapp2003"/>
+    <w:bookmarkEnd w:id="57"/>
+    <w:bookmarkStart w:id="59" w:name="ref-knapp2003"/>
     <w:p>
       <w:pPr>
         <w:pStyle w:val="Bibliography"/>
@@ -5210,7 +5287,7 @@
       <w:r>
         <w:t xml:space="preserve"> </w:t>
       </w:r>
-      <w:hyperlink r:id="rId57">
+      <w:hyperlink r:id="rId58">
         <w:r>
           <w:rPr>
             <w:rStyle w:val="Hyperlink"/>
@@ -5222,8 +5299,8 @@
         <w:t xml:space="preserve">.</w:t>
       </w:r>
     </w:p>
-    <w:bookmarkEnd w:id="58"/>
-    <w:bookmarkStart w:id="59" w:name="ref-lirman1997"/>
+    <w:bookmarkEnd w:id="59"/>
+    <w:bookmarkStart w:id="60" w:name="ref-lirman1997"/>
     <w:p>
       <w:pPr>
         <w:pStyle w:val="Bibliography"/>
@@ -5263,8 +5340,8 @@
         <w:t xml:space="preserve">.</w:t>
       </w:r>
     </w:p>
-    <w:bookmarkEnd w:id="59"/>
-    <w:bookmarkStart w:id="61" w:name="ref-madin2020"/>
+    <w:bookmarkEnd w:id="60"/>
+    <w:bookmarkStart w:id="62" w:name="ref-madin2020"/>
     <w:p>
       <w:pPr>
         <w:pStyle w:val="Bibliography"/>
@@ -5294,7 +5371,7 @@
       <w:r>
         <w:t xml:space="preserve"> </w:t>
       </w:r>
-      <w:hyperlink r:id="rId60">
+      <w:hyperlink r:id="rId61">
         <w:r>
           <w:rPr>
             <w:rStyle w:val="Hyperlink"/>
@@ -5306,8 +5383,8 @@
         <w:t xml:space="preserve">.</w:t>
       </w:r>
     </w:p>
-    <w:bookmarkEnd w:id="61"/>
-    <w:bookmarkStart w:id="63" w:name="ref-manzello2025"/>
+    <w:bookmarkEnd w:id="62"/>
+    <w:bookmarkStart w:id="64" w:name="ref-manzello2025"/>
     <w:p>
       <w:pPr>
         <w:pStyle w:val="Bibliography"/>
@@ -5379,7 +5456,7 @@
       <w:r>
         <w:t xml:space="preserve"> </w:t>
       </w:r>
-      <w:hyperlink r:id="rId62">
+      <w:hyperlink r:id="rId63">
         <w:r>
           <w:rPr>
             <w:rStyle w:val="Hyperlink"/>
@@ -5391,8 +5468,8 @@
         <w:t xml:space="preserve">.</w:t>
       </w:r>
     </w:p>
-    <w:bookmarkEnd w:id="63"/>
-    <w:bookmarkStart w:id="65" w:name="ref-ramosromero2025"/>
+    <w:bookmarkEnd w:id="64"/>
+    <w:bookmarkStart w:id="66" w:name="ref-ramosromero2025"/>
     <w:p>
       <w:pPr>
         <w:pStyle w:val="Bibliography"/>
@@ -5434,7 +5511,7 @@
       <w:r>
         <w:t xml:space="preserve"> </w:t>
       </w:r>
-      <w:hyperlink r:id="rId64">
+      <w:hyperlink r:id="rId65">
         <w:r>
           <w:rPr>
             <w:rStyle w:val="Hyperlink"/>
@@ -5446,8 +5523,8 @@
         <w:t xml:space="preserve">.</w:t>
       </w:r>
     </w:p>
-    <w:bookmarkEnd w:id="65"/>
-    <w:bookmarkStart w:id="66" w:name="ref-vardi2011"/>
+    <w:bookmarkEnd w:id="66"/>
+    <w:bookmarkStart w:id="67" w:name="ref-vardi2011"/>
     <w:p>
       <w:pPr>
         <w:pStyle w:val="Bibliography"/>
@@ -5490,8 +5567,8 @@
         <w:t xml:space="preserve">.</w:t>
       </w:r>
     </w:p>
-    <w:bookmarkEnd w:id="66"/>
-    <w:bookmarkStart w:id="68" w:name="ref-viechtbauer2010"/>
+    <w:bookmarkEnd w:id="67"/>
+    <w:bookmarkStart w:id="69" w:name="ref-viechtbauer2010"/>
     <w:p>
       <w:pPr>
         <w:pStyle w:val="Bibliography"/>
@@ -5533,7 +5610,7 @@
       <w:r>
         <w:t xml:space="preserve"> </w:t>
       </w:r>
-      <w:hyperlink r:id="rId67">
+      <w:hyperlink r:id="rId68">
         <w:r>
           <w:rPr>
             <w:rStyle w:val="Hyperlink"/>
@@ -5545,8 +5622,8 @@
         <w:t xml:space="preserve">.</w:t>
       </w:r>
     </w:p>
-    <w:bookmarkEnd w:id="68"/>
-    <w:bookmarkStart w:id="70" w:name="ref-williams2023"/>
+    <w:bookmarkEnd w:id="69"/>
+    <w:bookmarkStart w:id="71" w:name="ref-williams2023"/>
     <w:p>
       <w:pPr>
         <w:pStyle w:val="Bibliography"/>
@@ -5582,7 +5659,7 @@
       <w:r>
         <w:t xml:space="preserve"> </w:t>
       </w:r>
-      <w:hyperlink r:id="rId69">
+      <w:hyperlink r:id="rId70">
         <w:r>
           <w:rPr>
             <w:rStyle w:val="Hyperlink"/>
@@ -5594,8 +5671,8 @@
         <w:t xml:space="preserve">.</w:t>
       </w:r>
     </w:p>
-    <w:bookmarkEnd w:id="70"/>
-    <w:bookmarkStart w:id="72" w:name="ref-williams2008"/>
+    <w:bookmarkEnd w:id="71"/>
+    <w:bookmarkStart w:id="73" w:name="ref-williams2008"/>
     <w:p>
       <w:pPr>
         <w:pStyle w:val="Bibliography"/>
@@ -5634,7 +5711,7 @@
       <w:r>
         <w:t xml:space="preserve"> </w:t>
       </w:r>
-      <w:hyperlink r:id="rId71">
+      <w:hyperlink r:id="rId72">
         <w:r>
           <w:rPr>
             <w:rStyle w:val="Hyperlink"/>
@@ -5646,10 +5723,10 @@
         <w:t xml:space="preserve">.</w:t>
       </w:r>
     </w:p>
-    <w:bookmarkEnd w:id="72"/>
     <w:bookmarkEnd w:id="73"/>
     <w:bookmarkEnd w:id="74"/>
     <w:bookmarkEnd w:id="75"/>
+    <w:bookmarkEnd w:id="76"/>
     <w:sectPr>
       <w:footnotePr>
         <w:numRestart w:val="eachSect"/>

</xml_diff>

<commit_message>
Condense Coral Reefs supplement package
</commit_message>
<xml_diff>
--- a/paper/output/acropora_palmata_demography_manuscript.docx
+++ b/paper/output/acropora_palmata_demography_manuscript.docx
@@ -853,7 +853,7 @@
         <w:pStyle w:val="FirstParagraph"/>
       </w:pPr>
       <w:r>
-        <w:t xml:space="preserve">We retained all intervals in primary analyses because observed storms, disease, bleaching, cold events, and chronic stressors comprise the demographic context experienced by the study populations. We then linked each interval to a curated Caribbean disturbance timeline. The timeline distinguished acute events used in baseline-exclusion sensitivity analyses from chronic or indirect pressures retained as contextual exposure. We independently rebuilt the interval-to-event linkage and summarized it as a study-window audit (Table S2). We fitted size-by-disturbance interaction models to natural-colony records, thereby avoiding the confounding of disturbance context with restoration material and handling history.</w:t>
+        <w:t xml:space="preserve">We retained all intervals in primary analyses because observed storms, disease, bleaching, cold events, and chronic stressors comprise the demographic context experienced by the study populations. We then linked each interval to a curated Caribbean disturbance timeline. The timeline distinguished acute events used in baseline-exclusion sensitivity analyses from chronic or indirect pressures retained as contextual exposure. We independently rebuilt the interval-to-event linkage and summarized it as a study-window audit (Online Resource 1, Table S1). We fitted size-by-disturbance interaction models to natural-colony records, thereby avoiding the confounding of disturbance context with restoration material and handling history.</w:t>
       </w:r>
     </w:p>
     <w:p>
@@ -1143,7 +1143,7 @@
         <w:t xml:space="preserve"> </w:t>
       </w:r>
       <w:r>
-        <w:t xml:space="preserve">(ED50 = 7.8 degree-heating weeks [DHW], ED95 = 17.6 DHW) to define 8-, 12-, and 18-DHW sensitivity scenarios. We then added an observed-2023 Florida endpoint: 97.8–100% mortality, represented by a 0–2.2% heatwave-year survival multiplier. The deterministic projection used the midpoint of that range; Monte Carlo projections sampled uniformly across it at each prescribed event. Heatwave pulses were applied after the annual matrix transition to all size classes, consistent with the reported absence of size refuge during the Florida event. We report the geometric mean of annual abundance ratios as effective lambda under recurrence intervals of 5, 10, 20, and 50 years. These scenarios are stress tests for a Florida-like event sequence, not estimates of a Caribbean-wide thermal mortality rate or full population viability.</w:t>
+        <w:t xml:space="preserve">(ED50 = 7.8 degree-heating weeks [DHW], ED95 = 17.6 DHW) to define 8-, 12-, and 18-DHW sensitivity scenarios. We then added an observed-2023 Florida endpoint: 97.8–100% mortality, represented by a 0–2.2% heatwave-year survival multiplier. The deterministic projection used the midpoint of that range; because the published study reports bounds rather than a colony-level sampling distribution, Monte Carlo projections sampled uniformly across the reported range at each prescribed event. Heatwave pulses were applied after the annual matrix transition to all size classes, consistent with the reported absence of size refuge during the Florida event. We report the geometric mean of annual abundance ratios as effective lambda under recurrence intervals of 5, 10, 20, and 50 years. These intervals span frequent to rare recurrence and are sensitivity values, not estimates of future return periods. The scenarios are stress tests for a Florida-like event sequence, not estimates of a Caribbean-wide thermal mortality rate or full population viability.</w:t>
       </w:r>
     </w:p>
     <w:bookmarkEnd w:id="14"/>
@@ -1207,7 +1207,7 @@
         <w:pStyle w:val="FirstParagraph"/>
       </w:pPr>
       <w:r>
-        <w:t xml:space="preserve">Survival increased with colony size, although the fitted relationship explained a modest share of individual survival variation (Fig. 2a). The survival model identified a high-size inflection near 7,498 cm², but leave-one-study-out estimates were broad, indicating that the exact location of this threshold was not stable across the study mix. Relative growth rate showed a sharper early ontogenetic transition: the estimated inflection occurred near 37 cm², while the probability of positive growth crossed its threshold near 411 cm² (Fig. 2b; Fig. S5). Relative growth captured size dependence more effectively than absolute growth rate, whose variance increased strongly with colony size (Fig. S6).</w:t>
+        <w:t xml:space="preserve">Survival increased with colony size, although the fitted relationship explained a modest share of individual survival variation (Fig. 2a). The survival model identified a high-size inflection near 7,498 cm², but leave-one-study-out estimates were broad, indicating that the exact location of this threshold was not stable across the study mix. Relative growth rate showed a sharper early ontogenetic transition: the estimated inflection occurred near 37 cm², while the probability of positive growth crossed its threshold near 411 cm² (Online Resource 1, Fig. S1). Relative growth captured size dependence more effectively than absolute growth rate, whose variance increased strongly with colony size.</w:t>
       </w:r>
     </w:p>
     <w:p>
@@ -1241,7 +1241,7 @@
         <w:pStyle w:val="BodyText"/>
       </w:pPr>
       <w:r>
-        <w:t xml:space="preserve">Natural-colony effects had higher pooled survival than restoration-fragment effects (84.1% versus 74.5%), but the difference was not statistically supported in the expanded meta-analysis. Regional variation remained substantial within population types (Fig. 3b; Fig. S15). The overlap-zone comparison likewise showed that study identity and sampling context could not be separated cleanly from population origin (Fig. S8). These analyses do not support a single general survival penalty or benefit of restoration origin.</w:t>
+        <w:t xml:space="preserve">Natural-colony effects had higher pooled survival than restoration-fragment effects (84.1% versus 74.5%), but the difference was not statistically supported in the expanded meta-analysis. Regional variation remained substantial within population types (Fig. 3b). The overlap-zone comparison likewise showed that study identity and sampling context could not be separated cleanly from population origin (Online Resource 1, Fig. S2). These analyses do not support a single general survival penalty or benefit of restoration origin.</w:t>
       </w:r>
     </w:p>
     <w:bookmarkEnd w:id="19"/>
@@ -1259,7 +1259,7 @@
         <w:pStyle w:val="FirstParagraph"/>
       </w:pPr>
       <w:r>
-        <w:t xml:space="preserve">Colonies often survived while losing tissue. In the matrix-compatible growth dataset, 39.4% of records showed shrinkage (Fig. S16). Shrinkage frequency increased from 18.2% in SC1 to 47.5% in SC5, demonstrating that large colonies were not simply stable endpoints. Retrogression probabilities were 15.2% in SC2, 16.8% in SC3, 17.2% in SC4, and 9.1% in SC5. Thus, large colonies persisted more reliably than small colonies, but partial mortality still moved a measurable fraction of survivors backward through the size structure.</w:t>
+        <w:t xml:space="preserve">Colonies often survived while losing tissue. In the matrix-compatible growth dataset, 39.4% of records showed shrinkage (Online Resource 1, Fig. S3). Shrinkage frequency increased from 18.2% in SC1 to 47.5% in SC5, demonstrating that large colonies were not simply stable endpoints. Retrogression probabilities were 15.2% in SC2, 16.8% in SC3, 17.2% in SC4, and 9.1% in SC5. Thus, large colonies persisted more reliably than small colonies, but partial mortality still moved a measurable fraction of survivors backward through the size structure.</w:t>
       </w:r>
     </w:p>
     <w:bookmarkEnd w:id="20"/>
@@ -1277,7 +1277,7 @@
         <w:pStyle w:val="FirstParagraph"/>
       </w:pPr>
       <w:r>
-        <w:t xml:space="preserve">The study-window audit covered 1,072 demographic intervals, 95.1% of which overlapped at least one curated disturbance or chronic-pressure record (Table S2). The survival relationship with colony size differed among intervals with no curated disturbance, context-only pressure, and acute baseline-exclusion exposure (likelihood-ratio test, (p&lt;0.001); Fig. S17). Growth-side interaction evidence was weaker and is therefore treated as supportive rather than definitive. Excluding all acute baseline-exclusion intervals changed the pooled survival estimate by only −0.3 percentage points, indicating that the main pooled result was not driven solely by locally identified acute events. Instead, disturbance exposure was pervasive across the monitored demographic regime.</w:t>
+        <w:t xml:space="preserve">The study-window audit covered 1,072 demographic intervals, 95.1% of which overlapped at least one curated disturbance or chronic-pressure record (Online Resource 1, Table S1). The survival relationship with colony size differed among intervals with no curated disturbance, context-only pressure, and acute baseline-exclusion exposure (likelihood-ratio test, (p&lt;0.001); Online Resource 1, Fig. S4). Growth-side interaction evidence was weaker and is therefore treated as supportive rather than definitive. Excluding all acute baseline-exclusion intervals changed the pooled survival estimate by only −0.3 percentage points, indicating that the main pooled result was not driven solely by locally identified acute events. Instead, disturbance exposure was pervasive across the monitored demographic regime.</w:t>
       </w:r>
     </w:p>
     <w:bookmarkEnd w:id="21"/>
@@ -1295,7 +1295,7 @@
         <w:pStyle w:val="FirstParagraph"/>
       </w:pPr>
       <w:r>
-        <w:t xml:space="preserve">The subtype-coded dataset contained 5,079 records from five studies (Fig. S19): 3,968 natural fragments from one study, 1,012 nursery outplants from two studies, 53 re-cemented nursery outplants from one study, and 46 direct outplants from one study. Natural fragments had weighted survival of 87.1%, compared with 58.7% for nursery outplants, 81.1% for nursery outplants re-cemented after fragmentation, and 65.2% for outplanted colonies. Excluding natural fragments reduced mean survival across subtype-coded records from 81.2% to 60.0%. These contrasts show why a broad restoration-fragment category is not an adequate biological description of the material represented in the synthesis; they are descriptive because the subtype groups are highly unbalanced.</w:t>
+        <w:t xml:space="preserve">The subtype-coded dataset contained 5,079 records from five studies (Online Resource 1, Fig. S5): 3,968 natural fragments from one study, 1,012 nursery outplants from two studies, 53 re-cemented nursery outplants from one study, and 46 direct outplants from one study. Natural fragments had weighted survival of 87.1%, compared with 58.7% for nursery outplants, 81.1% for nursery outplants re-cemented after fragmentation, and 65.2% for outplanted colonies. Excluding natural fragments reduced mean survival across subtype-coded records from 81.2% to 60.0%. These contrasts show why a broad restoration-fragment category is not an adequate biological description of the material represented in the synthesis; they are descriptive because the subtype groups are highly unbalanced.</w:t>
       </w:r>
     </w:p>
     <w:bookmarkEnd w:id="22"/>
@@ -1331,7 +1331,7 @@
         <w:pStyle w:val="FirstParagraph"/>
       </w:pPr>
       <w:r>
-        <w:t xml:space="preserve">The thermal-event layer did not alter the chronic-regime matrix lambda; it estimated the conditional consequence of recurrent survival pulses. Under the observed 2023 Florida endpoint, effective lambda was 0.355, 0.576, 0.769, and 0.846 when a Florida-like event recurred every 5, 10, 20, and 50 years, respectively (Fig. S22). The corresponding 50-year quasi-extinction probabilities were 100% in these simulations because the baseline subsystem was already declining. The 18-DHW dose-response sensitivity scenario was less severe than the observed endpoint because its fitted mortality was 95.5%, rather than the 97.8–100% mortality reported from the Florida Keys and Dry Tortugas. These results should not be extrapolated as a Caribbean-wide forecast: they show that recovery trajectories conditional on the compiled post-settlement matrix are highly vulnerable to recurrence of an event of the observed Florida magnitude.</w:t>
+        <w:t xml:space="preserve">The thermal-event layer did not alter the chronic-regime matrix lambda; it estimated the conditional consequence of recurrent survival pulses. Under the observed 2023 Florida endpoint, effective lambda was 0.355, 0.576, 0.769, and 0.846 when a Florida-like event recurred every 5, 10, 20, and 50 years, respectively (Online Resource 1, Fig. S6). The corresponding 50-year quasi-extinction probabilities were 100% in these simulations because the baseline subsystem was already declining. The 18-DHW dose-response sensitivity scenario was less severe than the observed endpoint because its fitted mortality was 95.5%, rather than the 97.8–100% mortality reported from the Florida Keys and Dry Tortugas. These results should not be extrapolated as a Caribbean-wide forecast: they show that recovery trajectories conditional on the compiled post-settlement matrix are highly vulnerable to recurrence of an event of the observed Florida magnitude.</w:t>
       </w:r>
     </w:p>
     <w:bookmarkEnd w:id="24"/>
@@ -1625,2911 +1625,51 @@
     </w:p>
     <w:bookmarkEnd w:id="34"/>
     <w:bookmarkEnd w:id="35"/>
-    <w:bookmarkStart w:id="36" w:name="X49e23a8fc8a8d9cb284ad4fa4cf2a5036bfb028"/>
-    <w:p>
-      <w:pPr>
-        <w:pStyle w:val="Heading1"/>
-      </w:pPr>
-      <w:r>
-        <w:t xml:space="preserve">Table S1. Disturbance and stressor chronology used in the demographic synthesis</w:t>
+    <w:bookmarkStart w:id="36" w:name="online-resources"/>
+    <w:p>
+      <w:pPr>
+        <w:pStyle w:val="Heading2"/>
+      </w:pPr>
+      <w:r>
+        <w:t xml:space="preserve">Online resources</w:t>
       </w:r>
     </w:p>
     <w:p>
       <w:pPr>
         <w:pStyle w:val="FirstParagraph"/>
-      </w:pPr>
-      <w:r>
-        <w:t xml:space="preserve">This compact, landscape-ready version is embedded in the manuscript.</w:t>
-      </w:r>
-    </w:p>
-    <w:tbl>
-      <w:tblPr>
-        <w:tblStyle w:val="Table"/>
-        <w:tblW w:type="pct" w:w="5000"/>
-        <w:tblLayout w:type="fixed"/>
-        <w:tblLook w:firstRow="1" w:lastRow="0" w:firstColumn="0" w:lastColumn="0" w:noHBand="0" w:noVBand="0" w:val="0020"/>
-      </w:tblPr>
-      <w:tblGrid>
-        <w:gridCol w:w="1584"/>
-        <w:gridCol w:w="1584"/>
-        <w:gridCol w:w="1584"/>
-        <w:gridCol w:w="1584"/>
-        <w:gridCol w:w="1584"/>
-      </w:tblGrid>
-      <w:tr>
-        <w:trPr>
-          <w:tblHeader w:val="on"/>
-        </w:trPr>
-        <w:tc>
-          <w:tcPr/>
-          <w:p>
-            <w:pPr>
-              <w:pStyle w:val="Compact"/>
-              <w:jc w:val="left"/>
-            </w:pPr>
-            <w:r>
-              <w:t xml:space="preserve">Period</w:t>
-            </w:r>
-          </w:p>
-        </w:tc>
-        <w:tc>
-          <w:tcPr/>
-          <w:p>
-            <w:pPr>
-              <w:pStyle w:val="Compact"/>
-              <w:jc w:val="left"/>
-            </w:pPr>
-            <w:r>
-              <w:t xml:space="preserve">Event and geography</w:t>
-            </w:r>
-          </w:p>
-        </w:tc>
-        <w:tc>
-          <w:tcPr/>
-          <w:p>
-            <w:pPr>
-              <w:pStyle w:val="Compact"/>
-              <w:jc w:val="left"/>
-            </w:pPr>
-            <w:r>
-              <w:t xml:space="preserve">Exposure class</w:t>
-            </w:r>
-          </w:p>
-        </w:tc>
-        <w:tc>
-          <w:tcPr/>
-          <w:p>
-            <w:pPr>
-              <w:pStyle w:val="Compact"/>
-              <w:jc w:val="left"/>
-            </w:pPr>
-            <w:r>
-              <w:t xml:space="preserve">Use in baseline sensitivity</w:t>
-            </w:r>
-          </w:p>
-        </w:tc>
-        <w:tc>
-          <w:tcPr/>
-          <w:p>
-            <w:pPr>
-              <w:pStyle w:val="Compact"/>
-              <w:jc w:val="left"/>
-            </w:pPr>
-            <w:r>
-              <w:t xml:space="preserve">Demographic relevance</w:t>
-            </w:r>
-          </w:p>
-        </w:tc>
-      </w:tr>
-      <w:tr>
-        <w:tc>
-          <w:tcPr/>
-          <w:p>
-            <w:pPr>
-              <w:pStyle w:val="Compact"/>
-              <w:jc w:val="left"/>
-            </w:pPr>
-            <w:r>
-              <w:t xml:space="preserve">1961</w:t>
-            </w:r>
-          </w:p>
-        </w:tc>
-        <w:tc>
-          <w:tcPr/>
-          <w:p>
-            <w:pPr>
-              <w:pStyle w:val="Compact"/>
-              <w:jc w:val="left"/>
-            </w:pPr>
-            <w:r>
-              <w:t xml:space="preserve">Hurricane Hattie, Belize</w:t>
-            </w:r>
-          </w:p>
-        </w:tc>
-        <w:tc>
-          <w:tcPr/>
-          <w:p>
-            <w:pPr>
-              <w:pStyle w:val="Compact"/>
-              <w:jc w:val="left"/>
-            </w:pPr>
-            <w:r>
-              <w:t xml:space="preserve">Hurricane; local acute event</w:t>
-            </w:r>
-          </w:p>
-        </w:tc>
-        <w:tc>
-          <w:tcPr/>
-          <w:p>
-            <w:pPr>
-              <w:pStyle w:val="Compact"/>
-              <w:jc w:val="left"/>
-            </w:pPr>
-            <w:r>
-              <w:t xml:space="preserve">Exclude</w:t>
-            </w:r>
-          </w:p>
-        </w:tc>
-        <w:tc>
-          <w:tcPr/>
-          <w:p>
-            <w:pPr>
-              <w:pStyle w:val="Compact"/>
-              <w:jc w:val="left"/>
-            </w:pPr>
-            <w:r>
-              <w:t xml:space="preserve">80%</w:t>
-            </w:r>
-            <w:r>
-              <w:t xml:space="preserve"> </w:t>
-            </w:r>
-            <w:r>
-              <w:rPr>
-                <w:i/>
-                <w:iCs/>
-              </w:rPr>
-              <w:t xml:space="preserve">A. palmata</w:t>
-            </w:r>
-            <w:r>
-              <w:t xml:space="preserve"> </w:t>
-            </w:r>
-            <w:r>
-              <w:t xml:space="preserve">destruction; long algal shift</w:t>
-            </w:r>
-          </w:p>
-        </w:tc>
-      </w:tr>
-      <w:tr>
-        <w:tc>
-          <w:tcPr/>
-          <w:p>
-            <w:pPr>
-              <w:pStyle w:val="Compact"/>
-              <w:jc w:val="left"/>
-            </w:pPr>
-            <w:r>
-              <w:t xml:space="preserve">1978–1984</w:t>
-            </w:r>
-          </w:p>
-        </w:tc>
-        <w:tc>
-          <w:tcPr/>
-          <w:p>
-            <w:pPr>
-              <w:pStyle w:val="Compact"/>
-              <w:jc w:val="left"/>
-            </w:pPr>
-            <w:r>
-              <w:t xml:space="preserve">White-band disease epizootic, Caribbean-wide</w:t>
-            </w:r>
-          </w:p>
-        </w:tc>
-        <w:tc>
-          <w:tcPr/>
-          <w:p>
-            <w:pPr>
-              <w:pStyle w:val="Compact"/>
-              <w:jc w:val="left"/>
-            </w:pPr>
-            <w:r>
-              <w:t xml:space="preserve">Disease; chronic regime</w:t>
-            </w:r>
-          </w:p>
-        </w:tc>
-        <w:tc>
-          <w:tcPr/>
-          <w:p>
-            <w:pPr>
-              <w:pStyle w:val="Compact"/>
-              <w:jc w:val="left"/>
-            </w:pPr>
-            <w:r>
-              <w:t xml:space="preserve">Context only</w:t>
-            </w:r>
-          </w:p>
-        </w:tc>
-        <w:tc>
-          <w:tcPr/>
-          <w:p>
-            <w:pPr>
-              <w:pStyle w:val="Compact"/>
-              <w:jc w:val="left"/>
-            </w:pPr>
-            <w:r>
-              <w:t xml:space="preserve">Foundational collapse of acroporid stands</w:t>
-            </w:r>
-          </w:p>
-        </w:tc>
-      </w:tr>
-      <w:tr>
-        <w:tc>
-          <w:tcPr/>
-          <w:p>
-            <w:pPr>
-              <w:pStyle w:val="Compact"/>
-              <w:jc w:val="left"/>
-            </w:pPr>
-            <w:r>
-              <w:t xml:space="preserve">1983–1984</w:t>
-            </w:r>
-          </w:p>
-        </w:tc>
-        <w:tc>
-          <w:tcPr/>
-          <w:p>
-            <w:pPr>
-              <w:pStyle w:val="Compact"/>
-              <w:jc w:val="left"/>
-            </w:pPr>
-            <w:r>
-              <w:rPr>
-                <w:i/>
-                <w:iCs/>
-              </w:rPr>
-              <w:t xml:space="preserve">Diadema</w:t>
-            </w:r>
-            <w:r>
-              <w:t xml:space="preserve"> </w:t>
-            </w:r>
-            <w:r>
-              <w:t xml:space="preserve">mass mortality, Caribbean-wide</w:t>
-            </w:r>
-          </w:p>
-        </w:tc>
-        <w:tc>
-          <w:tcPr/>
-          <w:p>
-            <w:pPr>
-              <w:pStyle w:val="Compact"/>
-              <w:jc w:val="left"/>
-            </w:pPr>
-            <w:r>
-              <w:t xml:space="preserve">Disease; acute event</w:t>
-            </w:r>
-          </w:p>
-        </w:tc>
-        <w:tc>
-          <w:tcPr/>
-          <w:p>
-            <w:pPr>
-              <w:pStyle w:val="Compact"/>
-              <w:jc w:val="left"/>
-            </w:pPr>
-            <w:r>
-              <w:t xml:space="preserve">Exclude</w:t>
-            </w:r>
-          </w:p>
-        </w:tc>
-        <w:tc>
-          <w:tcPr/>
-          <w:p>
-            <w:pPr>
-              <w:pStyle w:val="Compact"/>
-              <w:jc w:val="left"/>
-            </w:pPr>
-            <w:r>
-              <w:t xml:space="preserve">Loss of herbivory and macroalgal phase shift</w:t>
-            </w:r>
-          </w:p>
-        </w:tc>
-      </w:tr>
-      <w:tr>
-        <w:tc>
-          <w:tcPr/>
-          <w:p>
-            <w:pPr>
-              <w:pStyle w:val="Compact"/>
-              <w:jc w:val="left"/>
-            </w:pPr>
-            <w:r>
-              <w:t xml:space="preserve">1992</w:t>
-            </w:r>
-          </w:p>
-        </w:tc>
-        <w:tc>
-          <w:tcPr/>
-          <w:p>
-            <w:pPr>
-              <w:pStyle w:val="Compact"/>
-              <w:jc w:val="left"/>
-            </w:pPr>
-            <w:r>
-              <w:t xml:space="preserve">Hurricane Andrew, Florida Keys</w:t>
-            </w:r>
-          </w:p>
-        </w:tc>
-        <w:tc>
-          <w:tcPr/>
-          <w:p>
-            <w:pPr>
-              <w:pStyle w:val="Compact"/>
-              <w:jc w:val="left"/>
-            </w:pPr>
-            <w:r>
-              <w:t xml:space="preserve">Hurricane; local acute event</w:t>
-            </w:r>
-          </w:p>
-        </w:tc>
-        <w:tc>
-          <w:tcPr/>
-          <w:p>
-            <w:pPr>
-              <w:pStyle w:val="Compact"/>
-              <w:jc w:val="left"/>
-            </w:pPr>
-            <w:r>
-              <w:t xml:space="preserve">Exclude</w:t>
-            </w:r>
-          </w:p>
-        </w:tc>
-        <w:tc>
-          <w:tcPr/>
-          <w:p>
-            <w:pPr>
-              <w:pStyle w:val="Compact"/>
-              <w:jc w:val="left"/>
-            </w:pPr>
-            <w:r>
-              <w:t xml:space="preserve">Colony breakage and fragmentation-driven recovery</w:t>
-            </w:r>
-          </w:p>
-        </w:tc>
-      </w:tr>
-      <w:tr>
-        <w:tc>
-          <w:tcPr/>
-          <w:p>
-            <w:pPr>
-              <w:pStyle w:val="Compact"/>
-              <w:jc w:val="left"/>
-            </w:pPr>
-            <w:r>
-              <w:t xml:space="preserve">1997</w:t>
-            </w:r>
-          </w:p>
-        </w:tc>
-        <w:tc>
-          <w:tcPr/>
-          <w:p>
-            <w:pPr>
-              <w:pStyle w:val="Compact"/>
-              <w:jc w:val="left"/>
-            </w:pPr>
-            <w:r>
-              <w:t xml:space="preserve">Cuevones grounding, Mexico</w:t>
-            </w:r>
-          </w:p>
-        </w:tc>
-        <w:tc>
-          <w:tcPr/>
-          <w:p>
-            <w:pPr>
-              <w:pStyle w:val="Compact"/>
-              <w:jc w:val="left"/>
-            </w:pPr>
-            <w:r>
-              <w:t xml:space="preserve">Vessel grounding; local acute event</w:t>
-            </w:r>
-          </w:p>
-        </w:tc>
-        <w:tc>
-          <w:tcPr/>
-          <w:p>
-            <w:pPr>
-              <w:pStyle w:val="Compact"/>
-              <w:jc w:val="left"/>
-            </w:pPr>
-            <w:r>
-              <w:t xml:space="preserve">Exclude</w:t>
-            </w:r>
-          </w:p>
-        </w:tc>
-        <w:tc>
-          <w:tcPr/>
-          <w:p>
-            <w:pPr>
-              <w:pStyle w:val="Compact"/>
-              <w:jc w:val="left"/>
-            </w:pPr>
-            <w:r>
-              <w:t xml:space="preserve">Coral cover fell from 14% to 1%; recruitment remained absent</w:t>
-            </w:r>
-          </w:p>
-        </w:tc>
-      </w:tr>
-      <w:tr>
-        <w:tc>
-          <w:tcPr/>
-          <w:p>
-            <w:pPr>
-              <w:pStyle w:val="Compact"/>
-              <w:jc w:val="left"/>
-            </w:pPr>
-            <w:r>
-              <w:t xml:space="preserve">1999–2019</w:t>
-            </w:r>
-          </w:p>
-        </w:tc>
-        <w:tc>
-          <w:tcPr/>
-          <w:p>
-            <w:pPr>
-              <w:pStyle w:val="Compact"/>
-              <w:jc w:val="left"/>
-            </w:pPr>
-            <w:r>
-              <w:t xml:space="preserve">Coastal eutrophication, middle Florida Keys</w:t>
-            </w:r>
-          </w:p>
-        </w:tc>
-        <w:tc>
-          <w:tcPr/>
-          <w:p>
-            <w:pPr>
-              <w:pStyle w:val="Compact"/>
-              <w:jc w:val="left"/>
-            </w:pPr>
-            <w:r>
-              <w:t xml:space="preserve">Pollution; chronic pressure</w:t>
-            </w:r>
-          </w:p>
-        </w:tc>
-        <w:tc>
-          <w:tcPr/>
-          <w:p>
-            <w:pPr>
-              <w:pStyle w:val="Compact"/>
-              <w:jc w:val="left"/>
-            </w:pPr>
-            <w:r>
-              <w:t xml:space="preserve">Context only</w:t>
-            </w:r>
-          </w:p>
-        </w:tc>
-        <w:tc>
-          <w:tcPr/>
-          <w:p>
-            <w:pPr>
-              <w:pStyle w:val="Compact"/>
-              <w:jc w:val="left"/>
-            </w:pPr>
-            <w:r>
-              <w:t xml:space="preserve">Reduced habitat suitability and persistence</w:t>
-            </w:r>
-          </w:p>
-        </w:tc>
-      </w:tr>
-      <w:tr>
-        <w:tc>
-          <w:tcPr/>
-          <w:p>
-            <w:pPr>
-              <w:pStyle w:val="Compact"/>
-              <w:jc w:val="left"/>
-            </w:pPr>
-            <w:r>
-              <w:t xml:space="preserve">2005</w:t>
-            </w:r>
-          </w:p>
-        </w:tc>
-        <w:tc>
-          <w:tcPr/>
-          <w:p>
-            <w:pPr>
-              <w:pStyle w:val="Compact"/>
-              <w:jc w:val="left"/>
-            </w:pPr>
-            <w:r>
-              <w:t xml:space="preserve">Hurricane season, Florida Keys</w:t>
-            </w:r>
-          </w:p>
-        </w:tc>
-        <w:tc>
-          <w:tcPr/>
-          <w:p>
-            <w:pPr>
-              <w:pStyle w:val="Compact"/>
-              <w:jc w:val="left"/>
-            </w:pPr>
-            <w:r>
-              <w:t xml:space="preserve">Hurricane; local acute event</w:t>
-            </w:r>
-          </w:p>
-        </w:tc>
-        <w:tc>
-          <w:tcPr/>
-          <w:p>
-            <w:pPr>
-              <w:pStyle w:val="Compact"/>
-              <w:jc w:val="left"/>
-            </w:pPr>
-            <w:r>
-              <w:t xml:space="preserve">Exclude</w:t>
-            </w:r>
-          </w:p>
-        </w:tc>
-        <w:tc>
-          <w:tcPr/>
-          <w:p>
-            <w:pPr>
-              <w:pStyle w:val="Compact"/>
-              <w:jc w:val="left"/>
-            </w:pPr>
-            <w:r>
-              <w:t xml:space="preserve">Nearly 50% tissue loss, primarily through breakage</w:t>
-            </w:r>
-          </w:p>
-        </w:tc>
-      </w:tr>
-      <w:tr>
-        <w:tc>
-          <w:tcPr/>
-          <w:p>
-            <w:pPr>
-              <w:pStyle w:val="Compact"/>
-              <w:jc w:val="left"/>
-            </w:pPr>
-            <w:r>
-              <w:t xml:space="preserve">2005–2006</w:t>
-            </w:r>
-          </w:p>
-        </w:tc>
-        <w:tc>
-          <w:tcPr/>
-          <w:p>
-            <w:pPr>
-              <w:pStyle w:val="Compact"/>
-              <w:jc w:val="left"/>
-            </w:pPr>
-            <w:r>
-              <w:t xml:space="preserve">Thermal anomaly, USVI and Florida</w:t>
-            </w:r>
-          </w:p>
-        </w:tc>
-        <w:tc>
-          <w:tcPr/>
-          <w:p>
-            <w:pPr>
-              <w:pStyle w:val="Compact"/>
-              <w:jc w:val="left"/>
-            </w:pPr>
-            <w:r>
-              <w:t xml:space="preserve">Bleaching; acute event</w:t>
-            </w:r>
-          </w:p>
-        </w:tc>
-        <w:tc>
-          <w:tcPr/>
-          <w:p>
-            <w:pPr>
-              <w:pStyle w:val="Compact"/>
-              <w:jc w:val="left"/>
-            </w:pPr>
-            <w:r>
-              <w:t xml:space="preserve">Exclude</w:t>
-            </w:r>
-          </w:p>
-        </w:tc>
-        <w:tc>
-          <w:tcPr/>
-          <w:p>
-            <w:pPr>
-              <w:pStyle w:val="Compact"/>
-              <w:jc w:val="left"/>
-            </w:pPr>
-            <w:r>
-              <w:t xml:space="preserve">Mass bleaching followed by disease outbreak</w:t>
-            </w:r>
-          </w:p>
-        </w:tc>
-      </w:tr>
-      <w:tr>
-        <w:tc>
-          <w:tcPr/>
-          <w:p>
-            <w:pPr>
-              <w:pStyle w:val="Compact"/>
-              <w:jc w:val="left"/>
-            </w:pPr>
-            <w:r>
-              <w:t xml:space="preserve">2005–2010</w:t>
-            </w:r>
-          </w:p>
-        </w:tc>
-        <w:tc>
-          <w:tcPr/>
-          <w:p>
-            <w:pPr>
-              <w:pStyle w:val="Compact"/>
-              <w:jc w:val="left"/>
-            </w:pPr>
-            <w:r>
-              <w:t xml:space="preserve">Snail predation trap, Florida Keys</w:t>
-            </w:r>
-          </w:p>
-        </w:tc>
-        <w:tc>
-          <w:tcPr/>
-          <w:p>
-            <w:pPr>
-              <w:pStyle w:val="Compact"/>
-              <w:jc w:val="left"/>
-            </w:pPr>
-            <w:r>
-              <w:t xml:space="preserve">Biotic pressure; chronic pressure</w:t>
-            </w:r>
-          </w:p>
-        </w:tc>
-        <w:tc>
-          <w:tcPr/>
-          <w:p>
-            <w:pPr>
-              <w:pStyle w:val="Compact"/>
-              <w:jc w:val="left"/>
-            </w:pPr>
-            <w:r>
-              <w:t xml:space="preserve">Context only</w:t>
-            </w:r>
-          </w:p>
-        </w:tc>
-        <w:tc>
-          <w:tcPr/>
-          <w:p>
-            <w:pPr>
-              <w:pStyle w:val="Compact"/>
-              <w:jc w:val="left"/>
-            </w:pPr>
-            <w:r>
-              <w:t xml:space="preserve">Concentrated tissue loss on surviving fragments</w:t>
-            </w:r>
-          </w:p>
-        </w:tc>
-      </w:tr>
-      <w:tr>
-        <w:tc>
-          <w:tcPr/>
-          <w:p>
-            <w:pPr>
-              <w:pStyle w:val="Compact"/>
-              <w:jc w:val="left"/>
-            </w:pPr>
-            <w:r>
-              <w:t xml:space="preserve">2005–2021</w:t>
-            </w:r>
-          </w:p>
-        </w:tc>
-        <w:tc>
-          <w:tcPr/>
-          <w:p>
-            <w:pPr>
-              <w:pStyle w:val="Compact"/>
-              <w:jc w:val="left"/>
-            </w:pPr>
-            <w:r>
-              <w:t xml:space="preserve">Playa Baracoa pollution, Cuba</w:t>
-            </w:r>
-          </w:p>
-        </w:tc>
-        <w:tc>
-          <w:tcPr/>
-          <w:p>
-            <w:pPr>
-              <w:pStyle w:val="Compact"/>
-              <w:jc w:val="left"/>
-            </w:pPr>
-            <w:r>
-              <w:t xml:space="preserve">Pollution; chronic pressure</w:t>
-            </w:r>
-          </w:p>
-        </w:tc>
-        <w:tc>
-          <w:tcPr/>
-          <w:p>
-            <w:pPr>
-              <w:pStyle w:val="Compact"/>
-              <w:jc w:val="left"/>
-            </w:pPr>
-            <w:r>
-              <w:t xml:space="preserve">Context only</w:t>
-            </w:r>
-          </w:p>
-        </w:tc>
-        <w:tc>
-          <w:tcPr/>
-          <w:p>
-            <w:pPr>
-              <w:pStyle w:val="Compact"/>
-              <w:jc w:val="left"/>
-            </w:pPr>
-            <w:r>
-              <w:t xml:space="preserve">Wastewater, macroalgal cover, and low colony density</w:t>
-            </w:r>
-          </w:p>
-        </w:tc>
-      </w:tr>
-      <w:tr>
-        <w:tc>
-          <w:tcPr/>
-          <w:p>
-            <w:pPr>
-              <w:pStyle w:val="Compact"/>
-              <w:jc w:val="left"/>
-            </w:pPr>
-            <w:r>
-              <w:t xml:space="preserve">2010</w:t>
-            </w:r>
-          </w:p>
-        </w:tc>
-        <w:tc>
-          <w:tcPr/>
-          <w:p>
-            <w:pPr>
-              <w:pStyle w:val="Compact"/>
-              <w:jc w:val="left"/>
-            </w:pPr>
-            <w:r>
-              <w:t xml:space="preserve">Cold-water event, Florida Keys</w:t>
-            </w:r>
-          </w:p>
-        </w:tc>
-        <w:tc>
-          <w:tcPr/>
-          <w:p>
-            <w:pPr>
-              <w:pStyle w:val="Compact"/>
-              <w:jc w:val="left"/>
-            </w:pPr>
-            <w:r>
-              <w:t xml:space="preserve">Cold snap; local acute event</w:t>
-            </w:r>
-          </w:p>
-        </w:tc>
-        <w:tc>
-          <w:tcPr/>
-          <w:p>
-            <w:pPr>
-              <w:pStyle w:val="Compact"/>
-              <w:jc w:val="left"/>
-            </w:pPr>
-            <w:r>
-              <w:t xml:space="preserve">Exclude</w:t>
-            </w:r>
-          </w:p>
-        </w:tc>
-        <w:tc>
-          <w:tcPr/>
-          <w:p>
-            <w:pPr>
-              <w:pStyle w:val="Compact"/>
-              <w:jc w:val="left"/>
-            </w:pPr>
-            <w:r>
-              <w:t xml:space="preserve">Mass mortality of wild colonies and outplants</w:t>
-            </w:r>
-          </w:p>
-        </w:tc>
-      </w:tr>
-      <w:tr>
-        <w:tc>
-          <w:tcPr/>
-          <w:p>
-            <w:pPr>
-              <w:pStyle w:val="Compact"/>
-              <w:jc w:val="left"/>
-            </w:pPr>
-            <w:r>
-              <w:t xml:space="preserve">2011–2025</w:t>
-            </w:r>
-          </w:p>
-        </w:tc>
-        <w:tc>
-          <w:tcPr/>
-          <w:p>
-            <w:pPr>
-              <w:pStyle w:val="Compact"/>
-              <w:jc w:val="left"/>
-            </w:pPr>
-            <w:r>
-              <w:t xml:space="preserve">Sargassum brown tides, Caribbean-wide</w:t>
-            </w:r>
-          </w:p>
-        </w:tc>
-        <w:tc>
-          <w:tcPr/>
-          <w:p>
-            <w:pPr>
-              <w:pStyle w:val="Compact"/>
-              <w:jc w:val="left"/>
-            </w:pPr>
-            <w:r>
-              <w:t xml:space="preserve">Chronic pressure</w:t>
-            </w:r>
-          </w:p>
-        </w:tc>
-        <w:tc>
-          <w:tcPr/>
-          <w:p>
-            <w:pPr>
-              <w:pStyle w:val="Compact"/>
-              <w:jc w:val="left"/>
-            </w:pPr>
-            <w:r>
-              <w:t xml:space="preserve">Context only</w:t>
-            </w:r>
-          </w:p>
-        </w:tc>
-        <w:tc>
-          <w:tcPr/>
-          <w:p>
-            <w:pPr>
-              <w:pStyle w:val="Compact"/>
-              <w:jc w:val="left"/>
-            </w:pPr>
-            <w:r>
-              <w:t xml:space="preserve">Leachate toxicity, larval effects, and hypoxia</w:t>
-            </w:r>
-          </w:p>
-        </w:tc>
-      </w:tr>
-      <w:tr>
-        <w:tc>
-          <w:tcPr/>
-          <w:p>
-            <w:pPr>
-              <w:pStyle w:val="Compact"/>
-              <w:jc w:val="left"/>
-            </w:pPr>
-            <w:r>
-              <w:t xml:space="preserve">2014–2017</w:t>
-            </w:r>
-          </w:p>
-        </w:tc>
-        <w:tc>
-          <w:tcPr/>
-          <w:p>
-            <w:pPr>
-              <w:pStyle w:val="Compact"/>
-              <w:jc w:val="left"/>
-            </w:pPr>
-            <w:r>
-              <w:t xml:space="preserve">Third global bleaching event, Caribbean-wide</w:t>
-            </w:r>
-          </w:p>
-        </w:tc>
-        <w:tc>
-          <w:tcPr/>
-          <w:p>
-            <w:pPr>
-              <w:pStyle w:val="Compact"/>
-              <w:jc w:val="left"/>
-            </w:pPr>
-            <w:r>
-              <w:t xml:space="preserve">Bleaching; chronic regime</w:t>
-            </w:r>
-          </w:p>
-        </w:tc>
-        <w:tc>
-          <w:tcPr/>
-          <w:p>
-            <w:pPr>
-              <w:pStyle w:val="Compact"/>
-              <w:jc w:val="left"/>
-            </w:pPr>
-            <w:r>
-              <w:t xml:space="preserve">Context only</w:t>
-            </w:r>
-          </w:p>
-        </w:tc>
-        <w:tc>
-          <w:tcPr/>
-          <w:p>
-            <w:pPr>
-              <w:pStyle w:val="Compact"/>
-              <w:jc w:val="left"/>
-            </w:pPr>
-            <w:r>
-              <w:t xml:space="preserve">Prolonged thermal stress and elevated mortality</w:t>
-            </w:r>
-          </w:p>
-        </w:tc>
-      </w:tr>
-      <w:tr>
-        <w:tc>
-          <w:tcPr/>
-          <w:p>
-            <w:pPr>
-              <w:pStyle w:val="Compact"/>
-              <w:jc w:val="left"/>
-            </w:pPr>
-            <w:r>
-              <w:t xml:space="preserve">2017</w:t>
-            </w:r>
-          </w:p>
-        </w:tc>
-        <w:tc>
-          <w:tcPr/>
-          <w:p>
-            <w:pPr>
-              <w:pStyle w:val="Compact"/>
-              <w:jc w:val="left"/>
-            </w:pPr>
-            <w:r>
-              <w:t xml:space="preserve">Hurricane Irma, Florida Keys and USVI</w:t>
-            </w:r>
-          </w:p>
-        </w:tc>
-        <w:tc>
-          <w:tcPr/>
-          <w:p>
-            <w:pPr>
-              <w:pStyle w:val="Compact"/>
-              <w:jc w:val="left"/>
-            </w:pPr>
-            <w:r>
-              <w:t xml:space="preserve">Hurricane; regional acute event</w:t>
-            </w:r>
-          </w:p>
-        </w:tc>
-        <w:tc>
-          <w:tcPr/>
-          <w:p>
-            <w:pPr>
-              <w:pStyle w:val="Compact"/>
-              <w:jc w:val="left"/>
-            </w:pPr>
-            <w:r>
-              <w:t xml:space="preserve">Exclude</w:t>
-            </w:r>
-          </w:p>
-        </w:tc>
-        <w:tc>
-          <w:tcPr/>
-          <w:p>
-            <w:pPr>
-              <w:pStyle w:val="Compact"/>
-              <w:jc w:val="left"/>
-            </w:pPr>
-            <w:r>
-              <w:t xml:space="preserve">Physical damage and framework displacement</w:t>
-            </w:r>
-          </w:p>
-        </w:tc>
-      </w:tr>
-      <w:tr>
-        <w:tc>
-          <w:tcPr/>
-          <w:p>
-            <w:pPr>
-              <w:pStyle w:val="Compact"/>
-              <w:jc w:val="left"/>
-            </w:pPr>
-            <w:r>
-              <w:t xml:space="preserve">2017</w:t>
-            </w:r>
-          </w:p>
-        </w:tc>
-        <w:tc>
-          <w:tcPr/>
-          <w:p>
-            <w:pPr>
-              <w:pStyle w:val="Compact"/>
-              <w:jc w:val="left"/>
-            </w:pPr>
-            <w:r>
-              <w:t xml:space="preserve">M/V</w:t>
-            </w:r>
-            <w:r>
-              <w:t xml:space="preserve"> </w:t>
-            </w:r>
-            <w:r>
-              <w:rPr>
-                <w:i/>
-                <w:iCs/>
-              </w:rPr>
-              <w:t xml:space="preserve">Noemi</w:t>
-            </w:r>
-            <w:r>
-              <w:t xml:space="preserve"> </w:t>
-            </w:r>
-            <w:r>
-              <w:t xml:space="preserve">grounding, Puerto Rico</w:t>
-            </w:r>
-          </w:p>
-        </w:tc>
-        <w:tc>
-          <w:tcPr/>
-          <w:p>
-            <w:pPr>
-              <w:pStyle w:val="Compact"/>
-              <w:jc w:val="left"/>
-            </w:pPr>
-            <w:r>
-              <w:t xml:space="preserve">Vessel grounding; local acute event</w:t>
-            </w:r>
-          </w:p>
-        </w:tc>
-        <w:tc>
-          <w:tcPr/>
-          <w:p>
-            <w:pPr>
-              <w:pStyle w:val="Compact"/>
-              <w:jc w:val="left"/>
-            </w:pPr>
-            <w:r>
-              <w:t xml:space="preserve">Exclude</w:t>
-            </w:r>
-          </w:p>
-        </w:tc>
-        <w:tc>
-          <w:tcPr/>
-          <w:p>
-            <w:pPr>
-              <w:pStyle w:val="Compact"/>
-              <w:jc w:val="left"/>
-            </w:pPr>
-            <w:r>
-              <w:t xml:space="preserve">Physical destruction of wild thickets</w:t>
-            </w:r>
-          </w:p>
-        </w:tc>
-      </w:tr>
-      <w:tr>
-        <w:tc>
-          <w:tcPr/>
-          <w:p>
-            <w:pPr>
-              <w:pStyle w:val="Compact"/>
-              <w:jc w:val="left"/>
-            </w:pPr>
-            <w:r>
-              <w:t xml:space="preserve">2018–2025</w:t>
-            </w:r>
-          </w:p>
-        </w:tc>
-        <w:tc>
-          <w:tcPr/>
-          <w:p>
-            <w:pPr>
-              <w:pStyle w:val="Compact"/>
-              <w:jc w:val="left"/>
-            </w:pPr>
-            <w:r>
-              <w:t xml:space="preserve">SCTLD outbreak, Mexico</w:t>
-            </w:r>
-          </w:p>
-        </w:tc>
-        <w:tc>
-          <w:tcPr/>
-          <w:p>
-            <w:pPr>
-              <w:pStyle w:val="Compact"/>
-              <w:jc w:val="left"/>
-            </w:pPr>
-            <w:r>
-              <w:t xml:space="preserve">Disease; indirect framework pressure</w:t>
-            </w:r>
-          </w:p>
-        </w:tc>
-        <w:tc>
-          <w:tcPr/>
-          <w:p>
-            <w:pPr>
-              <w:pStyle w:val="Compact"/>
-              <w:jc w:val="left"/>
-            </w:pPr>
-            <w:r>
-              <w:t xml:space="preserve">Context only</w:t>
-            </w:r>
-          </w:p>
-        </w:tc>
-        <w:tc>
-          <w:tcPr/>
-          <w:p>
-            <w:pPr>
-              <w:pStyle w:val="Compact"/>
-              <w:jc w:val="left"/>
-            </w:pPr>
-            <w:r>
-              <w:t xml:space="preserve">Collapse of framework species and shifted carbonate budget</w:t>
-            </w:r>
-          </w:p>
-        </w:tc>
-      </w:tr>
-      <w:tr>
-        <w:tc>
-          <w:tcPr/>
-          <w:p>
-            <w:pPr>
-              <w:pStyle w:val="Compact"/>
-              <w:jc w:val="left"/>
-            </w:pPr>
-            <w:r>
-              <w:t xml:space="preserve">2022</w:t>
-            </w:r>
-          </w:p>
-        </w:tc>
-        <w:tc>
-          <w:tcPr/>
-          <w:p>
-            <w:pPr>
-              <w:pStyle w:val="Compact"/>
-              <w:jc w:val="left"/>
-            </w:pPr>
-            <w:r>
-              <w:t xml:space="preserve">Second</w:t>
-            </w:r>
-            <w:r>
-              <w:t xml:space="preserve"> </w:t>
-            </w:r>
-            <w:r>
-              <w:rPr>
-                <w:i/>
-                <w:iCs/>
-              </w:rPr>
-              <w:t xml:space="preserve">Diadema</w:t>
-            </w:r>
-            <w:r>
-              <w:t xml:space="preserve"> </w:t>
-            </w:r>
-            <w:r>
-              <w:t xml:space="preserve">die-off, USVI and Caribbean</w:t>
-            </w:r>
-          </w:p>
-        </w:tc>
-        <w:tc>
-          <w:tcPr/>
-          <w:p>
-            <w:pPr>
-              <w:pStyle w:val="Compact"/>
-              <w:jc w:val="left"/>
-            </w:pPr>
-            <w:r>
-              <w:t xml:space="preserve">Disease; regional acute event</w:t>
-            </w:r>
-          </w:p>
-        </w:tc>
-        <w:tc>
-          <w:tcPr/>
-          <w:p>
-            <w:pPr>
-              <w:pStyle w:val="Compact"/>
-              <w:jc w:val="left"/>
-            </w:pPr>
-            <w:r>
-              <w:t xml:space="preserve">Exclude</w:t>
-            </w:r>
-          </w:p>
-        </w:tc>
-        <w:tc>
-          <w:tcPr/>
-          <w:p>
-            <w:pPr>
-              <w:pStyle w:val="Compact"/>
-              <w:jc w:val="left"/>
-            </w:pPr>
-            <w:r>
-              <w:t xml:space="preserve">Rapid loss of algal control</w:t>
-            </w:r>
-          </w:p>
-        </w:tc>
-      </w:tr>
-      <w:tr>
-        <w:tc>
-          <w:tcPr/>
-          <w:p>
-            <w:pPr>
-              <w:pStyle w:val="Compact"/>
-              <w:jc w:val="left"/>
-            </w:pPr>
-            <w:r>
-              <w:t xml:space="preserve">2023</w:t>
-            </w:r>
-          </w:p>
-        </w:tc>
-        <w:tc>
-          <w:tcPr/>
-          <w:p>
-            <w:pPr>
-              <w:pStyle w:val="Compact"/>
-              <w:jc w:val="left"/>
-            </w:pPr>
-            <w:r>
-              <w:t xml:space="preserve">Marine heatwave, Caribbean-wide</w:t>
-            </w:r>
-          </w:p>
-        </w:tc>
-        <w:tc>
-          <w:tcPr/>
-          <w:p>
-            <w:pPr>
-              <w:pStyle w:val="Compact"/>
-              <w:jc w:val="left"/>
-            </w:pPr>
-            <w:r>
-              <w:t xml:space="preserve">Bleaching; acute event</w:t>
-            </w:r>
-          </w:p>
-        </w:tc>
-        <w:tc>
-          <w:tcPr/>
-          <w:p>
-            <w:pPr>
-              <w:pStyle w:val="Compact"/>
-              <w:jc w:val="left"/>
-            </w:pPr>
-            <w:r>
-              <w:t xml:space="preserve">Exclude</w:t>
-            </w:r>
-          </w:p>
-        </w:tc>
-        <w:tc>
-          <w:tcPr/>
-          <w:p>
-            <w:pPr>
-              <w:pStyle w:val="Compact"/>
-              <w:jc w:val="left"/>
-            </w:pPr>
-            <w:r>
-              <w:t xml:space="preserve">Functional extinction in Florida and severe regional loss</w:t>
-            </w:r>
-          </w:p>
-        </w:tc>
-      </w:tr>
-    </w:tbl>
-    <w:p>
-      <w:pPr>
-        <w:pStyle w:val="BodyText"/>
       </w:pPr>
       <w:r>
         <w:rPr>
           <w:b/>
           <w:bCs/>
         </w:rPr>
-        <w:t xml:space="preserve">Notes.</w:t>
-      </w:r>
-      <w:r>
-        <w:t xml:space="preserve"> </w:t>
-      </w:r>
-      <w:r>
-        <w:t xml:space="preserve">The chronology contains 18 documented events or pressures spanning</w:t>
-      </w:r>
-      <w:r>
-        <w:t xml:space="preserve"> </w:t>
-      </w:r>
-      <w:r>
-        <w:t xml:space="preserve">7 broad regions and 8 event classes. Eleven are treated as baseline exclusions,</w:t>
-      </w:r>
-      <w:r>
-        <w:t xml:space="preserve"> </w:t>
-      </w:r>
-      <w:r>
-        <w:t xml:space="preserve">and seven as chronic or contextual pressure. The categories describe exposure</w:t>
-      </w:r>
-      <w:r>
-        <w:t xml:space="preserve"> </w:t>
-      </w:r>
-      <w:r>
-        <w:t xml:space="preserve">context; they do not identify a single causal effect for each event.</w:t>
+        <w:t xml:space="preserve">Online Resource 1 (ESM_1.pdf).</w:t>
+      </w:r>
+      <w:r>
+        <w:t xml:space="preserve"> </w:t>
+      </w:r>
+      <w:r>
+        <w:t xml:space="preserve">Concise supporting analyses for the</w:t>
+      </w:r>
+      <w:r>
+        <w:t xml:space="preserve"> </w:t>
+      </w:r>
+      <w:r>
+        <w:rPr>
+          <w:i/>
+          <w:iCs/>
+        </w:rPr>
+        <w:t xml:space="preserve">Acropora palmata</w:t>
+      </w:r>
+      <w:r>
+        <w:t xml:space="preserve"> </w:t>
+      </w:r>
+      <w:r>
+        <w:t xml:space="preserve">demographic synthesis: the study-window disturbance audit and six supplementary figures. Extended diagnostics and source outputs remain available in the public repository.</w:t>
       </w:r>
     </w:p>
     <w:bookmarkEnd w:id="36"/>
-    <w:bookmarkStart w:id="37" w:name="X233dfcf836878d74c22e8d4fc4a52b66ad121b1"/>
-    <w:p>
-      <w:pPr>
-        <w:pStyle w:val="Heading1"/>
-      </w:pPr>
-      <w:r>
-        <w:t xml:space="preserve">Table S2. Study-window disturbance coverage audit</w:t>
-      </w:r>
-    </w:p>
-    <w:p>
-      <w:pPr>
-        <w:pStyle w:val="FirstParagraph"/>
-      </w:pPr>
-      <w:r>
-        <w:t xml:space="preserve">This audit rebuilds the curated disturbance overlay on prepared survival intervals and summarizes overlap by study window.</w:t>
-      </w:r>
-    </w:p>
-    <w:p>
-      <w:pPr>
-        <w:pStyle w:val="BodyText"/>
-      </w:pPr>
-      <w:r>
-        <w:rPr>
-          <w:b/>
-          <w:bCs/>
-        </w:rPr>
-        <w:t xml:space="preserve">Overall coverage.</w:t>
-      </w:r>
-    </w:p>
-    <w:p>
-      <w:pPr>
-        <w:pStyle w:val="Compact"/>
-        <w:numPr>
-          <w:ilvl w:val="0"/>
-          <w:numId w:val="1001"/>
-        </w:numPr>
-      </w:pPr>
-      <w:r>
-        <w:t xml:space="preserve">Intervals audited: 1,072</w:t>
-      </w:r>
-    </w:p>
-    <w:p>
-      <w:pPr>
-        <w:pStyle w:val="Compact"/>
-        <w:numPr>
-          <w:ilvl w:val="0"/>
-          <w:numId w:val="1001"/>
-        </w:numPr>
-      </w:pPr>
-      <w:r>
-        <w:t xml:space="preserve">Studies represented: 7</w:t>
-      </w:r>
-    </w:p>
-    <w:p>
-      <w:pPr>
-        <w:pStyle w:val="Compact"/>
-        <w:numPr>
-          <w:ilvl w:val="0"/>
-          <w:numId w:val="1001"/>
-        </w:numPr>
-      </w:pPr>
-      <w:r>
-        <w:t xml:space="preserve">Zero-overlap intervals: 53</w:t>
-      </w:r>
-    </w:p>
-    <w:p>
-      <w:pPr>
-        <w:pStyle w:val="Compact"/>
-        <w:numPr>
-          <w:ilvl w:val="0"/>
-          <w:numId w:val="1001"/>
-        </w:numPr>
-      </w:pPr>
-      <w:r>
-        <w:t xml:space="preserve">One-event intervals: 74</w:t>
-      </w:r>
-    </w:p>
-    <w:p>
-      <w:pPr>
-        <w:pStyle w:val="Compact"/>
-        <w:numPr>
-          <w:ilvl w:val="0"/>
-          <w:numId w:val="1001"/>
-        </w:numPr>
-      </w:pPr>
-      <w:r>
-        <w:t xml:space="preserve">Multi-event intervals: 945</w:t>
-      </w:r>
-    </w:p>
-    <w:p>
-      <w:pPr>
-        <w:pStyle w:val="Compact"/>
-        <w:numPr>
-          <w:ilvl w:val="0"/>
-          <w:numId w:val="1001"/>
-        </w:numPr>
-      </w:pPr>
-      <w:r>
-        <w:t xml:space="preserve">Baseline-exclusion intervals: 297</w:t>
-      </w:r>
-    </w:p>
-    <w:p>
-      <w:pPr>
-        <w:pStyle w:val="FirstParagraph"/>
-      </w:pPr>
-      <w:r>
-        <w:rPr>
-          <w:b/>
-          <w:bCs/>
-        </w:rPr>
-        <w:t xml:space="preserve">Study-level coverage.</w:t>
-      </w:r>
-    </w:p>
-    <w:tbl>
-      <w:tblPr>
-        <w:tblStyle w:val="Table"/>
-        <w:tblW w:type="pct" w:w="5000"/>
-        <w:tblLayout w:type="fixed"/>
-        <w:tblLook w:firstRow="1" w:lastRow="0" w:firstColumn="0" w:lastColumn="0" w:noHBand="0" w:noVBand="0" w:val="0020"/>
-      </w:tblPr>
-      <w:tblGrid>
-        <w:gridCol w:w="792"/>
-        <w:gridCol w:w="792"/>
-        <w:gridCol w:w="792"/>
-        <w:gridCol w:w="792"/>
-        <w:gridCol w:w="792"/>
-        <w:gridCol w:w="792"/>
-        <w:gridCol w:w="792"/>
-        <w:gridCol w:w="792"/>
-        <w:gridCol w:w="792"/>
-        <w:gridCol w:w="792"/>
-      </w:tblGrid>
-      <w:tr>
-        <w:trPr>
-          <w:tblHeader w:val="on"/>
-        </w:trPr>
-        <w:tc>
-          <w:tcPr/>
-          <w:p>
-            <w:pPr>
-              <w:pStyle w:val="Compact"/>
-              <w:jc w:val="left"/>
-            </w:pPr>
-            <w:r>
-              <w:t xml:space="preserve">Study</w:t>
-            </w:r>
-          </w:p>
-        </w:tc>
-        <w:tc>
-          <w:tcPr/>
-          <w:p>
-            <w:pPr>
-              <w:pStyle w:val="Compact"/>
-              <w:jc w:val="right"/>
-            </w:pPr>
-            <w:r>
-              <w:t xml:space="preserve">Intervals</w:t>
-            </w:r>
-          </w:p>
-        </w:tc>
-        <w:tc>
-          <w:tcPr/>
-          <w:p>
-            <w:pPr>
-              <w:pStyle w:val="Compact"/>
-              <w:jc w:val="right"/>
-            </w:pPr>
-            <w:r>
-              <w:t xml:space="preserve">No overlap</w:t>
-            </w:r>
-          </w:p>
-        </w:tc>
-        <w:tc>
-          <w:tcPr/>
-          <w:p>
-            <w:pPr>
-              <w:pStyle w:val="Compact"/>
-              <w:jc w:val="right"/>
-            </w:pPr>
-            <w:r>
-              <w:t xml:space="preserve">One event</w:t>
-            </w:r>
-          </w:p>
-        </w:tc>
-        <w:tc>
-          <w:tcPr/>
-          <w:p>
-            <w:pPr>
-              <w:pStyle w:val="Compact"/>
-              <w:jc w:val="right"/>
-            </w:pPr>
-            <w:r>
-              <w:t xml:space="preserve">Two or more events</w:t>
-            </w:r>
-          </w:p>
-        </w:tc>
-        <w:tc>
-          <w:tcPr/>
-          <w:p>
-            <w:pPr>
-              <w:pStyle w:val="Compact"/>
-              <w:jc w:val="right"/>
-            </w:pPr>
-            <w:r>
-              <w:t xml:space="preserve">Local metadata only</w:t>
-            </w:r>
-          </w:p>
-        </w:tc>
-        <w:tc>
-          <w:tcPr/>
-          <w:p>
-            <w:pPr>
-              <w:pStyle w:val="Compact"/>
-              <w:jc w:val="right"/>
-            </w:pPr>
-            <w:r>
-              <w:t xml:space="preserve">Timeline overlay</w:t>
-            </w:r>
-          </w:p>
-        </w:tc>
-        <w:tc>
-          <w:tcPr/>
-          <w:p>
-            <w:pPr>
-              <w:pStyle w:val="Compact"/>
-              <w:jc w:val="right"/>
-            </w:pPr>
-            <w:r>
-              <w:t xml:space="preserve">Both sources</w:t>
-            </w:r>
-          </w:p>
-        </w:tc>
-        <w:tc>
-          <w:tcPr/>
-          <w:p>
-            <w:pPr>
-              <w:pStyle w:val="Compact"/>
-              <w:jc w:val="right"/>
-            </w:pPr>
-            <w:r>
-              <w:t xml:space="preserve">Baseline exclusion</w:t>
-            </w:r>
-          </w:p>
-        </w:tc>
-        <w:tc>
-          <w:tcPr/>
-          <w:p>
-            <w:pPr>
-              <w:pStyle w:val="Compact"/>
-              <w:jc w:val="right"/>
-            </w:pPr>
-            <w:r>
-              <w:t xml:space="preserve">Any overlap (%)</w:t>
-            </w:r>
-          </w:p>
-        </w:tc>
-      </w:tr>
-      <w:tr>
-        <w:tc>
-          <w:tcPr/>
-          <w:p>
-            <w:pPr>
-              <w:pStyle w:val="Compact"/>
-              <w:jc w:val="left"/>
-            </w:pPr>
-            <w:r>
-              <w:t xml:space="preserve">NOAA_survey</w:t>
-            </w:r>
-          </w:p>
-        </w:tc>
-        <w:tc>
-          <w:tcPr/>
-          <w:p>
-            <w:pPr>
-              <w:pStyle w:val="Compact"/>
-              <w:jc w:val="right"/>
-            </w:pPr>
-            <w:r>
-              <w:t xml:space="preserve">842</w:t>
-            </w:r>
-          </w:p>
-        </w:tc>
-        <w:tc>
-          <w:tcPr/>
-          <w:p>
-            <w:pPr>
-              <w:pStyle w:val="Compact"/>
-              <w:jc w:val="right"/>
-            </w:pPr>
-            <w:r>
-              <w:t xml:space="preserve">50</w:t>
-            </w:r>
-          </w:p>
-        </w:tc>
-        <w:tc>
-          <w:tcPr/>
-          <w:p>
-            <w:pPr>
-              <w:pStyle w:val="Compact"/>
-              <w:jc w:val="right"/>
-            </w:pPr>
-            <w:r>
-              <w:t xml:space="preserve">59</w:t>
-            </w:r>
-          </w:p>
-        </w:tc>
-        <w:tc>
-          <w:tcPr/>
-          <w:p>
-            <w:pPr>
-              <w:pStyle w:val="Compact"/>
-              <w:jc w:val="right"/>
-            </w:pPr>
-            <w:r>
-              <w:t xml:space="preserve">733</w:t>
-            </w:r>
-          </w:p>
-        </w:tc>
-        <w:tc>
-          <w:tcPr/>
-          <w:p>
-            <w:pPr>
-              <w:pStyle w:val="Compact"/>
-              <w:jc w:val="right"/>
-            </w:pPr>
-            <w:r>
-              <w:t xml:space="preserve">12</w:t>
-            </w:r>
-          </w:p>
-        </w:tc>
-        <w:tc>
-          <w:tcPr/>
-          <w:p>
-            <w:pPr>
-              <w:pStyle w:val="Compact"/>
-              <w:jc w:val="right"/>
-            </w:pPr>
-            <w:r>
-              <w:t xml:space="preserve">716</w:t>
-            </w:r>
-          </w:p>
-        </w:tc>
-        <w:tc>
-          <w:tcPr/>
-          <w:p>
-            <w:pPr>
-              <w:pStyle w:val="Compact"/>
-              <w:jc w:val="right"/>
-            </w:pPr>
-            <w:r>
-              <w:t xml:space="preserve">76</w:t>
-            </w:r>
-          </w:p>
-        </w:tc>
-        <w:tc>
-          <w:tcPr/>
-          <w:p>
-            <w:pPr>
-              <w:pStyle w:val="Compact"/>
-              <w:jc w:val="right"/>
-            </w:pPr>
-            <w:r>
-              <w:t xml:space="preserve">228</w:t>
-            </w:r>
-          </w:p>
-        </w:tc>
-        <w:tc>
-          <w:tcPr/>
-          <w:p>
-            <w:pPr>
-              <w:pStyle w:val="Compact"/>
-              <w:jc w:val="right"/>
-            </w:pPr>
-            <w:r>
-              <w:t xml:space="preserve">94.1</w:t>
-            </w:r>
-          </w:p>
-        </w:tc>
-      </w:tr>
-      <w:tr>
-        <w:tc>
-          <w:tcPr/>
-          <w:p>
-            <w:pPr>
-              <w:pStyle w:val="Compact"/>
-              <w:jc w:val="left"/>
-            </w:pPr>
-            <w:r>
-              <w:t xml:space="preserve">neely_et_al_2022</w:t>
-            </w:r>
-          </w:p>
-        </w:tc>
-        <w:tc>
-          <w:tcPr/>
-          <w:p>
-            <w:pPr>
-              <w:pStyle w:val="Compact"/>
-              <w:jc w:val="right"/>
-            </w:pPr>
-            <w:r>
-              <w:t xml:space="preserve">98</w:t>
-            </w:r>
-          </w:p>
-        </w:tc>
-        <w:tc>
-          <w:tcPr/>
-          <w:p>
-            <w:pPr>
-              <w:pStyle w:val="Compact"/>
-              <w:jc w:val="right"/>
-            </w:pPr>
-            <w:r>
-              <w:t xml:space="preserve">3</w:t>
-            </w:r>
-          </w:p>
-        </w:tc>
-        <w:tc>
-          <w:tcPr/>
-          <w:p>
-            <w:pPr>
-              <w:pStyle w:val="Compact"/>
-              <w:jc w:val="right"/>
-            </w:pPr>
-            <w:r>
-              <w:t xml:space="preserve">0</w:t>
-            </w:r>
-          </w:p>
-        </w:tc>
-        <w:tc>
-          <w:tcPr/>
-          <w:p>
-            <w:pPr>
-              <w:pStyle w:val="Compact"/>
-              <w:jc w:val="right"/>
-            </w:pPr>
-            <w:r>
-              <w:t xml:space="preserve">95</w:t>
-            </w:r>
-          </w:p>
-        </w:tc>
-        <w:tc>
-          <w:tcPr/>
-          <w:p>
-            <w:pPr>
-              <w:pStyle w:val="Compact"/>
-              <w:jc w:val="right"/>
-            </w:pPr>
-            <w:r>
-              <w:t xml:space="preserve">0</w:t>
-            </w:r>
-          </w:p>
-        </w:tc>
-        <w:tc>
-          <w:tcPr/>
-          <w:p>
-            <w:pPr>
-              <w:pStyle w:val="Compact"/>
-              <w:jc w:val="right"/>
-            </w:pPr>
-            <w:r>
-              <w:t xml:space="preserve">56</w:t>
-            </w:r>
-          </w:p>
-        </w:tc>
-        <w:tc>
-          <w:tcPr/>
-          <w:p>
-            <w:pPr>
-              <w:pStyle w:val="Compact"/>
-              <w:jc w:val="right"/>
-            </w:pPr>
-            <w:r>
-              <w:t xml:space="preserve">39</w:t>
-            </w:r>
-          </w:p>
-        </w:tc>
-        <w:tc>
-          <w:tcPr/>
-          <w:p>
-            <w:pPr>
-              <w:pStyle w:val="Compact"/>
-              <w:jc w:val="right"/>
-            </w:pPr>
-            <w:r>
-              <w:t xml:space="preserve">10</w:t>
-            </w:r>
-          </w:p>
-        </w:tc>
-        <w:tc>
-          <w:tcPr/>
-          <w:p>
-            <w:pPr>
-              <w:pStyle w:val="Compact"/>
-              <w:jc w:val="right"/>
-            </w:pPr>
-            <w:r>
-              <w:t xml:space="preserve">96.9</w:t>
-            </w:r>
-          </w:p>
-        </w:tc>
-      </w:tr>
-      <w:tr>
-        <w:tc>
-          <w:tcPr/>
-          <w:p>
-            <w:pPr>
-              <w:pStyle w:val="Compact"/>
-              <w:jc w:val="left"/>
-            </w:pPr>
-            <w:r>
-              <w:t xml:space="preserve">pausch_et_al_2018</w:t>
-            </w:r>
-          </w:p>
-        </w:tc>
-        <w:tc>
-          <w:tcPr/>
-          <w:p>
-            <w:pPr>
-              <w:pStyle w:val="Compact"/>
-              <w:jc w:val="right"/>
-            </w:pPr>
-            <w:r>
-              <w:t xml:space="preserve">70</w:t>
-            </w:r>
-          </w:p>
-        </w:tc>
-        <w:tc>
-          <w:tcPr/>
-          <w:p>
-            <w:pPr>
-              <w:pStyle w:val="Compact"/>
-              <w:jc w:val="right"/>
-            </w:pPr>
-            <w:r>
-              <w:t xml:space="preserve">0</w:t>
-            </w:r>
-          </w:p>
-        </w:tc>
-        <w:tc>
-          <w:tcPr/>
-          <w:p>
-            <w:pPr>
-              <w:pStyle w:val="Compact"/>
-              <w:jc w:val="right"/>
-            </w:pPr>
-            <w:r>
-              <w:t xml:space="preserve">0</w:t>
-            </w:r>
-          </w:p>
-        </w:tc>
-        <w:tc>
-          <w:tcPr/>
-          <w:p>
-            <w:pPr>
-              <w:pStyle w:val="Compact"/>
-              <w:jc w:val="right"/>
-            </w:pPr>
-            <w:r>
-              <w:t xml:space="preserve">70</w:t>
-            </w:r>
-          </w:p>
-        </w:tc>
-        <w:tc>
-          <w:tcPr/>
-          <w:p>
-            <w:pPr>
-              <w:pStyle w:val="Compact"/>
-              <w:jc w:val="right"/>
-            </w:pPr>
-            <w:r>
-              <w:t xml:space="preserve">0</w:t>
-            </w:r>
-          </w:p>
-        </w:tc>
-        <w:tc>
-          <w:tcPr/>
-          <w:p>
-            <w:pPr>
-              <w:pStyle w:val="Compact"/>
-              <w:jc w:val="right"/>
-            </w:pPr>
-            <w:r>
-              <w:t xml:space="preserve">70</w:t>
-            </w:r>
-          </w:p>
-        </w:tc>
-        <w:tc>
-          <w:tcPr/>
-          <w:p>
-            <w:pPr>
-              <w:pStyle w:val="Compact"/>
-              <w:jc w:val="right"/>
-            </w:pPr>
-            <w:r>
-              <w:t xml:space="preserve">0</w:t>
-            </w:r>
-          </w:p>
-        </w:tc>
-        <w:tc>
-          <w:tcPr/>
-          <w:p>
-            <w:pPr>
-              <w:pStyle w:val="Compact"/>
-              <w:jc w:val="right"/>
-            </w:pPr>
-            <w:r>
-              <w:t xml:space="preserve">46</w:t>
-            </w:r>
-          </w:p>
-        </w:tc>
-        <w:tc>
-          <w:tcPr/>
-          <w:p>
-            <w:pPr>
-              <w:pStyle w:val="Compact"/>
-              <w:jc w:val="right"/>
-            </w:pPr>
-            <w:r>
-              <w:t xml:space="preserve">100.0</w:t>
-            </w:r>
-          </w:p>
-        </w:tc>
-      </w:tr>
-      <w:tr>
-        <w:tc>
-          <w:tcPr/>
-          <w:p>
-            <w:pPr>
-              <w:pStyle w:val="Compact"/>
-              <w:jc w:val="left"/>
-            </w:pPr>
-            <w:r>
-              <w:t xml:space="preserve">USGS_USVI_exp</w:t>
-            </w:r>
-          </w:p>
-        </w:tc>
-        <w:tc>
-          <w:tcPr/>
-          <w:p>
-            <w:pPr>
-              <w:pStyle w:val="Compact"/>
-              <w:jc w:val="right"/>
-            </w:pPr>
-            <w:r>
-              <w:t xml:space="preserve">27</w:t>
-            </w:r>
-          </w:p>
-        </w:tc>
-        <w:tc>
-          <w:tcPr/>
-          <w:p>
-            <w:pPr>
-              <w:pStyle w:val="Compact"/>
-              <w:jc w:val="right"/>
-            </w:pPr>
-            <w:r>
-              <w:t xml:space="preserve">0</w:t>
-            </w:r>
-          </w:p>
-        </w:tc>
-        <w:tc>
-          <w:tcPr/>
-          <w:p>
-            <w:pPr>
-              <w:pStyle w:val="Compact"/>
-              <w:jc w:val="right"/>
-            </w:pPr>
-            <w:r>
-              <w:t xml:space="preserve">15</w:t>
-            </w:r>
-          </w:p>
-        </w:tc>
-        <w:tc>
-          <w:tcPr/>
-          <w:p>
-            <w:pPr>
-              <w:pStyle w:val="Compact"/>
-              <w:jc w:val="right"/>
-            </w:pPr>
-            <w:r>
-              <w:t xml:space="preserve">12</w:t>
-            </w:r>
-          </w:p>
-        </w:tc>
-        <w:tc>
-          <w:tcPr/>
-          <w:p>
-            <w:pPr>
-              <w:pStyle w:val="Compact"/>
-              <w:jc w:val="right"/>
-            </w:pPr>
-            <w:r>
-              <w:t xml:space="preserve">0</w:t>
-            </w:r>
-          </w:p>
-        </w:tc>
-        <w:tc>
-          <w:tcPr/>
-          <w:p>
-            <w:pPr>
-              <w:pStyle w:val="Compact"/>
-              <w:jc w:val="right"/>
-            </w:pPr>
-            <w:r>
-              <w:t xml:space="preserve">27</w:t>
-            </w:r>
-          </w:p>
-        </w:tc>
-        <w:tc>
-          <w:tcPr/>
-          <w:p>
-            <w:pPr>
-              <w:pStyle w:val="Compact"/>
-              <w:jc w:val="right"/>
-            </w:pPr>
-            <w:r>
-              <w:t xml:space="preserve">0</w:t>
-            </w:r>
-          </w:p>
-        </w:tc>
-        <w:tc>
-          <w:tcPr/>
-          <w:p>
-            <w:pPr>
-              <w:pStyle w:val="Compact"/>
-              <w:jc w:val="right"/>
-            </w:pPr>
-            <w:r>
-              <w:t xml:space="preserve">12</w:t>
-            </w:r>
-          </w:p>
-        </w:tc>
-        <w:tc>
-          <w:tcPr/>
-          <w:p>
-            <w:pPr>
-              <w:pStyle w:val="Compact"/>
-              <w:jc w:val="right"/>
-            </w:pPr>
-            <w:r>
-              <w:t xml:space="preserve">100.0</w:t>
-            </w:r>
-          </w:p>
-        </w:tc>
-      </w:tr>
-      <w:tr>
-        <w:tc>
-          <w:tcPr/>
-          <w:p>
-            <w:pPr>
-              <w:pStyle w:val="Compact"/>
-              <w:jc w:val="left"/>
-            </w:pPr>
-            <w:r>
-              <w:t xml:space="preserve">kuffner_et_al_2020</w:t>
-            </w:r>
-          </w:p>
-        </w:tc>
-        <w:tc>
-          <w:tcPr/>
-          <w:p>
-            <w:pPr>
-              <w:pStyle w:val="Compact"/>
-              <w:jc w:val="right"/>
-            </w:pPr>
-            <w:r>
-              <w:t xml:space="preserve">27</w:t>
-            </w:r>
-          </w:p>
-        </w:tc>
-        <w:tc>
-          <w:tcPr/>
-          <w:p>
-            <w:pPr>
-              <w:pStyle w:val="Compact"/>
-              <w:jc w:val="right"/>
-            </w:pPr>
-            <w:r>
-              <w:t xml:space="preserve">0</w:t>
-            </w:r>
-          </w:p>
-        </w:tc>
-        <w:tc>
-          <w:tcPr/>
-          <w:p>
-            <w:pPr>
-              <w:pStyle w:val="Compact"/>
-              <w:jc w:val="right"/>
-            </w:pPr>
-            <w:r>
-              <w:t xml:space="preserve">0</w:t>
-            </w:r>
-          </w:p>
-        </w:tc>
-        <w:tc>
-          <w:tcPr/>
-          <w:p>
-            <w:pPr>
-              <w:pStyle w:val="Compact"/>
-              <w:jc w:val="right"/>
-            </w:pPr>
-            <w:r>
-              <w:t xml:space="preserve">27</w:t>
-            </w:r>
-          </w:p>
-        </w:tc>
-        <w:tc>
-          <w:tcPr/>
-          <w:p>
-            <w:pPr>
-              <w:pStyle w:val="Compact"/>
-              <w:jc w:val="right"/>
-            </w:pPr>
-            <w:r>
-              <w:t xml:space="preserve">0</w:t>
-            </w:r>
-          </w:p>
-        </w:tc>
-        <w:tc>
-          <w:tcPr/>
-          <w:p>
-            <w:pPr>
-              <w:pStyle w:val="Compact"/>
-              <w:jc w:val="right"/>
-            </w:pPr>
-            <w:r>
-              <w:t xml:space="preserve">27</w:t>
-            </w:r>
-          </w:p>
-        </w:tc>
-        <w:tc>
-          <w:tcPr/>
-          <w:p>
-            <w:pPr>
-              <w:pStyle w:val="Compact"/>
-              <w:jc w:val="right"/>
-            </w:pPr>
-            <w:r>
-              <w:t xml:space="preserve">0</w:t>
-            </w:r>
-          </w:p>
-        </w:tc>
-        <w:tc>
-          <w:tcPr/>
-          <w:p>
-            <w:pPr>
-              <w:pStyle w:val="Compact"/>
-              <w:jc w:val="right"/>
-            </w:pPr>
-            <w:r>
-              <w:t xml:space="preserve">0</w:t>
-            </w:r>
-          </w:p>
-        </w:tc>
-        <w:tc>
-          <w:tcPr/>
-          <w:p>
-            <w:pPr>
-              <w:pStyle w:val="Compact"/>
-              <w:jc w:val="right"/>
-            </w:pPr>
-            <w:r>
-              <w:t xml:space="preserve">100.0</w:t>
-            </w:r>
-          </w:p>
-        </w:tc>
-      </w:tr>
-      <w:tr>
-        <w:tc>
-          <w:tcPr/>
-          <w:p>
-            <w:pPr>
-              <w:pStyle w:val="Compact"/>
-              <w:jc w:val="left"/>
-            </w:pPr>
-            <w:r>
-              <w:t xml:space="preserve">mendoza_quiroz_et_al_2023</w:t>
-            </w:r>
-          </w:p>
-        </w:tc>
-        <w:tc>
-          <w:tcPr/>
-          <w:p>
-            <w:pPr>
-              <w:pStyle w:val="Compact"/>
-              <w:jc w:val="right"/>
-            </w:pPr>
-            <w:r>
-              <w:t xml:space="preserve">7</w:t>
-            </w:r>
-          </w:p>
-        </w:tc>
-        <w:tc>
-          <w:tcPr/>
-          <w:p>
-            <w:pPr>
-              <w:pStyle w:val="Compact"/>
-              <w:jc w:val="right"/>
-            </w:pPr>
-            <w:r>
-              <w:t xml:space="preserve">0</w:t>
-            </w:r>
-          </w:p>
-        </w:tc>
-        <w:tc>
-          <w:tcPr/>
-          <w:p>
-            <w:pPr>
-              <w:pStyle w:val="Compact"/>
-              <w:jc w:val="right"/>
-            </w:pPr>
-            <w:r>
-              <w:t xml:space="preserve">0</w:t>
-            </w:r>
-          </w:p>
-        </w:tc>
-        <w:tc>
-          <w:tcPr/>
-          <w:p>
-            <w:pPr>
-              <w:pStyle w:val="Compact"/>
-              <w:jc w:val="right"/>
-            </w:pPr>
-            <w:r>
-              <w:t xml:space="preserve">7</w:t>
-            </w:r>
-          </w:p>
-        </w:tc>
-        <w:tc>
-          <w:tcPr/>
-          <w:p>
-            <w:pPr>
-              <w:pStyle w:val="Compact"/>
-              <w:jc w:val="right"/>
-            </w:pPr>
-            <w:r>
-              <w:t xml:space="preserve">0</w:t>
-            </w:r>
-          </w:p>
-        </w:tc>
-        <w:tc>
-          <w:tcPr/>
-          <w:p>
-            <w:pPr>
-              <w:pStyle w:val="Compact"/>
-              <w:jc w:val="right"/>
-            </w:pPr>
-            <w:r>
-              <w:t xml:space="preserve">7</w:t>
-            </w:r>
-          </w:p>
-        </w:tc>
-        <w:tc>
-          <w:tcPr/>
-          <w:p>
-            <w:pPr>
-              <w:pStyle w:val="Compact"/>
-              <w:jc w:val="right"/>
-            </w:pPr>
-            <w:r>
-              <w:t xml:space="preserve">0</w:t>
-            </w:r>
-          </w:p>
-        </w:tc>
-        <w:tc>
-          <w:tcPr/>
-          <w:p>
-            <w:pPr>
-              <w:pStyle w:val="Compact"/>
-              <w:jc w:val="right"/>
-            </w:pPr>
-            <w:r>
-              <w:t xml:space="preserve">0</w:t>
-            </w:r>
-          </w:p>
-        </w:tc>
-        <w:tc>
-          <w:tcPr/>
-          <w:p>
-            <w:pPr>
-              <w:pStyle w:val="Compact"/>
-              <w:jc w:val="right"/>
-            </w:pPr>
-            <w:r>
-              <w:t xml:space="preserve">100.0</w:t>
-            </w:r>
-          </w:p>
-        </w:tc>
-      </w:tr>
-      <w:tr>
-        <w:tc>
-          <w:tcPr/>
-          <w:p>
-            <w:pPr>
-              <w:pStyle w:val="Compact"/>
-              <w:jc w:val="left"/>
-            </w:pPr>
-            <w:r>
-              <w:t xml:space="preserve">fundemar_fragments</w:t>
-            </w:r>
-          </w:p>
-        </w:tc>
-        <w:tc>
-          <w:tcPr/>
-          <w:p>
-            <w:pPr>
-              <w:pStyle w:val="Compact"/>
-              <w:jc w:val="right"/>
-            </w:pPr>
-            <w:r>
-              <w:t xml:space="preserve">1</w:t>
-            </w:r>
-          </w:p>
-        </w:tc>
-        <w:tc>
-          <w:tcPr/>
-          <w:p>
-            <w:pPr>
-              <w:pStyle w:val="Compact"/>
-              <w:jc w:val="right"/>
-            </w:pPr>
-            <w:r>
-              <w:t xml:space="preserve">0</w:t>
-            </w:r>
-          </w:p>
-        </w:tc>
-        <w:tc>
-          <w:tcPr/>
-          <w:p>
-            <w:pPr>
-              <w:pStyle w:val="Compact"/>
-              <w:jc w:val="right"/>
-            </w:pPr>
-            <w:r>
-              <w:t xml:space="preserve">0</w:t>
-            </w:r>
-          </w:p>
-        </w:tc>
-        <w:tc>
-          <w:tcPr/>
-          <w:p>
-            <w:pPr>
-              <w:pStyle w:val="Compact"/>
-              <w:jc w:val="right"/>
-            </w:pPr>
-            <w:r>
-              <w:t xml:space="preserve">1</w:t>
-            </w:r>
-          </w:p>
-        </w:tc>
-        <w:tc>
-          <w:tcPr/>
-          <w:p>
-            <w:pPr>
-              <w:pStyle w:val="Compact"/>
-              <w:jc w:val="right"/>
-            </w:pPr>
-            <w:r>
-              <w:t xml:space="preserve">0</w:t>
-            </w:r>
-          </w:p>
-        </w:tc>
-        <w:tc>
-          <w:tcPr/>
-          <w:p>
-            <w:pPr>
-              <w:pStyle w:val="Compact"/>
-              <w:jc w:val="right"/>
-            </w:pPr>
-            <w:r>
-              <w:t xml:space="preserve">1</w:t>
-            </w:r>
-          </w:p>
-        </w:tc>
-        <w:tc>
-          <w:tcPr/>
-          <w:p>
-            <w:pPr>
-              <w:pStyle w:val="Compact"/>
-              <w:jc w:val="right"/>
-            </w:pPr>
-            <w:r>
-              <w:t xml:space="preserve">0</w:t>
-            </w:r>
-          </w:p>
-        </w:tc>
-        <w:tc>
-          <w:tcPr/>
-          <w:p>
-            <w:pPr>
-              <w:pStyle w:val="Compact"/>
-              <w:jc w:val="right"/>
-            </w:pPr>
-            <w:r>
-              <w:t xml:space="preserve">1</w:t>
-            </w:r>
-          </w:p>
-        </w:tc>
-        <w:tc>
-          <w:tcPr/>
-          <w:p>
-            <w:pPr>
-              <w:pStyle w:val="Compact"/>
-              <w:jc w:val="right"/>
-            </w:pPr>
-            <w:r>
-              <w:t xml:space="preserve">100.0</w:t>
-            </w:r>
-          </w:p>
-        </w:tc>
-      </w:tr>
-    </w:tbl>
-    <w:p>
-      <w:pPr>
-        <w:pStyle w:val="BodyText"/>
-      </w:pPr>
-      <w:r>
-        <w:rPr>
-          <w:b/>
-          <w:bCs/>
-        </w:rPr>
-        <w:t xml:space="preserve">Rebuild check.</w:t>
-      </w:r>
-      <w:r>
-        <w:t xml:space="preserve"> </w:t>
-      </w:r>
-      <w:r>
-        <w:t xml:space="preserve">Exact field mismatches found: 0.</w:t>
-      </w:r>
-    </w:p>
-    <w:p>
-      <w:pPr>
-        <w:pStyle w:val="BodyText"/>
-      </w:pPr>
-      <w:r>
-        <w:rPr>
-          <w:b/>
-          <w:bCs/>
-        </w:rPr>
-        <w:t xml:space="preserve">Notes.</w:t>
-      </w:r>
-      <w:r>
-        <w:t xml:space="preserve"> </w:t>
-      </w:r>
-      <w:r>
-        <w:t xml:space="preserve">Overlap refers to curated acute events or chronic pressures within a</w:t>
-      </w:r>
-      <w:r>
-        <w:t xml:space="preserve"> </w:t>
-      </w:r>
-      <w:r>
-        <w:t xml:space="preserve">demographic interval. “Baseline exclusion” identifies intervals excluded in the</w:t>
-      </w:r>
-      <w:r>
-        <w:t xml:space="preserve"> </w:t>
-      </w:r>
-      <w:r>
-        <w:t xml:space="preserve">acute-event sensitivity analysis; it does not imply that all remaining</w:t>
-      </w:r>
-      <w:r>
-        <w:t xml:space="preserve"> </w:t>
-      </w:r>
-      <w:r>
-        <w:t xml:space="preserve">intervals were undisturbed.</w:t>
-      </w:r>
-    </w:p>
-    <w:bookmarkEnd w:id="37"/>
-    <w:bookmarkStart w:id="76" w:name="X58cc7afffcc1205d30b9bae8f108893f395cd59"/>
-    <w:p>
-      <w:pPr>
-        <w:pStyle w:val="Heading1"/>
-      </w:pPr>
-      <w:r>
-        <w:t xml:space="preserve">Table S3. Size-class synthesis for</w:t>
-      </w:r>
-      <w:r>
-        <w:t xml:space="preserve"> </w:t>
-      </w:r>
-      <w:r>
-        <w:rPr>
-          <w:i/>
-          <w:iCs/>
-        </w:rPr>
-        <w:t xml:space="preserve">Acropora palmata</w:t>
-      </w:r>
-    </w:p>
-    <w:p>
-      <w:pPr>
-        <w:pStyle w:val="FirstParagraph"/>
-      </w:pPr>
-      <w:r>
-        <w:t xml:space="preserve">This landscape supplementary table links size-structured estimates to their</w:t>
-      </w:r>
-      <w:r>
-        <w:t xml:space="preserve"> </w:t>
-      </w:r>
-      <w:r>
-        <w:t xml:space="preserve">biological and restoration interpretation. It is designed as a reading table,</w:t>
-      </w:r>
-      <w:r>
-        <w:t xml:space="preserve"> </w:t>
-      </w:r>
-      <w:r>
-        <w:t xml:space="preserve">not a substitute for the underlying estimates and uncertainty intervals.</w:t>
-      </w:r>
-    </w:p>
-    <w:tbl>
-      <w:tblPr>
-        <w:tblStyle w:val="Table"/>
-        <w:tblW w:type="pct" w:w="5000"/>
-        <w:tblLayout w:type="fixed"/>
-        <w:tblLook w:firstRow="1" w:lastRow="0" w:firstColumn="0" w:lastColumn="0" w:noHBand="0" w:noVBand="0" w:val="0020"/>
-      </w:tblPr>
-      <w:tblGrid>
-        <w:gridCol w:w="1584"/>
-        <w:gridCol w:w="1584"/>
-        <w:gridCol w:w="1584"/>
-        <w:gridCol w:w="1584"/>
-        <w:gridCol w:w="1584"/>
-      </w:tblGrid>
-      <w:tr>
-        <w:trPr>
-          <w:tblHeader w:val="on"/>
-        </w:trPr>
-        <w:tc>
-          <w:tcPr/>
-          <w:p>
-            <w:pPr>
-              <w:pStyle w:val="Compact"/>
-              <w:jc w:val="left"/>
-            </w:pPr>
-            <w:r>
-              <w:t xml:space="preserve">Size class (live area)</w:t>
-            </w:r>
-          </w:p>
-        </w:tc>
-        <w:tc>
-          <w:tcPr/>
-          <w:p>
-            <w:pPr>
-              <w:pStyle w:val="Compact"/>
-              <w:jc w:val="left"/>
-            </w:pPr>
-            <w:r>
-              <w:t xml:space="preserve">Principal risk</w:t>
-            </w:r>
-          </w:p>
-        </w:tc>
-        <w:tc>
-          <w:tcPr/>
-          <w:p>
-            <w:pPr>
-              <w:pStyle w:val="Compact"/>
-              <w:jc w:val="left"/>
-            </w:pPr>
-            <w:r>
-              <w:t xml:space="preserve">Observed demographic pattern</w:t>
-            </w:r>
-          </w:p>
-        </w:tc>
-        <w:tc>
-          <w:tcPr/>
-          <w:p>
-            <w:pPr>
-              <w:pStyle w:val="Compact"/>
-              <w:jc w:val="left"/>
-            </w:pPr>
-            <w:r>
-              <w:t xml:space="preserve">Transition leverage</w:t>
-            </w:r>
-          </w:p>
-        </w:tc>
-        <w:tc>
-          <w:tcPr/>
-          <w:p>
-            <w:pPr>
-              <w:pStyle w:val="Compact"/>
-              <w:jc w:val="left"/>
-            </w:pPr>
-            <w:r>
-              <w:t xml:space="preserve">Restoration implication</w:t>
-            </w:r>
-          </w:p>
-        </w:tc>
-      </w:tr>
-      <w:tr>
-        <w:tc>
-          <w:tcPr/>
-          <w:p>
-            <w:pPr>
-              <w:pStyle w:val="Compact"/>
-              <w:jc w:val="left"/>
-            </w:pPr>
-            <w:r>
-              <w:t xml:space="preserve">SC1 (0–10 cm²)</w:t>
-            </w:r>
-          </w:p>
-        </w:tc>
-        <w:tc>
-          <w:tcPr/>
-          <w:p>
-            <w:pPr>
-              <w:pStyle w:val="Compact"/>
-              <w:jc w:val="left"/>
-            </w:pPr>
-            <w:r>
-              <w:t xml:space="preserve">Early mortality; disturbance exposure; sparse coverage outside Florida</w:t>
-            </w:r>
-          </w:p>
-        </w:tc>
-        <w:tc>
-          <w:tcPr/>
-          <w:p>
-            <w:pPr>
-              <w:pStyle w:val="Compact"/>
-              <w:jc w:val="left"/>
-            </w:pPr>
-            <w:r>
-              <w:t xml:space="preserve">Entry point to the matrix; shrinkage also occurs</w:t>
-            </w:r>
-          </w:p>
-        </w:tc>
-        <w:tc>
-          <w:tcPr/>
-          <w:p>
-            <w:pPr>
-              <w:pStyle w:val="Compact"/>
-              <w:jc w:val="left"/>
-            </w:pPr>
-            <w:r>
-              <w:t xml:space="preserve">Aggregated survival elasticity: 0.004</w:t>
-            </w:r>
-          </w:p>
-        </w:tc>
-        <w:tc>
-          <w:tcPr/>
-          <w:p>
-            <w:pPr>
-              <w:pStyle w:val="Compact"/>
-              <w:jc w:val="left"/>
-            </w:pPr>
-            <w:r>
-              <w:t xml:space="preserve">Use as nursery or recruitment substrate, not a transition-model endpoint</w:t>
-            </w:r>
-          </w:p>
-        </w:tc>
-      </w:tr>
-      <w:tr>
-        <w:tc>
-          <w:tcPr/>
-          <w:p>
-            <w:pPr>
-              <w:pStyle w:val="Compact"/>
-              <w:jc w:val="left"/>
-            </w:pPr>
-            <w:r>
-              <w:t xml:space="preserve">SC2 (10–100 cm²)</w:t>
-            </w:r>
-          </w:p>
-        </w:tc>
-        <w:tc>
-          <w:tcPr/>
-          <w:p>
-            <w:pPr>
-              <w:pStyle w:val="Compact"/>
-              <w:jc w:val="left"/>
-            </w:pPr>
-            <w:r>
-              <w:t xml:space="preserve">Post-transplant stress, fragmentation, disease, and backward transitions</w:t>
-            </w:r>
-          </w:p>
-        </w:tc>
-        <w:tc>
-          <w:tcPr/>
-          <w:p>
-            <w:pPr>
-              <w:pStyle w:val="Compact"/>
-              <w:jc w:val="left"/>
-            </w:pPr>
-            <w:r>
-              <w:t xml:space="preserve">Substantial churn; 23.8% shrinkage and 15.2% retrogression</w:t>
-            </w:r>
-          </w:p>
-        </w:tc>
-        <w:tc>
-          <w:tcPr/>
-          <w:p>
-            <w:pPr>
-              <w:pStyle w:val="Compact"/>
-              <w:jc w:val="left"/>
-            </w:pPr>
-            <w:r>
-              <w:t xml:space="preserve">Aggregated survival elasticity: 0.024; losses can prevent entry to larger classes</w:t>
-            </w:r>
-          </w:p>
-        </w:tc>
-        <w:tc>
-          <w:tcPr/>
-          <w:p>
-            <w:pPr>
-              <w:pStyle w:val="Compact"/>
-              <w:jc w:val="left"/>
-            </w:pPr>
-            <w:r>
-              <w:t xml:space="preserve">Prioritize acclimation, early stabilization, and rapid growth through this stage</w:t>
-            </w:r>
-          </w:p>
-        </w:tc>
-      </w:tr>
-      <w:tr>
-        <w:tc>
-          <w:tcPr/>
-          <w:p>
-            <w:pPr>
-              <w:pStyle w:val="Compact"/>
-              <w:jc w:val="left"/>
-            </w:pPr>
-            <w:r>
-              <w:t xml:space="preserve">SC3 (100–900 cm²)</w:t>
-            </w:r>
-          </w:p>
-        </w:tc>
-        <w:tc>
-          <w:tcPr/>
-          <w:p>
-            <w:pPr>
-              <w:pStyle w:val="Compact"/>
-              <w:jc w:val="left"/>
-            </w:pPr>
-            <w:r>
-              <w:t xml:space="preserve">Partial mortality, storm damage, and disturbance-driven retrogression</w:t>
-            </w:r>
-          </w:p>
-        </w:tc>
-        <w:tc>
-          <w:tcPr/>
-          <w:p>
-            <w:pPr>
-              <w:pStyle w:val="Compact"/>
-              <w:jc w:val="left"/>
-            </w:pPr>
-            <w:r>
-              <w:t xml:space="preserve">Mid-size instability; 40.5% shrinkage and 16.8% retrogression</w:t>
-            </w:r>
-          </w:p>
-        </w:tc>
-        <w:tc>
-          <w:tcPr/>
-          <w:p>
-            <w:pPr>
-              <w:pStyle w:val="Compact"/>
-              <w:jc w:val="left"/>
-            </w:pPr>
-            <w:r>
-              <w:t xml:space="preserve">Aggregated survival elasticity: 0.106; contributes to the flow into adult stages</w:t>
-            </w:r>
-          </w:p>
-        </w:tc>
-        <w:tc>
-          <w:tcPr/>
-          <w:p>
-            <w:pPr>
-              <w:pStyle w:val="Compact"/>
-              <w:jc w:val="left"/>
-            </w:pPr>
-            <w:r>
-              <w:t xml:space="preserve">Protect recovery windows from disturbance-linked backward transitions</w:t>
-            </w:r>
-          </w:p>
-        </w:tc>
-      </w:tr>
-      <w:tr>
-        <w:tc>
-          <w:tcPr/>
-          <w:p>
-            <w:pPr>
-              <w:pStyle w:val="Compact"/>
-              <w:jc w:val="left"/>
-            </w:pPr>
-            <w:r>
-              <w:t xml:space="preserve">SC4 (900–4,000 cm²)</w:t>
-            </w:r>
-          </w:p>
-        </w:tc>
-        <w:tc>
-          <w:tcPr/>
-          <w:p>
-            <w:pPr>
-              <w:pStyle w:val="Compact"/>
-              <w:jc w:val="left"/>
-            </w:pPr>
-            <w:r>
-              <w:t xml:space="preserve">Shrinkage, breakage, and loss before reproductive size</w:t>
-            </w:r>
-          </w:p>
-        </w:tc>
-        <w:tc>
-          <w:tcPr/>
-          <w:p>
-            <w:pPr>
-              <w:pStyle w:val="Compact"/>
-              <w:jc w:val="left"/>
-            </w:pPr>
-            <w:r>
-              <w:t xml:space="preserve">Bridge to adulthood; 44.5% shrinkage and 17.2% retrogression</w:t>
-            </w:r>
-          </w:p>
-        </w:tc>
-        <w:tc>
-          <w:tcPr/>
-          <w:p>
-            <w:pPr>
-              <w:pStyle w:val="Compact"/>
-              <w:jc w:val="left"/>
-            </w:pPr>
-            <w:r>
-              <w:t xml:space="preserve">Aggregated survival elasticity: 0.208</w:t>
-            </w:r>
-          </w:p>
-        </w:tc>
-        <w:tc>
-          <w:tcPr/>
-          <w:p>
-            <w:pPr>
-              <w:pStyle w:val="Compact"/>
-              <w:jc w:val="left"/>
-            </w:pPr>
-            <w:r>
-              <w:t xml:space="preserve">A strong target when colonies can be protected through the transition to SC5</w:t>
-            </w:r>
-          </w:p>
-        </w:tc>
-      </w:tr>
-      <w:tr>
-        <w:tc>
-          <w:tcPr/>
-          <w:p>
-            <w:pPr>
-              <w:pStyle w:val="Compact"/>
-              <w:jc w:val="left"/>
-            </w:pPr>
-            <w:r>
-              <w:t xml:space="preserve">SC5 (&gt;4,000 cm²)</w:t>
-            </w:r>
-          </w:p>
-        </w:tc>
-        <w:tc>
-          <w:tcPr/>
-          <w:p>
-            <w:pPr>
-              <w:pStyle w:val="Compact"/>
-              <w:jc w:val="left"/>
-            </w:pPr>
-            <w:r>
-              <w:t xml:space="preserve">Loss or shrinkage of reproductive adults; fragmentation</w:t>
-            </w:r>
-          </w:p>
-        </w:tc>
-        <w:tc>
-          <w:tcPr/>
-          <w:p>
-            <w:pPr>
-              <w:pStyle w:val="Compact"/>
-              <w:jc w:val="left"/>
-            </w:pPr>
-            <w:r>
-              <w:t xml:space="preserve">Highest leverage; 47.5% shrinkage, 9.1% retrogression, and negative mean net growth in the matrix-compatible subset</w:t>
-            </w:r>
-          </w:p>
-        </w:tc>
-        <w:tc>
-          <w:tcPr/>
-          <w:p>
-            <w:pPr>
-              <w:pStyle w:val="Compact"/>
-              <w:jc w:val="left"/>
-            </w:pPr>
-            <w:r>
-              <w:t xml:space="preserve">Aggregated survival elasticity: 0.602; SC5→SC5 stasis matrix-cell elasticity: 0.589; fragmentation elasticity: 0.051</w:t>
-            </w:r>
-          </w:p>
-        </w:tc>
-        <w:tc>
-          <w:tcPr/>
-          <w:p>
-            <w:pPr>
-              <w:pStyle w:val="Compact"/>
-              <w:jc w:val="left"/>
-            </w:pPr>
-            <w:r>
-              <w:t xml:space="preserve">Highest conservation priority: retain mature colonies and minimize physical disturbance</w:t>
-            </w:r>
-          </w:p>
-        </w:tc>
-      </w:tr>
-    </w:tbl>
-    <w:bookmarkStart w:id="38" w:name="figure-legends"/>
+    <w:bookmarkStart w:id="37" w:name="figure-legends"/>
     <w:p>
       <w:pPr>
         <w:pStyle w:val="Heading2"/>
@@ -4736,8 +1876,8 @@
         <w:t xml:space="preserve">+ 1; colour encodes probability. (b) Elasticity decomposition by source size class. Stacked bars show stasis, growth, and retrogression; orange points show fragmentation elasticity, which is displayed separately because it is a component of retrogression rather than an additional transition class. (c) Distribution of lambda from 2,000 hierarchical-bootstrap replicates. Orange bars denote replicates with lambda &lt; 1 and blue bars replicates with lambda at least 1; the distribution characterizes uncertainty in the compiled transition rates, not the probability of real-world decline. The dashed line is the deterministic estimate and the solid line marks replacement. (d) Leave-one-study-out lambda estimates. The dashed and dotted lines mark the full-data estimate and replacement, respectively; orange identifies exclusion of the NOAA survey.</w:t>
       </w:r>
     </w:p>
-    <w:bookmarkEnd w:id="38"/>
-    <w:bookmarkStart w:id="51" w:name="figures"/>
+    <w:bookmarkEnd w:id="37"/>
+    <w:bookmarkStart w:id="50" w:name="figures"/>
     <w:p>
       <w:pPr>
         <w:pStyle w:val="Heading2"/>
@@ -4755,18 +1895,18 @@
           <wp:inline>
             <wp:extent cx="5334000" cy="5363849"/>
             <wp:effectExtent b="0" l="0" r="0" t="0"/>
-            <wp:docPr descr="" title="" id="40" name="Picture"/>
+            <wp:docPr descr="" title="" id="39" name="Picture"/>
             <a:graphic>
               <a:graphicData uri="http://schemas.openxmlformats.org/drawingml/2006/picture">
                 <pic:pic>
                   <pic:nvPicPr>
-                    <pic:cNvPr descr="06_analysis/figures/manuscript/Fig1_study_landscape.png" id="41" name="Picture"/>
+                    <pic:cNvPr descr="06_analysis/figures/manuscript/Fig1_study_landscape.png" id="40" name="Picture"/>
                     <pic:cNvPicPr>
                       <a:picLocks noChangeArrowheads="1" noChangeAspect="1"/>
                     </pic:cNvPicPr>
                   </pic:nvPicPr>
                   <pic:blipFill>
-                    <a:blip r:embed="rId39"/>
+                    <a:blip r:embed="rId38"/>
                     <a:stretch>
                       <a:fillRect/>
                     </a:stretch>
@@ -4844,18 +1984,18 @@
           <wp:inline>
             <wp:extent cx="5334000" cy="6743421"/>
             <wp:effectExtent b="0" l="0" r="0" t="0"/>
-            <wp:docPr descr="" title="" id="43" name="Picture"/>
+            <wp:docPr descr="" title="" id="42" name="Picture"/>
             <a:graphic>
               <a:graphicData uri="http://schemas.openxmlformats.org/drawingml/2006/picture">
                 <pic:pic>
                   <pic:nvPicPr>
-                    <pic:cNvPr descr="06_analysis/figures/manuscript/Fig2_demographic_rates.png" id="44" name="Picture"/>
+                    <pic:cNvPr descr="06_analysis/figures/manuscript/Fig2_demographic_rates.png" id="43" name="Picture"/>
                     <pic:cNvPicPr>
                       <a:picLocks noChangeArrowheads="1" noChangeAspect="1"/>
                     </pic:cNvPicPr>
                   </pic:nvPicPr>
                   <pic:blipFill>
-                    <a:blip r:embed="rId42"/>
+                    <a:blip r:embed="rId41"/>
                     <a:stretch>
                       <a:fillRect/>
                     </a:stretch>
@@ -4926,18 +2066,18 @@
           <wp:inline>
             <wp:extent cx="5334000" cy="7051002"/>
             <wp:effectExtent b="0" l="0" r="0" t="0"/>
-            <wp:docPr descr="" title="" id="46" name="Picture"/>
+            <wp:docPr descr="" title="" id="45" name="Picture"/>
             <a:graphic>
               <a:graphicData uri="http://schemas.openxmlformats.org/drawingml/2006/picture">
                 <pic:pic>
                   <pic:nvPicPr>
-                    <pic:cNvPr descr="06_analysis/figures/manuscript/Fig3_caribbean_synthesis.png" id="47" name="Picture"/>
+                    <pic:cNvPr descr="06_analysis/figures/manuscript/Fig3_caribbean_synthesis.png" id="46" name="Picture"/>
                     <pic:cNvPicPr>
                       <a:picLocks noChangeArrowheads="1" noChangeAspect="1"/>
                     </pic:cNvPicPr>
                   </pic:nvPicPr>
                   <pic:blipFill>
-                    <a:blip r:embed="rId45"/>
+                    <a:blip r:embed="rId44"/>
                     <a:stretch>
                       <a:fillRect/>
                     </a:stretch>
@@ -5008,18 +2148,18 @@
           <wp:inline>
             <wp:extent cx="5334000" cy="5516991"/>
             <wp:effectExtent b="0" l="0" r="0" t="0"/>
-            <wp:docPr descr="" title="" id="49" name="Picture"/>
+            <wp:docPr descr="" title="" id="48" name="Picture"/>
             <a:graphic>
               <a:graphicData uri="http://schemas.openxmlformats.org/drawingml/2006/picture">
                 <pic:pic>
                   <pic:nvPicPr>
-                    <pic:cNvPr descr="06_analysis/figures/manuscript/Fig4_population_model.png" id="50" name="Picture"/>
+                    <pic:cNvPr descr="06_analysis/figures/manuscript/Fig4_population_model.png" id="49" name="Picture"/>
                     <pic:cNvPicPr>
                       <a:picLocks noChangeArrowheads="1" noChangeAspect="1"/>
                     </pic:cNvPicPr>
                   </pic:nvPicPr>
                   <pic:blipFill>
-                    <a:blip r:embed="rId48"/>
+                    <a:blip r:embed="rId47"/>
                     <a:stretch>
                       <a:fillRect/>
                     </a:stretch>
@@ -5081,8 +2221,8 @@
         <w:t xml:space="preserve">.</w:t>
       </w:r>
     </w:p>
-    <w:bookmarkEnd w:id="51"/>
-    <w:bookmarkStart w:id="75" w:name="refs"/>
+    <w:bookmarkEnd w:id="50"/>
+    <w:bookmarkStart w:id="74" w:name="refs"/>
     <w:p>
       <w:pPr>
         <w:pStyle w:val="Heading2"/>
@@ -5091,8 +2231,8 @@
         <w:t xml:space="preserve">References</w:t>
       </w:r>
     </w:p>
-    <w:bookmarkStart w:id="74" w:name="refs"/>
-    <w:bookmarkStart w:id="53" w:name="ref-banister2024"/>
+    <w:bookmarkStart w:id="73" w:name="refs"/>
+    <w:bookmarkStart w:id="52" w:name="ref-banister2024"/>
     <w:p>
       <w:pPr>
         <w:pStyle w:val="Bibliography"/>
@@ -5131,7 +2271,7 @@
       <w:r>
         <w:t xml:space="preserve"> </w:t>
       </w:r>
-      <w:hyperlink r:id="rId52">
+      <w:hyperlink r:id="rId51">
         <w:r>
           <w:rPr>
             <w:rStyle w:val="Hyperlink"/>
@@ -5143,8 +2283,8 @@
         <w:t xml:space="preserve">.</w:t>
       </w:r>
     </w:p>
-    <w:bookmarkEnd w:id="53"/>
-    <w:bookmarkStart w:id="55" w:name="ref-forrester2012"/>
+    <w:bookmarkEnd w:id="52"/>
+    <w:bookmarkStart w:id="54" w:name="ref-forrester2012"/>
     <w:p>
       <w:pPr>
         <w:pStyle w:val="Bibliography"/>
@@ -5186,7 +2326,7 @@
       <w:r>
         <w:t xml:space="preserve"> </w:t>
       </w:r>
-      <w:hyperlink r:id="rId54">
+      <w:hyperlink r:id="rId53">
         <w:r>
           <w:rPr>
             <w:rStyle w:val="Hyperlink"/>
@@ -5198,8 +2338,8 @@
         <w:t xml:space="preserve">.</w:t>
       </w:r>
     </w:p>
-    <w:bookmarkEnd w:id="55"/>
-    <w:bookmarkStart w:id="57" w:name="ref-gardner2003"/>
+    <w:bookmarkEnd w:id="54"/>
+    <w:bookmarkStart w:id="56" w:name="ref-gardner2003"/>
     <w:p>
       <w:pPr>
         <w:pStyle w:val="Bibliography"/>
@@ -5244,7 +2384,7 @@
       <w:r>
         <w:t xml:space="preserve"> </w:t>
       </w:r>
-      <w:hyperlink r:id="rId56">
+      <w:hyperlink r:id="rId55">
         <w:r>
           <w:rPr>
             <w:rStyle w:val="Hyperlink"/>
@@ -5256,8 +2396,8 @@
         <w:t xml:space="preserve">.</w:t>
       </w:r>
     </w:p>
-    <w:bookmarkEnd w:id="57"/>
-    <w:bookmarkStart w:id="59" w:name="ref-knapp2003"/>
+    <w:bookmarkEnd w:id="56"/>
+    <w:bookmarkStart w:id="58" w:name="ref-knapp2003"/>
     <w:p>
       <w:pPr>
         <w:pStyle w:val="Bibliography"/>
@@ -5287,7 +2427,7 @@
       <w:r>
         <w:t xml:space="preserve"> </w:t>
       </w:r>
-      <w:hyperlink r:id="rId58">
+      <w:hyperlink r:id="rId57">
         <w:r>
           <w:rPr>
             <w:rStyle w:val="Hyperlink"/>
@@ -5299,54 +2439,54 @@
         <w:t xml:space="preserve">.</w:t>
       </w:r>
     </w:p>
+    <w:bookmarkEnd w:id="58"/>
+    <w:bookmarkStart w:id="59" w:name="ref-lirman1997"/>
+    <w:p>
+      <w:pPr>
+        <w:pStyle w:val="Bibliography"/>
+      </w:pPr>
+      <w:r>
+        <w:t xml:space="preserve">Lirman, Diego, and Peggy Fong. 1997.</w:t>
+      </w:r>
+      <w:r>
+        <w:t xml:space="preserve"> </w:t>
+      </w:r>
+      <w:r>
+        <w:t xml:space="preserve">“Patterns of Damage to the Branching Coral</w:t>
+      </w:r>
+      <w:r>
+        <w:t xml:space="preserve"> </w:t>
+      </w:r>
+      <w:r>
+        <w:t xml:space="preserve">Acropora palmata</w:t>
+      </w:r>
+      <w:r>
+        <w:t xml:space="preserve"> </w:t>
+      </w:r>
+      <w:r>
+        <w:t xml:space="preserve">Following Hurricane Andrew.”</w:t>
+      </w:r>
+      <w:r>
+        <w:t xml:space="preserve"> </w:t>
+      </w:r>
+      <w:r>
+        <w:rPr>
+          <w:i/>
+          <w:iCs/>
+        </w:rPr>
+        <w:t xml:space="preserve">Journal of Coastal Research</w:t>
+      </w:r>
+      <w:r>
+        <w:t xml:space="preserve">.</w:t>
+      </w:r>
+    </w:p>
     <w:bookmarkEnd w:id="59"/>
-    <w:bookmarkStart w:id="60" w:name="ref-lirman1997"/>
+    <w:bookmarkStart w:id="61" w:name="ref-madin2020"/>
     <w:p>
       <w:pPr>
         <w:pStyle w:val="Bibliography"/>
       </w:pPr>
       <w:r>
-        <w:t xml:space="preserve">Lirman, Diego, and Peggy Fong. 1997.</w:t>
-      </w:r>
-      <w:r>
-        <w:t xml:space="preserve"> </w:t>
-      </w:r>
-      <w:r>
-        <w:t xml:space="preserve">“Patterns of Damage to the Branching Coral</w:t>
-      </w:r>
-      <w:r>
-        <w:t xml:space="preserve"> </w:t>
-      </w:r>
-      <w:r>
-        <w:t xml:space="preserve">Acropora palmata</w:t>
-      </w:r>
-      <w:r>
-        <w:t xml:space="preserve"> </w:t>
-      </w:r>
-      <w:r>
-        <w:t xml:space="preserve">Following Hurricane Andrew.”</w:t>
-      </w:r>
-      <w:r>
-        <w:t xml:space="preserve"> </w:t>
-      </w:r>
-      <w:r>
-        <w:rPr>
-          <w:i/>
-          <w:iCs/>
-        </w:rPr>
-        <w:t xml:space="preserve">Journal of Coastal Research</w:t>
-      </w:r>
-      <w:r>
-        <w:t xml:space="preserve">.</w:t>
-      </w:r>
-    </w:p>
-    <w:bookmarkEnd w:id="60"/>
-    <w:bookmarkStart w:id="62" w:name="ref-madin2020"/>
-    <w:p>
-      <w:pPr>
-        <w:pStyle w:val="Bibliography"/>
-      </w:pPr>
-      <w:r>
         <w:t xml:space="preserve">Madin, Joshua S., Andrew H. Baird, Marissa L. Baskett, Sean R. Connolly, and Maria A. Dornelas. 2020.</w:t>
       </w:r>
       <w:r>
@@ -5371,7 +2511,7 @@
       <w:r>
         <w:t xml:space="preserve"> </w:t>
       </w:r>
-      <w:hyperlink r:id="rId61">
+      <w:hyperlink r:id="rId60">
         <w:r>
           <w:rPr>
             <w:rStyle w:val="Hyperlink"/>
@@ -5383,8 +2523,8 @@
         <w:t xml:space="preserve">.</w:t>
       </w:r>
     </w:p>
-    <w:bookmarkEnd w:id="62"/>
-    <w:bookmarkStart w:id="64" w:name="ref-manzello2025"/>
+    <w:bookmarkEnd w:id="61"/>
+    <w:bookmarkStart w:id="63" w:name="ref-manzello2025"/>
     <w:p>
       <w:pPr>
         <w:pStyle w:val="Bibliography"/>
@@ -5456,7 +2596,7 @@
       <w:r>
         <w:t xml:space="preserve"> </w:t>
       </w:r>
-      <w:hyperlink r:id="rId63">
+      <w:hyperlink r:id="rId62">
         <w:r>
           <w:rPr>
             <w:rStyle w:val="Hyperlink"/>
@@ -5468,8 +2608,8 @@
         <w:t xml:space="preserve">.</w:t>
       </w:r>
     </w:p>
-    <w:bookmarkEnd w:id="64"/>
-    <w:bookmarkStart w:id="66" w:name="ref-ramosromero2025"/>
+    <w:bookmarkEnd w:id="63"/>
+    <w:bookmarkStart w:id="65" w:name="ref-ramosromero2025"/>
     <w:p>
       <w:pPr>
         <w:pStyle w:val="Bibliography"/>
@@ -5511,7 +2651,7 @@
       <w:r>
         <w:t xml:space="preserve"> </w:t>
       </w:r>
-      <w:hyperlink r:id="rId65">
+      <w:hyperlink r:id="rId64">
         <w:r>
           <w:rPr>
             <w:rStyle w:val="Hyperlink"/>
@@ -5523,57 +2663,57 @@
         <w:t xml:space="preserve">.</w:t>
       </w:r>
     </w:p>
+    <w:bookmarkEnd w:id="65"/>
+    <w:bookmarkStart w:id="66" w:name="ref-vardi2011"/>
+    <w:p>
+      <w:pPr>
+        <w:pStyle w:val="Bibliography"/>
+      </w:pPr>
+      <w:r>
+        <w:t xml:space="preserve">Vardi, Tali. 2011.</w:t>
+      </w:r>
+      <w:r>
+        <w:t xml:space="preserve"> </w:t>
+      </w:r>
+      <w:r>
+        <w:rPr>
+          <w:i/>
+          <w:iCs/>
+        </w:rPr>
+        <w:t xml:space="preserve">The Threatened Atlantic Elkhorn Coral,</w:t>
+      </w:r>
+      <w:r>
+        <w:rPr>
+          <w:i/>
+          <w:iCs/>
+        </w:rPr>
+        <w:t xml:space="preserve"> </w:t>
+      </w:r>
+      <w:r>
+        <w:rPr>
+          <w:i/>
+          <w:iCs/>
+        </w:rPr>
+        <w:t xml:space="preserve">Acropora palmata</w:t>
+      </w:r>
+      <w:r>
+        <w:rPr>
+          <w:i/>
+          <w:iCs/>
+        </w:rPr>
+        <w:t xml:space="preserve">: Population Dynamics and Their Policy Implications</w:t>
+      </w:r>
+      <w:r>
+        <w:t xml:space="preserve">.</w:t>
+      </w:r>
+    </w:p>
     <w:bookmarkEnd w:id="66"/>
-    <w:bookmarkStart w:id="67" w:name="ref-vardi2011"/>
+    <w:bookmarkStart w:id="68" w:name="ref-viechtbauer2010"/>
     <w:p>
       <w:pPr>
         <w:pStyle w:val="Bibliography"/>
       </w:pPr>
       <w:r>
-        <w:t xml:space="preserve">Vardi, Tali. 2011.</w:t>
-      </w:r>
-      <w:r>
-        <w:t xml:space="preserve"> </w:t>
-      </w:r>
-      <w:r>
-        <w:rPr>
-          <w:i/>
-          <w:iCs/>
-        </w:rPr>
-        <w:t xml:space="preserve">The Threatened Atlantic Elkhorn Coral,</w:t>
-      </w:r>
-      <w:r>
-        <w:rPr>
-          <w:i/>
-          <w:iCs/>
-        </w:rPr>
-        <w:t xml:space="preserve"> </w:t>
-      </w:r>
-      <w:r>
-        <w:rPr>
-          <w:i/>
-          <w:iCs/>
-        </w:rPr>
-        <w:t xml:space="preserve">Acropora palmata</w:t>
-      </w:r>
-      <w:r>
-        <w:rPr>
-          <w:i/>
-          <w:iCs/>
-        </w:rPr>
-        <w:t xml:space="preserve">: Population Dynamics and Their Policy Implications</w:t>
-      </w:r>
-      <w:r>
-        <w:t xml:space="preserve">.</w:t>
-      </w:r>
-    </w:p>
-    <w:bookmarkEnd w:id="67"/>
-    <w:bookmarkStart w:id="69" w:name="ref-viechtbauer2010"/>
-    <w:p>
-      <w:pPr>
-        <w:pStyle w:val="Bibliography"/>
-      </w:pPr>
-      <w:r>
         <w:t xml:space="preserve">Viechtbauer, Wolfgang. 2010.</w:t>
       </w:r>
       <w:r>
@@ -5610,7 +2750,7 @@
       <w:r>
         <w:t xml:space="preserve"> </w:t>
       </w:r>
-      <w:hyperlink r:id="rId68">
+      <w:hyperlink r:id="rId67">
         <w:r>
           <w:rPr>
             <w:rStyle w:val="Hyperlink"/>
@@ -5622,8 +2762,8 @@
         <w:t xml:space="preserve">.</w:t>
       </w:r>
     </w:p>
-    <w:bookmarkEnd w:id="69"/>
-    <w:bookmarkStart w:id="71" w:name="ref-williams2023"/>
+    <w:bookmarkEnd w:id="68"/>
+    <w:bookmarkStart w:id="70" w:name="ref-williams2023"/>
     <w:p>
       <w:pPr>
         <w:pStyle w:val="Bibliography"/>
@@ -5659,7 +2799,7 @@
       <w:r>
         <w:t xml:space="preserve"> </w:t>
       </w:r>
-      <w:hyperlink r:id="rId70">
+      <w:hyperlink r:id="rId69">
         <w:r>
           <w:rPr>
             <w:rStyle w:val="Hyperlink"/>
@@ -5671,8 +2811,8 @@
         <w:t xml:space="preserve">.</w:t>
       </w:r>
     </w:p>
-    <w:bookmarkEnd w:id="71"/>
-    <w:bookmarkStart w:id="73" w:name="ref-williams2008"/>
+    <w:bookmarkEnd w:id="70"/>
+    <w:bookmarkStart w:id="72" w:name="ref-williams2008"/>
     <w:p>
       <w:pPr>
         <w:pStyle w:val="Bibliography"/>
@@ -5711,7 +2851,7 @@
       <w:r>
         <w:t xml:space="preserve"> </w:t>
       </w:r>
-      <w:hyperlink r:id="rId72">
+      <w:hyperlink r:id="rId71">
         <w:r>
           <w:rPr>
             <w:rStyle w:val="Hyperlink"/>
@@ -5723,10 +2863,9 @@
         <w:t xml:space="preserve">.</w:t>
       </w:r>
     </w:p>
+    <w:bookmarkEnd w:id="72"/>
     <w:bookmarkEnd w:id="73"/>
     <w:bookmarkEnd w:id="74"/>
-    <w:bookmarkEnd w:id="75"/>
-    <w:bookmarkEnd w:id="76"/>
     <w:sectPr>
       <w:footnotePr>
         <w:numRestart w:val="eachSect"/>
@@ -5837,114 +2976,8 @@
       </w:pPr>
     </w:lvl>
   </w:abstractNum>
-  <w:abstractNum w:abstractNumId="991">
-    <w:nsid w:val="0000A991"/>
-    <w:multiLevelType w:val="multilevel"/>
-    <w:lvl w:ilvl="0">
-      <w:numFmt w:val="bullet"/>
-      <w:lvlText w:val=""/>
-      <w:lvlJc w:val="left"/>
-      <w:pPr>
-        <w:ind w:left="720" w:hanging="360"/>
-      </w:pPr>
-      <w:rPr>
-        <w:rFonts w:ascii="Symbol" w:hAnsi="Symbol" w:cs="Symbol" w:hint="default"/>
-      </w:rPr>
-    </w:lvl>
-    <w:lvl w:ilvl="1">
-      <w:numFmt w:val="bullet"/>
-      <w:lvlText w:val="o"/>
-      <w:lvlJc w:val="left"/>
-      <w:pPr>
-        <w:ind w:left="1440" w:hanging="360"/>
-      </w:pPr>
-      <w:rPr>
-        <w:rFonts w:ascii="Courier New" w:hAnsi="Courier New" w:cs="Courier New" w:hint="default"/>
-      </w:rPr>
-    </w:lvl>
-    <w:lvl w:ilvl="2">
-      <w:numFmt w:val="bullet"/>
-      <w:lvlText w:val=""/>
-      <w:lvlJc w:val="left"/>
-      <w:pPr>
-        <w:ind w:left="2160" w:hanging="360"/>
-      </w:pPr>
-      <w:rPr>
-        <w:rFonts w:ascii="Wingdings" w:hAnsi="Wingdings" w:cs="Wingdings" w:hint="default"/>
-      </w:rPr>
-    </w:lvl>
-    <w:lvl w:ilvl="3">
-      <w:numFmt w:val="bullet"/>
-      <w:lvlText w:val=""/>
-      <w:lvlJc w:val="left"/>
-      <w:pPr>
-        <w:ind w:left="2880" w:hanging="360"/>
-      </w:pPr>
-      <w:rPr>
-        <w:rFonts w:ascii="Symbol" w:hAnsi="Symbol" w:cs="Symbol" w:hint="default"/>
-      </w:rPr>
-    </w:lvl>
-    <w:lvl w:ilvl="4">
-      <w:numFmt w:val="bullet"/>
-      <w:lvlText w:val="o"/>
-      <w:lvlJc w:val="left"/>
-      <w:pPr>
-        <w:ind w:left="3600" w:hanging="360"/>
-      </w:pPr>
-      <w:rPr>
-        <w:rFonts w:ascii="Courier New" w:hAnsi="Courier New" w:cs="Courier New" w:hint="default"/>
-      </w:rPr>
-    </w:lvl>
-    <w:lvl w:ilvl="5">
-      <w:numFmt w:val="bullet"/>
-      <w:lvlText w:val=""/>
-      <w:lvlJc w:val="left"/>
-      <w:pPr>
-        <w:ind w:left="4320" w:hanging="360"/>
-      </w:pPr>
-      <w:rPr>
-        <w:rFonts w:ascii="Wingdings" w:hAnsi="Wingdings" w:cs="Wingdings" w:hint="default"/>
-      </w:rPr>
-    </w:lvl>
-    <w:lvl w:ilvl="6">
-      <w:numFmt w:val="bullet"/>
-      <w:lvlText w:val=""/>
-      <w:lvlJc w:val="left"/>
-      <w:pPr>
-        <w:ind w:left="5040" w:hanging="360"/>
-      </w:pPr>
-      <w:rPr>
-        <w:rFonts w:ascii="Symbol" w:hAnsi="Symbol" w:cs="Symbol" w:hint="default"/>
-      </w:rPr>
-    </w:lvl>
-    <w:lvl w:ilvl="7">
-      <w:numFmt w:val="bullet"/>
-      <w:lvlText w:val="o"/>
-      <w:lvlJc w:val="left"/>
-      <w:pPr>
-        <w:ind w:left="5760" w:hanging="360"/>
-      </w:pPr>
-      <w:rPr>
-        <w:rFonts w:ascii="Courier New" w:hAnsi="Courier New" w:cs="Courier New" w:hint="default"/>
-      </w:rPr>
-    </w:lvl>
-    <w:lvl w:ilvl="8">
-      <w:numFmt w:val="bullet"/>
-      <w:lvlText w:val=""/>
-      <w:lvlJc w:val="left"/>
-      <w:pPr>
-        <w:ind w:left="6480" w:hanging="360"/>
-      </w:pPr>
-      <w:rPr>
-        <w:rFonts w:ascii="Wingdings" w:hAnsi="Wingdings" w:cs="Wingdings" w:hint="default"/>
-      </w:rPr>
-    </w:lvl>
-  </w:abstractNum>
   <w:num w:numId="1000">
     <w:abstractNumId w:val="990"/>
-  </w:num>
-  <w:num w:numId="1001">
-    <w:abstractNumId w:val="991"/>
   </w:num>
 </w:numbering>
 </file>

</xml_diff>

<commit_message>
Review pass: manuscript/ESM revisions, verified bib, Fig 2c exclusion fix
</commit_message>
<xml_diff>
--- a/paper/output/acropora_palmata_demography_manuscript.docx
+++ b/paper/output/acropora_palmata_demography_manuscript.docx
@@ -191,7 +191,7 @@
         <w:pStyle w:val="FirstParagraph"/>
       </w:pPr>
       <w:r>
-        <w:t xml:space="preserve">Restoration and recovery of the endangered elkhorn coral</w:t>
+        <w:t xml:space="preserve">Restoration of the endangered elkhorn coral</w:t>
       </w:r>
       <w:r>
         <w:t xml:space="preserve"> </w:t>
@@ -207,7 +207,7 @@
         <w:t xml:space="preserve"> </w:t>
       </w:r>
       <w:r>
-        <w:t xml:space="preserve">depend on demographic rates that vary across colony sizes, locations, and disturbance histories. Yet those rates have rarely been synthesized in a form that can identify the size classes and transitions most relevant to population persistence. We compiled Caribbean-wide longitudinal records of survival, growth, fragmentation, and size from individual-level monitoring and published study summaries. We estimated size-dependent vital rates, evaluated disturbance and restoration context, and incorporated those rates into a five-class, recruitment-free Lefkovitch transition model. Annual survival increased with colony size, whereas relative growth changed most sharply among small colonies. The harmonized survival synthesis showed substantial variation among studies and regions. Tissue loss was common among surviving colonies, and partial mortality produced backward transitions across all non-recruit size classes. The conditional post-settlement transition subsystem had a dominant eigenvalue below one, with large-adult stasis contributing most to its elasticity. Size–survival associations differed among curated exposure categories, and restoration records could not be interpreted as one biologically uniform class. These results show that</w:t>
+        <w:t xml:space="preserve">depends on demographic rates that vary with colony size, location, and disturbance history, yet those rates have not been synthesized in a form that identifies which size classes and transitions limit persistence. Here, we compiled longitudinal survival, growth, and fragmentation records from 18 studies across the Caribbean, standardized colony size to live planar area, and linked size-dependent vital rates to a five-class, recruitment-free transition matrix. Pooled annual survival was 78.7% (95% CI 70.4–85.1%), but heterogeneity was extreme (I² = 97.6%) and the 95% prediction interval spanned 37.4–95.8%. Survival rose with colony size, whereas relative growth changed most sharply near 37 cm². Partial mortality was pervasive: 39.4% of surviving colonies lost live tissue during an interval, and 9–17% of colonies in each non-recruit size class moved to a smaller class. The post-settlement subsystem had a deterministic population growth rate (λ) of 0.961 (bootstrap interval 0.816–1.010), and stasis of the largest colonies accounted for 58.9% of matrix elasticity. Survival of broadly defined restoration fragments (74.5%) did not differ statistically from that of natural colonies (85.4%), but survival ranged from 58.7% to 81.1% among restoration subtypes. Recurrence of Florida-scale heatwave mortality every 5–50 years reduced effective λ to 0.36–0.85. Recovery of</w:t>
       </w:r>
       <w:r>
         <w:t xml:space="preserve"> </w:t>
@@ -223,7 +223,7 @@
         <w:t xml:space="preserve"> </w:t>
       </w:r>
       <w:r>
-        <w:t xml:space="preserve">recovery depends not only on increasing the number of corals deployed, but on maintaining colonies through the transitions that produce persistent large adults. The synthesis provides parameter distributions and explicit uncertainty bounds for conditional transition analyses and restoration planning across a changing Caribbean.</w:t>
+        <w:t xml:space="preserve">therefore depends less on the number of corals deployed than on keeping colonies alive and intact through the transitions that produce persistent large adults.</w:t>
       </w:r>
     </w:p>
     <w:p>
@@ -257,6 +257,20 @@
       <w:r>
         <w:t xml:space="preserve">(</w:t>
       </w:r>
+      <w:hyperlink w:anchor="ref-aronsonprecht2001">
+        <w:r>
+          <w:rPr>
+            <w:rStyle w:val="Hyperlink"/>
+          </w:rPr>
+          <w:t xml:space="preserve">Aronson and Precht 2001</w:t>
+        </w:r>
+      </w:hyperlink>
+      <w:r>
+        <w:t xml:space="preserve">;</w:t>
+      </w:r>
+      <w:r>
+        <w:t xml:space="preserve"> </w:t>
+      </w:r>
       <w:hyperlink w:anchor="ref-gardner2003">
         <w:r>
           <w:rPr>
@@ -282,7 +296,47 @@
         <w:t xml:space="preserve">Acropora palmata</w:t>
       </w:r>
       <w:r>
-        <w:t xml:space="preserve">, but the demographic information used to choose target sizes, sites, and intervention schedules remains fragmented among studies and regions.</w:t>
+        <w:t xml:space="preserve">, but the demographic information used to choose target sizes, sites, and intervention schedules remains fragmented among studies and regions</w:t>
+      </w:r>
+      <w:r>
+        <w:t xml:space="preserve"> </w:t>
+      </w:r>
+      <w:r>
+        <w:t xml:space="preserve">(</w:t>
+      </w:r>
+      <w:hyperlink w:anchor="ref-edmundsriegl2020">
+        <w:r>
+          <w:rPr>
+            <w:rStyle w:val="Hyperlink"/>
+          </w:rPr>
+          <w:t xml:space="preserve">Edmunds and Riegl 2020</w:t>
+        </w:r>
+      </w:hyperlink>
+      <w:r>
+        <w:t xml:space="preserve">)</w:t>
+      </w:r>
+      <w:r>
+        <w:t xml:space="preserve">. The most widely used size-structured model for the species was parameterized from tagged colonies in the northern Florida Keys</w:t>
+      </w:r>
+      <w:r>
+        <w:t xml:space="preserve"> </w:t>
+      </w:r>
+      <w:r>
+        <w:t xml:space="preserve">(</w:t>
+      </w:r>
+      <w:hyperlink w:anchor="ref-vardi2012">
+        <w:r>
+          <w:rPr>
+            <w:rStyle w:val="Hyperlink"/>
+          </w:rPr>
+          <w:t xml:space="preserve">Vardi et al. 2012</w:t>
+        </w:r>
+      </w:hyperlink>
+      <w:r>
+        <w:t xml:space="preserve">)</w:t>
+      </w:r>
+      <w:r>
+        <w:t xml:space="preserve">, a single region whose rates may not transfer to the rest of the Caribbean.</w:t>
       </w:r>
     </w:p>
     <w:p>
@@ -290,7 +344,7 @@
         <w:pStyle w:val="BodyText"/>
       </w:pPr>
       <w:r>
-        <w:t xml:space="preserve">Colony size is a central axis of coral demography. Small colonies may grow rapidly in proportional terms but are exposed to high mortality, whereas large colonies can persist, reproduce, and fragment. However, colonies do not move through size structure only by growing or dying. Storm damage, disease, predation, and tissue loss can reduce the live area of colonies that remain alive, producing shrinkage and retrogression rather than immediate whole-colony mortality</w:t>
+        <w:t xml:space="preserve">Colony size is a central axis of coral demography</w:t>
       </w:r>
       <w:r>
         <w:t xml:space="preserve"> </w:t>
@@ -298,6 +352,88 @@
       <w:r>
         <w:t xml:space="preserve">(</w:t>
       </w:r>
+      <w:hyperlink w:anchor="ref-hughes1984">
+        <w:r>
+          <w:rPr>
+            <w:rStyle w:val="Hyperlink"/>
+          </w:rPr>
+          <w:t xml:space="preserve">Hughes 1984</w:t>
+        </w:r>
+      </w:hyperlink>
+      <w:r>
+        <w:t xml:space="preserve">;</w:t>
+      </w:r>
+      <w:r>
+        <w:t xml:space="preserve"> </w:t>
+      </w:r>
+      <w:hyperlink w:anchor="ref-hughesjackson1985">
+        <w:r>
+          <w:rPr>
+            <w:rStyle w:val="Hyperlink"/>
+          </w:rPr>
+          <w:t xml:space="preserve">Hughes and Jackson 1985</w:t>
+        </w:r>
+      </w:hyperlink>
+      <w:r>
+        <w:t xml:space="preserve">)</w:t>
+      </w:r>
+      <w:r>
+        <w:t xml:space="preserve">. Small colonies may grow rapidly in proportional terms but are exposed to high mortality, whereas large colonies can persist, reproduce, and fragment</w:t>
+      </w:r>
+      <w:r>
+        <w:t xml:space="preserve"> </w:t>
+      </w:r>
+      <w:r>
+        <w:t xml:space="preserve">(</w:t>
+      </w:r>
+      <w:hyperlink w:anchor="ref-highsmith1982">
+        <w:r>
+          <w:rPr>
+            <w:rStyle w:val="Hyperlink"/>
+          </w:rPr>
+          <w:t xml:space="preserve">Highsmith 1982</w:t>
+        </w:r>
+      </w:hyperlink>
+      <w:r>
+        <w:t xml:space="preserve">;</w:t>
+      </w:r>
+      <w:r>
+        <w:t xml:space="preserve"> </w:t>
+      </w:r>
+      <w:hyperlink w:anchor="ref-lirman2000">
+        <w:r>
+          <w:rPr>
+            <w:rStyle w:val="Hyperlink"/>
+          </w:rPr>
+          <w:t xml:space="preserve">Lirman 2000</w:t>
+        </w:r>
+      </w:hyperlink>
+      <w:r>
+        <w:t xml:space="preserve">;</w:t>
+      </w:r>
+      <w:r>
+        <w:t xml:space="preserve"> </w:t>
+      </w:r>
+      <w:hyperlink w:anchor="ref-madin2014">
+        <w:r>
+          <w:rPr>
+            <w:rStyle w:val="Hyperlink"/>
+          </w:rPr>
+          <w:t xml:space="preserve">Madin et al. 2014</w:t>
+        </w:r>
+      </w:hyperlink>
+      <w:r>
+        <w:t xml:space="preserve">)</w:t>
+      </w:r>
+      <w:r>
+        <w:t xml:space="preserve">. However, colonies do not move through size structure only by growing or dying. Storm damage, disease, predation, and tissue loss can reduce the live area of colonies that remain alive, producing shrinkage and retrogression rather than immediate whole-colony mortality</w:t>
+      </w:r>
+      <w:r>
+        <w:t xml:space="preserve"> </w:t>
+      </w:r>
+      <w:r>
+        <w:t xml:space="preserve">(</w:t>
+      </w:r>
       <w:hyperlink w:anchor="ref-lirman1997">
         <w:r>
           <w:rPr>
@@ -324,6 +460,42 @@
         <w:t xml:space="preserve">)</w:t>
       </w:r>
       <w:r>
+        <w:t xml:space="preserve">. Partial mortality can also carry a reproductive cost:</w:t>
+      </w:r>
+      <w:r>
+        <w:t xml:space="preserve"> </w:t>
+      </w:r>
+      <w:r>
+        <w:rPr>
+          <w:i/>
+          <w:iCs/>
+        </w:rPr>
+        <w:t xml:space="preserve">A. palmata</w:t>
+      </w:r>
+      <w:r>
+        <w:t xml:space="preserve"> </w:t>
+      </w:r>
+      <w:r>
+        <w:t xml:space="preserve">colonies with unhealed lesions produced smaller eggs than apparently healthy colonies, and the lesions did not regenerate over a four-month season</w:t>
+      </w:r>
+      <w:r>
+        <w:t xml:space="preserve"> </w:t>
+      </w:r>
+      <w:r>
+        <w:t xml:space="preserve">(</w:t>
+      </w:r>
+      <w:hyperlink w:anchor="ref-pinongonzalez2018">
+        <w:r>
+          <w:rPr>
+            <w:rStyle w:val="Hyperlink"/>
+          </w:rPr>
+          <w:t xml:space="preserve">Piñón-González and Banaszak 2018</w:t>
+        </w:r>
+      </w:hyperlink>
+      <w:r>
+        <w:t xml:space="preserve">)</w:t>
+      </w:r>
+      <w:r>
         <w:t xml:space="preserve">. A demographic analysis that treats all surviving colonies as stable therefore risks obscuring the processes that determine whether individuals eventually contribute to adult population structure.</w:t>
       </w:r>
     </w:p>
@@ -377,7 +549,63 @@
           <w:rPr>
             <w:rStyle w:val="Hyperlink"/>
           </w:rPr>
-          <w:t xml:space="preserve">Manzello et al.</w:t>
+          <w:t xml:space="preserve">Manzello et al. 2025</w:t>
+        </w:r>
+      </w:hyperlink>
+      <w:r>
+        <w:t xml:space="preserve">)</w:t>
+      </w:r>
+      <w:r>
+        <w:t xml:space="preserve">. A useful synthesis must therefore separate the question of a counterfactual low-disturbance estimate from the question of how colonies actually performed within their observed disturbance histories.</w:t>
+      </w:r>
+    </w:p>
+    <w:p>
+      <w:pPr>
+        <w:pStyle w:val="BodyText"/>
+      </w:pPr>
+      <w:r>
+        <w:t xml:space="preserve">Restoration introduces a third source of heterogeneity. Nursery outplants, colonies re-cemented after fragmentation, direct outplants, and naturally fragmented colonies differ in size, handling, environment, and likely mortality processes</w:t>
+      </w:r>
+      <w:r>
+        <w:t xml:space="preserve"> </w:t>
+      </w:r>
+      <w:r>
+        <w:t xml:space="preserve">(</w:t>
+      </w:r>
+      <w:hyperlink w:anchor="ref-forrester2012">
+        <w:r>
+          <w:rPr>
+            <w:rStyle w:val="Hyperlink"/>
+          </w:rPr>
+          <w:t xml:space="preserve">Forrester et al. 2012</w:t>
+        </w:r>
+      </w:hyperlink>
+      <w:r>
+        <w:t xml:space="preserve">;</w:t>
+      </w:r>
+      <w:r>
+        <w:t xml:space="preserve"> </w:t>
+      </w:r>
+      <w:hyperlink w:anchor="ref-ramosromero2025">
+        <w:r>
+          <w:rPr>
+            <w:rStyle w:val="Hyperlink"/>
+          </w:rPr>
+          <w:t xml:space="preserve">Ramos Romero et al. 2025</w:t>
+        </w:r>
+      </w:hyperlink>
+      <w:r>
+        <w:t xml:space="preserve">;</w:t>
+      </w:r>
+      <w:r>
+        <w:t xml:space="preserve"> </w:t>
+      </w:r>
+      <w:hyperlink w:anchor="ref-banister2024">
+        <w:r>
+          <w:rPr>
+            <w:rStyle w:val="Hyperlink"/>
+          </w:rPr>
+          <w:t xml:space="preserve">Banister et al.</w:t>
         </w:r>
         <w:r>
           <w:rPr>
@@ -389,14 +617,60 @@
           <w:rPr>
             <w:rStyle w:val="Hyperlink"/>
           </w:rPr>
-          <w:t xml:space="preserve">2025</w:t>
+          <w:t xml:space="preserve">2024</w:t>
         </w:r>
       </w:hyperlink>
       <w:r>
         <w:t xml:space="preserve">)</w:t>
       </w:r>
       <w:r>
-        <w:t xml:space="preserve">. A useful synthesis must therefore separate the question of a counterfactual low-disturbance estimate from the question of how colonies actually performed within their observed disturbance histories.</w:t>
+        <w:t xml:space="preserve">. Treating these materials as one</w:t>
+      </w:r>
+      <w:r>
+        <w:t xml:space="preserve"> </w:t>
+      </w:r>
+      <w:r>
+        <w:t xml:space="preserve">“restoration fragment”</w:t>
+      </w:r>
+      <w:r>
+        <w:t xml:space="preserve"> </w:t>
+      </w:r>
+      <w:r>
+        <w:t xml:space="preserve">category can yield a pooled comparison that is statistically convenient but biologically ambiguous. This distinction matters because early survival bottlenecks and later outplant performance need not be governed by the same processes</w:t>
+      </w:r>
+      <w:r>
+        <w:t xml:space="preserve"> </w:t>
+      </w:r>
+      <w:r>
+        <w:t xml:space="preserve">(</w:t>
+      </w:r>
+      <w:hyperlink w:anchor="ref-williams2008">
+        <w:r>
+          <w:rPr>
+            <w:rStyle w:val="Hyperlink"/>
+          </w:rPr>
+          <w:t xml:space="preserve">Williams et al. 2008</w:t>
+        </w:r>
+      </w:hyperlink>
+      <w:r>
+        <w:t xml:space="preserve">;</w:t>
+      </w:r>
+      <w:r>
+        <w:t xml:space="preserve"> </w:t>
+      </w:r>
+      <w:hyperlink w:anchor="ref-williams2023">
+        <w:r>
+          <w:rPr>
+            <w:rStyle w:val="Hyperlink"/>
+          </w:rPr>
+          <w:t xml:space="preserve">Williams et al. 2023</w:t>
+        </w:r>
+      </w:hyperlink>
+      <w:r>
+        <w:t xml:space="preserve">)</w:t>
+      </w:r>
+      <w:r>
+        <w:t xml:space="preserve">.</w:t>
       </w:r>
     </w:p>
     <w:p>
@@ -404,7 +678,23 @@
         <w:pStyle w:val="BodyText"/>
       </w:pPr>
       <w:r>
-        <w:t xml:space="preserve">Restoration introduces a third source of heterogeneity. Nursery outplants, colonies re-cemented after fragmentation, direct outplants, and naturally fragmented colonies differ in size, handling, environment, and likely mortality processes</w:t>
+        <w:t xml:space="preserve">Here, we synthesized the available longitudinal demographic evidence for</w:t>
+      </w:r>
+      <w:r>
+        <w:t xml:space="preserve"> </w:t>
+      </w:r>
+      <w:r>
+        <w:rPr>
+          <w:i/>
+          <w:iCs/>
+        </w:rPr>
+        <w:t xml:space="preserve">A. palmata</w:t>
+      </w:r>
+      <w:r>
+        <w:t xml:space="preserve"> </w:t>
+      </w:r>
+      <w:r>
+        <w:t xml:space="preserve">across the Caribbean. We asked: (1) how do survival and growth vary with colony size; (2) how common are shrinkage and retrogression among surviving colonies; (3) how do disturbance histories and restoration subtypes change demographic interpretation; and (4) what do these vital rates imply for a recruitment-free post-settlement transition subsystem? We combined individual-level observations from seven studies with summary-level effects from eleven additional studies, standardized colony size to live planar area, and linked the resulting vital rates to a five-class transition model that updates the structure of Vardi et al.</w:t>
       </w:r>
       <w:r>
         <w:t xml:space="preserve"> </w:t>
@@ -412,117 +702,19 @@
       <w:r>
         <w:t xml:space="preserve">(</w:t>
       </w:r>
-      <w:hyperlink w:anchor="ref-forrester2012">
-        <w:r>
-          <w:rPr>
-            <w:rStyle w:val="Hyperlink"/>
-          </w:rPr>
-          <w:t xml:space="preserve">Forrester et al. 2012</w:t>
-        </w:r>
-      </w:hyperlink>
-      <w:r>
-        <w:t xml:space="preserve">;</w:t>
-      </w:r>
-      <w:r>
-        <w:t xml:space="preserve"> </w:t>
-      </w:r>
-      <w:hyperlink w:anchor="ref-ramosromero2025">
-        <w:r>
-          <w:rPr>
-            <w:rStyle w:val="Hyperlink"/>
-          </w:rPr>
-          <w:t xml:space="preserve">Ramos Romero et al. 2025</w:t>
-        </w:r>
-      </w:hyperlink>
-      <w:r>
-        <w:t xml:space="preserve">;</w:t>
-      </w:r>
-      <w:r>
-        <w:t xml:space="preserve"> </w:t>
-      </w:r>
-      <w:hyperlink w:anchor="ref-banister2024">
-        <w:r>
-          <w:rPr>
-            <w:rStyle w:val="Hyperlink"/>
-          </w:rPr>
-          <w:t xml:space="preserve">Banister et al. 2024</w:t>
+      <w:hyperlink w:anchor="ref-vardi2012">
+        <w:r>
+          <w:rPr>
+            <w:rStyle w:val="Hyperlink"/>
+          </w:rPr>
+          <w:t xml:space="preserve">2012</w:t>
         </w:r>
       </w:hyperlink>
       <w:r>
         <w:t xml:space="preserve">)</w:t>
       </w:r>
       <w:r>
-        <w:t xml:space="preserve">. Treating these materials as one</w:t>
-      </w:r>
-      <w:r>
-        <w:t xml:space="preserve"> </w:t>
-      </w:r>
-      <w:r>
-        <w:t xml:space="preserve">“restoration fragment”</w:t>
-      </w:r>
-      <w:r>
-        <w:t xml:space="preserve"> </w:t>
-      </w:r>
-      <w:r>
-        <w:t xml:space="preserve">category can yield a pooled comparison that is statistically convenient but biologically ambiguous. This distinction matters because early survival bottlenecks and later outplant performance need not be governed by the same processes</w:t>
-      </w:r>
-      <w:r>
-        <w:t xml:space="preserve"> </w:t>
-      </w:r>
-      <w:r>
-        <w:t xml:space="preserve">(</w:t>
-      </w:r>
-      <w:hyperlink w:anchor="ref-williams2008">
-        <w:r>
-          <w:rPr>
-            <w:rStyle w:val="Hyperlink"/>
-          </w:rPr>
-          <w:t xml:space="preserve">Williams et al. 2008</w:t>
-        </w:r>
-      </w:hyperlink>
-      <w:r>
-        <w:t xml:space="preserve">,</w:t>
-      </w:r>
-      <w:r>
-        <w:t xml:space="preserve"> </w:t>
-      </w:r>
-      <w:hyperlink w:anchor="ref-williams2023">
-        <w:r>
-          <w:rPr>
-            <w:rStyle w:val="Hyperlink"/>
-          </w:rPr>
-          <w:t xml:space="preserve">2023</w:t>
-        </w:r>
-      </w:hyperlink>
-      <w:r>
-        <w:t xml:space="preserve">)</w:t>
-      </w:r>
-      <w:r>
-        <w:t xml:space="preserve">.</w:t>
-      </w:r>
-    </w:p>
-    <w:p>
-      <w:pPr>
-        <w:pStyle w:val="BodyText"/>
-      </w:pPr>
-      <w:r>
-        <w:t xml:space="preserve">Here, we synthesized the available longitudinal demographic evidence for</w:t>
-      </w:r>
-      <w:r>
-        <w:t xml:space="preserve"> </w:t>
-      </w:r>
-      <w:r>
-        <w:rPr>
-          <w:i/>
-          <w:iCs/>
-        </w:rPr>
-        <w:t xml:space="preserve">A. palmata</w:t>
-      </w:r>
-      <w:r>
-        <w:t xml:space="preserve"> </w:t>
-      </w:r>
-      <w:r>
-        <w:t xml:space="preserve">across the Caribbean. We asked: (1) how do survival and growth vary with colony size; (2) how common are shrinkage and retrogression among surviving colonies; (3) how do disturbance histories and restoration subtypes change demographic interpretation; and (4) what do these vital rates imply for a recruitment-free post-settlement transition subsystem? We combined individual-level observations from seven studies with summary-level effects from ten additional studies, standardized colony size to live planar area, and linked the resulting vital rates to a five-class transition model. We expected size to structure both survival and growth, size–survival associations to differ among observed exposure categories, and large-adult persistence to exert disproportionate influence on conditional transition dynamics. Our goal was not to produce a universal Caribbean rate for a heterogeneous species, but to identify the patterns that are robust across the available evidence and the uncertainties that should bound restoration decisions.</w:t>
+        <w:t xml:space="preserve">. We expected size to structure both survival and growth, size–survival associations to differ among observed exposure categories, and large-adult persistence to exert disproportionate influence on conditional transition dynamics. Our goal was not to produce a universal Caribbean rate for a heterogeneous species, but to identify the patterns that are robust across the available evidence and the uncertainties that should bound restoration decisions.</w:t>
       </w:r>
     </w:p>
     <w:bookmarkEnd w:id="10"/>
@@ -605,7 +797,278 @@
         <w:t xml:space="preserve"> </w:t>
       </w:r>
       <w:r>
-        <w:t xml:space="preserve">colonies or fragments, survival or areal growth over a defined interval, and sufficient information to annualize survival or estimate a size-dependent vital rate. We excluded cross-sectional condition surveys, studies that reported only branch extension, laboratory micro-fragment experiments smaller than 1 cm², and overlapping analyses of the same tagged-colony datasets. Titles and abstracts were screened first, followed by full-text evaluation. A second reviewer independently evaluated a subset of expanded-search candidates; disagreements were adjudicated by a third review. The final survival synthesis included 17 studies contributing 22 study-level effects.</w:t>
+        <w:t xml:space="preserve">colonies or fragments, survival or areal growth over a defined interval, and sufficient information to annualize survival or estimate a size-dependent vital rate. We excluded cross-sectional condition surveys, studies that reported only branch extension, laboratory micro-fragment experiments smaller than 1 cm², and overlapping analyses of the same tagged-colony datasets. Titles and abstracts were screened first, followed by full-text evaluation. A second reviewer independently evaluated a subset of expanded-search candidates; disagreements were adjudicated by a third review. Across all sources, we identified approximately 2,500 records, assessed 101 full texts or data repositories, and excluded 82 with documented reasons; the most common reasons were a different species, overlap with an included dataset, and cross-sectional designs.</w:t>
+      </w:r>
+    </w:p>
+    <w:p>
+      <w:pPr>
+        <w:pStyle w:val="BodyText"/>
+      </w:pPr>
+      <w:r>
+        <w:t xml:space="preserve">The final dataset comprised 18 studies. Seven supplied individual colony records: NOAA long-term monitoring of tagged colonies in the Florida Keys, Curaçao, and Navassa; Neely et al.</w:t>
+      </w:r>
+      <w:r>
+        <w:t xml:space="preserve"> </w:t>
+      </w:r>
+      <w:r>
+        <w:t xml:space="preserve">(</w:t>
+      </w:r>
+      <w:hyperlink w:anchor="ref-neely2022">
+        <w:r>
+          <w:rPr>
+            <w:rStyle w:val="Hyperlink"/>
+          </w:rPr>
+          <w:t xml:space="preserve">2022</w:t>
+        </w:r>
+      </w:hyperlink>
+      <w:r>
+        <w:t xml:space="preserve">)</w:t>
+      </w:r>
+      <w:r>
+        <w:t xml:space="preserve">; Pausch et al.</w:t>
+      </w:r>
+      <w:r>
+        <w:t xml:space="preserve"> </w:t>
+      </w:r>
+      <w:r>
+        <w:t xml:space="preserve">(</w:t>
+      </w:r>
+      <w:hyperlink w:anchor="ref-pausch2018">
+        <w:r>
+          <w:rPr>
+            <w:rStyle w:val="Hyperlink"/>
+          </w:rPr>
+          <w:t xml:space="preserve">2018</w:t>
+        </w:r>
+      </w:hyperlink>
+      <w:r>
+        <w:t xml:space="preserve">)</w:t>
+      </w:r>
+      <w:r>
+        <w:t xml:space="preserve">; Kuffner et al.</w:t>
+      </w:r>
+      <w:r>
+        <w:t xml:space="preserve"> </w:t>
+      </w:r>
+      <w:r>
+        <w:t xml:space="preserve">(</w:t>
+      </w:r>
+      <w:hyperlink w:anchor="ref-kuffner2020">
+        <w:r>
+          <w:rPr>
+            <w:rStyle w:val="Hyperlink"/>
+          </w:rPr>
+          <w:t xml:space="preserve">2020</w:t>
+        </w:r>
+      </w:hyperlink>
+      <w:r>
+        <w:t xml:space="preserve">)</w:t>
+      </w:r>
+      <w:r>
+        <w:t xml:space="preserve">; a USGS outplant experiment in the US Virgin Islands; FUNDEMAR nursery fragments in the Dominican Republic; and Mendoza Quiroz et al.</w:t>
+      </w:r>
+      <w:r>
+        <w:t xml:space="preserve"> </w:t>
+      </w:r>
+      <w:r>
+        <w:t xml:space="preserve">(</w:t>
+      </w:r>
+      <w:hyperlink w:anchor="ref-mendozaquiroz2023">
+        <w:r>
+          <w:rPr>
+            <w:rStyle w:val="Hyperlink"/>
+          </w:rPr>
+          <w:t xml:space="preserve">2023</w:t>
+        </w:r>
+      </w:hyperlink>
+      <w:r>
+        <w:t xml:space="preserve">)</w:t>
+      </w:r>
+      <w:r>
+        <w:t xml:space="preserve">. Eleven supplied study-level summaries</w:t>
+      </w:r>
+      <w:r>
+        <w:t xml:space="preserve"> </w:t>
+      </w:r>
+      <w:r>
+        <w:t xml:space="preserve">(</w:t>
+      </w:r>
+      <w:hyperlink w:anchor="ref-rogers1982">
+        <w:r>
+          <w:rPr>
+            <w:rStyle w:val="Hyperlink"/>
+          </w:rPr>
+          <w:t xml:space="preserve">Rogers et al. 1982</w:t>
+        </w:r>
+      </w:hyperlink>
+      <w:r>
+        <w:t xml:space="preserve">;</w:t>
+      </w:r>
+      <w:r>
+        <w:t xml:space="preserve"> </w:t>
+      </w:r>
+      <w:hyperlink w:anchor="ref-bruckner2001">
+        <w:r>
+          <w:rPr>
+            <w:rStyle w:val="Hyperlink"/>
+          </w:rPr>
+          <w:t xml:space="preserve">Bruckner and Bruckner 2001</w:t>
+        </w:r>
+      </w:hyperlink>
+      <w:r>
+        <w:t xml:space="preserve">;</w:t>
+      </w:r>
+      <w:r>
+        <w:t xml:space="preserve"> </w:t>
+      </w:r>
+      <w:hyperlink w:anchor="ref-ortizprosper2005">
+        <w:r>
+          <w:rPr>
+            <w:rStyle w:val="Hyperlink"/>
+          </w:rPr>
+          <w:t xml:space="preserve">Ortiz Prosper 2005</w:t>
+        </w:r>
+      </w:hyperlink>
+      <w:r>
+        <w:t xml:space="preserve">;</w:t>
+      </w:r>
+      <w:r>
+        <w:t xml:space="preserve"> </w:t>
+      </w:r>
+      <w:hyperlink w:anchor="ref-garrison2008">
+        <w:r>
+          <w:rPr>
+            <w:rStyle w:val="Hyperlink"/>
+          </w:rPr>
+          <w:t xml:space="preserve">Garrison and Ward 2008</w:t>
+        </w:r>
+      </w:hyperlink>
+      <w:r>
+        <w:t xml:space="preserve">;</w:t>
+      </w:r>
+      <w:r>
+        <w:t xml:space="preserve"> </w:t>
+      </w:r>
+      <w:hyperlink w:anchor="ref-williamsmiller2010">
+        <w:r>
+          <w:rPr>
+            <w:rStyle w:val="Hyperlink"/>
+          </w:rPr>
+          <w:t xml:space="preserve">Williams and Miller 2010</w:t>
+        </w:r>
+      </w:hyperlink>
+      <w:r>
+        <w:t xml:space="preserve">;</w:t>
+      </w:r>
+      <w:r>
+        <w:t xml:space="preserve"> </w:t>
+      </w:r>
+      <w:hyperlink w:anchor="ref-vardi2011">
+        <w:r>
+          <w:rPr>
+            <w:rStyle w:val="Hyperlink"/>
+          </w:rPr>
+          <w:t xml:space="preserve">Vardi 2011</w:t>
+        </w:r>
+      </w:hyperlink>
+      <w:r>
+        <w:t xml:space="preserve">;</w:t>
+      </w:r>
+      <w:r>
+        <w:t xml:space="preserve"> </w:t>
+      </w:r>
+      <w:hyperlink w:anchor="ref-rogersmuller2012">
+        <w:r>
+          <w:rPr>
+            <w:rStyle w:val="Hyperlink"/>
+          </w:rPr>
+          <w:t xml:space="preserve">Rogers and Muller 2012</w:t>
+        </w:r>
+      </w:hyperlink>
+      <w:r>
+        <w:t xml:space="preserve">;</w:t>
+      </w:r>
+      <w:r>
+        <w:t xml:space="preserve"> </w:t>
+      </w:r>
+      <w:hyperlink w:anchor="ref-forrester2013">
+        <w:r>
+          <w:rPr>
+            <w:rStyle w:val="Hyperlink"/>
+          </w:rPr>
+          <w:t xml:space="preserve">Forrester et al. 2014</w:t>
+        </w:r>
+      </w:hyperlink>
+      <w:r>
+        <w:t xml:space="preserve">;</w:t>
+      </w:r>
+      <w:r>
+        <w:t xml:space="preserve"> </w:t>
+      </w:r>
+      <w:hyperlink w:anchor="ref-maurer2022">
+        <w:r>
+          <w:rPr>
+            <w:rStyle w:val="Hyperlink"/>
+          </w:rPr>
+          <w:t xml:space="preserve">Maurer et al. 2022</w:t>
+        </w:r>
+      </w:hyperlink>
+      <w:r>
+        <w:t xml:space="preserve">;</w:t>
+      </w:r>
+      <w:r>
+        <w:t xml:space="preserve"> </w:t>
+      </w:r>
+      <w:hyperlink w:anchor="ref-rosales2024">
+        <w:r>
+          <w:rPr>
+            <w:rStyle w:val="Hyperlink"/>
+          </w:rPr>
+          <w:t xml:space="preserve">Rosales et al. 2024</w:t>
+        </w:r>
+      </w:hyperlink>
+      <w:r>
+        <w:t xml:space="preserve">;</w:t>
+      </w:r>
+      <w:r>
+        <w:t xml:space="preserve"> </w:t>
+      </w:r>
+      <w:hyperlink w:anchor="ref-ramosromero2025">
+        <w:r>
+          <w:rPr>
+            <w:rStyle w:val="Hyperlink"/>
+          </w:rPr>
+          <w:t xml:space="preserve">Ramos Romero et al. 2025</w:t>
+        </w:r>
+      </w:hyperlink>
+      <w:r>
+        <w:t xml:space="preserve">)</w:t>
+      </w:r>
+      <w:r>
+        <w:t xml:space="preserve">. Seventeen of these studies, contributing 22 study-region effects, entered the survival synthesis. Mendoza Quiroz et al.</w:t>
+      </w:r>
+      <w:r>
+        <w:t xml:space="preserve"> </w:t>
+      </w:r>
+      <w:r>
+        <w:t xml:space="preserve">(</w:t>
+      </w:r>
+      <w:hyperlink w:anchor="ref-mendozaquiroz2023">
+        <w:r>
+          <w:rPr>
+            <w:rStyle w:val="Hyperlink"/>
+          </w:rPr>
+          <w:t xml:space="preserve">2023</w:t>
+        </w:r>
+      </w:hyperlink>
+      <w:r>
+        <w:t xml:space="preserve">)</w:t>
+      </w:r>
+      <w:r>
+        <w:t xml:space="preserve"> </w:t>
+      </w:r>
+      <w:r>
+        <w:t xml:space="preserve">contributed only to the size-dependent and transition analyses (Online Resource 1, Table S1).</w:t>
       </w:r>
     </w:p>
     <w:bookmarkEnd w:id="11"/>
@@ -647,7 +1110,27 @@
         <w:t xml:space="preserve"> </w:t>
       </w:r>
       <w:r>
-        <w:t xml:space="preserve">matrix models (Vardi et al. 2012). For diameter-only records, we estimated area from a circular footprint. Where a study reported a single linear measure, we applied study-informed width-to-length ratios; records for which size could not be defensibly converted were retained for survival synthesis but not size-dependent analyses. We annualized non-annual survival as</w:t>
+        <w:t xml:space="preserve">matrix models</w:t>
+      </w:r>
+      <w:r>
+        <w:t xml:space="preserve"> </w:t>
+      </w:r>
+      <w:r>
+        <w:t xml:space="preserve">(</w:t>
+      </w:r>
+      <w:hyperlink w:anchor="ref-vardi2012">
+        <w:r>
+          <w:rPr>
+            <w:rStyle w:val="Hyperlink"/>
+          </w:rPr>
+          <w:t xml:space="preserve">Vardi et al. 2012</w:t>
+        </w:r>
+      </w:hyperlink>
+      <w:r>
+        <w:t xml:space="preserve">)</w:t>
+      </w:r>
+      <w:r>
+        <w:t xml:space="preserve">. For diameter-only records, we estimated area from a circular footprint. Where a study reported a single linear measure, we applied study-informed width-to-length ratios; records for which size could not be defensibly converted were retained for survival synthesis but not size-dependent analyses. We annualized non-annual survival as</w:t>
       </w:r>
       <w:r>
         <w:t xml:space="preserve"> </w:t>
@@ -791,7 +1274,27 @@
         <w:t xml:space="preserve"> </w:t>
       </w:r>
       <w:r>
-        <w:t xml:space="preserve">is the monitoring interval in years.</w:t>
+        <w:t xml:space="preserve">is the monitoring interval in years. This transformation assumes a constant hazard within each interval and therefore does not represent seasonal mortality peaks. Mortality definitions also differed among studies, from loss of both tissue and skeleton in NOAA monitoring to loss of at least half of live tissue in Kuffner et al.</w:t>
+      </w:r>
+      <w:r>
+        <w:t xml:space="preserve"> </w:t>
+      </w:r>
+      <w:r>
+        <w:t xml:space="preserve">(</w:t>
+      </w:r>
+      <w:hyperlink w:anchor="ref-kuffner2020">
+        <w:r>
+          <w:rPr>
+            <w:rStyle w:val="Hyperlink"/>
+          </w:rPr>
+          <w:t xml:space="preserve">2020</w:t>
+        </w:r>
+      </w:hyperlink>
+      <w:r>
+        <w:t xml:space="preserve">)</w:t>
+      </w:r>
+      <w:r>
+        <w:t xml:space="preserve">. We retained each study’s definition rather than imposing a common one, so part of the among-study variation reflects measurement rather than biology.</w:t>
       </w:r>
     </w:p>
     <w:p>
@@ -853,7 +1356,7 @@
         <w:pStyle w:val="FirstParagraph"/>
       </w:pPr>
       <w:r>
-        <w:t xml:space="preserve">We retained all intervals in primary analyses because observed storms, disease, bleaching, cold events, and chronic stressors comprise the demographic context experienced by the study populations. We then linked each interval to a curated Caribbean disturbance timeline. The timeline distinguished acute events used in baseline-exclusion sensitivity analyses from chronic or indirect pressures retained as contextual exposure. We independently rebuilt the interval-to-event linkage and summarized it as a study-window audit (Online Resource 1, Table S1). We fitted size-by-disturbance interaction models to natural-colony records, thereby avoiding the confounding of disturbance context with restoration material and handling history.</w:t>
+        <w:t xml:space="preserve">We retained all intervals in primary analyses because observed storms, disease, bleaching, cold events, and chronic stressors comprise the demographic context experienced by the study populations. We then linked each interval to a curated Caribbean disturbance timeline. The timeline distinguished acute events used in baseline-exclusion sensitivity analyses from chronic or indirect pressures retained as contextual exposure. We independently rebuilt the interval-to-event linkage and summarized it as a study-window audit (Online Resource 1, Table S2). We fitted size-by-disturbance interaction models to natural-colony records, thereby avoiding the confounding of disturbance context with restoration material and handling history.</w:t>
       </w:r>
     </w:p>
     <w:p>
@@ -891,7 +1394,30 @@
         <w:pStyle w:val="FirstParagraph"/>
       </w:pPr>
       <w:r>
-        <w:t xml:space="preserve">We modeled annual survival as a function of log-transformed colony size using binomial generalized additive models and modeled relative growth rate with Gaussian generalized additive models. These main-figure curves are unadjusted descriptive GAMs; mixed-effect models accounting for study were used as diagnostics and sensitivity analyses rather than as the source of their displayed intervals. We used a pre-specified threshold analysis to evaluate nonlinear functional form and identify supported inflection points. We interpreted thresholds as data- and study-composition-dependent features rather than fixed biological boundaries. We assessed model diagnostics and study dependence with the pre-specified verification and leave-one-study-out procedures documented in the project repository.</w:t>
+        <w:t xml:space="preserve">We modeled annual survival as a function of log-transformed colony size using binomial generalized additive models and modeled relative growth rate with Gaussian generalized additive models. These main-figure curves are unadjusted descriptive GAMs; mixed-effect models accounting for study were used as diagnostics and sensitivity analyses rather than as the source of their displayed intervals. We used a pre-specified GAM threshold analysis</w:t>
+      </w:r>
+      <w:r>
+        <w:t xml:space="preserve"> </w:t>
+      </w:r>
+      <w:r>
+        <w:t xml:space="preserve">(</w:t>
+      </w:r>
+      <w:hyperlink w:anchor="ref-detmer2025">
+        <w:r>
+          <w:rPr>
+            <w:rStyle w:val="Hyperlink"/>
+          </w:rPr>
+          <w:t xml:space="preserve">Detmer et al. 2025</w:t>
+        </w:r>
+      </w:hyperlink>
+      <w:r>
+        <w:t xml:space="preserve">)</w:t>
+      </w:r>
+      <w:r>
+        <w:t xml:space="preserve"> </w:t>
+      </w:r>
+      <w:r>
+        <w:t xml:space="preserve">to evaluate nonlinear functional form and identify supported inflection points. A threshold was reported only when the GAM outperformed a linear model by at least 2 AICc units, and was located from the derivatives of the fitted curve. We interpreted thresholds as data- and study-composition-dependent features rather than fixed biological boundaries. We assessed model diagnostics and study dependence with the pre-specified verification and leave-one-study-out procedures documented in the project repository.</w:t>
       </w:r>
     </w:p>
     <w:p>
@@ -1076,7 +1602,7 @@
         <w:t xml:space="preserve">)</w:t>
       </w:r>
       <w:r>
-        <w:t xml:space="preserve">. We report pooled survival, 95% confidence intervals, prediction intervals, and heterogeneity statistics. We evaluated population type, colony size, year, and region as exploratory moderators because the number of effects was limited. We also performed leave-one-out, classification, and risk-of-bias sensitivity analyses.</w:t>
+        <w:t xml:space="preserve">. We report pooled survival, 95% confidence intervals, prediction intervals, and heterogeneity statistics. We evaluated population type, colony size, year, and region as exploratory moderators because the number of effects was limited. We also performed leave-one-out, classification, and risk-of-bias sensitivity analyses. We assessed small-study effects with Egger-type regression tests on the independent-effect and three-level models and with trim-and-fill on the independent-effect model. Funnel-plot methods were designed for comparative effect sizes, so we treat these tests as diagnostics of asymmetry among single-proportion effects rather than as direct tests of publication bias.</w:t>
       </w:r>
     </w:p>
     <w:p>
@@ -1084,7 +1610,27 @@
         <w:pStyle w:val="BodyText"/>
       </w:pPr>
       <w:r>
-        <w:t xml:space="preserve">We constructed a five-class, recruitment-free Lefkovitch transition matrix from the prepared natural-colony transition data. The dominant eigenvalue (lambda) represented conditional annual growth of the observed post-settlement transition subsystem, not a full population forecast. Matrix support was uneven: five studies contributed survival, three contributed growth, SC5 survival was predominantly supported by NOAA records, and fragmentation was represented by Vardi (2011). We quantified the elasticity of lambda to stasis, growth, retrogression, and fragmentation transitions, and propagated sampling uncertainty through hierarchical bootstrap resampling: studies were resampled first, then observations within sampled studies. We used 2,000 valid bootstrap replicates and leave-one-study-out analyses to characterize dependence on the contributing datasets; 43 bootstrap replicates imputed at least one missing size-class survival value, and the resampling did not propagate survival–growth covariance.</w:t>
+        <w:t xml:space="preserve">We constructed a five-class, recruitment-free Lefkovitch transition matrix from the prepared natural-colony transition data. The dominant eigenvalue (lambda) represented conditional annual growth of the observed post-settlement transition subsystem, not a full population forecast. Matrix support was uneven: five studies contributed survival, three contributed growth, SC5 survival was predominantly supported by NOAA records, and fragmentation was represented only by Vardi</w:t>
+      </w:r>
+      <w:r>
+        <w:t xml:space="preserve"> </w:t>
+      </w:r>
+      <w:r>
+        <w:t xml:space="preserve">(</w:t>
+      </w:r>
+      <w:hyperlink w:anchor="ref-vardi2011">
+        <w:r>
+          <w:rPr>
+            <w:rStyle w:val="Hyperlink"/>
+          </w:rPr>
+          <w:t xml:space="preserve">2011</w:t>
+        </w:r>
+      </w:hyperlink>
+      <w:r>
+        <w:t xml:space="preserve">)</w:t>
+      </w:r>
+      <w:r>
+        <w:t xml:space="preserve">. We quantified the elasticity of lambda to stasis, growth, retrogression, and fragmentation transitions, and propagated sampling uncertainty through hierarchical bootstrap resampling: studies were resampled first, then observations within sampled studies. We used 2,000 valid bootstrap replicates and leave-one-study-out analyses to characterize dependence on the contributing datasets; 43 bootstrap replicates imputed at least one missing size-class survival value, and the resampling did not propagate survival–growth covariance.</w:t>
       </w:r>
     </w:p>
     <w:p>
@@ -1121,19 +1667,7 @@
           <w:rPr>
             <w:rStyle w:val="Hyperlink"/>
           </w:rPr>
-          <w:t xml:space="preserve">Manzello et al.</w:t>
-        </w:r>
-        <w:r>
-          <w:rPr>
-            <w:rStyle w:val="Hyperlink"/>
-          </w:rPr>
-          <w:t xml:space="preserve"> </w:t>
-        </w:r>
-        <w:r>
-          <w:rPr>
-            <w:rStyle w:val="Hyperlink"/>
-          </w:rPr>
-          <w:t xml:space="preserve">2025</w:t>
+          <w:t xml:space="preserve">Manzello et al. 2025</w:t>
         </w:r>
       </w:hyperlink>
       <w:r>
@@ -1143,7 +1677,7 @@
         <w:t xml:space="preserve"> </w:t>
       </w:r>
       <w:r>
-        <w:t xml:space="preserve">(ED50 = 7.8 degree-heating weeks [DHW], ED95 = 17.6 DHW) to define 8-, 12-, and 18-DHW sensitivity scenarios. We then added an observed-2023 Florida endpoint: 97.8–100% mortality, represented by a 0–2.2% heatwave-year survival multiplier. The deterministic projection used the midpoint of that range; because the published study reports bounds rather than a colony-level sampling distribution, Monte Carlo projections sampled uniformly across the reported range at each prescribed event. Heatwave pulses were applied after the annual matrix transition to all size classes, consistent with the reported absence of size refuge during the Florida event. We report the geometric mean of annual abundance ratios as effective lambda under recurrence intervals of 5, 10, 20, and 50 years. These intervals span frequent to rare recurrence and are sensitivity values, not estimates of future return periods. The scenarios are stress tests for a Florida-like event sequence, not estimates of a Caribbean-wide thermal mortality rate or full population viability.</w:t>
+        <w:t xml:space="preserve">(ED50 = 7.8 degree-heating weeks [DHW], ED95 = 17.6 DHW) to define 8-, 12-, and 18-DHW sensitivity scenarios. We then added an observed-2023 Florida endpoint: 97.8–100% mortality, represented by a 0–2.2% heatwave-year survival multiplier. The deterministic projection used the midpoint of that range; because the published study reports bounds rather than a colony-level sampling distribution, Monte Carlo projections sampled uniformly across the reported range at each prescribed event. Heatwave pulses were applied after the annual matrix transition to all size classes, consistent with the reported absence of size refuge during the Florida event. We report the geometric mean of annual abundance ratios as effective lambda under recurrence intervals of 5, 10, 20, and 50 years, and the probability that total abundance fell below 10% of its initial value within 50 years (quasi-extinction). These intervals span frequent to rare recurrence and are sensitivity values, not estimates of future return periods. The scenarios are stress tests for a Florida-like event sequence, not estimates of a Caribbean-wide thermal mortality rate or full population viability.</w:t>
       </w:r>
     </w:p>
     <w:bookmarkEnd w:id="14"/>
@@ -1189,7 +1723,7 @@
         <w:pStyle w:val="FirstParagraph"/>
       </w:pPr>
       <w:r>
-        <w:t xml:space="preserve">The synthesis combined individual-level monitoring with study-level records across 13 Caribbean regions (Fig. 1). Coverage was geographically uneven: Florida supplied the largest share of observations, whereas several non-Florida regions contributed data from only a subset of size classes. Large adults outside Florida, Curaçao, and Navassa were particularly sparse. This imbalance matters because large colonies have the greatest demographic leverage in the projection model, while the regional settings in which they are best represented do not encompass the full Caribbean range.</w:t>
+        <w:t xml:space="preserve">The synthesis combined individual-level monitoring with study-level records across 13 Caribbean regions (Fig. 1). Coverage was geographically uneven: the Florida Keys supplied 6,222 observations, more than all other regions combined, whereas several non-Florida regions contributed data from only a subset of size classes. Large adults outside Florida, Curaçao, and Navassa were particularly sparse. This imbalance matters because large colonies have the greatest demographic leverage in the projection model, while the regional settings in which they are best represented do not encompass the full Caribbean range.</w:t>
       </w:r>
     </w:p>
     <w:bookmarkEnd w:id="17"/>
@@ -1207,7 +1741,7 @@
         <w:pStyle w:val="FirstParagraph"/>
       </w:pPr>
       <w:r>
-        <w:t xml:space="preserve">Survival increased with colony size, although the fitted relationship explained a modest share of individual survival variation (Fig. 2a). The survival model identified a high-size inflection near 7,498 cm², but leave-one-study-out estimates were broad, indicating that the exact location of this threshold was not stable across the study mix. Relative growth rate showed a sharper early ontogenetic transition: the estimated inflection occurred near 37 cm², while the probability of positive growth crossed its threshold near 411 cm² (Online Resource 1, Fig. S1). Relative growth captured size dependence more effectively than absolute growth rate, whose variance increased strongly with colony size.</w:t>
+        <w:t xml:space="preserve">Survival increased with colony size, from roughly 60% below 10 cm² to above 90% beyond 4,000 cm², although size explained less than 10% of the deviance in individual fate (Fig. 2a). The survival GAM outperformed a linear model (ΔAICc = 17.9) and identified a high-size inflection near 7,498 cm², but leave-one-study-out estimates were broad, indicating that the exact location of this threshold was not stable across the study mix. Relative growth rate showed a sharper early ontogenetic transition: the estimated inflection occurred near 37 cm², while the probability of positive growth crossed its threshold near 411 cm² (Online Resource 1, Fig. S1). Relative growth captured size dependence more effectively than absolute growth rate, whose variance increased strongly with colony size.</w:t>
       </w:r>
     </w:p>
     <w:p>
@@ -1215,7 +1749,7 @@
         <w:pStyle w:val="BodyText"/>
       </w:pPr>
       <w:r>
-        <w:t xml:space="preserve">Study-level survival estimates by size class reinforced this pattern but also showed substantial overlap among classes and studies (Fig. 2c). Size therefore structured demographic performance, but it did not supply a region- or disturbance-independent prediction of fate. The widest variability occurred among the smaller and intermediate classes, where study context, disturbance history, and population type varied most strongly.</w:t>
+        <w:t xml:space="preserve">Study-level survival estimates by size class showed that the size effect was concentrated in the largest classes (Fig. 2c). Pooled survival was nearly flat from SC1 to SC3 (77.3%, 75.1%, and 76.6%) and then rose to 90.9% in SC4 and 94.7% in SC5, where every study estimate exceeded 82%. Among-study spread was widest in SC1–SC3, where individual estimates ranged from about 40% to 100% and where study context, disturbance history, and population type varied most strongly. Size therefore structured demographic performance, but it did not supply a region- or disturbance-independent prediction of fate.</w:t>
       </w:r>
     </w:p>
     <w:bookmarkEnd w:id="18"/>
@@ -1233,7 +1767,33 @@
         <w:pStyle w:val="FirstParagraph"/>
       </w:pPr>
       <w:r>
-        <w:t xml:space="preserve">The expanded synthesis estimated pooled annual survival at 78.7% (95% CI: 70.4–85.1%; 95% prediction interval: 37.4–95.8%) across 17 studies and 22 study-region effects (Fig. 3a). Tier 1 and Tier 2 effects were both annualized before aggregation. Heterogeneity was high (I² = 97.6%), so the pooled value summarizes the assembled evidence rather than a Caribbean-wide constant.</w:t>
+        <w:t xml:space="preserve">The expanded synthesis estimated pooled annual survival at 78.7% (95% CI: 70.4–85.1%; 95% prediction interval: 37.4–95.8%) across 17 studies and 22 study-region effects (Fig. 3a). Tier 1 and Tier 2 effects were both annualized before aggregation. Heterogeneity was high (I² = 97.6%; τ² = 0.72, of which 0.29 was between studies and 0.44 within studies), so the pooled value summarizes the assembled evidence rather than a Caribbean-wide constant. No single study moved the independent-effect estimate by more than 2.6 percentage points in leave-one-out analyses, and restricting the synthesis to the 13 studies with the highest methodological-quality scores changed it by less than 1 point. Evidence for small-study asymmetry was mixed: the Egger-type test was not significant for the independent-effect model (</w:t>
+      </w:r>
+      <w:r>
+        <w:rPr>
+          <w:i/>
+          <w:iCs/>
+        </w:rPr>
+        <w:t xml:space="preserve">p</w:t>
+      </w:r>
+      <w:r>
+        <w:t xml:space="preserve"> </w:t>
+      </w:r>
+      <w:r>
+        <w:t xml:space="preserve">= 0.55) but was significant for the three-level model (</w:t>
+      </w:r>
+      <w:r>
+        <w:rPr>
+          <w:i/>
+          <w:iCs/>
+        </w:rPr>
+        <w:t xml:space="preserve">p</w:t>
+      </w:r>
+      <w:r>
+        <w:t xml:space="preserve"> </w:t>
+      </w:r>
+      <w:r>
+        <w:t xml:space="preserve">= 0.001), and trim-and-fill imputed three effects and lowered the independent-effect estimate from 80.1% to 77.3%.</w:t>
       </w:r>
     </w:p>
     <w:p>
@@ -1241,7 +1801,52 @@
         <w:pStyle w:val="BodyText"/>
       </w:pPr>
       <w:r>
-        <w:t xml:space="preserve">Natural-colony effects had higher pooled survival than restoration-fragment effects (84.1% versus 74.5%), but the difference was not statistically supported in the expanded meta-analysis. Regional variation remained substantial within population types (Fig. 3b). The overlap-zone comparison likewise showed that study identity and sampling context could not be separated cleanly from population origin (Online Resource 1, Fig. S2). These analyses do not support a single general survival penalty or benefit of restoration origin.</w:t>
+        <w:t xml:space="preserve">Natural-colony effects had higher pooled survival than restoration-fragment effects (85.4%, 95% CI 72.9–92.7%,</w:t>
+      </w:r>
+      <w:r>
+        <w:t xml:space="preserve"> </w:t>
+      </w:r>
+      <w:r>
+        <w:rPr>
+          <w:i/>
+          <w:iCs/>
+        </w:rPr>
+        <w:t xml:space="preserve">k</w:t>
+      </w:r>
+      <w:r>
+        <w:t xml:space="preserve"> </w:t>
+      </w:r>
+      <w:r>
+        <w:t xml:space="preserve">= 10, versus 74.5%, 63.9–82.9%,</w:t>
+      </w:r>
+      <w:r>
+        <w:t xml:space="preserve"> </w:t>
+      </w:r>
+      <w:r>
+        <w:rPr>
+          <w:i/>
+          <w:iCs/>
+        </w:rPr>
+        <w:t xml:space="preserve">k</w:t>
+      </w:r>
+      <w:r>
+        <w:t xml:space="preserve"> </w:t>
+      </w:r>
+      <w:r>
+        <w:t xml:space="preserve">= 12), but population type was not a supported moderator (</w:t>
+      </w:r>
+      <w:r>
+        <w:rPr>
+          <w:i/>
+          <w:iCs/>
+        </w:rPr>
+        <w:t xml:space="preserve">p</w:t>
+      </w:r>
+      <w:r>
+        <w:t xml:space="preserve"> </w:t>
+      </w:r>
+      <w:r>
+        <w:t xml:space="preserve">= 0.20). With 22 effects, the minimum detectable difference at 80% power was about 20 percentage points, so the analysis could not have reliably detected the observed 10.9-point difference. Regional variation remained substantial within population types (Fig. 3b). The overlap-zone comparison likewise showed that study identity and sampling context could not be separated cleanly from population origin (Online Resource 1, Fig. S2). These analyses do not support a single general survival penalty or benefit of restoration origin.</w:t>
       </w:r>
     </w:p>
     <w:bookmarkEnd w:id="19"/>
@@ -1277,7 +1882,100 @@
         <w:pStyle w:val="FirstParagraph"/>
       </w:pPr>
       <w:r>
-        <w:t xml:space="preserve">The study-window audit covered 1,072 demographic intervals, 95.1% of which overlapped at least one curated disturbance or chronic-pressure record (Online Resource 1, Table S1). The survival relationship with colony size differed among intervals with no curated disturbance, context-only pressure, and acute baseline-exclusion exposure (likelihood-ratio test, (p&lt;0.001); Online Resource 1, Fig. S4). Growth-side interaction evidence was weaker and is therefore treated as supportive rather than definitive. Excluding all acute baseline-exclusion intervals changed the pooled survival estimate by only −0.3 percentage points, indicating that the main pooled result was not driven solely by locally identified acute events. Instead, disturbance exposure was pervasive across the monitored demographic regime.</w:t>
+        <w:t xml:space="preserve">The study-window audit covered 1,072 demographic intervals, 95.1% of which overlapped at least one curated disturbance or chronic-pressure record (Online Resource 1, Table S2). Only 353 of 6,141 natural-colony survival records came from intervals with no curated disturbance, and 193 of those were SC5 colonies. The survival relationship with colony size differed among intervals with no curated disturbance, context-only pressure, and acute baseline-exclusion exposure (likelihood-ratio test,</w:t>
+      </w:r>
+      <w:r>
+        <w:t xml:space="preserve"> </w:t>
+      </w:r>
+      <w:r>
+        <w:rPr>
+          <w:i/>
+          <w:iCs/>
+        </w:rPr>
+        <w:t xml:space="preserve">p</w:t>
+      </w:r>
+      <w:r>
+        <w:t xml:space="preserve"> </w:t>
+      </w:r>
+      <w:r>
+        <w:t xml:space="preserve">&lt; 0.001; Online Resource 1, Fig. S4), but not in the direction a simple disturbance penalty would predict. Large colonies survived better in intervals flagged for acute events (SC5: 98.0%,</w:t>
+      </w:r>
+      <w:r>
+        <w:t xml:space="preserve"> </w:t>
+      </w:r>
+      <w:r>
+        <w:rPr>
+          <w:i/>
+          <w:iCs/>
+        </w:rPr>
+        <w:t xml:space="preserve">n</w:t>
+      </w:r>
+      <w:r>
+        <w:t xml:space="preserve"> </w:t>
+      </w:r>
+      <w:r>
+        <w:t xml:space="preserve">= 409; SC4: 90.4%,</w:t>
+      </w:r>
+      <w:r>
+        <w:t xml:space="preserve"> </w:t>
+      </w:r>
+      <w:r>
+        <w:rPr>
+          <w:i/>
+          <w:iCs/>
+        </w:rPr>
+        <w:t xml:space="preserve">n</w:t>
+      </w:r>
+      <w:r>
+        <w:t xml:space="preserve"> </w:t>
+      </w:r>
+      <w:r>
+        <w:t xml:space="preserve">= 250) than in intervals with no curated event (SC5: 83.9%,</w:t>
+      </w:r>
+      <w:r>
+        <w:t xml:space="preserve"> </w:t>
+      </w:r>
+      <w:r>
+        <w:rPr>
+          <w:i/>
+          <w:iCs/>
+        </w:rPr>
+        <w:t xml:space="preserve">n</w:t>
+      </w:r>
+      <w:r>
+        <w:t xml:space="preserve"> </w:t>
+      </w:r>
+      <w:r>
+        <w:t xml:space="preserve">= 193; SC4: 79.1%,</w:t>
+      </w:r>
+      <w:r>
+        <w:t xml:space="preserve"> </w:t>
+      </w:r>
+      <w:r>
+        <w:rPr>
+          <w:i/>
+          <w:iCs/>
+        </w:rPr>
+        <w:t xml:space="preserve">n</w:t>
+      </w:r>
+      <w:r>
+        <w:t xml:space="preserve"> </w:t>
+      </w:r>
+      <w:r>
+        <w:t xml:space="preserve">= 91), whereas survival of SC2 and SC3 colonies differed by less than 6 percentage points among states. The size-by-exposure interaction for the probability of positive growth was weaker (</w:t>
+      </w:r>
+      <w:r>
+        <w:rPr>
+          <w:i/>
+          <w:iCs/>
+        </w:rPr>
+        <w:t xml:space="preserve">p</w:t>
+      </w:r>
+      <w:r>
+        <w:t xml:space="preserve"> </w:t>
+      </w:r>
+      <w:r>
+        <w:t xml:space="preserve">= 0.010). Excluding all acute baseline-exclusion intervals from the individual-level synthesis (six studies) changed its pooled survival from 75.9% to 75.6%, indicating that the pooled result was not driven by locally identified acute events. Disturbance exposure was instead pervasive across the monitored demographic regime.</w:t>
       </w:r>
     </w:p>
     <w:bookmarkEnd w:id="21"/>
@@ -1313,7 +2011,27 @@
         <w:pStyle w:val="FirstParagraph"/>
       </w:pPr>
       <w:r>
-        <w:t xml:space="preserve">The recruitment-free transition matrix estimated a deterministic lambda of 0.961 (95% bootstrap interval: 0.816–1.010; Fig. 4). In 94.3% of hierarchical-bootstrap replicates, lambda was below one. This resampling fraction characterizes uncertainty in the compiled transition rates; it is not a probability of real-world population decline. Stasis dominated the transition matrix, and SC5-to-SC5 stasis accounted for 58.9% of matrix-cell elasticity. Leave-one-study-out estimates of lambda ranged from 0.882 to 0.993, indicating substantial dependence on the small number of natural-colony transition datasets. Within this conditional, recruitment-free subsystem, persistence of large adults had more influence on lambda than marginal changes in any single early transition.</w:t>
+        <w:t xml:space="preserve">The recruitment-free transition matrix estimated a deterministic lambda of 0.961 (95% bootstrap interval: 0.816–1.010; Fig. 4). In 94.3% of hierarchical-bootstrap replicates, lambda was below one. This resampling fraction characterizes uncertainty in the compiled transition rates; it is not a probability of real-world population decline. Stasis dominated the transition matrix, and SC5-to-SC5 stasis accounted for 58.9% of matrix-cell elasticity. Leave-one-study-out estimates of lambda ranged from 0.882 (excluding NOAA monitoring) to 0.993 (excluding Neely et al.</w:t>
+      </w:r>
+      <w:r>
+        <w:t xml:space="preserve"> </w:t>
+      </w:r>
+      <w:r>
+        <w:t xml:space="preserve">(</w:t>
+      </w:r>
+      <w:hyperlink w:anchor="ref-neely2022">
+        <w:r>
+          <w:rPr>
+            <w:rStyle w:val="Hyperlink"/>
+          </w:rPr>
+          <w:t xml:space="preserve">2022</w:t>
+        </w:r>
+      </w:hyperlink>
+      <w:r>
+        <w:t xml:space="preserve">)</w:t>
+      </w:r>
+      <w:r>
+        <w:t xml:space="preserve">), indicating substantial dependence on the three natural-colony transition datasets. Removing fragmentation altogether lowered lambda to 0.892, so asexual fragment production, estimated from a single study, contributed about 0.07 to the deterministic growth rate. Within this conditional, recruitment-free subsystem, persistence of large adults had more influence on lambda than marginal changes in any single early transition.</w:t>
       </w:r>
     </w:p>
     <w:bookmarkEnd w:id="23"/>
@@ -1331,7 +2049,7 @@
         <w:pStyle w:val="FirstParagraph"/>
       </w:pPr>
       <w:r>
-        <w:t xml:space="preserve">The thermal-event layer did not alter the chronic-regime matrix lambda; it estimated the conditional consequence of recurrent survival pulses. Under the observed 2023 Florida endpoint, effective lambda was 0.355, 0.576, 0.769, and 0.846 when a Florida-like event recurred every 5, 10, 20, and 50 years, respectively (Online Resource 1, Fig. S6). The corresponding 50-year quasi-extinction probabilities were 100% in these simulations because the baseline subsystem was already declining. The 18-DHW dose-response sensitivity scenario was less severe than the observed endpoint because its fitted mortality was 95.5%, rather than the 97.8–100% mortality reported from the Florida Keys and Dry Tortugas. These results should not be extrapolated as a Caribbean-wide forecast: they show that recovery trajectories conditional on the compiled post-settlement matrix are highly vulnerable to recurrence of an event of the observed Florida magnitude.</w:t>
+        <w:t xml:space="preserve">The thermal-event layer did not alter the chronic-regime matrix lambda; it estimated the conditional consequence of recurrent survival pulses. Under the observed 2023 Florida endpoint, effective lambda was 0.355, 0.576, 0.769, and 0.846 when a Florida-like event recurred every 5, 10, 20, and 50 years, respectively (Online Resource 1, Fig. S6). Every observed-endpoint scenario reached quasi-extinction within 50 years in all simulations. The baseline was already precarious: without heatwaves, the stochastic projections had an effective lambda of 0.933, lower than the deterministic 0.961 because the simulations drew from bootstrap-resampled matrices, and a 70.8% probability of quasi-extinction within 50 years. The 18-DHW dose-response sensitivity scenario was less severe than the observed endpoint because its fitted mortality was 95.5%, rather than the 97.8–100% mortality reported from the Florida Keys and Dry Tortugas. These results should not be extrapolated as a Caribbean-wide forecast: they show that recovery trajectories conditional on the compiled post-settlement matrix are highly vulnerable to recurrence of an event of the observed Florida magnitude.</w:t>
       </w:r>
     </w:p>
     <w:bookmarkEnd w:id="24"/>
@@ -1374,7 +2092,75 @@
         <w:pStyle w:val="BodyText"/>
       </w:pPr>
       <w:r>
-        <w:t xml:space="preserve">Large colonies carried the greatest leverage for population growth because their stasis had the highest elasticity. This result is consistent with size-structured coral demography, in which large colonies combine higher survival, reproductive potential, and the capacity to produce fragments (Vardi et al. 2012; Madin et al. 2025). However, large colonies were not invulnerable. Tissue loss was frequent even in the largest class, and colonies in every non-recruit class sometimes retrogressed. The implication is not simply that restoration should make colonies larger. Rather, strategies should be evaluated by whether they keep colonies alive and prevent the backward transitions that erode the adult size structure.</w:t>
+        <w:t xml:space="preserve">Large colonies carried the greatest leverage for population growth because their stasis had the highest elasticity. This result is consistent with size-structured coral demography, in which large colonies combine higher survival, reproductive potential, and the capacity to produce fragments</w:t>
+      </w:r>
+      <w:r>
+        <w:t xml:space="preserve"> </w:t>
+      </w:r>
+      <w:r>
+        <w:t xml:space="preserve">(</w:t>
+      </w:r>
+      <w:hyperlink w:anchor="ref-lirman2000">
+        <w:r>
+          <w:rPr>
+            <w:rStyle w:val="Hyperlink"/>
+          </w:rPr>
+          <w:t xml:space="preserve">Lirman 2000</w:t>
+        </w:r>
+      </w:hyperlink>
+      <w:r>
+        <w:t xml:space="preserve">;</w:t>
+      </w:r>
+      <w:r>
+        <w:t xml:space="preserve"> </w:t>
+      </w:r>
+      <w:hyperlink w:anchor="ref-vardi2012">
+        <w:r>
+          <w:rPr>
+            <w:rStyle w:val="Hyperlink"/>
+          </w:rPr>
+          <w:t xml:space="preserve">Vardi et al. 2012</w:t>
+        </w:r>
+      </w:hyperlink>
+      <w:r>
+        <w:t xml:space="preserve">;</w:t>
+      </w:r>
+      <w:r>
+        <w:t xml:space="preserve"> </w:t>
+      </w:r>
+      <w:hyperlink w:anchor="ref-madin2025">
+        <w:r>
+          <w:rPr>
+            <w:rStyle w:val="Hyperlink"/>
+          </w:rPr>
+          <w:t xml:space="preserve">Madin et al. 2025</w:t>
+        </w:r>
+      </w:hyperlink>
+      <w:r>
+        <w:t xml:space="preserve">)</w:t>
+      </w:r>
+      <w:r>
+        <w:t xml:space="preserve">. It also matches the earlier Florida matrix, in which stasis of the largest class had the highest elasticity</w:t>
+      </w:r>
+      <w:r>
+        <w:t xml:space="preserve"> </w:t>
+      </w:r>
+      <w:r>
+        <w:t xml:space="preserve">(</w:t>
+      </w:r>
+      <w:hyperlink w:anchor="ref-vardi2012">
+        <w:r>
+          <w:rPr>
+            <w:rStyle w:val="Hyperlink"/>
+          </w:rPr>
+          <w:t xml:space="preserve">Vardi et al. 2012</w:t>
+        </w:r>
+      </w:hyperlink>
+      <w:r>
+        <w:t xml:space="preserve">)</w:t>
+      </w:r>
+      <w:r>
+        <w:t xml:space="preserve">. That matrix drew on the same northern Florida Keys monitoring that dominates our SC5 data, however, so the agreement is expected rather than independent confirmation. However, large colonies were not invulnerable. Tissue loss was frequent even in the largest class, and colonies in every non-recruit class sometimes retrogressed. The implication is not simply that restoration should make colonies larger. Rather, strategies should be evaluated by whether they keep colonies alive and prevent the backward transitions that erode the adult size structure.</w:t>
       </w:r>
     </w:p>
     <w:p>
@@ -1390,7 +2176,27 @@
         <w:pStyle w:val="BodyText"/>
       </w:pPr>
       <w:r>
-        <w:t xml:space="preserve">Most intervals in the synthesis overlapped a documented event or chronic pressure, and the size–survival relationship differed among disturbance states. The disturbance layer does not identify a single causal effect of storms, disease, or heat because the underlying studies were not designed as a common experiment and their event histories differed. The evidence therefore supports a narrower conclusion: transition analyses should retain disturbance history as part of the context in which observed size-dependent rates were generated. The 2023 heatwave makes this boundary especially important. Our chronic-regime matrix is not a forecast under severe contemporary thermal stress; the separate Florida event-pulse scenarios show how quickly its conditional trajectories deteriorate when Florida-scale mortality recurs (Manzello et al. 2025).</w:t>
+        <w:t xml:space="preserve">Most intervals in the synthesis overlapped a documented event or chronic pressure, and the size–survival relationship differed among disturbance states. The direction of that difference is the more instructive result. Large colonies survived better in intervals flagged for acute events than in the few intervals with no curated event, which is the opposite of a disturbance penalty. We interpret this as evidence that exposure categories track study, site, and survey period at least as closely as they track realized disturbance intensity: the undisturbed category was small and drawn from a narrow set of studies and years. The disturbance layer therefore does not identify a causal effect of storms, disease, or heat, because the underlying studies were not designed as a common experiment and their event histories differed. The evidence supports a narrower conclusion: transition analyses should retain disturbance history as part of the context in which observed size-dependent rates were generated. The 2023 heatwave makes this boundary especially important. Our chronic-regime matrix is not a forecast under severe contemporary thermal stress; the separate Florida event-pulse scenarios show how quickly its conditional trajectories deteriorate when Florida-scale mortality recurs</w:t>
+      </w:r>
+      <w:r>
+        <w:t xml:space="preserve"> </w:t>
+      </w:r>
+      <w:r>
+        <w:t xml:space="preserve">(</w:t>
+      </w:r>
+      <w:hyperlink w:anchor="ref-manzello2025">
+        <w:r>
+          <w:rPr>
+            <w:rStyle w:val="Hyperlink"/>
+          </w:rPr>
+          <w:t xml:space="preserve">Manzello et al. 2025</w:t>
+        </w:r>
+      </w:hyperlink>
+      <w:r>
+        <w:t xml:space="preserve">)</w:t>
+      </w:r>
+      <w:r>
+        <w:t xml:space="preserve">.</w:t>
       </w:r>
     </w:p>
     <w:p>
@@ -1398,7 +2204,91 @@
         <w:pStyle w:val="BodyText"/>
       </w:pPr>
       <w:r>
-        <w:t xml:space="preserve">The restoration comparison likewise requires a constrained interpretation. Natural-colony and broad restoration-fragment effects overlapped in the expanded meta-analysis, but the subtype decomposition showed marked variation among nursery outplants, re-cemented colonies, direct outplants, and natural fragments. These materials differ in handling, age, size, substrate, and exposure; the present data do not isolate any one of those mechanisms. However, the result does show that average restoration survival is not a transferable property of a generic fragment. This is an important distinction for programs that use benchmarks from related species or later life stages. A target that is realistic for established outplants may be inappropriate for the earliest steps of sexual propagation, when survival bottlenecks are likely to be different.</w:t>
+        <w:t xml:space="preserve">The restoration comparison likewise requires a constrained interpretation. Natural-colony and broad restoration-fragment effects overlapped in the expanded meta-analysis, but the subtype decomposition showed marked variation among nursery outplants, re-cemented colonies, direct outplants, and natural fragments. These materials differ in handling, age, size, substrate, and exposure; the present data do not isolate any one of those mechanisms. However, the result does show that average restoration survival is not a transferable property of a generic fragment. This is an important distinction for programs that use benchmarks from related species or later life stages, such as the first-year survival targets developed for</w:t>
+      </w:r>
+      <w:r>
+        <w:t xml:space="preserve"> </w:t>
+      </w:r>
+      <w:r>
+        <w:rPr>
+          <w:i/>
+          <w:iCs/>
+        </w:rPr>
+        <w:t xml:space="preserve">Acropora cervicornis</w:t>
+      </w:r>
+      <w:r>
+        <w:t xml:space="preserve"> </w:t>
+      </w:r>
+      <w:r>
+        <w:t xml:space="preserve">(</w:t>
+      </w:r>
+      <w:hyperlink w:anchor="ref-schopmeyer2017">
+        <w:r>
+          <w:rPr>
+            <w:rStyle w:val="Hyperlink"/>
+          </w:rPr>
+          <w:t xml:space="preserve">Schopmeyer et al. 2017</w:t>
+        </w:r>
+      </w:hyperlink>
+      <w:r>
+        <w:t xml:space="preserve">)</w:t>
+      </w:r>
+      <w:r>
+        <w:t xml:space="preserve">. A target that is realistic for established outplants may be inappropriate for the earliest steps of sexual propagation, when survival of settlers and recruits is typically far lower</w:t>
+      </w:r>
+      <w:r>
+        <w:t xml:space="preserve"> </w:t>
+      </w:r>
+      <w:r>
+        <w:t xml:space="preserve">(</w:t>
+      </w:r>
+      <w:hyperlink w:anchor="ref-chamberland2015">
+        <w:r>
+          <w:rPr>
+            <w:rStyle w:val="Hyperlink"/>
+          </w:rPr>
+          <w:t xml:space="preserve">Chamberland et al. 2015</w:t>
+        </w:r>
+      </w:hyperlink>
+      <w:r>
+        <w:t xml:space="preserve">;</w:t>
+      </w:r>
+      <w:r>
+        <w:t xml:space="preserve"> </w:t>
+      </w:r>
+      <w:hyperlink w:anchor="ref-mendozaquiroz2023">
+        <w:r>
+          <w:rPr>
+            <w:rStyle w:val="Hyperlink"/>
+          </w:rPr>
+          <w:t xml:space="preserve">Mendoza Quiroz et al. 2023</w:t>
+        </w:r>
+      </w:hyperlink>
+      <w:r>
+        <w:t xml:space="preserve">)</w:t>
+      </w:r>
+      <w:r>
+        <w:t xml:space="preserve">. Monitoring windows compound the problem: 60% of coral restoration projects reported less than 18 months of monitoring</w:t>
+      </w:r>
+      <w:r>
+        <w:t xml:space="preserve"> </w:t>
+      </w:r>
+      <w:r>
+        <w:t xml:space="preserve">(</w:t>
+      </w:r>
+      <w:hyperlink w:anchor="ref-bostromeinarsson2020">
+        <w:r>
+          <w:rPr>
+            <w:rStyle w:val="Hyperlink"/>
+          </w:rPr>
+          <w:t xml:space="preserve">Boström-Einarsson et al. 2020</w:t>
+        </w:r>
+      </w:hyperlink>
+      <w:r>
+        <w:t xml:space="preserve">)</w:t>
+      </w:r>
+      <w:r>
+        <w:t xml:space="preserve">, too short to observe the adult transitions that carried the most weight in our matrix.</w:t>
       </w:r>
     </w:p>
     <w:p>
@@ -1406,7 +2296,7 @@
         <w:pStyle w:val="BodyText"/>
       </w:pPr>
       <w:r>
-        <w:t xml:space="preserve">Extreme heterogeneity is the central limitation and the central contribution of this synthesis. The prediction interval spanned most of the probability scale, mortality definitions varied among source studies, and the individual-level dataset was heavily weighted toward Florida. Large adults outside a few regions remained poorly represented, even though they had the greatest elasticity. These limitations constrain the precision of absolute regional estimates and the generality of the projected lambda. However, they do not erase the recurring patterns: size dependence, frequent partial mortality, large-adult leverage, and the importance of disturbance and intervention context. By retaining study identity, reporting prediction intervals, and distinguishing material subtypes, the synthesis makes these limitations visible rather than embedding them in an apparently precise pooled rate.</w:t>
+        <w:t xml:space="preserve">Extreme heterogeneity is the central limitation and the central contribution of this synthesis. The prediction interval spanned most of the probability scale, mortality definitions and monitoring intervals varied among source studies, NOAA monitoring supplied 78% of the individual-level records, and the three-level model showed evidence of small-study asymmetry. Large adults outside a few regions remained poorly represented, even though they had the greatest elasticity. These limitations constrain the precision of absolute regional estimates and the generality of the projected lambda. However, they do not erase the recurring patterns: size dependence, frequent partial mortality, large-adult leverage, and the importance of disturbance and intervention context. By retaining study identity, reporting prediction intervals, and distinguishing material subtypes, the synthesis makes these limitations visible rather than embedding them in an apparently precise pooled rate.</w:t>
       </w:r>
     </w:p>
     <w:p>
@@ -1414,7 +2304,7 @@
         <w:pStyle w:val="BodyText"/>
       </w:pPr>
       <w:r>
-        <w:t xml:space="preserve">The next empirical priority is therefore not another undifferentiated estimate of average survival. Longitudinal monitoring should target the transitions that most limit inference: survival and retrogression of large adults outside Florida, early post-outplant survival for defined restoration materials, and the responses of those transitions to heat, disease, and storms. Comparable measurements of live area, mortality definition, monitoring interval, colony origin, and disturbance exposure would allow future synthesis to distinguish biological variation from measurement variation. Recruitment and fecundity remain less well estimated than survival and growth, so a fully Caribbean-wide demographic model still requires better information on early-life and reproductive transitions.</w:t>
+        <w:t xml:space="preserve">The next empirical priority is therefore not another undifferentiated estimate of average survival. Three gaps limit inference most. (1) Survival and retrogression of large adults outside Florida: SC5 carried 60% of the aggregated survival elasticity but was supported mainly by NOAA monitoring, and excluding that one dataset lowered lambda from 0.961 to 0.882. (2) Early post-outplant survival for defined restoration materials, reported by subtype, size at outplanting, and time since outplanting, so that nursery outplants, re-cemented fragments, and sexual recruits are no longer pooled. (3) Fragmentation and sexual recruitment: fragment production rested on a single study yet contributed about 0.07 to lambda, and sexual recruitment was fixed at zero, so a full Caribbean population model still requires field estimates of both. Across all three, comparable measurements of live area, mortality definition, monitoring interval, colony origin, and disturbance exposure would allow future syntheses to separate biological variation from measurement variation.</w:t>
       </w:r>
     </w:p>
     <w:p>
@@ -1439,16 +2329,34 @@
       </w:r>
     </w:p>
     <w:bookmarkEnd w:id="26"/>
-    <w:bookmarkStart w:id="35" w:name="statements-and-declarations"/>
+    <w:bookmarkStart w:id="27" w:name="acknowledgements"/>
     <w:p>
       <w:pPr>
         <w:pStyle w:val="Heading2"/>
       </w:pPr>
       <w:r>
+        <w:t xml:space="preserve">Acknowledgements</w:t>
+      </w:r>
+    </w:p>
+    <w:p>
+      <w:pPr>
+        <w:pStyle w:val="FirstParagraph"/>
+      </w:pPr>
+      <w:r>
+        <w:t xml:space="preserve">We thank the NOAA Southeast Fisheries Science Center, K. Neely, the US Geological Survey, and FUNDEMAR for sharing monitoring data, and the authors of the published studies whose summaries made this synthesis possible. [Authors to confirm the individuals and programs to acknowledge.]</w:t>
+      </w:r>
+    </w:p>
+    <w:bookmarkEnd w:id="27"/>
+    <w:bookmarkStart w:id="36" w:name="statements-and-declarations"/>
+    <w:p>
+      <w:pPr>
+        <w:pStyle w:val="Heading2"/>
+      </w:pPr>
+      <w:r>
         <w:t xml:space="preserve">Statements and Declarations</w:t>
       </w:r>
     </w:p>
-    <w:bookmarkStart w:id="27" w:name="funding"/>
+    <w:bookmarkStart w:id="28" w:name="funding"/>
     <w:p>
       <w:pPr>
         <w:pStyle w:val="Heading3"/>
@@ -1465,8 +2373,8 @@
         <w:t xml:space="preserve">This work was supported by The Nature Conservancy.</w:t>
       </w:r>
     </w:p>
-    <w:bookmarkEnd w:id="27"/>
-    <w:bookmarkStart w:id="28" w:name="competing-interests"/>
+    <w:bookmarkEnd w:id="28"/>
+    <w:bookmarkStart w:id="29" w:name="competing-interests"/>
     <w:p>
       <w:pPr>
         <w:pStyle w:val="Heading3"/>
@@ -1483,8 +2391,8 @@
         <w:t xml:space="preserve">The authors declare no competing interests.</w:t>
       </w:r>
     </w:p>
-    <w:bookmarkEnd w:id="28"/>
-    <w:bookmarkStart w:id="29" w:name="ethics-approval-and-permits"/>
+    <w:bookmarkEnd w:id="29"/>
+    <w:bookmarkStart w:id="30" w:name="ethics-approval-and-permits"/>
     <w:p>
       <w:pPr>
         <w:pStyle w:val="Heading3"/>
@@ -1513,8 +2421,8 @@
         <w:t xml:space="preserve">field collection requiring ethical approval or permits.</w:t>
       </w:r>
     </w:p>
-    <w:bookmarkEnd w:id="29"/>
-    <w:bookmarkStart w:id="30" w:name="consent-to-participate"/>
+    <w:bookmarkEnd w:id="30"/>
+    <w:bookmarkStart w:id="31" w:name="consent-to-participate"/>
     <w:p>
       <w:pPr>
         <w:pStyle w:val="Heading3"/>
@@ -1531,8 +2439,8 @@
         <w:t xml:space="preserve">Not applicable.</w:t>
       </w:r>
     </w:p>
-    <w:bookmarkEnd w:id="30"/>
-    <w:bookmarkStart w:id="31" w:name="consent-to-publish"/>
+    <w:bookmarkEnd w:id="31"/>
+    <w:bookmarkStart w:id="32" w:name="consent-to-publish"/>
     <w:p>
       <w:pPr>
         <w:pStyle w:val="Heading3"/>
@@ -1549,8 +2457,8 @@
         <w:t xml:space="preserve">Not applicable.</w:t>
       </w:r>
     </w:p>
-    <w:bookmarkEnd w:id="31"/>
-    <w:bookmarkStart w:id="33" w:name="data-availability"/>
+    <w:bookmarkEnd w:id="32"/>
+    <w:bookmarkStart w:id="34" w:name="data-availability"/>
     <w:p>
       <w:pPr>
         <w:pStyle w:val="Heading3"/>
@@ -1569,7 +2477,7 @@
       <w:r>
         <w:t xml:space="preserve"> </w:t>
       </w:r>
-      <w:hyperlink r:id="rId32">
+      <w:hyperlink r:id="rId33">
         <w:r>
           <w:rPr>
             <w:rStyle w:val="Hyperlink"/>
@@ -1587,8 +2495,8 @@
         <w:t xml:space="preserve">archival release will be deposited upon acceptance.</w:t>
       </w:r>
     </w:p>
-    <w:bookmarkEnd w:id="33"/>
-    <w:bookmarkStart w:id="34" w:name="author-contributions"/>
+    <w:bookmarkEnd w:id="34"/>
+    <w:bookmarkStart w:id="35" w:name="author-contributions"/>
     <w:p>
       <w:pPr>
         <w:pStyle w:val="Heading3"/>
@@ -1623,9 +2531,9 @@
         <w:t xml:space="preserve">approved the manuscript.</w:t>
       </w:r>
     </w:p>
-    <w:bookmarkEnd w:id="34"/>
     <w:bookmarkEnd w:id="35"/>
-    <w:bookmarkStart w:id="36" w:name="online-resources"/>
+    <w:bookmarkEnd w:id="36"/>
+    <w:bookmarkStart w:id="37" w:name="online-resources"/>
     <w:p>
       <w:pPr>
         <w:pStyle w:val="Heading2"/>
@@ -1665,11 +2573,11 @@
         <w:t xml:space="preserve"> </w:t>
       </w:r>
       <w:r>
-        <w:t xml:space="preserve">demographic synthesis: the study-window disturbance audit and six supplementary figures. Extended diagnostics and source outputs remain available in the public repository.</w:t>
-      </w:r>
-    </w:p>
-    <w:bookmarkEnd w:id="36"/>
-    <w:bookmarkStart w:id="37" w:name="figure-legends"/>
+        <w:t xml:space="preserve">demographic synthesis: a table of contributing studies, the study-window disturbance audit, and six supplementary figures. Extended diagnostics and source outputs remain available in the public repository.</w:t>
+      </w:r>
+    </w:p>
+    <w:bookmarkEnd w:id="37"/>
+    <w:bookmarkStart w:id="38" w:name="figure-legends"/>
     <w:p>
       <w:pPr>
         <w:pStyle w:val="Heading2"/>
@@ -1709,7 +2617,7 @@
         <w:t xml:space="preserve"> </w:t>
       </w:r>
       <w:r>
-        <w:t xml:space="preserve">demographic synthesis. (a) Study locations across the Caribbean. Circle symbols identify regions represented by individual-level observations; triangles identify regions represented only by summary-level studies. Symbol area is proportional to the number of observations, and labels give regional totals. Locations are regional centroids. (b) Availability of individual-level observations by canonical size class and region; cell labels are sample sizes, and darker cells indicate more observations. Empty cells indicate no available observations. Size classes are SC1, 0–10 cm²; SC2, 10–100 cm²; SC3, 100–900 cm²; SC4, 900–4,000 cm²; and SC5, &gt;4,000 cm².</w:t>
+        <w:t xml:space="preserve">demographic synthesis. (a) Study locations across the Caribbean. Circles identify individual-level (Tier 1) studies and triangles summary-level (Tier 2) studies; regions with both are shown with both symbols. Symbol area is proportional to the number of observations, and labels give regional totals. Locations are regional centroids. (b) Availability of individual-level observations by canonical size class and region; cell labels are sample sizes, and darker cells indicate more observations. Empty cells indicate no available observations. Size classes are SC1, 0–10 cm²; SC2, 10–100 cm²; SC3, 100–900 cm²; SC4, 900–4,000 cm²; and SC5, &gt;4,000 cm².</w:t>
       </w:r>
     </w:p>
     <w:p>
@@ -1873,11 +2781,31 @@
         <w:t xml:space="preserve"> </w:t>
       </w:r>
       <w:r>
-        <w:t xml:space="preserve">+ 1; colour encodes probability. (b) Elasticity decomposition by source size class. Stacked bars show stasis, growth, and retrogression; orange points show fragmentation elasticity, which is displayed separately because it is a component of retrogression rather than an additional transition class. (c) Distribution of lambda from 2,000 hierarchical-bootstrap replicates. Orange bars denote replicates with lambda &lt; 1 and blue bars replicates with lambda at least 1; the distribution characterizes uncertainty in the compiled transition rates, not the probability of real-world decline. The dashed line is the deterministic estimate and the solid line marks replacement. (d) Leave-one-study-out lambda estimates. The dashed and dotted lines mark the full-data estimate and replacement, respectively; orange identifies exclusion of the NOAA survey.</w:t>
-      </w:r>
-    </w:p>
-    <w:bookmarkEnd w:id="37"/>
-    <w:bookmarkStart w:id="50" w:name="figures"/>
+        <w:t xml:space="preserve">+ 1; colour encodes probability. The SC5 column sums to more than one because it includes fragments produced by surviving colonies</w:t>
+      </w:r>
+      <w:r>
+        <w:t xml:space="preserve"> </w:t>
+      </w:r>
+      <w:r>
+        <w:t xml:space="preserve">(</w:t>
+      </w:r>
+      <w:hyperlink w:anchor="ref-vardi2011">
+        <w:r>
+          <w:rPr>
+            <w:rStyle w:val="Hyperlink"/>
+          </w:rPr>
+          <w:t xml:space="preserve">Vardi 2011</w:t>
+        </w:r>
+      </w:hyperlink>
+      <w:r>
+        <w:t xml:space="preserve">)</w:t>
+      </w:r>
+      <w:r>
+        <w:t xml:space="preserve">. (b) Elasticity decomposition by source size class. Stacked bars show stasis, growth, and retrogression; orange points show fragmentation elasticity, which is displayed separately because it is a component of retrogression rather than an additional transition class. (c) Distribution of lambda from 2,000 hierarchical-bootstrap replicates. Orange bars denote replicates with lambda &lt; 1 and blue bars replicates with lambda at least 1; the distribution characterizes uncertainty in the compiled transition rates, not the probability of real-world decline. The dashed line is the deterministic estimate and the solid line marks replacement. (d) Leave-one-study-out lambda estimates. The dashed and dotted lines mark the full-data estimate and replacement, respectively; orange identifies exclusion of the NOAA survey.</w:t>
+      </w:r>
+    </w:p>
+    <w:bookmarkEnd w:id="38"/>
+    <w:bookmarkStart w:id="51" w:name="figures"/>
     <w:p>
       <w:pPr>
         <w:pStyle w:val="Heading2"/>
@@ -1895,18 +2823,18 @@
           <wp:inline>
             <wp:extent cx="5334000" cy="5363849"/>
             <wp:effectExtent b="0" l="0" r="0" t="0"/>
-            <wp:docPr descr="" title="" id="39" name="Picture"/>
+            <wp:docPr descr="" title="" id="40" name="Picture"/>
             <a:graphic>
               <a:graphicData uri="http://schemas.openxmlformats.org/drawingml/2006/picture">
                 <pic:pic>
                   <pic:nvPicPr>
-                    <pic:cNvPr descr="06_analysis/figures/manuscript/Fig1_study_landscape.png" id="40" name="Picture"/>
+                    <pic:cNvPr descr="06_analysis/figures/manuscript/Fig1_study_landscape.png" id="41" name="Picture"/>
                     <pic:cNvPicPr>
                       <a:picLocks noChangeArrowheads="1" noChangeAspect="1"/>
                     </pic:cNvPicPr>
                   </pic:nvPicPr>
                   <pic:blipFill>
-                    <a:blip r:embed="rId38"/>
+                    <a:blip r:embed="rId39"/>
                     <a:stretch>
                       <a:fillRect/>
                     </a:stretch>
@@ -1984,18 +2912,18 @@
           <wp:inline>
             <wp:extent cx="5334000" cy="6743421"/>
             <wp:effectExtent b="0" l="0" r="0" t="0"/>
-            <wp:docPr descr="" title="" id="42" name="Picture"/>
+            <wp:docPr descr="" title="" id="43" name="Picture"/>
             <a:graphic>
               <a:graphicData uri="http://schemas.openxmlformats.org/drawingml/2006/picture">
                 <pic:pic>
                   <pic:nvPicPr>
-                    <pic:cNvPr descr="06_analysis/figures/manuscript/Fig2_demographic_rates.png" id="43" name="Picture"/>
+                    <pic:cNvPr descr="06_analysis/figures/manuscript/Fig2_demographic_rates.png" id="44" name="Picture"/>
                     <pic:cNvPicPr>
                       <a:picLocks noChangeArrowheads="1" noChangeAspect="1"/>
                     </pic:cNvPicPr>
                   </pic:nvPicPr>
                   <pic:blipFill>
-                    <a:blip r:embed="rId41"/>
+                    <a:blip r:embed="rId42"/>
                     <a:stretch>
                       <a:fillRect/>
                     </a:stretch>
@@ -2066,18 +2994,18 @@
           <wp:inline>
             <wp:extent cx="5334000" cy="7051002"/>
             <wp:effectExtent b="0" l="0" r="0" t="0"/>
-            <wp:docPr descr="" title="" id="45" name="Picture"/>
+            <wp:docPr descr="" title="" id="46" name="Picture"/>
             <a:graphic>
               <a:graphicData uri="http://schemas.openxmlformats.org/drawingml/2006/picture">
                 <pic:pic>
                   <pic:nvPicPr>
-                    <pic:cNvPr descr="06_analysis/figures/manuscript/Fig3_caribbean_synthesis.png" id="46" name="Picture"/>
+                    <pic:cNvPr descr="06_analysis/figures/manuscript/Fig3_caribbean_synthesis.png" id="47" name="Picture"/>
                     <pic:cNvPicPr>
                       <a:picLocks noChangeArrowheads="1" noChangeAspect="1"/>
                     </pic:cNvPicPr>
                   </pic:nvPicPr>
                   <pic:blipFill>
-                    <a:blip r:embed="rId44"/>
+                    <a:blip r:embed="rId45"/>
                     <a:stretch>
                       <a:fillRect/>
                     </a:stretch>
@@ -2148,18 +3076,18 @@
           <wp:inline>
             <wp:extent cx="5334000" cy="5516991"/>
             <wp:effectExtent b="0" l="0" r="0" t="0"/>
-            <wp:docPr descr="" title="" id="48" name="Picture"/>
+            <wp:docPr descr="" title="" id="49" name="Picture"/>
             <a:graphic>
               <a:graphicData uri="http://schemas.openxmlformats.org/drawingml/2006/picture">
                 <pic:pic>
                   <pic:nvPicPr>
-                    <pic:cNvPr descr="06_analysis/figures/manuscript/Fig4_population_model.png" id="49" name="Picture"/>
+                    <pic:cNvPr descr="06_analysis/figures/manuscript/Fig4_population_model.png" id="50" name="Picture"/>
                     <pic:cNvPicPr>
                       <a:picLocks noChangeArrowheads="1" noChangeAspect="1"/>
                     </pic:cNvPicPr>
                   </pic:nvPicPr>
                   <pic:blipFill>
-                    <a:blip r:embed="rId47"/>
+                    <a:blip r:embed="rId48"/>
                     <a:stretch>
                       <a:fillRect/>
                     </a:stretch>
@@ -2221,8 +3149,8 @@
         <w:t xml:space="preserve">.</w:t>
       </w:r>
     </w:p>
-    <w:bookmarkEnd w:id="50"/>
-    <w:bookmarkStart w:id="74" w:name="refs"/>
+    <w:bookmarkEnd w:id="51"/>
+    <w:bookmarkStart w:id="122" w:name="refs"/>
     <w:p>
       <w:pPr>
         <w:pStyle w:val="Heading2"/>
@@ -2231,14 +3159,61 @@
         <w:t xml:space="preserve">References</w:t>
       </w:r>
     </w:p>
-    <w:bookmarkStart w:id="73" w:name="refs"/>
-    <w:bookmarkStart w:id="52" w:name="ref-banister2024"/>
+    <w:bookmarkStart w:id="121" w:name="refs"/>
+    <w:bookmarkStart w:id="52" w:name="ref-aronsonprecht2001"/>
     <w:p>
       <w:pPr>
         <w:pStyle w:val="Bibliography"/>
       </w:pPr>
       <w:r>
-        <w:t xml:space="preserve">Banister, Raymond B., T. Shay Viehman, Stephanie Schopmeyer, and Robert van Woesik. 2024.</w:t>
+        <w:t xml:space="preserve">Aronson, Richard B., and William F. Precht. 2001.</w:t>
+      </w:r>
+      <w:r>
+        <w:t xml:space="preserve"> </w:t>
+      </w:r>
+      <w:r>
+        <w:t xml:space="preserve">“White-Band Disease and the Changing Face of</w:t>
+      </w:r>
+      <w:r>
+        <w:t xml:space="preserve"> </w:t>
+      </w:r>
+      <w:r>
+        <w:t xml:space="preserve">Caribbean</w:t>
+      </w:r>
+      <w:r>
+        <w:t xml:space="preserve"> </w:t>
+      </w:r>
+      <w:r>
+        <w:t xml:space="preserve">Coral Reefs.”</w:t>
+      </w:r>
+      <w:r>
+        <w:t xml:space="preserve"> </w:t>
+      </w:r>
+      <w:r>
+        <w:rPr>
+          <w:i/>
+          <w:iCs/>
+        </w:rPr>
+        <w:t xml:space="preserve">Hydrobiologia</w:t>
+      </w:r>
+      <w:r>
+        <w:t xml:space="preserve"> </w:t>
+      </w:r>
+      <w:r>
+        <w:t xml:space="preserve">460: 25–38.</w:t>
+      </w:r>
+    </w:p>
+    <w:bookmarkEnd w:id="52"/>
+    <w:bookmarkStart w:id="54" w:name="ref-banister2024"/>
+    <w:p>
+      <w:pPr>
+        <w:pStyle w:val="Bibliography"/>
+      </w:pPr>
+      <w:r>
+        <w:t xml:space="preserve">Banister, Raymond B., T. Shay Viehman, Stephanie Schopmeyer, and Robert van Woesik</w:t>
+      </w:r>
+      <w:r>
+        <w:t xml:space="preserve">. 2024.</w:t>
       </w:r>
       <w:r>
         <w:t xml:space="preserve"> </w:t>
@@ -2253,17 +3228,435 @@
         <w:t xml:space="preserve">Acropora palmata</w:t>
       </w:r>
       <w:r>
-        <w:t xml:space="preserve">, Along the Florida Reef Tract.”</w:t>
-      </w:r>
-      <w:r>
-        <w:t xml:space="preserve"> </w:t>
-      </w:r>
-      <w:r>
-        <w:rPr>
-          <w:i/>
-          <w:iCs/>
-        </w:rPr>
-        <w:t xml:space="preserve">PLOS ONE</w:t>
+        <w:t xml:space="preserve">, Along the</w:t>
+      </w:r>
+      <w:r>
+        <w:t xml:space="preserve"> </w:t>
+      </w:r>
+      <w:r>
+        <w:t xml:space="preserve">Florida</w:t>
+      </w:r>
+      <w:r>
+        <w:t xml:space="preserve"> </w:t>
+      </w:r>
+      <w:r>
+        <w:t xml:space="preserve">Reef Tract.”</w:t>
+      </w:r>
+      <w:r>
+        <w:t xml:space="preserve"> </w:t>
+      </w:r>
+      <w:r>
+        <w:rPr>
+          <w:i/>
+          <w:iCs/>
+        </w:rPr>
+        <w:t xml:space="preserve">PLoS ONE</w:t>
+      </w:r>
+      <w:r>
+        <w:t xml:space="preserve"> </w:t>
+      </w:r>
+      <w:r>
+        <w:t xml:space="preserve">19 (1): e0296485.</w:t>
+      </w:r>
+      <w:r>
+        <w:t xml:space="preserve"> </w:t>
+      </w:r>
+      <w:hyperlink r:id="rId53">
+        <w:r>
+          <w:rPr>
+            <w:rStyle w:val="Hyperlink"/>
+          </w:rPr>
+          <w:t xml:space="preserve">https://doi.org/10.1371/journal.pone.0296485</w:t>
+        </w:r>
+      </w:hyperlink>
+      <w:r>
+        <w:t xml:space="preserve">.</w:t>
+      </w:r>
+    </w:p>
+    <w:bookmarkEnd w:id="54"/>
+    <w:bookmarkStart w:id="56" w:name="ref-bostromeinarsson2020"/>
+    <w:p>
+      <w:pPr>
+        <w:pStyle w:val="Bibliography"/>
+      </w:pPr>
+      <w:r>
+        <w:t xml:space="preserve">Boström-Einarsson, Lisa, Russell C. Babcock, Elisa Bayraktarov, et al. 2020.</w:t>
+      </w:r>
+      <w:r>
+        <w:t xml:space="preserve"> </w:t>
+      </w:r>
+      <w:r>
+        <w:t xml:space="preserve">“Coral Restoration –</w:t>
+      </w:r>
+      <w:r>
+        <w:t xml:space="preserve"> </w:t>
+      </w:r>
+      <w:r>
+        <w:t xml:space="preserve">A</w:t>
+      </w:r>
+      <w:r>
+        <w:t xml:space="preserve"> </w:t>
+      </w:r>
+      <w:r>
+        <w:t xml:space="preserve">Systematic Review of Current Methods, Successes, Failures and Future Directions.”</w:t>
+      </w:r>
+      <w:r>
+        <w:t xml:space="preserve"> </w:t>
+      </w:r>
+      <w:r>
+        <w:rPr>
+          <w:i/>
+          <w:iCs/>
+        </w:rPr>
+        <w:t xml:space="preserve">PLoS ONE</w:t>
+      </w:r>
+      <w:r>
+        <w:t xml:space="preserve"> </w:t>
+      </w:r>
+      <w:r>
+        <w:t xml:space="preserve">15 (1): e0226631.</w:t>
+      </w:r>
+      <w:r>
+        <w:t xml:space="preserve"> </w:t>
+      </w:r>
+      <w:hyperlink r:id="rId55">
+        <w:r>
+          <w:rPr>
+            <w:rStyle w:val="Hyperlink"/>
+          </w:rPr>
+          <w:t xml:space="preserve">https://doi.org/10.1371/journal.pone.0226631</w:t>
+        </w:r>
+      </w:hyperlink>
+      <w:r>
+        <w:t xml:space="preserve">.</w:t>
+      </w:r>
+    </w:p>
+    <w:bookmarkEnd w:id="56"/>
+    <w:bookmarkStart w:id="58" w:name="ref-bruckner2001"/>
+    <w:p>
+      <w:pPr>
+        <w:pStyle w:val="Bibliography"/>
+      </w:pPr>
+      <w:r>
+        <w:t xml:space="preserve">Bruckner, A. W., and R. J. Bruckner. 2001.</w:t>
+      </w:r>
+      <w:r>
+        <w:t xml:space="preserve"> </w:t>
+      </w:r>
+      <w:r>
+        <w:t xml:space="preserve">“Condition of Restored</w:t>
+      </w:r>
+      <w:r>
+        <w:t xml:space="preserve"> </w:t>
+      </w:r>
+      <w:r>
+        <w:t xml:space="preserve">Acropora palmata</w:t>
+      </w:r>
+      <w:r>
+        <w:t xml:space="preserve"> </w:t>
+      </w:r>
+      <w:r>
+        <w:t xml:space="preserve">Fragments Off</w:t>
+      </w:r>
+      <w:r>
+        <w:t xml:space="preserve"> </w:t>
+      </w:r>
+      <w:r>
+        <w:t xml:space="preserve">Mona Island</w:t>
+      </w:r>
+      <w:r>
+        <w:t xml:space="preserve">,</w:t>
+      </w:r>
+      <w:r>
+        <w:t xml:space="preserve"> </w:t>
+      </w:r>
+      <w:r>
+        <w:t xml:space="preserve">Puerto Rico</w:t>
+      </w:r>
+      <w:r>
+        <w:t xml:space="preserve">, 2 Years After the</w:t>
+      </w:r>
+      <w:r>
+        <w:t xml:space="preserve"> </w:t>
+      </w:r>
+      <w:r>
+        <w:t xml:space="preserve">Fortuna Reefer</w:t>
+      </w:r>
+      <w:r>
+        <w:t xml:space="preserve"> </w:t>
+      </w:r>
+      <w:r>
+        <w:t xml:space="preserve">Ship Grounding.”</w:t>
+      </w:r>
+      <w:r>
+        <w:t xml:space="preserve"> </w:t>
+      </w:r>
+      <w:r>
+        <w:rPr>
+          <w:i/>
+          <w:iCs/>
+        </w:rPr>
+        <w:t xml:space="preserve">Coral Reefs</w:t>
+      </w:r>
+      <w:r>
+        <w:t xml:space="preserve"> </w:t>
+      </w:r>
+      <w:r>
+        <w:t xml:space="preserve">20: 235–43.</w:t>
+      </w:r>
+      <w:r>
+        <w:t xml:space="preserve"> </w:t>
+      </w:r>
+      <w:hyperlink r:id="rId57">
+        <w:r>
+          <w:rPr>
+            <w:rStyle w:val="Hyperlink"/>
+          </w:rPr>
+          <w:t xml:space="preserve">https://doi.org/10.1007/s003380100164</w:t>
+        </w:r>
+      </w:hyperlink>
+      <w:r>
+        <w:t xml:space="preserve">.</w:t>
+      </w:r>
+    </w:p>
+    <w:bookmarkEnd w:id="58"/>
+    <w:bookmarkStart w:id="60" w:name="ref-chamberland2015"/>
+    <w:p>
+      <w:pPr>
+        <w:pStyle w:val="Bibliography"/>
+      </w:pPr>
+      <w:r>
+        <w:t xml:space="preserve">Chamberland, Valérie F., Mark J. A. Vermeij, Mike Brittsan, et al. 2015.</w:t>
+      </w:r>
+      <w:r>
+        <w:t xml:space="preserve"> </w:t>
+      </w:r>
+      <w:r>
+        <w:t xml:space="preserve">“Restoration of Critically Endangered Elkhorn Coral (</w:t>
+      </w:r>
+      <w:r>
+        <w:t xml:space="preserve">Acropora palmata</w:t>
+      </w:r>
+      <w:r>
+        <w:t xml:space="preserve">) Populations Using Larvae Reared from Wild-Caught Gametes.”</w:t>
+      </w:r>
+      <w:r>
+        <w:t xml:space="preserve"> </w:t>
+      </w:r>
+      <w:r>
+        <w:rPr>
+          <w:i/>
+          <w:iCs/>
+        </w:rPr>
+        <w:t xml:space="preserve">Global Ecology and Conservation</w:t>
+      </w:r>
+      <w:r>
+        <w:t xml:space="preserve"> </w:t>
+      </w:r>
+      <w:r>
+        <w:t xml:space="preserve">4: 526–37.</w:t>
+      </w:r>
+      <w:r>
+        <w:t xml:space="preserve"> </w:t>
+      </w:r>
+      <w:hyperlink r:id="rId59">
+        <w:r>
+          <w:rPr>
+            <w:rStyle w:val="Hyperlink"/>
+          </w:rPr>
+          <w:t xml:space="preserve">https://doi.org/10.1016/j.gecco.2015.10.005</w:t>
+        </w:r>
+      </w:hyperlink>
+      <w:r>
+        <w:t xml:space="preserve">.</w:t>
+      </w:r>
+    </w:p>
+    <w:bookmarkEnd w:id="60"/>
+    <w:bookmarkStart w:id="62" w:name="ref-detmer2025"/>
+    <w:p>
+      <w:pPr>
+        <w:pStyle w:val="Bibliography"/>
+      </w:pPr>
+      <w:r>
+        <w:t xml:space="preserve">Detmer, A. Raine, Eric J. Ward, Mary E. Hunsicker, et al. 2025.</w:t>
+      </w:r>
+      <w:r>
+        <w:t xml:space="preserve"> </w:t>
+      </w:r>
+      <w:r>
+        <w:t xml:space="preserve">“Evaluating the Robustness of Generalized Additive Models as a Tool for Threshold Detection in Variable Environments.”</w:t>
+      </w:r>
+      <w:r>
+        <w:t xml:space="preserve"> </w:t>
+      </w:r>
+      <w:r>
+        <w:rPr>
+          <w:i/>
+          <w:iCs/>
+        </w:rPr>
+        <w:t xml:space="preserve">Ecosphere</w:t>
+      </w:r>
+      <w:r>
+        <w:t xml:space="preserve"> </w:t>
+      </w:r>
+      <w:r>
+        <w:t xml:space="preserve">16 (3): e70117.</w:t>
+      </w:r>
+      <w:r>
+        <w:t xml:space="preserve"> </w:t>
+      </w:r>
+      <w:hyperlink r:id="rId61">
+        <w:r>
+          <w:rPr>
+            <w:rStyle w:val="Hyperlink"/>
+          </w:rPr>
+          <w:t xml:space="preserve">https://doi.org/10.1002/ecs2.70117</w:t>
+        </w:r>
+      </w:hyperlink>
+      <w:r>
+        <w:t xml:space="preserve">.</w:t>
+      </w:r>
+    </w:p>
+    <w:bookmarkEnd w:id="62"/>
+    <w:bookmarkStart w:id="64" w:name="ref-edmundsriegl2020"/>
+    <w:p>
+      <w:pPr>
+        <w:pStyle w:val="Bibliography"/>
+      </w:pPr>
+      <w:r>
+        <w:t xml:space="preserve">Edmunds, Peter J., and Bernhard Riegl. 2020.</w:t>
+      </w:r>
+      <w:r>
+        <w:t xml:space="preserve"> </w:t>
+      </w:r>
+      <w:r>
+        <w:t xml:space="preserve">“Urgent Need for Coral Demography in a World Where Corals Are Disappearing.”</w:t>
+      </w:r>
+      <w:r>
+        <w:t xml:space="preserve"> </w:t>
+      </w:r>
+      <w:r>
+        <w:rPr>
+          <w:i/>
+          <w:iCs/>
+        </w:rPr>
+        <w:t xml:space="preserve">Marine Ecology Progress Series</w:t>
+      </w:r>
+      <w:r>
+        <w:t xml:space="preserve"> </w:t>
+      </w:r>
+      <w:r>
+        <w:t xml:space="preserve">635: 233–42.</w:t>
+      </w:r>
+      <w:r>
+        <w:t xml:space="preserve"> </w:t>
+      </w:r>
+      <w:hyperlink r:id="rId63">
+        <w:r>
+          <w:rPr>
+            <w:rStyle w:val="Hyperlink"/>
+          </w:rPr>
+          <w:t xml:space="preserve">https://doi.org/10.3354/meps13205</w:t>
+        </w:r>
+      </w:hyperlink>
+      <w:r>
+        <w:t xml:space="preserve">.</w:t>
+      </w:r>
+    </w:p>
+    <w:bookmarkEnd w:id="64"/>
+    <w:bookmarkStart w:id="66" w:name="ref-forrester2013"/>
+    <w:p>
+      <w:pPr>
+        <w:pStyle w:val="Bibliography"/>
+      </w:pPr>
+      <w:r>
+        <w:t xml:space="preserve">Forrester, Graham E., Megan A. Ferguson, Caitlin E. O’Connell-Rodwell, and Lianna L. Jarecki. 2014.</w:t>
+      </w:r>
+      <w:r>
+        <w:t xml:space="preserve"> </w:t>
+      </w:r>
+      <w:r>
+        <w:t xml:space="preserve">“Long-Term Survival and Colony Growth of</w:t>
+      </w:r>
+      <w:r>
+        <w:t xml:space="preserve"> </w:t>
+      </w:r>
+      <w:r>
+        <w:t xml:space="preserve">Acropora palmata</w:t>
+      </w:r>
+      <w:r>
+        <w:t xml:space="preserve"> </w:t>
+      </w:r>
+      <w:r>
+        <w:t xml:space="preserve">Fragments Transplanted by Volunteers for Restoration.”</w:t>
+      </w:r>
+      <w:r>
+        <w:t xml:space="preserve"> </w:t>
+      </w:r>
+      <w:r>
+        <w:rPr>
+          <w:i/>
+          <w:iCs/>
+        </w:rPr>
+        <w:t xml:space="preserve">Aquatic Conservation: Marine and Freshwater Ecosystems</w:t>
+      </w:r>
+      <w:r>
+        <w:t xml:space="preserve"> </w:t>
+      </w:r>
+      <w:r>
+        <w:t xml:space="preserve">24: 81–91.</w:t>
+      </w:r>
+      <w:r>
+        <w:t xml:space="preserve"> </w:t>
+      </w:r>
+      <w:hyperlink r:id="rId65">
+        <w:r>
+          <w:rPr>
+            <w:rStyle w:val="Hyperlink"/>
+          </w:rPr>
+          <w:t xml:space="preserve">https://doi.org/10.1002/aqc.2374</w:t>
+        </w:r>
+      </w:hyperlink>
+      <w:r>
+        <w:t xml:space="preserve">.</w:t>
+      </w:r>
+    </w:p>
+    <w:bookmarkEnd w:id="66"/>
+    <w:bookmarkStart w:id="68" w:name="ref-forrester2012"/>
+    <w:p>
+      <w:pPr>
+        <w:pStyle w:val="Bibliography"/>
+      </w:pPr>
+      <w:r>
+        <w:t xml:space="preserve">Forrester, Graham E., Amy Maynard, Stephanie Schofield, and Kerianne Taylor. 2012.</w:t>
+      </w:r>
+      <w:r>
+        <w:t xml:space="preserve"> </w:t>
+      </w:r>
+      <w:r>
+        <w:t xml:space="preserve">“Evaluating Causes of Transplant Stress in Fragments of</w:t>
+      </w:r>
+      <w:r>
+        <w:t xml:space="preserve"> </w:t>
+      </w:r>
+      <w:r>
+        <w:t xml:space="preserve">Acropora palmata</w:t>
+      </w:r>
+      <w:r>
+        <w:t xml:space="preserve"> </w:t>
+      </w:r>
+      <w:r>
+        <w:t xml:space="preserve">Used for Coral Reef Restoration.”</w:t>
+      </w:r>
+      <w:r>
+        <w:t xml:space="preserve"> </w:t>
+      </w:r>
+      <w:r>
+        <w:rPr>
+          <w:i/>
+          <w:iCs/>
+        </w:rPr>
+        <w:t xml:space="preserve">Bulletin of Marine Science</w:t>
       </w:r>
       <w:r>
         <w:t xml:space="preserve">, ahead of print.</w:t>
@@ -2271,32 +3664,290 @@
       <w:r>
         <w:t xml:space="preserve"> </w:t>
       </w:r>
-      <w:hyperlink r:id="rId51">
-        <w:r>
-          <w:rPr>
-            <w:rStyle w:val="Hyperlink"/>
-          </w:rPr>
-          <w:t xml:space="preserve">https://doi.org/10.1371/journal.pone.0296485</w:t>
+      <w:hyperlink r:id="rId67">
+        <w:r>
+          <w:rPr>
+            <w:rStyle w:val="Hyperlink"/>
+          </w:rPr>
+          <w:t xml:space="preserve">https://doi.org/10.5343/bms.2012.1016</w:t>
         </w:r>
       </w:hyperlink>
       <w:r>
         <w:t xml:space="preserve">.</w:t>
       </w:r>
     </w:p>
-    <w:bookmarkEnd w:id="52"/>
-    <w:bookmarkStart w:id="54" w:name="ref-forrester2012"/>
+    <w:bookmarkEnd w:id="68"/>
+    <w:bookmarkStart w:id="70" w:name="ref-gardner2003"/>
     <w:p>
       <w:pPr>
         <w:pStyle w:val="Bibliography"/>
       </w:pPr>
       <w:r>
-        <w:t xml:space="preserve">Forrester, Graham E., Amy Maynard, Stephanie Schofield, and Kerianne Taylor. 2012.</w:t>
-      </w:r>
-      <w:r>
-        <w:t xml:space="preserve"> </w:t>
-      </w:r>
-      <w:r>
-        <w:t xml:space="preserve">“Evaluating Causes of Transplant Stress in Fragments of</w:t>
+        <w:t xml:space="preserve">Gardner, Toby A., Isabelle M. Côté, Jennifer A. Gill, Alastair Grant, and Andrew R. Watkinson. 2003.</w:t>
+      </w:r>
+      <w:r>
+        <w:t xml:space="preserve"> </w:t>
+      </w:r>
+      <w:r>
+        <w:t xml:space="preserve">“Long-Term Region-Wide Declines in</w:t>
+      </w:r>
+      <w:r>
+        <w:t xml:space="preserve"> </w:t>
+      </w:r>
+      <w:r>
+        <w:t xml:space="preserve">Caribbean</w:t>
+      </w:r>
+      <w:r>
+        <w:t xml:space="preserve"> </w:t>
+      </w:r>
+      <w:r>
+        <w:t xml:space="preserve">Corals.”</w:t>
+      </w:r>
+      <w:r>
+        <w:t xml:space="preserve"> </w:t>
+      </w:r>
+      <w:r>
+        <w:rPr>
+          <w:i/>
+          <w:iCs/>
+        </w:rPr>
+        <w:t xml:space="preserve">Science</w:t>
+      </w:r>
+      <w:r>
+        <w:t xml:space="preserve"> </w:t>
+      </w:r>
+      <w:r>
+        <w:t xml:space="preserve">301 (5635): 958–60.</w:t>
+      </w:r>
+      <w:r>
+        <w:t xml:space="preserve"> </w:t>
+      </w:r>
+      <w:hyperlink r:id="rId69">
+        <w:r>
+          <w:rPr>
+            <w:rStyle w:val="Hyperlink"/>
+          </w:rPr>
+          <w:t xml:space="preserve">https://doi.org/10.1126/science.1086050</w:t>
+        </w:r>
+      </w:hyperlink>
+      <w:r>
+        <w:t xml:space="preserve">.</w:t>
+      </w:r>
+    </w:p>
+    <w:bookmarkEnd w:id="70"/>
+    <w:bookmarkStart w:id="72" w:name="ref-garrison2008"/>
+    <w:p>
+      <w:pPr>
+        <w:pStyle w:val="Bibliography"/>
+      </w:pPr>
+      <w:r>
+        <w:t xml:space="preserve">Garrison, Virginia, and Greg Ward. 2008.</w:t>
+      </w:r>
+      <w:r>
+        <w:t xml:space="preserve"> </w:t>
+      </w:r>
+      <w:r>
+        <w:t xml:space="preserve">“Storm-Generated Coral Fragments –</w:t>
+      </w:r>
+      <w:r>
+        <w:t xml:space="preserve"> </w:t>
+      </w:r>
+      <w:r>
+        <w:t xml:space="preserve">A</w:t>
+      </w:r>
+      <w:r>
+        <w:t xml:space="preserve"> </w:t>
+      </w:r>
+      <w:r>
+        <w:t xml:space="preserve">Viable Source of Transplants for Reef Rehabilitation.”</w:t>
+      </w:r>
+      <w:r>
+        <w:t xml:space="preserve"> </w:t>
+      </w:r>
+      <w:r>
+        <w:rPr>
+          <w:i/>
+          <w:iCs/>
+        </w:rPr>
+        <w:t xml:space="preserve">Biological Conservation</w:t>
+      </w:r>
+      <w:r>
+        <w:t xml:space="preserve"> </w:t>
+      </w:r>
+      <w:r>
+        <w:t xml:space="preserve">141: 3089–100.</w:t>
+      </w:r>
+      <w:r>
+        <w:t xml:space="preserve"> </w:t>
+      </w:r>
+      <w:hyperlink r:id="rId71">
+        <w:r>
+          <w:rPr>
+            <w:rStyle w:val="Hyperlink"/>
+          </w:rPr>
+          <w:t xml:space="preserve">https://doi.org/10.1016/j.biocon.2008.09.020</w:t>
+        </w:r>
+      </w:hyperlink>
+      <w:r>
+        <w:t xml:space="preserve">.</w:t>
+      </w:r>
+    </w:p>
+    <w:bookmarkEnd w:id="72"/>
+    <w:bookmarkStart w:id="73" w:name="ref-highsmith1982"/>
+    <w:p>
+      <w:pPr>
+        <w:pStyle w:val="Bibliography"/>
+      </w:pPr>
+      <w:r>
+        <w:t xml:space="preserve">Highsmith, Raymond C. 1982.</w:t>
+      </w:r>
+      <w:r>
+        <w:t xml:space="preserve"> </w:t>
+      </w:r>
+      <w:r>
+        <w:t xml:space="preserve">“Reproduction by Fragmentation in Corals.”</w:t>
+      </w:r>
+      <w:r>
+        <w:t xml:space="preserve"> </w:t>
+      </w:r>
+      <w:r>
+        <w:rPr>
+          <w:i/>
+          <w:iCs/>
+        </w:rPr>
+        <w:t xml:space="preserve">Marine Ecology Progress Series</w:t>
+      </w:r>
+      <w:r>
+        <w:t xml:space="preserve"> </w:t>
+      </w:r>
+      <w:r>
+        <w:t xml:space="preserve">7: 207–26.</w:t>
+      </w:r>
+    </w:p>
+    <w:bookmarkEnd w:id="73"/>
+    <w:bookmarkStart w:id="74" w:name="ref-hughesjackson1985"/>
+    <w:p>
+      <w:pPr>
+        <w:pStyle w:val="Bibliography"/>
+      </w:pPr>
+      <w:r>
+        <w:t xml:space="preserve">Hughes, T. P., and J. B. C. Jackson. 1985.</w:t>
+      </w:r>
+      <w:r>
+        <w:t xml:space="preserve"> </w:t>
+      </w:r>
+      <w:r>
+        <w:t xml:space="preserve">“Population Dynamics and Life Histories of Foliaceous Corals.”</w:t>
+      </w:r>
+      <w:r>
+        <w:t xml:space="preserve"> </w:t>
+      </w:r>
+      <w:r>
+        <w:rPr>
+          <w:i/>
+          <w:iCs/>
+        </w:rPr>
+        <w:t xml:space="preserve">Ecological Monographs</w:t>
+      </w:r>
+      <w:r>
+        <w:t xml:space="preserve"> </w:t>
+      </w:r>
+      <w:r>
+        <w:t xml:space="preserve">55 (2): 141–66.</w:t>
+      </w:r>
+    </w:p>
+    <w:bookmarkEnd w:id="74"/>
+    <w:bookmarkStart w:id="75" w:name="ref-hughes1984"/>
+    <w:p>
+      <w:pPr>
+        <w:pStyle w:val="Bibliography"/>
+      </w:pPr>
+      <w:r>
+        <w:t xml:space="preserve">Hughes, Terence P. 1984.</w:t>
+      </w:r>
+      <w:r>
+        <w:t xml:space="preserve"> </w:t>
+      </w:r>
+      <w:r>
+        <w:t xml:space="preserve">“Population Dynamics Based on Individual Size Rather Than Age: A General Model with a Reef Coral Example.”</w:t>
+      </w:r>
+      <w:r>
+        <w:t xml:space="preserve"> </w:t>
+      </w:r>
+      <w:r>
+        <w:rPr>
+          <w:i/>
+          <w:iCs/>
+        </w:rPr>
+        <w:t xml:space="preserve">The American Naturalist</w:t>
+      </w:r>
+      <w:r>
+        <w:t xml:space="preserve"> </w:t>
+      </w:r>
+      <w:r>
+        <w:t xml:space="preserve">123 (6): 778–95.</w:t>
+      </w:r>
+    </w:p>
+    <w:bookmarkEnd w:id="75"/>
+    <w:bookmarkStart w:id="77" w:name="ref-knapp2003"/>
+    <w:p>
+      <w:pPr>
+        <w:pStyle w:val="Bibliography"/>
+      </w:pPr>
+      <w:r>
+        <w:t xml:space="preserve">Knapp, Guido, and Joachim Hartung. 2003.</w:t>
+      </w:r>
+      <w:r>
+        <w:t xml:space="preserve"> </w:t>
+      </w:r>
+      <w:r>
+        <w:t xml:space="preserve">“Improved Tests for a Random Effects Meta-Regression with a Single Covariate.”</w:t>
+      </w:r>
+      <w:r>
+        <w:t xml:space="preserve"> </w:t>
+      </w:r>
+      <w:r>
+        <w:rPr>
+          <w:i/>
+          <w:iCs/>
+        </w:rPr>
+        <w:t xml:space="preserve">Statistics in Medicine</w:t>
+      </w:r>
+      <w:r>
+        <w:t xml:space="preserve"> </w:t>
+      </w:r>
+      <w:r>
+        <w:t xml:space="preserve">22 (17): 2693–710.</w:t>
+      </w:r>
+      <w:r>
+        <w:t xml:space="preserve"> </w:t>
+      </w:r>
+      <w:hyperlink r:id="rId76">
+        <w:r>
+          <w:rPr>
+            <w:rStyle w:val="Hyperlink"/>
+          </w:rPr>
+          <w:t xml:space="preserve">https://doi.org/10.1002/sim.1482</w:t>
+        </w:r>
+      </w:hyperlink>
+      <w:r>
+        <w:t xml:space="preserve">.</w:t>
+      </w:r>
+    </w:p>
+    <w:bookmarkEnd w:id="77"/>
+    <w:bookmarkStart w:id="79" w:name="ref-kuffner2020"/>
+    <w:p>
+      <w:pPr>
+        <w:pStyle w:val="Bibliography"/>
+      </w:pPr>
+      <w:r>
+        <w:t xml:space="preserve">Kuffner, Ilsa B., Anastasios Stathakopoulos, Lauren T. Toth, and Lucy A. Bartlett. 2020.</w:t>
+      </w:r>
+      <w:r>
+        <w:t xml:space="preserve"> </w:t>
+      </w:r>
+      <w:r>
+        <w:t xml:space="preserve">“Reestablishing a Stepping-Stone Population of the Threatened Elkhorn Coral</w:t>
       </w:r>
       <w:r>
         <w:t xml:space="preserve"> </w:t>
@@ -2308,7 +3959,918 @@
         <w:t xml:space="preserve"> </w:t>
       </w:r>
       <w:r>
-        <w:t xml:space="preserve">Used for Coral Reef Restoration.”</w:t>
+        <w:t xml:space="preserve">to Aid Regional Recovery.”</w:t>
+      </w:r>
+      <w:r>
+        <w:t xml:space="preserve"> </w:t>
+      </w:r>
+      <w:r>
+        <w:rPr>
+          <w:i/>
+          <w:iCs/>
+        </w:rPr>
+        <w:t xml:space="preserve">Endangered Species Research</w:t>
+      </w:r>
+      <w:r>
+        <w:t xml:space="preserve"> </w:t>
+      </w:r>
+      <w:r>
+        <w:t xml:space="preserve">43: 461–73.</w:t>
+      </w:r>
+      <w:r>
+        <w:t xml:space="preserve"> </w:t>
+      </w:r>
+      <w:hyperlink r:id="rId78">
+        <w:r>
+          <w:rPr>
+            <w:rStyle w:val="Hyperlink"/>
+          </w:rPr>
+          <w:t xml:space="preserve">https://doi.org/10.3354/esr01083</w:t>
+        </w:r>
+      </w:hyperlink>
+      <w:r>
+        <w:t xml:space="preserve">.</w:t>
+      </w:r>
+    </w:p>
+    <w:bookmarkEnd w:id="79"/>
+    <w:bookmarkStart w:id="80" w:name="ref-lirman2000"/>
+    <w:p>
+      <w:pPr>
+        <w:pStyle w:val="Bibliography"/>
+      </w:pPr>
+      <w:r>
+        <w:t xml:space="preserve">Lirman, Diego. 2000.</w:t>
+      </w:r>
+      <w:r>
+        <w:t xml:space="preserve"> </w:t>
+      </w:r>
+      <w:r>
+        <w:t xml:space="preserve">“Fragmentation in the Branching Coral</w:t>
+      </w:r>
+      <w:r>
+        <w:t xml:space="preserve"> </w:t>
+      </w:r>
+      <w:r>
+        <w:t xml:space="preserve">Acropora palmata</w:t>
+      </w:r>
+      <w:r>
+        <w:t xml:space="preserve"> </w:t>
+      </w:r>
+      <w:r>
+        <w:t xml:space="preserve">(</w:t>
+      </w:r>
+      <w:r>
+        <w:t xml:space="preserve">Lamarck</w:t>
+      </w:r>
+      <w:r>
+        <w:t xml:space="preserve">): Growth, Survivorship, and Reproduction of Colonies and Fragments.”</w:t>
+      </w:r>
+      <w:r>
+        <w:t xml:space="preserve"> </w:t>
+      </w:r>
+      <w:r>
+        <w:rPr>
+          <w:i/>
+          <w:iCs/>
+        </w:rPr>
+        <w:t xml:space="preserve">Journal of Experimental Marine Biology and Ecology</w:t>
+      </w:r>
+      <w:r>
+        <w:t xml:space="preserve"> </w:t>
+      </w:r>
+      <w:r>
+        <w:t xml:space="preserve">251: 41–57.</w:t>
+      </w:r>
+    </w:p>
+    <w:bookmarkEnd w:id="80"/>
+    <w:bookmarkStart w:id="81" w:name="ref-lirman1997"/>
+    <w:p>
+      <w:pPr>
+        <w:pStyle w:val="Bibliography"/>
+      </w:pPr>
+      <w:r>
+        <w:t xml:space="preserve">Lirman, Diego, and Peggy Fong. 1997.</w:t>
+      </w:r>
+      <w:r>
+        <w:t xml:space="preserve"> </w:t>
+      </w:r>
+      <w:r>
+        <w:t xml:space="preserve">“Patterns of Damage to the Branching Coral</w:t>
+      </w:r>
+      <w:r>
+        <w:t xml:space="preserve"> </w:t>
+      </w:r>
+      <w:r>
+        <w:t xml:space="preserve">Acropora palmata</w:t>
+      </w:r>
+      <w:r>
+        <w:t xml:space="preserve"> </w:t>
+      </w:r>
+      <w:r>
+        <w:t xml:space="preserve">Following</w:t>
+      </w:r>
+      <w:r>
+        <w:t xml:space="preserve"> </w:t>
+      </w:r>
+      <w:r>
+        <w:t xml:space="preserve">Hurricane Andrew</w:t>
+      </w:r>
+      <w:r>
+        <w:t xml:space="preserve">.”</w:t>
+      </w:r>
+      <w:r>
+        <w:t xml:space="preserve"> </w:t>
+      </w:r>
+      <w:r>
+        <w:rPr>
+          <w:i/>
+          <w:iCs/>
+        </w:rPr>
+        <w:t xml:space="preserve">Journal of Coastal Research</w:t>
+      </w:r>
+      <w:r>
+        <w:t xml:space="preserve">.</w:t>
+      </w:r>
+    </w:p>
+    <w:bookmarkEnd w:id="81"/>
+    <w:bookmarkStart w:id="83" w:name="ref-madin2020"/>
+    <w:p>
+      <w:pPr>
+        <w:pStyle w:val="Bibliography"/>
+      </w:pPr>
+      <w:r>
+        <w:t xml:space="preserve">Madin, Joshua S., Andrew H. Baird, Marissa L. Baskett, Sean R. Connolly, and Maria A. Dornelas. 2020.</w:t>
+      </w:r>
+      <w:r>
+        <w:t xml:space="preserve"> </w:t>
+      </w:r>
+      <w:r>
+        <w:t xml:space="preserve">“Partitioning Colony Size Variation into Growth and Partial Mortality.”</w:t>
+      </w:r>
+      <w:r>
+        <w:t xml:space="preserve"> </w:t>
+      </w:r>
+      <w:r>
+        <w:rPr>
+          <w:i/>
+          <w:iCs/>
+        </w:rPr>
+        <w:t xml:space="preserve">Biology Letters</w:t>
+      </w:r>
+      <w:r>
+        <w:t xml:space="preserve"> </w:t>
+      </w:r>
+      <w:r>
+        <w:t xml:space="preserve">16: 20190727.</w:t>
+      </w:r>
+      <w:r>
+        <w:t xml:space="preserve"> </w:t>
+      </w:r>
+      <w:hyperlink r:id="rId82">
+        <w:r>
+          <w:rPr>
+            <w:rStyle w:val="Hyperlink"/>
+          </w:rPr>
+          <w:t xml:space="preserve">https://doi.org/10.1098/rsbl.2019.0727</w:t>
+        </w:r>
+      </w:hyperlink>
+      <w:r>
+        <w:t xml:space="preserve">.</w:t>
+      </w:r>
+    </w:p>
+    <w:bookmarkEnd w:id="83"/>
+    <w:bookmarkStart w:id="85" w:name="ref-madin2014"/>
+    <w:p>
+      <w:pPr>
+        <w:pStyle w:val="Bibliography"/>
+      </w:pPr>
+      <w:r>
+        <w:t xml:space="preserve">Madin, Joshua S., Andrew H. Baird, Maria Dornelas, and Sean R. Connolly. 2014.</w:t>
+      </w:r>
+      <w:r>
+        <w:t xml:space="preserve"> </w:t>
+      </w:r>
+      <w:r>
+        <w:t xml:space="preserve">“Mechanical Vulnerability Explains Size-Dependent Mortality of Reef Corals.”</w:t>
+      </w:r>
+      <w:r>
+        <w:t xml:space="preserve"> </w:t>
+      </w:r>
+      <w:r>
+        <w:rPr>
+          <w:i/>
+          <w:iCs/>
+        </w:rPr>
+        <w:t xml:space="preserve">Ecology Letters</w:t>
+      </w:r>
+      <w:r>
+        <w:t xml:space="preserve"> </w:t>
+      </w:r>
+      <w:r>
+        <w:t xml:space="preserve">17 (8): 1008–15.</w:t>
+      </w:r>
+      <w:r>
+        <w:t xml:space="preserve"> </w:t>
+      </w:r>
+      <w:hyperlink r:id="rId84">
+        <w:r>
+          <w:rPr>
+            <w:rStyle w:val="Hyperlink"/>
+          </w:rPr>
+          <w:t xml:space="preserve">https://doi.org/10.1111/ele.12306</w:t>
+        </w:r>
+      </w:hyperlink>
+      <w:r>
+        <w:t xml:space="preserve">.</w:t>
+      </w:r>
+    </w:p>
+    <w:bookmarkEnd w:id="85"/>
+    <w:bookmarkStart w:id="87" w:name="ref-madin2025"/>
+    <w:p>
+      <w:pPr>
+        <w:pStyle w:val="Bibliography"/>
+      </w:pPr>
+      <w:r>
+        <w:t xml:space="preserve">Madin, Joshua S., Thomas Oliver, Mike McWilliam, et al. 2025.</w:t>
+      </w:r>
+      <w:r>
+        <w:t xml:space="preserve"> </w:t>
+      </w:r>
+      <w:r>
+        <w:rPr>
+          <w:i/>
+          <w:iCs/>
+        </w:rPr>
+        <w:t xml:space="preserve">Demographic Insights for Coral Restoration</w:t>
+      </w:r>
+      <w:r>
+        <w:t xml:space="preserve">. bioRxiv.</w:t>
+      </w:r>
+      <w:r>
+        <w:t xml:space="preserve"> </w:t>
+      </w:r>
+      <w:hyperlink r:id="rId86">
+        <w:r>
+          <w:rPr>
+            <w:rStyle w:val="Hyperlink"/>
+          </w:rPr>
+          <w:t xml:space="preserve">https://doi.org/10.1101/2025.10.21.683544</w:t>
+        </w:r>
+      </w:hyperlink>
+      <w:r>
+        <w:t xml:space="preserve">.</w:t>
+      </w:r>
+    </w:p>
+    <w:bookmarkEnd w:id="87"/>
+    <w:bookmarkStart w:id="89" w:name="ref-manzello2025"/>
+    <w:p>
+      <w:pPr>
+        <w:pStyle w:val="Bibliography"/>
+      </w:pPr>
+      <w:r>
+        <w:t xml:space="preserve">Manzello, Derek P., Ross Cunning, Richard F. Karp, et al. 2025.</w:t>
+      </w:r>
+      <w:r>
+        <w:t xml:space="preserve"> </w:t>
+      </w:r>
+      <w:r>
+        <w:t xml:space="preserve">“Heat-Driven Functional Extinction of</w:t>
+      </w:r>
+      <w:r>
+        <w:t xml:space="preserve"> </w:t>
+      </w:r>
+      <w:r>
+        <w:t xml:space="preserve">Caribbean</w:t>
+      </w:r>
+      <w:r>
+        <w:t xml:space="preserve"> </w:t>
+      </w:r>
+      <w:r>
+        <w:t xml:space="preserve">Acropora</w:t>
+      </w:r>
+      <w:r>
+        <w:t xml:space="preserve"> </w:t>
+      </w:r>
+      <w:r>
+        <w:t xml:space="preserve">Corals from</w:t>
+      </w:r>
+      <w:r>
+        <w:t xml:space="preserve"> </w:t>
+      </w:r>
+      <w:r>
+        <w:t xml:space="preserve">Florida</w:t>
+      </w:r>
+      <w:r>
+        <w:t xml:space="preserve">’s</w:t>
+      </w:r>
+      <w:r>
+        <w:t xml:space="preserve"> </w:t>
+      </w:r>
+      <w:r>
+        <w:t xml:space="preserve">Coral Reef</w:t>
+      </w:r>
+      <w:r>
+        <w:t xml:space="preserve">.”</w:t>
+      </w:r>
+      <w:r>
+        <w:t xml:space="preserve"> </w:t>
+      </w:r>
+      <w:r>
+        <w:rPr>
+          <w:i/>
+          <w:iCs/>
+        </w:rPr>
+        <w:t xml:space="preserve">Science</w:t>
+      </w:r>
+      <w:r>
+        <w:t xml:space="preserve"> </w:t>
+      </w:r>
+      <w:r>
+        <w:t xml:space="preserve">390 (6771): 361–66.</w:t>
+      </w:r>
+      <w:r>
+        <w:t xml:space="preserve"> </w:t>
+      </w:r>
+      <w:hyperlink r:id="rId88">
+        <w:r>
+          <w:rPr>
+            <w:rStyle w:val="Hyperlink"/>
+          </w:rPr>
+          <w:t xml:space="preserve">https://doi.org/10.1126/science.adx7825</w:t>
+        </w:r>
+      </w:hyperlink>
+      <w:r>
+        <w:t xml:space="preserve">.</w:t>
+      </w:r>
+    </w:p>
+    <w:bookmarkEnd w:id="89"/>
+    <w:bookmarkStart w:id="91" w:name="ref-maurer2022"/>
+    <w:p>
+      <w:pPr>
+        <w:pStyle w:val="Bibliography"/>
+      </w:pPr>
+      <w:r>
+        <w:t xml:space="preserve">Maurer, Leah, Lauren Puishys, Nancy Kim Pham Ho, et al. 2022.</w:t>
+      </w:r>
+      <w:r>
+        <w:t xml:space="preserve"> </w:t>
+      </w:r>
+      <w:r>
+        <w:t xml:space="preserve">“</w:t>
+      </w:r>
+      <w:r>
+        <w:t xml:space="preserve">Acropora cervicornis</w:t>
+      </w:r>
+      <w:r>
+        <w:t xml:space="preserve"> </w:t>
+      </w:r>
+      <w:r>
+        <w:t xml:space="preserve">and</w:t>
+      </w:r>
+      <w:r>
+        <w:t xml:space="preserve"> </w:t>
+      </w:r>
+      <w:r>
+        <w:t xml:space="preserve">Acropora palmata</w:t>
+      </w:r>
+      <w:r>
+        <w:t xml:space="preserve"> </w:t>
+      </w:r>
+      <w:r>
+        <w:t xml:space="preserve">Cultured on a Low Maintenance Line Nursery Design in</w:t>
+      </w:r>
+      <w:r>
+        <w:t xml:space="preserve"> </w:t>
+      </w:r>
+      <w:r>
+        <w:t xml:space="preserve">The Bahamas</w:t>
+      </w:r>
+      <w:r>
+        <w:t xml:space="preserve">.”</w:t>
+      </w:r>
+      <w:r>
+        <w:t xml:space="preserve"> </w:t>
+      </w:r>
+      <w:r>
+        <w:rPr>
+          <w:i/>
+          <w:iCs/>
+        </w:rPr>
+        <w:t xml:space="preserve">PLoS ONE</w:t>
+      </w:r>
+      <w:r>
+        <w:t xml:space="preserve"> </w:t>
+      </w:r>
+      <w:r>
+        <w:t xml:space="preserve">17 (4): e0267034.</w:t>
+      </w:r>
+      <w:r>
+        <w:t xml:space="preserve"> </w:t>
+      </w:r>
+      <w:hyperlink r:id="rId90">
+        <w:r>
+          <w:rPr>
+            <w:rStyle w:val="Hyperlink"/>
+          </w:rPr>
+          <w:t xml:space="preserve">https://doi.org/10.1371/journal.pone.0267034</w:t>
+        </w:r>
+      </w:hyperlink>
+      <w:r>
+        <w:t xml:space="preserve">.</w:t>
+      </w:r>
+    </w:p>
+    <w:bookmarkEnd w:id="91"/>
+    <w:bookmarkStart w:id="93" w:name="ref-mendozaquiroz2023"/>
+    <w:p>
+      <w:pPr>
+        <w:pStyle w:val="Bibliography"/>
+      </w:pPr>
+      <w:r>
+        <w:t xml:space="preserve">Mendoza Quiroz, Sandra, Aurora Urania Beltrán-Torres, Maria Victoria Grosso-Becerra, Daniela Muñoz Villareal, Raúl Tecalco Rentería, and Anastazia T. Banaszak. 2023.</w:t>
+      </w:r>
+      <w:r>
+        <w:t xml:space="preserve"> </w:t>
+      </w:r>
+      <w:r>
+        <w:t xml:space="preserve">“Long-Term Survival, Growth, and Reproduction of</w:t>
+      </w:r>
+      <w:r>
+        <w:t xml:space="preserve"> </w:t>
+      </w:r>
+      <w:r>
+        <w:t xml:space="preserve">Acropora palmata</w:t>
+      </w:r>
+      <w:r>
+        <w:t xml:space="preserve"> </w:t>
+      </w:r>
+      <w:r>
+        <w:t xml:space="preserve">Sexual Recruits Outplanted onto</w:t>
+      </w:r>
+      <w:r>
+        <w:t xml:space="preserve"> </w:t>
+      </w:r>
+      <w:r>
+        <w:t xml:space="preserve">Mexican Caribbean</w:t>
+      </w:r>
+      <w:r>
+        <w:t xml:space="preserve"> </w:t>
+      </w:r>
+      <w:r>
+        <w:t xml:space="preserve">Reefs.”</w:t>
+      </w:r>
+      <w:r>
+        <w:t xml:space="preserve"> </w:t>
+      </w:r>
+      <w:r>
+        <w:rPr>
+          <w:i/>
+          <w:iCs/>
+        </w:rPr>
+        <w:t xml:space="preserve">PeerJ</w:t>
+      </w:r>
+      <w:r>
+        <w:t xml:space="preserve"> </w:t>
+      </w:r>
+      <w:r>
+        <w:t xml:space="preserve">11: e15813.</w:t>
+      </w:r>
+      <w:r>
+        <w:t xml:space="preserve"> </w:t>
+      </w:r>
+      <w:hyperlink r:id="rId92">
+        <w:r>
+          <w:rPr>
+            <w:rStyle w:val="Hyperlink"/>
+          </w:rPr>
+          <w:t xml:space="preserve">https://doi.org/10.7717/peerj.15813</w:t>
+        </w:r>
+      </w:hyperlink>
+      <w:r>
+        <w:t xml:space="preserve">.</w:t>
+      </w:r>
+    </w:p>
+    <w:bookmarkEnd w:id="93"/>
+    <w:bookmarkStart w:id="95" w:name="ref-neely2022"/>
+    <w:p>
+      <w:pPr>
+        <w:pStyle w:val="Bibliography"/>
+      </w:pPr>
+      <w:r>
+        <w:t xml:space="preserve">Neely, Karen L., Kevin A. Macaulay, and Kate S. Lunz. 2022.</w:t>
+      </w:r>
+      <w:r>
+        <w:t xml:space="preserve"> </w:t>
+      </w:r>
+      <w:r>
+        <w:t xml:space="preserve">“Population Trajectory and Stressors of</w:t>
+      </w:r>
+      <w:r>
+        <w:t xml:space="preserve"> </w:t>
+      </w:r>
+      <w:r>
+        <w:t xml:space="preserve">Acropora palmata</w:t>
+      </w:r>
+      <w:r>
+        <w:t xml:space="preserve"> </w:t>
+      </w:r>
+      <w:r>
+        <w:t xml:space="preserve">Sites in the</w:t>
+      </w:r>
+      <w:r>
+        <w:t xml:space="preserve"> </w:t>
+      </w:r>
+      <w:r>
+        <w:t xml:space="preserve">Florida Keys</w:t>
+      </w:r>
+      <w:r>
+        <w:t xml:space="preserve">.”</w:t>
+      </w:r>
+      <w:r>
+        <w:t xml:space="preserve"> </w:t>
+      </w:r>
+      <w:r>
+        <w:rPr>
+          <w:i/>
+          <w:iCs/>
+        </w:rPr>
+        <w:t xml:space="preserve">Frontiers in Marine Science</w:t>
+      </w:r>
+      <w:r>
+        <w:t xml:space="preserve"> </w:t>
+      </w:r>
+      <w:r>
+        <w:t xml:space="preserve">9: 978785.</w:t>
+      </w:r>
+      <w:r>
+        <w:t xml:space="preserve"> </w:t>
+      </w:r>
+      <w:hyperlink r:id="rId94">
+        <w:r>
+          <w:rPr>
+            <w:rStyle w:val="Hyperlink"/>
+          </w:rPr>
+          <w:t xml:space="preserve">https://doi.org/10.3389/fmars.2022.978785</w:t>
+        </w:r>
+      </w:hyperlink>
+      <w:r>
+        <w:t xml:space="preserve">.</w:t>
+      </w:r>
+    </w:p>
+    <w:bookmarkEnd w:id="95"/>
+    <w:bookmarkStart w:id="96" w:name="ref-ortizprosper2005"/>
+    <w:p>
+      <w:pPr>
+        <w:pStyle w:val="Bibliography"/>
+      </w:pPr>
+      <w:r>
+        <w:t xml:space="preserve">Ortiz Prosper, Antonio L. 2005.</w:t>
+      </w:r>
+      <w:r>
+        <w:t xml:space="preserve"> </w:t>
+      </w:r>
+      <w:r>
+        <w:t xml:space="preserve">“Population Dynamics of Hurricane-Generated Fragments of Elkhorn Coral</w:t>
+      </w:r>
+      <w:r>
+        <w:t xml:space="preserve"> </w:t>
+      </w:r>
+      <w:r>
+        <w:t xml:space="preserve">Acropora palmata</w:t>
+      </w:r>
+      <w:r>
+        <w:t xml:space="preserve"> </w:t>
+      </w:r>
+      <w:r>
+        <w:t xml:space="preserve">(</w:t>
+      </w:r>
+      <w:r>
+        <w:t xml:space="preserve">Lamarck</w:t>
+      </w:r>
+      <w:r>
+        <w:t xml:space="preserve">, 1816).”</w:t>
+      </w:r>
+      <w:r>
+        <w:t xml:space="preserve"> </w:t>
+      </w:r>
+      <w:r>
+        <w:t xml:space="preserve">{PhD} dissertation, University of Puerto Rico, Mayag</w:t>
+      </w:r>
+      <w:r>
+        <w:t xml:space="preserve">ü</w:t>
+      </w:r>
+      <w:r>
+        <w:t xml:space="preserve">ez.</w:t>
+      </w:r>
+    </w:p>
+    <w:bookmarkEnd w:id="96"/>
+    <w:bookmarkStart w:id="98" w:name="ref-pausch2018"/>
+    <w:p>
+      <w:pPr>
+        <w:pStyle w:val="Bibliography"/>
+      </w:pPr>
+      <w:r>
+        <w:t xml:space="preserve">Pausch, Rachel E., Dana E. Williams, and Margaret W. Miller. 2018.</w:t>
+      </w:r>
+      <w:r>
+        <w:t xml:space="preserve"> </w:t>
+      </w:r>
+      <w:r>
+        <w:t xml:space="preserve">“Impacts of Fragment Genotype, Habitat, and Size on Outplanted Elkhorn Coral Success Under Thermal Stress.”</w:t>
+      </w:r>
+      <w:r>
+        <w:t xml:space="preserve"> </w:t>
+      </w:r>
+      <w:r>
+        <w:rPr>
+          <w:i/>
+          <w:iCs/>
+        </w:rPr>
+        <w:t xml:space="preserve">Marine Ecology Progress Series</w:t>
+      </w:r>
+      <w:r>
+        <w:t xml:space="preserve"> </w:t>
+      </w:r>
+      <w:r>
+        <w:t xml:space="preserve">592: 109–17.</w:t>
+      </w:r>
+      <w:r>
+        <w:t xml:space="preserve"> </w:t>
+      </w:r>
+      <w:hyperlink r:id="rId97">
+        <w:r>
+          <w:rPr>
+            <w:rStyle w:val="Hyperlink"/>
+          </w:rPr>
+          <w:t xml:space="preserve">https://doi.org/10.3354/meps12488</w:t>
+        </w:r>
+      </w:hyperlink>
+      <w:r>
+        <w:t xml:space="preserve">.</w:t>
+      </w:r>
+    </w:p>
+    <w:bookmarkEnd w:id="98"/>
+    <w:bookmarkStart w:id="100" w:name="ref-pinongonzalez2018"/>
+    <w:p>
+      <w:pPr>
+        <w:pStyle w:val="Bibliography"/>
+      </w:pPr>
+      <w:r>
+        <w:t xml:space="preserve">Piñón-González, Victor M., and Anastazia T. Banaszak. 2018.</w:t>
+      </w:r>
+      <w:r>
+        <w:t xml:space="preserve"> </w:t>
+      </w:r>
+      <w:r>
+        <w:t xml:space="preserve">“Effects of Partial Mortality on Growth, Reproduction and Total Lipid Content in the Elkhorn Coral</w:t>
+      </w:r>
+      <w:r>
+        <w:t xml:space="preserve"> </w:t>
+      </w:r>
+      <w:r>
+        <w:t xml:space="preserve">Acropora palmata</w:t>
+      </w:r>
+      <w:r>
+        <w:t xml:space="preserve">.”</w:t>
+      </w:r>
+      <w:r>
+        <w:t xml:space="preserve"> </w:t>
+      </w:r>
+      <w:r>
+        <w:rPr>
+          <w:i/>
+          <w:iCs/>
+        </w:rPr>
+        <w:t xml:space="preserve">Frontiers in Marine Science</w:t>
+      </w:r>
+      <w:r>
+        <w:t xml:space="preserve"> </w:t>
+      </w:r>
+      <w:r>
+        <w:t xml:space="preserve">5: 396.</w:t>
+      </w:r>
+      <w:r>
+        <w:t xml:space="preserve"> </w:t>
+      </w:r>
+      <w:hyperlink r:id="rId99">
+        <w:r>
+          <w:rPr>
+            <w:rStyle w:val="Hyperlink"/>
+          </w:rPr>
+          <w:t xml:space="preserve">https://doi.org/10.3389/fmars.2018.00396</w:t>
+        </w:r>
+      </w:hyperlink>
+      <w:r>
+        <w:t xml:space="preserve">.</w:t>
+      </w:r>
+    </w:p>
+    <w:bookmarkEnd w:id="100"/>
+    <w:bookmarkStart w:id="102" w:name="ref-ramosromero2025"/>
+    <w:p>
+      <w:pPr>
+        <w:pStyle w:val="Bibliography"/>
+      </w:pPr>
+      <w:r>
+        <w:t xml:space="preserve">Ramos Romero, Amanda, Patricia González-Díaz, Gabriela Aguilera Pérez, and Anastazia T. Banaszak. 2025.</w:t>
+      </w:r>
+      <w:r>
+        <w:t xml:space="preserve"> </w:t>
+      </w:r>
+      <w:r>
+        <w:t xml:space="preserve">“Does Reef Crest Zone Selection Influence</w:t>
+      </w:r>
+      <w:r>
+        <w:t xml:space="preserve"> </w:t>
+      </w:r>
+      <w:r>
+        <w:t xml:space="preserve">Acropora palmata</w:t>
+      </w:r>
+      <w:r>
+        <w:t xml:space="preserve"> </w:t>
+      </w:r>
+      <w:r>
+        <w:t xml:space="preserve">(</w:t>
+      </w:r>
+      <w:r>
+        <w:t xml:space="preserve">Lamarck</w:t>
+      </w:r>
+      <w:r>
+        <w:t xml:space="preserve">, 1816) Fragment Survival and Growth?”</w:t>
+      </w:r>
+      <w:r>
+        <w:t xml:space="preserve"> </w:t>
+      </w:r>
+      <w:r>
+        <w:rPr>
+          <w:i/>
+          <w:iCs/>
+        </w:rPr>
+        <w:t xml:space="preserve">PeerJ</w:t>
+      </w:r>
+      <w:r>
+        <w:t xml:space="preserve"> </w:t>
+      </w:r>
+      <w:r>
+        <w:t xml:space="preserve">13: e20303.</w:t>
+      </w:r>
+      <w:r>
+        <w:t xml:space="preserve"> </w:t>
+      </w:r>
+      <w:hyperlink r:id="rId101">
+        <w:r>
+          <w:rPr>
+            <w:rStyle w:val="Hyperlink"/>
+          </w:rPr>
+          <w:t xml:space="preserve">https://doi.org/10.7717/peerj.20303</w:t>
+        </w:r>
+      </w:hyperlink>
+      <w:r>
+        <w:t xml:space="preserve">.</w:t>
+      </w:r>
+    </w:p>
+    <w:bookmarkEnd w:id="102"/>
+    <w:bookmarkStart w:id="104" w:name="ref-rogersmuller2012"/>
+    <w:p>
+      <w:pPr>
+        <w:pStyle w:val="Bibliography"/>
+      </w:pPr>
+      <w:r>
+        <w:t xml:space="preserve">Rogers, C. S., and E. M. Muller. 2012.</w:t>
+      </w:r>
+      <w:r>
+        <w:t xml:space="preserve"> </w:t>
+      </w:r>
+      <w:r>
+        <w:t xml:space="preserve">“Bleaching, Disease and Recovery in the Threatened Scleractinian Coral</w:t>
+      </w:r>
+      <w:r>
+        <w:t xml:space="preserve"> </w:t>
+      </w:r>
+      <w:r>
+        <w:t xml:space="preserve">Acropora palmata</w:t>
+      </w:r>
+      <w:r>
+        <w:t xml:space="preserve"> </w:t>
+      </w:r>
+      <w:r>
+        <w:t xml:space="preserve">in</w:t>
+      </w:r>
+      <w:r>
+        <w:t xml:space="preserve"> </w:t>
+      </w:r>
+      <w:r>
+        <w:t xml:space="preserve">St. John</w:t>
+      </w:r>
+      <w:r>
+        <w:t xml:space="preserve">,</w:t>
+      </w:r>
+      <w:r>
+        <w:t xml:space="preserve"> </w:t>
+      </w:r>
+      <w:r>
+        <w:t xml:space="preserve">US Virgin Islands</w:t>
+      </w:r>
+      <w:r>
+        <w:t xml:space="preserve">: 2003–2010.”</w:t>
+      </w:r>
+      <w:r>
+        <w:t xml:space="preserve"> </w:t>
+      </w:r>
+      <w:r>
+        <w:rPr>
+          <w:i/>
+          <w:iCs/>
+        </w:rPr>
+        <w:t xml:space="preserve">Coral Reefs</w:t>
+      </w:r>
+      <w:r>
+        <w:t xml:space="preserve"> </w:t>
+      </w:r>
+      <w:r>
+        <w:t xml:space="preserve">31: 807–19.</w:t>
+      </w:r>
+      <w:r>
+        <w:t xml:space="preserve"> </w:t>
+      </w:r>
+      <w:hyperlink r:id="rId103">
+        <w:r>
+          <w:rPr>
+            <w:rStyle w:val="Hyperlink"/>
+          </w:rPr>
+          <w:t xml:space="preserve">https://doi.org/10.1007/s00338-012-0898-8</w:t>
+        </w:r>
+      </w:hyperlink>
+      <w:r>
+        <w:t xml:space="preserve">.</w:t>
+      </w:r>
+    </w:p>
+    <w:bookmarkEnd w:id="104"/>
+    <w:bookmarkStart w:id="105" w:name="ref-rogers1982"/>
+    <w:p>
+      <w:pPr>
+        <w:pStyle w:val="Bibliography"/>
+      </w:pPr>
+      <w:r>
+        <w:t xml:space="preserve">Rogers, Caroline S., Thomas H. Suchanek, and Frank A. Pecora. 1982.</w:t>
+      </w:r>
+      <w:r>
+        <w:t xml:space="preserve"> </w:t>
+      </w:r>
+      <w:r>
+        <w:t xml:space="preserve">“Effects of</w:t>
+      </w:r>
+      <w:r>
+        <w:t xml:space="preserve"> </w:t>
+      </w:r>
+      <w:r>
+        <w:t xml:space="preserve">Hurricanes David</w:t>
+      </w:r>
+      <w:r>
+        <w:t xml:space="preserve"> </w:t>
+      </w:r>
+      <w:r>
+        <w:t xml:space="preserve">and</w:t>
+      </w:r>
+      <w:r>
+        <w:t xml:space="preserve"> </w:t>
+      </w:r>
+      <w:r>
+        <w:t xml:space="preserve">Frederic</w:t>
+      </w:r>
+      <w:r>
+        <w:t xml:space="preserve"> </w:t>
+      </w:r>
+      <w:r>
+        <w:t xml:space="preserve">(1979) on Shallow</w:t>
+      </w:r>
+      <w:r>
+        <w:t xml:space="preserve"> </w:t>
+      </w:r>
+      <w:r>
+        <w:t xml:space="preserve">Acropora palmata</w:t>
+      </w:r>
+      <w:r>
+        <w:t xml:space="preserve"> </w:t>
+      </w:r>
+      <w:r>
+        <w:t xml:space="preserve">Reef Communities:</w:t>
+      </w:r>
+      <w:r>
+        <w:t xml:space="preserve"> </w:t>
+      </w:r>
+      <w:r>
+        <w:t xml:space="preserve">St. Croix</w:t>
+      </w:r>
+      <w:r>
+        <w:t xml:space="preserve">,</w:t>
+      </w:r>
+      <w:r>
+        <w:t xml:space="preserve"> </w:t>
+      </w:r>
+      <w:r>
+        <w:t xml:space="preserve">U.S. Virgin Islands</w:t>
+      </w:r>
+      <w:r>
+        <w:t xml:space="preserve">.”</w:t>
       </w:r>
       <w:r>
         <w:t xml:space="preserve"> </w:t>
@@ -2321,37 +4883,328 @@
         <w:t xml:space="preserve">Bulletin of Marine Science</w:t>
       </w:r>
       <w:r>
-        <w:t xml:space="preserve">, ahead of print.</w:t>
-      </w:r>
-      <w:r>
-        <w:t xml:space="preserve"> </w:t>
-      </w:r>
-      <w:hyperlink r:id="rId53">
-        <w:r>
-          <w:rPr>
-            <w:rStyle w:val="Hyperlink"/>
-          </w:rPr>
-          <w:t xml:space="preserve">https://doi.org/10.5343/bms.2012.1016</w:t>
+        <w:t xml:space="preserve"> </w:t>
+      </w:r>
+      <w:r>
+        <w:t xml:space="preserve">32 (2): 532–48.</w:t>
+      </w:r>
+    </w:p>
+    <w:bookmarkEnd w:id="105"/>
+    <w:bookmarkStart w:id="107" w:name="ref-rosales2024"/>
+    <w:p>
+      <w:pPr>
+        <w:pStyle w:val="Bibliography"/>
+      </w:pPr>
+      <w:r>
+        <w:t xml:space="preserve">Rosales, Stephanie M., Benjamin D. Young, Allan J. Bright, et al. 2024.</w:t>
+      </w:r>
+      <w:r>
+        <w:t xml:space="preserve"> </w:t>
+      </w:r>
+      <w:r>
+        <w:t xml:space="preserve">“Reef Site and Habitat Influence Effectiveness of</w:t>
+      </w:r>
+      <w:r>
+        <w:t xml:space="preserve"> </w:t>
+      </w:r>
+      <w:r>
+        <w:t xml:space="preserve">Acropora palmata</w:t>
+      </w:r>
+      <w:r>
+        <w:t xml:space="preserve"> </w:t>
+      </w:r>
+      <w:r>
+        <w:t xml:space="preserve">Restoration and Its Microbiome in the</w:t>
+      </w:r>
+      <w:r>
+        <w:t xml:space="preserve"> </w:t>
+      </w:r>
+      <w:r>
+        <w:t xml:space="preserve">Florida Keys</w:t>
+      </w:r>
+      <w:r>
+        <w:t xml:space="preserve">.”</w:t>
+      </w:r>
+      <w:r>
+        <w:t xml:space="preserve"> </w:t>
+      </w:r>
+      <w:r>
+        <w:rPr>
+          <w:i/>
+          <w:iCs/>
+        </w:rPr>
+        <w:t xml:space="preserve">Communications Earth &amp; Environment</w:t>
+      </w:r>
+      <w:r>
+        <w:t xml:space="preserve"> </w:t>
+      </w:r>
+      <w:r>
+        <w:t xml:space="preserve">5: 689.</w:t>
+      </w:r>
+      <w:r>
+        <w:t xml:space="preserve"> </w:t>
+      </w:r>
+      <w:hyperlink r:id="rId106">
+        <w:r>
+          <w:rPr>
+            <w:rStyle w:val="Hyperlink"/>
+          </w:rPr>
+          <w:t xml:space="preserve">https://doi.org/10.1038/s43247-024-01816-7</w:t>
         </w:r>
       </w:hyperlink>
       <w:r>
         <w:t xml:space="preserve">.</w:t>
       </w:r>
     </w:p>
-    <w:bookmarkEnd w:id="54"/>
-    <w:bookmarkStart w:id="56" w:name="ref-gardner2003"/>
+    <w:bookmarkEnd w:id="107"/>
+    <w:bookmarkStart w:id="109" w:name="ref-schopmeyer2017"/>
     <w:p>
       <w:pPr>
         <w:pStyle w:val="Bibliography"/>
       </w:pPr>
       <w:r>
-        <w:t xml:space="preserve">Gardner, Toby A., Isabelle M. Côté, Jennifer A. Gill, Alastair Grant, and Andrew R. Watkinson. 2003.</w:t>
-      </w:r>
-      <w:r>
-        <w:t xml:space="preserve"> </w:t>
-      </w:r>
-      <w:r>
-        <w:t xml:space="preserve">“Long-Term Region-Wide Declines in</w:t>
+        <w:t xml:space="preserve">Schopmeyer, Stephanie A., Diego Lirman, Erich Bartels, et al. 2017.</w:t>
+      </w:r>
+      <w:r>
+        <w:t xml:space="preserve"> </w:t>
+      </w:r>
+      <w:r>
+        <w:t xml:space="preserve">“Regional Restoration Benchmarks for</w:t>
+      </w:r>
+      <w:r>
+        <w:t xml:space="preserve"> </w:t>
+      </w:r>
+      <w:r>
+        <w:t xml:space="preserve">Acropora cervicornis</w:t>
+      </w:r>
+      <w:r>
+        <w:t xml:space="preserve">.”</w:t>
+      </w:r>
+      <w:r>
+        <w:t xml:space="preserve"> </w:t>
+      </w:r>
+      <w:r>
+        <w:rPr>
+          <w:i/>
+          <w:iCs/>
+        </w:rPr>
+        <w:t xml:space="preserve">Coral Reefs</w:t>
+      </w:r>
+      <w:r>
+        <w:t xml:space="preserve"> </w:t>
+      </w:r>
+      <w:r>
+        <w:t xml:space="preserve">36: 1047–57.</w:t>
+      </w:r>
+      <w:r>
+        <w:t xml:space="preserve"> </w:t>
+      </w:r>
+      <w:hyperlink r:id="rId108">
+        <w:r>
+          <w:rPr>
+            <w:rStyle w:val="Hyperlink"/>
+          </w:rPr>
+          <w:t xml:space="preserve">https://doi.org/10.1007/s00338-017-1596-3</w:t>
+        </w:r>
+      </w:hyperlink>
+      <w:r>
+        <w:t xml:space="preserve">.</w:t>
+      </w:r>
+    </w:p>
+    <w:bookmarkEnd w:id="109"/>
+    <w:bookmarkStart w:id="110" w:name="ref-vardi2011"/>
+    <w:p>
+      <w:pPr>
+        <w:pStyle w:val="Bibliography"/>
+      </w:pPr>
+      <w:r>
+        <w:t xml:space="preserve">Vardi, Tali. 2011.</w:t>
+      </w:r>
+      <w:r>
+        <w:t xml:space="preserve"> </w:t>
+      </w:r>
+      <w:r>
+        <w:t xml:space="preserve">“The Threatened</w:t>
+      </w:r>
+      <w:r>
+        <w:t xml:space="preserve"> </w:t>
+      </w:r>
+      <w:r>
+        <w:t xml:space="preserve">Atlantic</w:t>
+      </w:r>
+      <w:r>
+        <w:t xml:space="preserve"> </w:t>
+      </w:r>
+      <w:r>
+        <w:t xml:space="preserve">Elkhorn Coral,</w:t>
+      </w:r>
+      <w:r>
+        <w:t xml:space="preserve"> </w:t>
+      </w:r>
+      <w:r>
+        <w:t xml:space="preserve">Acropora palmata</w:t>
+      </w:r>
+      <w:r>
+        <w:t xml:space="preserve">: Population Dynamics and Their Policy Implications.”</w:t>
+      </w:r>
+      <w:r>
+        <w:t xml:space="preserve"> </w:t>
+      </w:r>
+      <w:r>
+        <w:t xml:space="preserve">{PhD} dissertation, University of California, San Diego.</w:t>
+      </w:r>
+    </w:p>
+    <w:bookmarkEnd w:id="110"/>
+    <w:bookmarkStart w:id="112" w:name="ref-vardi2012"/>
+    <w:p>
+      <w:pPr>
+        <w:pStyle w:val="Bibliography"/>
+      </w:pPr>
+      <w:r>
+        <w:t xml:space="preserve">Vardi, Tali, Dana E. Williams, and Stuart A. Sandin. 2012.</w:t>
+      </w:r>
+      <w:r>
+        <w:t xml:space="preserve"> </w:t>
+      </w:r>
+      <w:r>
+        <w:t xml:space="preserve">“Population Dynamics of Threatened Elkhorn Coral in the Northern</w:t>
+      </w:r>
+      <w:r>
+        <w:t xml:space="preserve"> </w:t>
+      </w:r>
+      <w:r>
+        <w:t xml:space="preserve">Florida Keys</w:t>
+      </w:r>
+      <w:r>
+        <w:t xml:space="preserve">,</w:t>
+      </w:r>
+      <w:r>
+        <w:t xml:space="preserve"> </w:t>
+      </w:r>
+      <w:r>
+        <w:t xml:space="preserve">USA</w:t>
+      </w:r>
+      <w:r>
+        <w:t xml:space="preserve">.”</w:t>
+      </w:r>
+      <w:r>
+        <w:t xml:space="preserve"> </w:t>
+      </w:r>
+      <w:r>
+        <w:rPr>
+          <w:i/>
+          <w:iCs/>
+        </w:rPr>
+        <w:t xml:space="preserve">Endangered Species Research</w:t>
+      </w:r>
+      <w:r>
+        <w:t xml:space="preserve"> </w:t>
+      </w:r>
+      <w:r>
+        <w:t xml:space="preserve">19: 157–69.</w:t>
+      </w:r>
+      <w:r>
+        <w:t xml:space="preserve"> </w:t>
+      </w:r>
+      <w:hyperlink r:id="rId111">
+        <w:r>
+          <w:rPr>
+            <w:rStyle w:val="Hyperlink"/>
+          </w:rPr>
+          <w:t xml:space="preserve">https://doi.org/10.3354/esr00475</w:t>
+        </w:r>
+      </w:hyperlink>
+      <w:r>
+        <w:t xml:space="preserve">.</w:t>
+      </w:r>
+    </w:p>
+    <w:bookmarkEnd w:id="112"/>
+    <w:bookmarkStart w:id="114" w:name="ref-viechtbauer2010"/>
+    <w:p>
+      <w:pPr>
+        <w:pStyle w:val="Bibliography"/>
+      </w:pPr>
+      <w:r>
+        <w:t xml:space="preserve">Viechtbauer, Wolfgang. 2010.</w:t>
+      </w:r>
+      <w:r>
+        <w:t xml:space="preserve"> </w:t>
+      </w:r>
+      <w:r>
+        <w:t xml:space="preserve">“Conducting Meta-Analyses in</w:t>
+      </w:r>
+      <w:r>
+        <w:t xml:space="preserve"> </w:t>
+      </w:r>
+      <w:r>
+        <w:t xml:space="preserve">R</w:t>
+      </w:r>
+      <w:r>
+        <w:t xml:space="preserve"> </w:t>
+      </w:r>
+      <w:r>
+        <w:t xml:space="preserve">with the Metafor Package.”</w:t>
+      </w:r>
+      <w:r>
+        <w:t xml:space="preserve"> </w:t>
+      </w:r>
+      <w:r>
+        <w:rPr>
+          <w:i/>
+          <w:iCs/>
+        </w:rPr>
+        <w:t xml:space="preserve">Journal of Statistical Software</w:t>
+      </w:r>
+      <w:r>
+        <w:t xml:space="preserve"> </w:t>
+      </w:r>
+      <w:r>
+        <w:t xml:space="preserve">36 (3): 1–48.</w:t>
+      </w:r>
+      <w:r>
+        <w:t xml:space="preserve"> </w:t>
+      </w:r>
+      <w:hyperlink r:id="rId113">
+        <w:r>
+          <w:rPr>
+            <w:rStyle w:val="Hyperlink"/>
+          </w:rPr>
+          <w:t xml:space="preserve">https://doi.org/10.18637/jss.v036.i03</w:t>
+        </w:r>
+      </w:hyperlink>
+      <w:r>
+        <w:t xml:space="preserve">.</w:t>
+      </w:r>
+    </w:p>
+    <w:bookmarkEnd w:id="114"/>
+    <w:bookmarkStart w:id="116" w:name="ref-williams2008"/>
+    <w:p>
+      <w:pPr>
+        <w:pStyle w:val="Bibliography"/>
+      </w:pPr>
+      <w:r>
+        <w:t xml:space="preserve">Williams, D. E., M. W. Miller, and K. L. Kramer. 2008.</w:t>
+      </w:r>
+      <w:r>
+        <w:t xml:space="preserve"> </w:t>
+      </w:r>
+      <w:r>
+        <w:t xml:space="preserve">“Recruitment Failure in</w:t>
+      </w:r>
+      <w:r>
+        <w:t xml:space="preserve"> </w:t>
+      </w:r>
+      <w:r>
+        <w:t xml:space="preserve">Florida Keys</w:t>
+      </w:r>
+      <w:r>
+        <w:t xml:space="preserve"> </w:t>
+      </w:r>
+      <w:r>
+        <w:t xml:space="preserve">Acropora palmata</w:t>
+      </w:r>
+      <w:r>
+        <w:t xml:space="preserve">, a Threatened</w:t>
       </w:r>
       <w:r>
         <w:t xml:space="preserve"> </w:t>
@@ -2363,96 +5216,123 @@
         <w:t xml:space="preserve"> </w:t>
       </w:r>
       <w:r>
-        <w:t xml:space="preserve">Corals.”</w:t>
-      </w:r>
-      <w:r>
-        <w:t xml:space="preserve"> </w:t>
-      </w:r>
-      <w:r>
-        <w:rPr>
-          <w:i/>
-          <w:iCs/>
-        </w:rPr>
-        <w:t xml:space="preserve">Science</w:t>
-      </w:r>
-      <w:r>
-        <w:t xml:space="preserve"> </w:t>
-      </w:r>
-      <w:r>
-        <w:t xml:space="preserve">301 (5635): 958–60.</w:t>
-      </w:r>
-      <w:r>
-        <w:t xml:space="preserve"> </w:t>
-      </w:r>
-      <w:hyperlink r:id="rId55">
-        <w:r>
-          <w:rPr>
-            <w:rStyle w:val="Hyperlink"/>
-          </w:rPr>
-          <w:t xml:space="preserve">https://doi.org/10.1126/science.1086050</w:t>
+        <w:t xml:space="preserve">Coral.”</w:t>
+      </w:r>
+      <w:r>
+        <w:t xml:space="preserve"> </w:t>
+      </w:r>
+      <w:r>
+        <w:rPr>
+          <w:i/>
+          <w:iCs/>
+        </w:rPr>
+        <w:t xml:space="preserve">Coral Reefs</w:t>
+      </w:r>
+      <w:r>
+        <w:t xml:space="preserve"> </w:t>
+      </w:r>
+      <w:r>
+        <w:t xml:space="preserve">27: 697–705.</w:t>
+      </w:r>
+      <w:r>
+        <w:t xml:space="preserve"> </w:t>
+      </w:r>
+      <w:hyperlink r:id="rId115">
+        <w:r>
+          <w:rPr>
+            <w:rStyle w:val="Hyperlink"/>
+          </w:rPr>
+          <w:t xml:space="preserve">https://doi.org/10.1007/s00338-008-0386-3</w:t>
         </w:r>
       </w:hyperlink>
       <w:r>
         <w:t xml:space="preserve">.</w:t>
       </w:r>
     </w:p>
-    <w:bookmarkEnd w:id="56"/>
-    <w:bookmarkStart w:id="58" w:name="ref-knapp2003"/>
+    <w:bookmarkEnd w:id="116"/>
+    <w:bookmarkStart w:id="118" w:name="ref-williams2023"/>
     <w:p>
       <w:pPr>
         <w:pStyle w:val="Bibliography"/>
       </w:pPr>
       <w:r>
-        <w:t xml:space="preserve">Knapp, Guido, and Joachim Hartung. 2003.</w:t>
-      </w:r>
-      <w:r>
-        <w:t xml:space="preserve"> </w:t>
-      </w:r>
-      <w:r>
-        <w:t xml:space="preserve">“Improved Tests for a Random Effects Meta-Regression with a Single Covariate.”</w:t>
-      </w:r>
-      <w:r>
-        <w:t xml:space="preserve"> </w:t>
-      </w:r>
-      <w:r>
-        <w:rPr>
-          <w:i/>
-          <w:iCs/>
-        </w:rPr>
-        <w:t xml:space="preserve">Statistics in Medicine</w:t>
-      </w:r>
-      <w:r>
-        <w:t xml:space="preserve">, ahead of print.</w:t>
-      </w:r>
-      <w:r>
-        <w:t xml:space="preserve"> </w:t>
-      </w:r>
-      <w:hyperlink r:id="rId57">
-        <w:r>
-          <w:rPr>
-            <w:rStyle w:val="Hyperlink"/>
-          </w:rPr>
-          <w:t xml:space="preserve">https://doi.org/10.1002/sim.1482</w:t>
+        <w:t xml:space="preserve">Williams, Dana E., Allan J. Bright, Olivia M. Williamson, Amelia Moura, and Mark C. Ladd. 2023.</w:t>
+      </w:r>
+      <w:r>
+        <w:t xml:space="preserve"> </w:t>
+      </w:r>
+      <w:r>
+        <w:t xml:space="preserve">“Synchronous Spawning of Nursery-Raised Elkhorn Coral (</w:t>
+      </w:r>
+      <w:r>
+        <w:t xml:space="preserve">Acropora palmata</w:t>
+      </w:r>
+      <w:r>
+        <w:t xml:space="preserve">) Outplanted to Reefs in the</w:t>
+      </w:r>
+      <w:r>
+        <w:t xml:space="preserve"> </w:t>
+      </w:r>
+      <w:r>
+        <w:t xml:space="preserve">Florida Keys</w:t>
+      </w:r>
+      <w:r>
+        <w:t xml:space="preserve"> </w:t>
+      </w:r>
+      <w:r>
+        <w:t xml:space="preserve">(</w:t>
+      </w:r>
+      <w:r>
+        <w:t xml:space="preserve">United States</w:t>
+      </w:r>
+      <w:r>
+        <w:t xml:space="preserve">).”</w:t>
+      </w:r>
+      <w:r>
+        <w:t xml:space="preserve"> </w:t>
+      </w:r>
+      <w:r>
+        <w:rPr>
+          <w:i/>
+          <w:iCs/>
+        </w:rPr>
+        <w:t xml:space="preserve">Frontiers in Marine Science</w:t>
+      </w:r>
+      <w:r>
+        <w:t xml:space="preserve"> </w:t>
+      </w:r>
+      <w:r>
+        <w:t xml:space="preserve">10: 1180996.</w:t>
+      </w:r>
+      <w:r>
+        <w:t xml:space="preserve"> </w:t>
+      </w:r>
+      <w:hyperlink r:id="rId117">
+        <w:r>
+          <w:rPr>
+            <w:rStyle w:val="Hyperlink"/>
+          </w:rPr>
+          <w:t xml:space="preserve">https://doi.org/10.3389/fmars.2023.1180996</w:t>
         </w:r>
       </w:hyperlink>
       <w:r>
         <w:t xml:space="preserve">.</w:t>
       </w:r>
     </w:p>
-    <w:bookmarkEnd w:id="58"/>
-    <w:bookmarkStart w:id="59" w:name="ref-lirman1997"/>
+    <w:bookmarkEnd w:id="118"/>
+    <w:bookmarkStart w:id="120" w:name="ref-williamsmiller2010"/>
     <w:p>
       <w:pPr>
         <w:pStyle w:val="Bibliography"/>
       </w:pPr>
       <w:r>
-        <w:t xml:space="preserve">Lirman, Diego, and Peggy Fong. 1997.</w:t>
-      </w:r>
-      <w:r>
-        <w:t xml:space="preserve"> </w:t>
-      </w:r>
-      <w:r>
-        <w:t xml:space="preserve">“Patterns of Damage to the Branching Coral</w:t>
+        <w:t xml:space="preserve">Williams, Dana E., and Margaret W. Miller. 2010.</w:t>
+      </w:r>
+      <w:r>
+        <w:t xml:space="preserve"> </w:t>
+      </w:r>
+      <w:r>
+        <w:t xml:space="preserve">“Stabilization of Fragments to Enhance Asexual Recruitment in</w:t>
       </w:r>
       <w:r>
         <w:t xml:space="preserve"> </w:t>
@@ -2461,411 +5341,54 @@
         <w:t xml:space="preserve">Acropora palmata</w:t>
       </w:r>
       <w:r>
-        <w:t xml:space="preserve"> </w:t>
-      </w:r>
-      <w:r>
-        <w:t xml:space="preserve">Following Hurricane Andrew.”</w:t>
-      </w:r>
-      <w:r>
-        <w:t xml:space="preserve"> </w:t>
-      </w:r>
-      <w:r>
-        <w:rPr>
-          <w:i/>
-          <w:iCs/>
-        </w:rPr>
-        <w:t xml:space="preserve">Journal of Coastal Research</w:t>
-      </w:r>
+        <w:t xml:space="preserve">, a Threatened</w:t>
+      </w:r>
+      <w:r>
+        <w:t xml:space="preserve"> </w:t>
+      </w:r>
+      <w:r>
+        <w:t xml:space="preserve">Caribbean</w:t>
+      </w:r>
+      <w:r>
+        <w:t xml:space="preserve"> </w:t>
+      </w:r>
+      <w:r>
+        <w:t xml:space="preserve">Coral.”</w:t>
+      </w:r>
+      <w:r>
+        <w:t xml:space="preserve"> </w:t>
+      </w:r>
+      <w:r>
+        <w:rPr>
+          <w:i/>
+          <w:iCs/>
+        </w:rPr>
+        <w:t xml:space="preserve">Restoration Ecology</w:t>
+      </w:r>
+      <w:r>
+        <w:t xml:space="preserve"> </w:t>
+      </w:r>
+      <w:r>
+        <w:t xml:space="preserve">18 (S2): 446–51.</w:t>
+      </w:r>
+      <w:r>
+        <w:t xml:space="preserve"> </w:t>
+      </w:r>
+      <w:hyperlink r:id="rId119">
+        <w:r>
+          <w:rPr>
+            <w:rStyle w:val="Hyperlink"/>
+          </w:rPr>
+          <w:t xml:space="preserve">https://doi.org/10.1111/j.1526-100X.2009.00579.x</w:t>
+        </w:r>
+      </w:hyperlink>
       <w:r>
         <w:t xml:space="preserve">.</w:t>
       </w:r>
     </w:p>
-    <w:bookmarkEnd w:id="59"/>
-    <w:bookmarkStart w:id="61" w:name="ref-madin2020"/>
-    <w:p>
-      <w:pPr>
-        <w:pStyle w:val="Bibliography"/>
-      </w:pPr>
-      <w:r>
-        <w:t xml:space="preserve">Madin, Joshua S., Andrew H. Baird, Marissa L. Baskett, Sean R. Connolly, and Maria A. Dornelas. 2020.</w:t>
-      </w:r>
-      <w:r>
-        <w:t xml:space="preserve"> </w:t>
-      </w:r>
-      <w:r>
-        <w:t xml:space="preserve">“Partial Mortality and Growth in Corals.”</w:t>
-      </w:r>
-      <w:r>
-        <w:t xml:space="preserve"> </w:t>
-      </w:r>
-      <w:r>
-        <w:rPr>
-          <w:i/>
-          <w:iCs/>
-        </w:rPr>
-        <w:t xml:space="preserve">Biology Letters</w:t>
-      </w:r>
-      <w:r>
-        <w:t xml:space="preserve">, ahead of print.</w:t>
-      </w:r>
-      <w:r>
-        <w:t xml:space="preserve"> </w:t>
-      </w:r>
-      <w:hyperlink r:id="rId60">
-        <w:r>
-          <w:rPr>
-            <w:rStyle w:val="Hyperlink"/>
-          </w:rPr>
-          <w:t xml:space="preserve">https://doi.org/10.1098/rsbl.2019.0727</w:t>
-        </w:r>
-      </w:hyperlink>
-      <w:r>
-        <w:t xml:space="preserve">.</w:t>
-      </w:r>
-    </w:p>
-    <w:bookmarkEnd w:id="61"/>
-    <w:bookmarkStart w:id="63" w:name="ref-manzello2025"/>
-    <w:p>
-      <w:pPr>
-        <w:pStyle w:val="Bibliography"/>
-      </w:pPr>
-      <w:r>
-        <w:t xml:space="preserve">Manzello, Derek P., Ross Cunning, Richard F. Karp, et al.</w:t>
-      </w:r>
-      <w:r>
-        <w:t xml:space="preserve"> 2025.</w:t>
-      </w:r>
-      <w:r>
-        <w:t xml:space="preserve"> </w:t>
-      </w:r>
-      <w:r>
-        <w:t xml:space="preserve">“Heat-Driven Functional Extinction of</w:t>
-      </w:r>
-      <w:r>
-        <w:t xml:space="preserve"> </w:t>
-      </w:r>
-      <w:r>
-        <w:t xml:space="preserve">Caribbean</w:t>
-      </w:r>
-      <w:r>
-        <w:t xml:space="preserve"> </w:t>
-      </w:r>
-      <w:r>
-        <w:t xml:space="preserve">Acropora</w:t>
-      </w:r>
-      <w:r>
-        <w:t xml:space="preserve"> </w:t>
-      </w:r>
-      <w:r>
-        <w:t xml:space="preserve">Corals from</w:t>
-      </w:r>
-      <w:r>
-        <w:t xml:space="preserve"> </w:t>
-      </w:r>
-      <w:r>
-        <w:t xml:space="preserve">Florida</w:t>
-      </w:r>
-      <w:r>
-        <w:t xml:space="preserve">’s</w:t>
-      </w:r>
-      <w:r>
-        <w:t xml:space="preserve"> </w:t>
-      </w:r>
-      <w:r>
-        <w:t xml:space="preserve">Coral Reef</w:t>
-      </w:r>
-      <w:r>
-        <w:t xml:space="preserve">.”</w:t>
-      </w:r>
-      <w:r>
-        <w:t xml:space="preserve"> </w:t>
-      </w:r>
-      <w:r>
-        <w:rPr>
-          <w:i/>
-          <w:iCs/>
-        </w:rPr>
-        <w:t xml:space="preserve">Science</w:t>
-      </w:r>
-      <w:r>
-        <w:t xml:space="preserve"> </w:t>
-      </w:r>
-      <w:r>
-        <w:t xml:space="preserve">390 (6771): 361–66.</w:t>
-      </w:r>
-      <w:r>
-        <w:t xml:space="preserve"> </w:t>
-      </w:r>
-      <w:hyperlink r:id="rId62">
-        <w:r>
-          <w:rPr>
-            <w:rStyle w:val="Hyperlink"/>
-          </w:rPr>
-          <w:t xml:space="preserve">https://doi.org/10.1126/science.adx7825</w:t>
-        </w:r>
-      </w:hyperlink>
-      <w:r>
-        <w:t xml:space="preserve">.</w:t>
-      </w:r>
-    </w:p>
-    <w:bookmarkEnd w:id="63"/>
-    <w:bookmarkStart w:id="65" w:name="ref-ramosromero2025"/>
-    <w:p>
-      <w:pPr>
-        <w:pStyle w:val="Bibliography"/>
-      </w:pPr>
-      <w:r>
-        <w:t xml:space="preserve">Ramos Romero, Amanda, Patricia González-Díaz, Gabriela Aguilera Pérez, and Anastazia T. Banaszak. 2025.</w:t>
-      </w:r>
-      <w:r>
-        <w:t xml:space="preserve"> </w:t>
-      </w:r>
-      <w:r>
-        <w:t xml:space="preserve">“Does Reef Crest Zone Selection Influence</w:t>
-      </w:r>
-      <w:r>
-        <w:t xml:space="preserve"> </w:t>
-      </w:r>
-      <w:r>
-        <w:t xml:space="preserve">Acropora palmata</w:t>
-      </w:r>
-      <w:r>
-        <w:t xml:space="preserve"> </w:t>
-      </w:r>
-      <w:r>
-        <w:t xml:space="preserve">Fragment Survival and Growth?”</w:t>
-      </w:r>
-      <w:r>
-        <w:t xml:space="preserve"> </w:t>
-      </w:r>
-      <w:r>
-        <w:rPr>
-          <w:i/>
-          <w:iCs/>
-        </w:rPr>
-        <w:t xml:space="preserve">PeerJ</w:t>
-      </w:r>
-      <w:r>
-        <w:t xml:space="preserve">, ahead of print.</w:t>
-      </w:r>
-      <w:r>
-        <w:t xml:space="preserve"> </w:t>
-      </w:r>
-      <w:hyperlink r:id="rId64">
-        <w:r>
-          <w:rPr>
-            <w:rStyle w:val="Hyperlink"/>
-          </w:rPr>
-          <w:t xml:space="preserve">https://doi.org/10.7717/peerj.20303</w:t>
-        </w:r>
-      </w:hyperlink>
-      <w:r>
-        <w:t xml:space="preserve">.</w:t>
-      </w:r>
-    </w:p>
-    <w:bookmarkEnd w:id="65"/>
-    <w:bookmarkStart w:id="66" w:name="ref-vardi2011"/>
-    <w:p>
-      <w:pPr>
-        <w:pStyle w:val="Bibliography"/>
-      </w:pPr>
-      <w:r>
-        <w:t xml:space="preserve">Vardi, Tali. 2011.</w:t>
-      </w:r>
-      <w:r>
-        <w:t xml:space="preserve"> </w:t>
-      </w:r>
-      <w:r>
-        <w:rPr>
-          <w:i/>
-          <w:iCs/>
-        </w:rPr>
-        <w:t xml:space="preserve">The Threatened Atlantic Elkhorn Coral,</w:t>
-      </w:r>
-      <w:r>
-        <w:rPr>
-          <w:i/>
-          <w:iCs/>
-        </w:rPr>
-        <w:t xml:space="preserve"> </w:t>
-      </w:r>
-      <w:r>
-        <w:rPr>
-          <w:i/>
-          <w:iCs/>
-        </w:rPr>
-        <w:t xml:space="preserve">Acropora palmata</w:t>
-      </w:r>
-      <w:r>
-        <w:rPr>
-          <w:i/>
-          <w:iCs/>
-        </w:rPr>
-        <w:t xml:space="preserve">: Population Dynamics and Their Policy Implications</w:t>
-      </w:r>
-      <w:r>
-        <w:t xml:space="preserve">.</w:t>
-      </w:r>
-    </w:p>
-    <w:bookmarkEnd w:id="66"/>
-    <w:bookmarkStart w:id="68" w:name="ref-viechtbauer2010"/>
-    <w:p>
-      <w:pPr>
-        <w:pStyle w:val="Bibliography"/>
-      </w:pPr>
-      <w:r>
-        <w:t xml:space="preserve">Viechtbauer, Wolfgang. 2010.</w:t>
-      </w:r>
-      <w:r>
-        <w:t xml:space="preserve"> </w:t>
-      </w:r>
-      <w:r>
-        <w:t xml:space="preserve">“Conducting Meta-Analyses in</w:t>
-      </w:r>
-      <w:r>
-        <w:t xml:space="preserve"> </w:t>
-      </w:r>
-      <w:r>
-        <w:t xml:space="preserve">R</w:t>
-      </w:r>
-      <w:r>
-        <w:t xml:space="preserve"> </w:t>
-      </w:r>
-      <w:r>
-        <w:t xml:space="preserve">with the Metafor Package.”</w:t>
-      </w:r>
-      <w:r>
-        <w:t xml:space="preserve"> </w:t>
-      </w:r>
-      <w:r>
-        <w:rPr>
-          <w:i/>
-          <w:iCs/>
-        </w:rPr>
-        <w:t xml:space="preserve">Journal of Statistical Software</w:t>
-      </w:r>
-      <w:r>
-        <w:t xml:space="preserve">, ahead of print.</w:t>
-      </w:r>
-      <w:r>
-        <w:t xml:space="preserve"> </w:t>
-      </w:r>
-      <w:hyperlink r:id="rId67">
-        <w:r>
-          <w:rPr>
-            <w:rStyle w:val="Hyperlink"/>
-          </w:rPr>
-          <w:t xml:space="preserve">https://doi.org/10.18637/jss.v036.i03</w:t>
-        </w:r>
-      </w:hyperlink>
-      <w:r>
-        <w:t xml:space="preserve">.</w:t>
-      </w:r>
-    </w:p>
-    <w:bookmarkEnd w:id="68"/>
-    <w:bookmarkStart w:id="70" w:name="ref-williams2023"/>
-    <w:p>
-      <w:pPr>
-        <w:pStyle w:val="Bibliography"/>
-      </w:pPr>
-      <w:r>
-        <w:t xml:space="preserve">Williams, Dana E., Allan J. Bright, Olivia M. Williamson, Amelia Moura, and Mark C. Ladd. 2023.</w:t>
-      </w:r>
-      <w:r>
-        <w:t xml:space="preserve"> </w:t>
-      </w:r>
-      <w:r>
-        <w:t xml:space="preserve">“Synchronous Spawning of Nursery-Raised Elkhorn Coral (</w:t>
-      </w:r>
-      <w:r>
-        <w:t xml:space="preserve">Acropora palmata</w:t>
-      </w:r>
-      <w:r>
-        <w:t xml:space="preserve">) Outplanted to Reefs in the Florida Keys.”</w:t>
-      </w:r>
-      <w:r>
-        <w:t xml:space="preserve"> </w:t>
-      </w:r>
-      <w:r>
-        <w:rPr>
-          <w:i/>
-          <w:iCs/>
-        </w:rPr>
-        <w:t xml:space="preserve">Frontiers in Marine Science</w:t>
-      </w:r>
-      <w:r>
-        <w:t xml:space="preserve">, ahead of print.</w:t>
-      </w:r>
-      <w:r>
-        <w:t xml:space="preserve"> </w:t>
-      </w:r>
-      <w:hyperlink r:id="rId69">
-        <w:r>
-          <w:rPr>
-            <w:rStyle w:val="Hyperlink"/>
-          </w:rPr>
-          <w:t xml:space="preserve">https://doi.org/10.3389/fmars.2023.1180996</w:t>
-        </w:r>
-      </w:hyperlink>
-      <w:r>
-        <w:t xml:space="preserve">.</w:t>
-      </w:r>
-    </w:p>
-    <w:bookmarkEnd w:id="70"/>
-    <w:bookmarkStart w:id="72" w:name="ref-williams2008"/>
-    <w:p>
-      <w:pPr>
-        <w:pStyle w:val="Bibliography"/>
-      </w:pPr>
-      <w:r>
-        <w:t xml:space="preserve">Williams, Dana E., Margaret W. Miller, and K. L. Kramer. 2008.</w:t>
-      </w:r>
-      <w:r>
-        <w:t xml:space="preserve"> </w:t>
-      </w:r>
-      <w:r>
-        <w:t xml:space="preserve">“Recruitment Failure in Florida Keys</w:t>
-      </w:r>
-      <w:r>
-        <w:t xml:space="preserve"> </w:t>
-      </w:r>
-      <w:r>
-        <w:t xml:space="preserve">Acropora palmata</w:t>
-      </w:r>
-      <w:r>
-        <w:t xml:space="preserve">, a Threatened Caribbean Coral.”</w:t>
-      </w:r>
-      <w:r>
-        <w:t xml:space="preserve"> </w:t>
-      </w:r>
-      <w:r>
-        <w:rPr>
-          <w:i/>
-          <w:iCs/>
-        </w:rPr>
-        <w:t xml:space="preserve">Coral Reefs</w:t>
-      </w:r>
-      <w:r>
-        <w:t xml:space="preserve">, ahead of print.</w:t>
-      </w:r>
-      <w:r>
-        <w:t xml:space="preserve"> </w:t>
-      </w:r>
-      <w:hyperlink r:id="rId71">
-        <w:r>
-          <w:rPr>
-            <w:rStyle w:val="Hyperlink"/>
-          </w:rPr>
-          <w:t xml:space="preserve">https://doi.org/10.1007/s00338-008-0386-3</w:t>
-        </w:r>
-      </w:hyperlink>
-      <w:r>
-        <w:t xml:space="preserve">.</w:t>
-      </w:r>
-    </w:p>
-    <w:bookmarkEnd w:id="72"/>
-    <w:bookmarkEnd w:id="73"/>
-    <w:bookmarkEnd w:id="74"/>
+    <w:bookmarkEnd w:id="120"/>
+    <w:bookmarkEnd w:id="121"/>
+    <w:bookmarkEnd w:id="122"/>
     <w:sectPr>
       <w:footnotePr>
         <w:numRestart w:val="eachSect"/>

</xml_diff>

<commit_message>
Centralize audit exclusions and refresh submission checks
</commit_message>
<xml_diff>
--- a/paper/output/acropora_palmata_demography_manuscript.docx
+++ b/paper/output/acropora_palmata_demography_manuscript.docx
@@ -177,6 +177,20 @@
         <w:t xml:space="preserve">Correspondence: A. Raine Detmer</w:t>
       </w:r>
     </w:p>
+    <w:p>
+      <w:pPr>
+        <w:pStyle w:val="BodyText"/>
+      </w:pPr>
+      <w:r>
+        <w:t xml:space="preserve">Corresponding author email: [insert corresponding-author email]</w:t>
+      </w:r>
+      <w:r>
+        <w:t xml:space="preserve"> </w:t>
+      </w:r>
+      <w:r>
+        <w:t xml:space="preserve">ORCID iDs: Adrian C. Stier [insert ORCID]; A. Raine Detmer [insert ORCID]; Jameal F. Samhouri [insert ORCID]; Darcy Bradley [insert ORCID]; Aldo Croquer [insert ORCID]; Rita I. Sellares-Blasco [insert ORCID]</w:t>
+      </w:r>
+    </w:p>
     <w:bookmarkStart w:id="9" w:name="abstract"/>
     <w:p>
       <w:pPr>
@@ -586,38 +600,38 @@
       <w:r>
         <w:t xml:space="preserve"> </w:t>
       </w:r>
+      <w:hyperlink w:anchor="ref-banister2024">
+        <w:r>
+          <w:rPr>
+            <w:rStyle w:val="Hyperlink"/>
+          </w:rPr>
+          <w:t xml:space="preserve">Banister et al.</w:t>
+        </w:r>
+        <w:r>
+          <w:rPr>
+            <w:rStyle w:val="Hyperlink"/>
+          </w:rPr>
+          <w:t xml:space="preserve"> </w:t>
+        </w:r>
+        <w:r>
+          <w:rPr>
+            <w:rStyle w:val="Hyperlink"/>
+          </w:rPr>
+          <w:t xml:space="preserve">2024</w:t>
+        </w:r>
+      </w:hyperlink>
+      <w:r>
+        <w:t xml:space="preserve">;</w:t>
+      </w:r>
+      <w:r>
+        <w:t xml:space="preserve"> </w:t>
+      </w:r>
       <w:hyperlink w:anchor="ref-ramosromero2025">
         <w:r>
           <w:rPr>
             <w:rStyle w:val="Hyperlink"/>
           </w:rPr>
           <w:t xml:space="preserve">Ramos Romero et al. 2025</w:t>
-        </w:r>
-      </w:hyperlink>
-      <w:r>
-        <w:t xml:space="preserve">;</w:t>
-      </w:r>
-      <w:r>
-        <w:t xml:space="preserve"> </w:t>
-      </w:r>
-      <w:hyperlink w:anchor="ref-banister2024">
-        <w:r>
-          <w:rPr>
-            <w:rStyle w:val="Hyperlink"/>
-          </w:rPr>
-          <w:t xml:space="preserve">Banister et al.</w:t>
-        </w:r>
-        <w:r>
-          <w:rPr>
-            <w:rStyle w:val="Hyperlink"/>
-          </w:rPr>
-          <w:t xml:space="preserve"> </w:t>
-        </w:r>
-        <w:r>
-          <w:rPr>
-            <w:rStyle w:val="Hyperlink"/>
-          </w:rPr>
-          <w:t xml:space="preserve">2024</w:t>
         </w:r>
       </w:hyperlink>
       <w:r>
@@ -3166,13 +3180,7 @@
         <w:pStyle w:val="Bibliography"/>
       </w:pPr>
       <w:r>
-        <w:t xml:space="preserve">Aronson, Richard B., and William F. Precht. 2001.</w:t>
-      </w:r>
-      <w:r>
-        <w:t xml:space="preserve"> </w:t>
-      </w:r>
-      <w:r>
-        <w:t xml:space="preserve">“White-Band Disease and the Changing Face of</w:t>
+        <w:t xml:space="preserve">Aronson RB, Precht WF (2001) White-band disease and the changing face of</w:t>
       </w:r>
       <w:r>
         <w:t xml:space="preserve"> </w:t>
@@ -3184,23 +3192,7 @@
         <w:t xml:space="preserve"> </w:t>
       </w:r>
       <w:r>
-        <w:t xml:space="preserve">Coral Reefs.”</w:t>
-      </w:r>
-      <w:r>
-        <w:t xml:space="preserve"> </w:t>
-      </w:r>
-      <w:r>
-        <w:rPr>
-          <w:i/>
-          <w:iCs/>
-        </w:rPr>
-        <w:t xml:space="preserve">Hydrobiologia</w:t>
-      </w:r>
-      <w:r>
-        <w:t xml:space="preserve"> </w:t>
-      </w:r>
-      <w:r>
-        <w:t xml:space="preserve">460: 25–38.</w:t>
+        <w:t xml:space="preserve">coral reefs. Hydrobiologia 460:25–38</w:t>
       </w:r>
     </w:p>
     <w:bookmarkEnd w:id="52"/>
@@ -3210,16 +3202,13 @@
         <w:pStyle w:val="Bibliography"/>
       </w:pPr>
       <w:r>
-        <w:t xml:space="preserve">Banister, Raymond B., T. Shay Viehman, Stephanie Schopmeyer, and Robert van Woesik</w:t>
-      </w:r>
-      <w:r>
-        <w:t xml:space="preserve">. 2024.</w:t>
-      </w:r>
-      <w:r>
-        <w:t xml:space="preserve"> </w:t>
-      </w:r>
-      <w:r>
-        <w:t xml:space="preserve">“Environmental Predictors for the Restoration of a Critically Endangered Coral,</w:t>
+        <w:t xml:space="preserve">Banister RB, Viehman TS, Schopmeyer S, van Woesik R</w:t>
+      </w:r>
+      <w:r>
+        <w:t xml:space="preserve"> </w:t>
+      </w:r>
+      <w:r>
+        <w:t xml:space="preserve">(2024) Environmental predictors for the restoration of a critically endangered coral,</w:t>
       </w:r>
       <w:r>
         <w:t xml:space="preserve"> </w:t>
@@ -3228,7 +3217,7 @@
         <w:t xml:space="preserve">Acropora palmata</w:t>
       </w:r>
       <w:r>
-        <w:t xml:space="preserve">, Along the</w:t>
+        <w:t xml:space="preserve">, along the</w:t>
       </w:r>
       <w:r>
         <w:t xml:space="preserve"> </w:t>
@@ -3240,23 +3229,7 @@
         <w:t xml:space="preserve"> </w:t>
       </w:r>
       <w:r>
-        <w:t xml:space="preserve">Reef Tract.”</w:t>
-      </w:r>
-      <w:r>
-        <w:t xml:space="preserve"> </w:t>
-      </w:r>
-      <w:r>
-        <w:rPr>
-          <w:i/>
-          <w:iCs/>
-        </w:rPr>
-        <w:t xml:space="preserve">PLoS ONE</w:t>
-      </w:r>
-      <w:r>
-        <w:t xml:space="preserve"> </w:t>
-      </w:r>
-      <w:r>
-        <w:t xml:space="preserve">19 (1): e0296485.</w:t>
+        <w:t xml:space="preserve">reef tract. PLoS ONE 19:e0296485.</w:t>
       </w:r>
       <w:r>
         <w:t xml:space="preserve"> </w:t>
@@ -3269,9 +3242,6 @@
           <w:t xml:space="preserve">https://doi.org/10.1371/journal.pone.0296485</w:t>
         </w:r>
       </w:hyperlink>
-      <w:r>
-        <w:t xml:space="preserve">.</w:t>
-      </w:r>
     </w:p>
     <w:bookmarkEnd w:id="54"/>
     <w:bookmarkStart w:id="56" w:name="ref-bostromeinarsson2020"/>
@@ -3280,13 +3250,7 @@
         <w:pStyle w:val="Bibliography"/>
       </w:pPr>
       <w:r>
-        <w:t xml:space="preserve">Boström-Einarsson, Lisa, Russell C. Babcock, Elisa Bayraktarov, et al. 2020.</w:t>
-      </w:r>
-      <w:r>
-        <w:t xml:space="preserve"> </w:t>
-      </w:r>
-      <w:r>
-        <w:t xml:space="preserve">“Coral Restoration –</w:t>
+        <w:t xml:space="preserve">Boström-Einarsson L, Babcock RC, Bayraktarov E, et al (2020) Coral restoration –</w:t>
       </w:r>
       <w:r>
         <w:t xml:space="preserve"> </w:t>
@@ -3298,23 +3262,7 @@
         <w:t xml:space="preserve"> </w:t>
       </w:r>
       <w:r>
-        <w:t xml:space="preserve">Systematic Review of Current Methods, Successes, Failures and Future Directions.”</w:t>
-      </w:r>
-      <w:r>
-        <w:t xml:space="preserve"> </w:t>
-      </w:r>
-      <w:r>
-        <w:rPr>
-          <w:i/>
-          <w:iCs/>
-        </w:rPr>
-        <w:t xml:space="preserve">PLoS ONE</w:t>
-      </w:r>
-      <w:r>
-        <w:t xml:space="preserve"> </w:t>
-      </w:r>
-      <w:r>
-        <w:t xml:space="preserve">15 (1): e0226631.</w:t>
+        <w:t xml:space="preserve">systematic review of current methods, successes, failures and future directions. PLoS ONE 15:e0226631.</w:t>
       </w:r>
       <w:r>
         <w:t xml:space="preserve"> </w:t>
@@ -3327,9 +3275,6 @@
           <w:t xml:space="preserve">https://doi.org/10.1371/journal.pone.0226631</w:t>
         </w:r>
       </w:hyperlink>
-      <w:r>
-        <w:t xml:space="preserve">.</w:t>
-      </w:r>
     </w:p>
     <w:bookmarkEnd w:id="56"/>
     <w:bookmarkStart w:id="58" w:name="ref-bruckner2001"/>
@@ -3338,13 +3283,7 @@
         <w:pStyle w:val="Bibliography"/>
       </w:pPr>
       <w:r>
-        <w:t xml:space="preserve">Bruckner, A. W., and R. J. Bruckner. 2001.</w:t>
-      </w:r>
-      <w:r>
-        <w:t xml:space="preserve"> </w:t>
-      </w:r>
-      <w:r>
-        <w:t xml:space="preserve">“Condition of Restored</w:t>
+        <w:t xml:space="preserve">Bruckner AW, Bruckner RJ (2001) Condition of restored</w:t>
       </w:r>
       <w:r>
         <w:t xml:space="preserve"> </w:t>
@@ -3356,7 +3295,7 @@
         <w:t xml:space="preserve"> </w:t>
       </w:r>
       <w:r>
-        <w:t xml:space="preserve">Fragments Off</w:t>
+        <w:t xml:space="preserve">fragments off</w:t>
       </w:r>
       <w:r>
         <w:t xml:space="preserve"> </w:t>
@@ -3374,7 +3313,7 @@
         <w:t xml:space="preserve">Puerto Rico</w:t>
       </w:r>
       <w:r>
-        <w:t xml:space="preserve">, 2 Years After the</w:t>
+        <w:t xml:space="preserve">, 2 years after the</w:t>
       </w:r>
       <w:r>
         <w:t xml:space="preserve"> </w:t>
@@ -3386,23 +3325,7 @@
         <w:t xml:space="preserve"> </w:t>
       </w:r>
       <w:r>
-        <w:t xml:space="preserve">Ship Grounding.”</w:t>
-      </w:r>
-      <w:r>
-        <w:t xml:space="preserve"> </w:t>
-      </w:r>
-      <w:r>
-        <w:rPr>
-          <w:i/>
-          <w:iCs/>
-        </w:rPr>
-        <w:t xml:space="preserve">Coral Reefs</w:t>
-      </w:r>
-      <w:r>
-        <w:t xml:space="preserve"> </w:t>
-      </w:r>
-      <w:r>
-        <w:t xml:space="preserve">20: 235–43.</w:t>
+        <w:t xml:space="preserve">ship grounding. Coral Reefs 20:235–243.</w:t>
       </w:r>
       <w:r>
         <w:t xml:space="preserve"> </w:t>
@@ -3415,9 +3338,6 @@
           <w:t xml:space="preserve">https://doi.org/10.1007/s003380100164</w:t>
         </w:r>
       </w:hyperlink>
-      <w:r>
-        <w:t xml:space="preserve">.</w:t>
-      </w:r>
     </w:p>
     <w:bookmarkEnd w:id="58"/>
     <w:bookmarkStart w:id="60" w:name="ref-chamberland2015"/>
@@ -3426,35 +3346,13 @@
         <w:pStyle w:val="Bibliography"/>
       </w:pPr>
       <w:r>
-        <w:t xml:space="preserve">Chamberland, Valérie F., Mark J. A. Vermeij, Mike Brittsan, et al. 2015.</w:t>
-      </w:r>
-      <w:r>
-        <w:t xml:space="preserve"> </w:t>
-      </w:r>
-      <w:r>
-        <w:t xml:space="preserve">“Restoration of Critically Endangered Elkhorn Coral (</w:t>
+        <w:t xml:space="preserve">Chamberland VF, Vermeij MJA, Brittsan M, et al (2015) Restoration of critically endangered elkhorn coral (</w:t>
       </w:r>
       <w:r>
         <w:t xml:space="preserve">Acropora palmata</w:t>
       </w:r>
       <w:r>
-        <w:t xml:space="preserve">) Populations Using Larvae Reared from Wild-Caught Gametes.”</w:t>
-      </w:r>
-      <w:r>
-        <w:t xml:space="preserve"> </w:t>
-      </w:r>
-      <w:r>
-        <w:rPr>
-          <w:i/>
-          <w:iCs/>
-        </w:rPr>
-        <w:t xml:space="preserve">Global Ecology and Conservation</w:t>
-      </w:r>
-      <w:r>
-        <w:t xml:space="preserve"> </w:t>
-      </w:r>
-      <w:r>
-        <w:t xml:space="preserve">4: 526–37.</w:t>
+        <w:t xml:space="preserve">) populations using larvae reared from wild-caught gametes. Global Ecology and Conservation 4:526–537.</w:t>
       </w:r>
       <w:r>
         <w:t xml:space="preserve"> </w:t>
@@ -3467,9 +3365,6 @@
           <w:t xml:space="preserve">https://doi.org/10.1016/j.gecco.2015.10.005</w:t>
         </w:r>
       </w:hyperlink>
-      <w:r>
-        <w:t xml:space="preserve">.</w:t>
-      </w:r>
     </w:p>
     <w:bookmarkEnd w:id="60"/>
     <w:bookmarkStart w:id="62" w:name="ref-detmer2025"/>
@@ -3478,29 +3373,7 @@
         <w:pStyle w:val="Bibliography"/>
       </w:pPr>
       <w:r>
-        <w:t xml:space="preserve">Detmer, A. Raine, Eric J. Ward, Mary E. Hunsicker, et al. 2025.</w:t>
-      </w:r>
-      <w:r>
-        <w:t xml:space="preserve"> </w:t>
-      </w:r>
-      <w:r>
-        <w:t xml:space="preserve">“Evaluating the Robustness of Generalized Additive Models as a Tool for Threshold Detection in Variable Environments.”</w:t>
-      </w:r>
-      <w:r>
-        <w:t xml:space="preserve"> </w:t>
-      </w:r>
-      <w:r>
-        <w:rPr>
-          <w:i/>
-          <w:iCs/>
-        </w:rPr>
-        <w:t xml:space="preserve">Ecosphere</w:t>
-      </w:r>
-      <w:r>
-        <w:t xml:space="preserve"> </w:t>
-      </w:r>
-      <w:r>
-        <w:t xml:space="preserve">16 (3): e70117.</w:t>
+        <w:t xml:space="preserve">Detmer AR, Ward EJ, Hunsicker ME, et al (2025) Evaluating the robustness of generalized additive models as a tool for threshold detection in variable environments. Ecosphere 16:e70117.</w:t>
       </w:r>
       <w:r>
         <w:t xml:space="preserve"> </w:t>
@@ -3513,9 +3386,6 @@
           <w:t xml:space="preserve">https://doi.org/10.1002/ecs2.70117</w:t>
         </w:r>
       </w:hyperlink>
-      <w:r>
-        <w:t xml:space="preserve">.</w:t>
-      </w:r>
     </w:p>
     <w:bookmarkEnd w:id="62"/>
     <w:bookmarkStart w:id="64" w:name="ref-edmundsriegl2020"/>
@@ -3524,29 +3394,7 @@
         <w:pStyle w:val="Bibliography"/>
       </w:pPr>
       <w:r>
-        <w:t xml:space="preserve">Edmunds, Peter J., and Bernhard Riegl. 2020.</w:t>
-      </w:r>
-      <w:r>
-        <w:t xml:space="preserve"> </w:t>
-      </w:r>
-      <w:r>
-        <w:t xml:space="preserve">“Urgent Need for Coral Demography in a World Where Corals Are Disappearing.”</w:t>
-      </w:r>
-      <w:r>
-        <w:t xml:space="preserve"> </w:t>
-      </w:r>
-      <w:r>
-        <w:rPr>
-          <w:i/>
-          <w:iCs/>
-        </w:rPr>
-        <w:t xml:space="preserve">Marine Ecology Progress Series</w:t>
-      </w:r>
-      <w:r>
-        <w:t xml:space="preserve"> </w:t>
-      </w:r>
-      <w:r>
-        <w:t xml:space="preserve">635: 233–42.</w:t>
+        <w:t xml:space="preserve">Edmunds PJ, Riegl B (2020) Urgent need for coral demography in a world where corals are disappearing. Marine Ecology Progress Series 635:233–242.</w:t>
       </w:r>
       <w:r>
         <w:t xml:space="preserve"> </w:t>
@@ -3559,9 +3407,6 @@
           <w:t xml:space="preserve">https://doi.org/10.3354/meps13205</w:t>
         </w:r>
       </w:hyperlink>
-      <w:r>
-        <w:t xml:space="preserve">.</w:t>
-      </w:r>
     </w:p>
     <w:bookmarkEnd w:id="64"/>
     <w:bookmarkStart w:id="66" w:name="ref-forrester2013"/>
@@ -3570,13 +3415,7 @@
         <w:pStyle w:val="Bibliography"/>
       </w:pPr>
       <w:r>
-        <w:t xml:space="preserve">Forrester, Graham E., Megan A. Ferguson, Caitlin E. O’Connell-Rodwell, and Lianna L. Jarecki. 2014.</w:t>
-      </w:r>
-      <w:r>
-        <w:t xml:space="preserve"> </w:t>
-      </w:r>
-      <w:r>
-        <w:t xml:space="preserve">“Long-Term Survival and Colony Growth of</w:t>
+        <w:t xml:space="preserve">Forrester GE, Ferguson MA, O’Connell-Rodwell CE, Jarecki LL (2014) Long-term survival and colony growth of</w:t>
       </w:r>
       <w:r>
         <w:t xml:space="preserve"> </w:t>
@@ -3588,23 +3427,7 @@
         <w:t xml:space="preserve"> </w:t>
       </w:r>
       <w:r>
-        <w:t xml:space="preserve">Fragments Transplanted by Volunteers for Restoration.”</w:t>
-      </w:r>
-      <w:r>
-        <w:t xml:space="preserve"> </w:t>
-      </w:r>
-      <w:r>
-        <w:rPr>
-          <w:i/>
-          <w:iCs/>
-        </w:rPr>
-        <w:t xml:space="preserve">Aquatic Conservation: Marine and Freshwater Ecosystems</w:t>
-      </w:r>
-      <w:r>
-        <w:t xml:space="preserve"> </w:t>
-      </w:r>
-      <w:r>
-        <w:t xml:space="preserve">24: 81–91.</w:t>
+        <w:t xml:space="preserve">fragments transplanted by volunteers for restoration. Aquatic Conservation: Marine and Freshwater Ecosystems 24:81–91.</w:t>
       </w:r>
       <w:r>
         <w:t xml:space="preserve"> </w:t>
@@ -3617,9 +3440,6 @@
           <w:t xml:space="preserve">https://doi.org/10.1002/aqc.2374</w:t>
         </w:r>
       </w:hyperlink>
-      <w:r>
-        <w:t xml:space="preserve">.</w:t>
-      </w:r>
     </w:p>
     <w:bookmarkEnd w:id="66"/>
     <w:bookmarkStart w:id="68" w:name="ref-forrester2012"/>
@@ -3628,13 +3448,7 @@
         <w:pStyle w:val="Bibliography"/>
       </w:pPr>
       <w:r>
-        <w:t xml:space="preserve">Forrester, Graham E., Amy Maynard, Stephanie Schofield, and Kerianne Taylor. 2012.</w:t>
-      </w:r>
-      <w:r>
-        <w:t xml:space="preserve"> </w:t>
-      </w:r>
-      <w:r>
-        <w:t xml:space="preserve">“Evaluating Causes of Transplant Stress in Fragments of</w:t>
+        <w:t xml:space="preserve">Forrester GE, Maynard A, Schofield S, Taylor K (2012) Evaluating causes of transplant stress in fragments of</w:t>
       </w:r>
       <w:r>
         <w:t xml:space="preserve"> </w:t>
@@ -3646,20 +3460,7 @@
         <w:t xml:space="preserve"> </w:t>
       </w:r>
       <w:r>
-        <w:t xml:space="preserve">Used for Coral Reef Restoration.”</w:t>
-      </w:r>
-      <w:r>
-        <w:t xml:space="preserve"> </w:t>
-      </w:r>
-      <w:r>
-        <w:rPr>
-          <w:i/>
-          <w:iCs/>
-        </w:rPr>
-        <w:t xml:space="preserve">Bulletin of Marine Science</w:t>
-      </w:r>
-      <w:r>
-        <w:t xml:space="preserve">, ahead of print.</w:t>
+        <w:t xml:space="preserve">used for coral reef restoration. Bulletin of Marine Science 88:1099–1113.</w:t>
       </w:r>
       <w:r>
         <w:t xml:space="preserve"> </w:t>
@@ -3672,9 +3473,6 @@
           <w:t xml:space="preserve">https://doi.org/10.5343/bms.2012.1016</w:t>
         </w:r>
       </w:hyperlink>
-      <w:r>
-        <w:t xml:space="preserve">.</w:t>
-      </w:r>
     </w:p>
     <w:bookmarkEnd w:id="68"/>
     <w:bookmarkStart w:id="70" w:name="ref-gardner2003"/>
@@ -3683,13 +3481,7 @@
         <w:pStyle w:val="Bibliography"/>
       </w:pPr>
       <w:r>
-        <w:t xml:space="preserve">Gardner, Toby A., Isabelle M. Côté, Jennifer A. Gill, Alastair Grant, and Andrew R. Watkinson. 2003.</w:t>
-      </w:r>
-      <w:r>
-        <w:t xml:space="preserve"> </w:t>
-      </w:r>
-      <w:r>
-        <w:t xml:space="preserve">“Long-Term Region-Wide Declines in</w:t>
+        <w:t xml:space="preserve">Gardner TA, Côté IM, Gill JA, et al (2003) Long-term region-wide declines in</w:t>
       </w:r>
       <w:r>
         <w:t xml:space="preserve"> </w:t>
@@ -3701,23 +3493,7 @@
         <w:t xml:space="preserve"> </w:t>
       </w:r>
       <w:r>
-        <w:t xml:space="preserve">Corals.”</w:t>
-      </w:r>
-      <w:r>
-        <w:t xml:space="preserve"> </w:t>
-      </w:r>
-      <w:r>
-        <w:rPr>
-          <w:i/>
-          <w:iCs/>
-        </w:rPr>
-        <w:t xml:space="preserve">Science</w:t>
-      </w:r>
-      <w:r>
-        <w:t xml:space="preserve"> </w:t>
-      </w:r>
-      <w:r>
-        <w:t xml:space="preserve">301 (5635): 958–60.</w:t>
+        <w:t xml:space="preserve">corals. Science 301:958–960.</w:t>
       </w:r>
       <w:r>
         <w:t xml:space="preserve"> </w:t>
@@ -3730,9 +3506,6 @@
           <w:t xml:space="preserve">https://doi.org/10.1126/science.1086050</w:t>
         </w:r>
       </w:hyperlink>
-      <w:r>
-        <w:t xml:space="preserve">.</w:t>
-      </w:r>
     </w:p>
     <w:bookmarkEnd w:id="70"/>
     <w:bookmarkStart w:id="72" w:name="ref-garrison2008"/>
@@ -3741,13 +3514,7 @@
         <w:pStyle w:val="Bibliography"/>
       </w:pPr>
       <w:r>
-        <w:t xml:space="preserve">Garrison, Virginia, and Greg Ward. 2008.</w:t>
-      </w:r>
-      <w:r>
-        <w:t xml:space="preserve"> </w:t>
-      </w:r>
-      <w:r>
-        <w:t xml:space="preserve">“Storm-Generated Coral Fragments –</w:t>
+        <w:t xml:space="preserve">Garrison V, Ward G (2008) Storm-generated coral fragments –</w:t>
       </w:r>
       <w:r>
         <w:t xml:space="preserve"> </w:t>
@@ -3759,23 +3526,7 @@
         <w:t xml:space="preserve"> </w:t>
       </w:r>
       <w:r>
-        <w:t xml:space="preserve">Viable Source of Transplants for Reef Rehabilitation.”</w:t>
-      </w:r>
-      <w:r>
-        <w:t xml:space="preserve"> </w:t>
-      </w:r>
-      <w:r>
-        <w:rPr>
-          <w:i/>
-          <w:iCs/>
-        </w:rPr>
-        <w:t xml:space="preserve">Biological Conservation</w:t>
-      </w:r>
-      <w:r>
-        <w:t xml:space="preserve"> </w:t>
-      </w:r>
-      <w:r>
-        <w:t xml:space="preserve">141: 3089–100.</w:t>
+        <w:t xml:space="preserve">viable source of transplants for reef rehabilitation. Biological Conservation 141:3089–3100.</w:t>
       </w:r>
       <w:r>
         <w:t xml:space="preserve"> </w:t>
@@ -3788,9 +3539,6 @@
           <w:t xml:space="preserve">https://doi.org/10.1016/j.biocon.2008.09.020</w:t>
         </w:r>
       </w:hyperlink>
-      <w:r>
-        <w:t xml:space="preserve">.</w:t>
-      </w:r>
     </w:p>
     <w:bookmarkEnd w:id="72"/>
     <w:bookmarkStart w:id="73" w:name="ref-highsmith1982"/>
@@ -3799,93 +3547,27 @@
         <w:pStyle w:val="Bibliography"/>
       </w:pPr>
       <w:r>
-        <w:t xml:space="preserve">Highsmith, Raymond C. 1982.</w:t>
-      </w:r>
-      <w:r>
-        <w:t xml:space="preserve"> </w:t>
-      </w:r>
-      <w:r>
-        <w:t xml:space="preserve">“Reproduction by Fragmentation in Corals.”</w:t>
-      </w:r>
-      <w:r>
-        <w:t xml:space="preserve"> </w:t>
-      </w:r>
-      <w:r>
-        <w:rPr>
-          <w:i/>
-          <w:iCs/>
-        </w:rPr>
-        <w:t xml:space="preserve">Marine Ecology Progress Series</w:t>
-      </w:r>
-      <w:r>
-        <w:t xml:space="preserve"> </w:t>
-      </w:r>
-      <w:r>
-        <w:t xml:space="preserve">7: 207–26.</w:t>
+        <w:t xml:space="preserve">Highsmith RC (1982) Reproduction by fragmentation in corals. Marine Ecology Progress Series 7:207–226</w:t>
       </w:r>
     </w:p>
     <w:bookmarkEnd w:id="73"/>
-    <w:bookmarkStart w:id="74" w:name="ref-hughesjackson1985"/>
+    <w:bookmarkStart w:id="74" w:name="ref-hughes1984"/>
     <w:p>
       <w:pPr>
         <w:pStyle w:val="Bibliography"/>
       </w:pPr>
       <w:r>
-        <w:t xml:space="preserve">Hughes, T. P., and J. B. C. Jackson. 1985.</w:t>
-      </w:r>
-      <w:r>
-        <w:t xml:space="preserve"> </w:t>
-      </w:r>
-      <w:r>
-        <w:t xml:space="preserve">“Population Dynamics and Life Histories of Foliaceous Corals.”</w:t>
-      </w:r>
-      <w:r>
-        <w:t xml:space="preserve"> </w:t>
-      </w:r>
-      <w:r>
-        <w:rPr>
-          <w:i/>
-          <w:iCs/>
-        </w:rPr>
-        <w:t xml:space="preserve">Ecological Monographs</w:t>
-      </w:r>
-      <w:r>
-        <w:t xml:space="preserve"> </w:t>
-      </w:r>
-      <w:r>
-        <w:t xml:space="preserve">55 (2): 141–66.</w:t>
+        <w:t xml:space="preserve">Hughes TP (1984) Population dynamics based on individual size rather than age: A general model with a reef coral example. The American Naturalist 123:778–795</w:t>
       </w:r>
     </w:p>
     <w:bookmarkEnd w:id="74"/>
-    <w:bookmarkStart w:id="75" w:name="ref-hughes1984"/>
+    <w:bookmarkStart w:id="75" w:name="ref-hughesjackson1985"/>
     <w:p>
       <w:pPr>
         <w:pStyle w:val="Bibliography"/>
       </w:pPr>
       <w:r>
-        <w:t xml:space="preserve">Hughes, Terence P. 1984.</w:t>
-      </w:r>
-      <w:r>
-        <w:t xml:space="preserve"> </w:t>
-      </w:r>
-      <w:r>
-        <w:t xml:space="preserve">“Population Dynamics Based on Individual Size Rather Than Age: A General Model with a Reef Coral Example.”</w:t>
-      </w:r>
-      <w:r>
-        <w:t xml:space="preserve"> </w:t>
-      </w:r>
-      <w:r>
-        <w:rPr>
-          <w:i/>
-          <w:iCs/>
-        </w:rPr>
-        <w:t xml:space="preserve">The American Naturalist</w:t>
-      </w:r>
-      <w:r>
-        <w:t xml:space="preserve"> </w:t>
-      </w:r>
-      <w:r>
-        <w:t xml:space="preserve">123 (6): 778–95.</w:t>
+        <w:t xml:space="preserve">Hughes TP, Jackson JBC (1985) Population dynamics and life histories of foliaceous corals. Ecological Monographs 55:141–166</w:t>
       </w:r>
     </w:p>
     <w:bookmarkEnd w:id="75"/>
@@ -3895,29 +3577,7 @@
         <w:pStyle w:val="Bibliography"/>
       </w:pPr>
       <w:r>
-        <w:t xml:space="preserve">Knapp, Guido, and Joachim Hartung. 2003.</w:t>
-      </w:r>
-      <w:r>
-        <w:t xml:space="preserve"> </w:t>
-      </w:r>
-      <w:r>
-        <w:t xml:space="preserve">“Improved Tests for a Random Effects Meta-Regression with a Single Covariate.”</w:t>
-      </w:r>
-      <w:r>
-        <w:t xml:space="preserve"> </w:t>
-      </w:r>
-      <w:r>
-        <w:rPr>
-          <w:i/>
-          <w:iCs/>
-        </w:rPr>
-        <w:t xml:space="preserve">Statistics in Medicine</w:t>
-      </w:r>
-      <w:r>
-        <w:t xml:space="preserve"> </w:t>
-      </w:r>
-      <w:r>
-        <w:t xml:space="preserve">22 (17): 2693–710.</w:t>
+        <w:t xml:space="preserve">Knapp G, Hartung J (2003) Improved tests for a random effects meta-regression with a single covariate. Statistics in Medicine 22:2693–2710.</w:t>
       </w:r>
       <w:r>
         <w:t xml:space="preserve"> </w:t>
@@ -3930,9 +3590,6 @@
           <w:t xml:space="preserve">https://doi.org/10.1002/sim.1482</w:t>
         </w:r>
       </w:hyperlink>
-      <w:r>
-        <w:t xml:space="preserve">.</w:t>
-      </w:r>
     </w:p>
     <w:bookmarkEnd w:id="77"/>
     <w:bookmarkStart w:id="79" w:name="ref-kuffner2020"/>
@@ -3941,13 +3598,7 @@
         <w:pStyle w:val="Bibliography"/>
       </w:pPr>
       <w:r>
-        <w:t xml:space="preserve">Kuffner, Ilsa B., Anastasios Stathakopoulos, Lauren T. Toth, and Lucy A. Bartlett. 2020.</w:t>
-      </w:r>
-      <w:r>
-        <w:t xml:space="preserve"> </w:t>
-      </w:r>
-      <w:r>
-        <w:t xml:space="preserve">“Reestablishing a Stepping-Stone Population of the Threatened Elkhorn Coral</w:t>
+        <w:t xml:space="preserve">Kuffner IB, Stathakopoulos A, Toth LT, Bartlett LA (2020) Reestablishing a stepping-stone population of the threatened elkhorn coral</w:t>
       </w:r>
       <w:r>
         <w:t xml:space="preserve"> </w:t>
@@ -3959,23 +3610,7 @@
         <w:t xml:space="preserve"> </w:t>
       </w:r>
       <w:r>
-        <w:t xml:space="preserve">to Aid Regional Recovery.”</w:t>
-      </w:r>
-      <w:r>
-        <w:t xml:space="preserve"> </w:t>
-      </w:r>
-      <w:r>
-        <w:rPr>
-          <w:i/>
-          <w:iCs/>
-        </w:rPr>
-        <w:t xml:space="preserve">Endangered Species Research</w:t>
-      </w:r>
-      <w:r>
-        <w:t xml:space="preserve"> </w:t>
-      </w:r>
-      <w:r>
-        <w:t xml:space="preserve">43: 461–73.</w:t>
+        <w:t xml:space="preserve">to aid regional recovery. Endangered Species Research 43:461–473.</w:t>
       </w:r>
       <w:r>
         <w:t xml:space="preserve"> </w:t>
@@ -3988,9 +3623,6 @@
           <w:t xml:space="preserve">https://doi.org/10.3354/esr01083</w:t>
         </w:r>
       </w:hyperlink>
-      <w:r>
-        <w:t xml:space="preserve">.</w:t>
-      </w:r>
     </w:p>
     <w:bookmarkEnd w:id="79"/>
     <w:bookmarkStart w:id="80" w:name="ref-lirman2000"/>
@@ -3999,13 +3631,7 @@
         <w:pStyle w:val="Bibliography"/>
       </w:pPr>
       <w:r>
-        <w:t xml:space="preserve">Lirman, Diego. 2000.</w:t>
-      </w:r>
-      <w:r>
-        <w:t xml:space="preserve"> </w:t>
-      </w:r>
-      <w:r>
-        <w:t xml:space="preserve">“Fragmentation in the Branching Coral</w:t>
+        <w:t xml:space="preserve">Lirman D (2000) Fragmentation in the branching coral</w:t>
       </w:r>
       <w:r>
         <w:t xml:space="preserve"> </w:t>
@@ -4023,23 +3649,7 @@
         <w:t xml:space="preserve">Lamarck</w:t>
       </w:r>
       <w:r>
-        <w:t xml:space="preserve">): Growth, Survivorship, and Reproduction of Colonies and Fragments.”</w:t>
-      </w:r>
-      <w:r>
-        <w:t xml:space="preserve"> </w:t>
-      </w:r>
-      <w:r>
-        <w:rPr>
-          <w:i/>
-          <w:iCs/>
-        </w:rPr>
-        <w:t xml:space="preserve">Journal of Experimental Marine Biology and Ecology</w:t>
-      </w:r>
-      <w:r>
-        <w:t xml:space="preserve"> </w:t>
-      </w:r>
-      <w:r>
-        <w:t xml:space="preserve">251: 41–57.</w:t>
+        <w:t xml:space="preserve">): Growth, survivorship, and reproduction of colonies and fragments. Journal of Experimental Marine Biology and Ecology 251:41–57</w:t>
       </w:r>
     </w:p>
     <w:bookmarkEnd w:id="80"/>
@@ -4049,13 +3659,7 @@
         <w:pStyle w:val="Bibliography"/>
       </w:pPr>
       <w:r>
-        <w:t xml:space="preserve">Lirman, Diego, and Peggy Fong. 1997.</w:t>
-      </w:r>
-      <w:r>
-        <w:t xml:space="preserve"> </w:t>
-      </w:r>
-      <w:r>
-        <w:t xml:space="preserve">“Patterns of Damage to the Branching Coral</w:t>
+        <w:t xml:space="preserve">Lirman D, Fong P (1997) Patterns of damage to the branching coral</w:t>
       </w:r>
       <w:r>
         <w:t xml:space="preserve"> </w:t>
@@ -4067,7 +3671,7 @@
         <w:t xml:space="preserve"> </w:t>
       </w:r>
       <w:r>
-        <w:t xml:space="preserve">Following</w:t>
+        <w:t xml:space="preserve">following</w:t>
       </w:r>
       <w:r>
         <w:t xml:space="preserve"> </w:t>
@@ -4076,20 +3680,7 @@
         <w:t xml:space="preserve">Hurricane Andrew</w:t>
       </w:r>
       <w:r>
-        <w:t xml:space="preserve">.”</w:t>
-      </w:r>
-      <w:r>
-        <w:t xml:space="preserve"> </w:t>
-      </w:r>
-      <w:r>
-        <w:rPr>
-          <w:i/>
-          <w:iCs/>
-        </w:rPr>
-        <w:t xml:space="preserve">Journal of Coastal Research</w:t>
-      </w:r>
-      <w:r>
-        <w:t xml:space="preserve">.</w:t>
+        <w:t xml:space="preserve">: Damage and survivorship of hurricane-generated asexual recruits. Journal of Coastal Research 13:67–72</w:t>
       </w:r>
     </w:p>
     <w:bookmarkEnd w:id="81"/>
@@ -4099,29 +3690,7 @@
         <w:pStyle w:val="Bibliography"/>
       </w:pPr>
       <w:r>
-        <w:t xml:space="preserve">Madin, Joshua S., Andrew H. Baird, Marissa L. Baskett, Sean R. Connolly, and Maria A. Dornelas. 2020.</w:t>
-      </w:r>
-      <w:r>
-        <w:t xml:space="preserve"> </w:t>
-      </w:r>
-      <w:r>
-        <w:t xml:space="preserve">“Partitioning Colony Size Variation into Growth and Partial Mortality.”</w:t>
-      </w:r>
-      <w:r>
-        <w:t xml:space="preserve"> </w:t>
-      </w:r>
-      <w:r>
-        <w:rPr>
-          <w:i/>
-          <w:iCs/>
-        </w:rPr>
-        <w:t xml:space="preserve">Biology Letters</w:t>
-      </w:r>
-      <w:r>
-        <w:t xml:space="preserve"> </w:t>
-      </w:r>
-      <w:r>
-        <w:t xml:space="preserve">16: 20190727.</w:t>
+        <w:t xml:space="preserve">Madin JS, Baird AH, Baskett ML, et al (2020) Partitioning colony size variation into growth and partial mortality. Biology Letters 16:20190727.</w:t>
       </w:r>
       <w:r>
         <w:t xml:space="preserve"> </w:t>
@@ -4134,9 +3703,6 @@
           <w:t xml:space="preserve">https://doi.org/10.1098/rsbl.2019.0727</w:t>
         </w:r>
       </w:hyperlink>
-      <w:r>
-        <w:t xml:space="preserve">.</w:t>
-      </w:r>
     </w:p>
     <w:bookmarkEnd w:id="83"/>
     <w:bookmarkStart w:id="85" w:name="ref-madin2014"/>
@@ -4145,29 +3711,7 @@
         <w:pStyle w:val="Bibliography"/>
       </w:pPr>
       <w:r>
-        <w:t xml:space="preserve">Madin, Joshua S., Andrew H. Baird, Maria Dornelas, and Sean R. Connolly. 2014.</w:t>
-      </w:r>
-      <w:r>
-        <w:t xml:space="preserve"> </w:t>
-      </w:r>
-      <w:r>
-        <w:t xml:space="preserve">“Mechanical Vulnerability Explains Size-Dependent Mortality of Reef Corals.”</w:t>
-      </w:r>
-      <w:r>
-        <w:t xml:space="preserve"> </w:t>
-      </w:r>
-      <w:r>
-        <w:rPr>
-          <w:i/>
-          <w:iCs/>
-        </w:rPr>
-        <w:t xml:space="preserve">Ecology Letters</w:t>
-      </w:r>
-      <w:r>
-        <w:t xml:space="preserve"> </w:t>
-      </w:r>
-      <w:r>
-        <w:t xml:space="preserve">17 (8): 1008–15.</w:t>
+        <w:t xml:space="preserve">Madin JS, Baird AH, Dornelas M, Connolly SR (2014) Mechanical vulnerability explains size-dependent mortality of reef corals. Ecology Letters 17:1008–1015.</w:t>
       </w:r>
       <w:r>
         <w:t xml:space="preserve"> </w:t>
@@ -4180,9 +3724,6 @@
           <w:t xml:space="preserve">https://doi.org/10.1111/ele.12306</w:t>
         </w:r>
       </w:hyperlink>
-      <w:r>
-        <w:t xml:space="preserve">.</w:t>
-      </w:r>
     </w:p>
     <w:bookmarkEnd w:id="85"/>
     <w:bookmarkStart w:id="87" w:name="ref-madin2025"/>
@@ -4191,20 +3732,7 @@
         <w:pStyle w:val="Bibliography"/>
       </w:pPr>
       <w:r>
-        <w:t xml:space="preserve">Madin, Joshua S., Thomas Oliver, Mike McWilliam, et al. 2025.</w:t>
-      </w:r>
-      <w:r>
-        <w:t xml:space="preserve"> </w:t>
-      </w:r>
-      <w:r>
-        <w:rPr>
-          <w:i/>
-          <w:iCs/>
-        </w:rPr>
-        <w:t xml:space="preserve">Demographic Insights for Coral Restoration</w:t>
-      </w:r>
-      <w:r>
-        <w:t xml:space="preserve">. bioRxiv.</w:t>
+        <w:t xml:space="preserve">Madin JS, Oliver T, McWilliam M, et al (2025)</w:t>
       </w:r>
       <w:r>
         <w:t xml:space="preserve"> </w:t>
@@ -4214,12 +3742,9 @@
           <w:rPr>
             <w:rStyle w:val="Hyperlink"/>
           </w:rPr>
-          <w:t xml:space="preserve">https://doi.org/10.1101/2025.10.21.683544</w:t>
-        </w:r>
-      </w:hyperlink>
-      <w:r>
-        <w:t xml:space="preserve">.</w:t>
-      </w:r>
+          <w:t xml:space="preserve">Demographic insights for coral restoration</w:t>
+        </w:r>
+      </w:hyperlink>
     </w:p>
     <w:bookmarkEnd w:id="87"/>
     <w:bookmarkStart w:id="89" w:name="ref-manzello2025"/>
@@ -4228,13 +3753,7 @@
         <w:pStyle w:val="Bibliography"/>
       </w:pPr>
       <w:r>
-        <w:t xml:space="preserve">Manzello, Derek P., Ross Cunning, Richard F. Karp, et al. 2025.</w:t>
-      </w:r>
-      <w:r>
-        <w:t xml:space="preserve"> </w:t>
-      </w:r>
-      <w:r>
-        <w:t xml:space="preserve">“Heat-Driven Functional Extinction of</w:t>
+        <w:t xml:space="preserve">Manzello DP, Cunning R, Karp RF, et al (2025) Heat-driven functional extinction of</w:t>
       </w:r>
       <w:r>
         <w:t xml:space="preserve"> </w:t>
@@ -4252,7 +3771,7 @@
         <w:t xml:space="preserve"> </w:t>
       </w:r>
       <w:r>
-        <w:t xml:space="preserve">Corals from</w:t>
+        <w:t xml:space="preserve">corals from</w:t>
       </w:r>
       <w:r>
         <w:t xml:space="preserve"> </w:t>
@@ -4270,23 +3789,7 @@
         <w:t xml:space="preserve">Coral Reef</w:t>
       </w:r>
       <w:r>
-        <w:t xml:space="preserve">.”</w:t>
-      </w:r>
-      <w:r>
-        <w:t xml:space="preserve"> </w:t>
-      </w:r>
-      <w:r>
-        <w:rPr>
-          <w:i/>
-          <w:iCs/>
-        </w:rPr>
-        <w:t xml:space="preserve">Science</w:t>
-      </w:r>
-      <w:r>
-        <w:t xml:space="preserve"> </w:t>
-      </w:r>
-      <w:r>
-        <w:t xml:space="preserve">390 (6771): 361–66.</w:t>
+        <w:t xml:space="preserve">. Science 390:361–366.</w:t>
       </w:r>
       <w:r>
         <w:t xml:space="preserve"> </w:t>
@@ -4299,9 +3802,6 @@
           <w:t xml:space="preserve">https://doi.org/10.1126/science.adx7825</w:t>
         </w:r>
       </w:hyperlink>
-      <w:r>
-        <w:t xml:space="preserve">.</w:t>
-      </w:r>
     </w:p>
     <w:bookmarkEnd w:id="89"/>
     <w:bookmarkStart w:id="91" w:name="ref-maurer2022"/>
@@ -4310,13 +3810,10 @@
         <w:pStyle w:val="Bibliography"/>
       </w:pPr>
       <w:r>
-        <w:t xml:space="preserve">Maurer, Leah, Lauren Puishys, Nancy Kim Pham Ho, et al. 2022.</w:t>
-      </w:r>
-      <w:r>
-        <w:t xml:space="preserve"> </w:t>
-      </w:r>
-      <w:r>
-        <w:t xml:space="preserve">“</w:t>
+        <w:t xml:space="preserve">Maurer L, Puishys L, Ho NKP, et al (2022)</w:t>
+      </w:r>
+      <w:r>
+        <w:t xml:space="preserve"> </w:t>
       </w:r>
       <w:r>
         <w:t xml:space="preserve">Acropora cervicornis</w:t>
@@ -4337,7 +3834,7 @@
         <w:t xml:space="preserve"> </w:t>
       </w:r>
       <w:r>
-        <w:t xml:space="preserve">Cultured on a Low Maintenance Line Nursery Design in</w:t>
+        <w:t xml:space="preserve">cultured on a low maintenance line nursery design in</w:t>
       </w:r>
       <w:r>
         <w:t xml:space="preserve"> </w:t>
@@ -4346,23 +3843,7 @@
         <w:t xml:space="preserve">The Bahamas</w:t>
       </w:r>
       <w:r>
-        <w:t xml:space="preserve">.”</w:t>
-      </w:r>
-      <w:r>
-        <w:t xml:space="preserve"> </w:t>
-      </w:r>
-      <w:r>
-        <w:rPr>
-          <w:i/>
-          <w:iCs/>
-        </w:rPr>
-        <w:t xml:space="preserve">PLoS ONE</w:t>
-      </w:r>
-      <w:r>
-        <w:t xml:space="preserve"> </w:t>
-      </w:r>
-      <w:r>
-        <w:t xml:space="preserve">17 (4): e0267034.</w:t>
+        <w:t xml:space="preserve">. PLoS ONE 17:e0267034.</w:t>
       </w:r>
       <w:r>
         <w:t xml:space="preserve"> </w:t>
@@ -4375,9 +3856,6 @@
           <w:t xml:space="preserve">https://doi.org/10.1371/journal.pone.0267034</w:t>
         </w:r>
       </w:hyperlink>
-      <w:r>
-        <w:t xml:space="preserve">.</w:t>
-      </w:r>
     </w:p>
     <w:bookmarkEnd w:id="91"/>
     <w:bookmarkStart w:id="93" w:name="ref-mendozaquiroz2023"/>
@@ -4386,13 +3864,7 @@
         <w:pStyle w:val="Bibliography"/>
       </w:pPr>
       <w:r>
-        <w:t xml:space="preserve">Mendoza Quiroz, Sandra, Aurora Urania Beltrán-Torres, Maria Victoria Grosso-Becerra, Daniela Muñoz Villareal, Raúl Tecalco Rentería, and Anastazia T. Banaszak. 2023.</w:t>
-      </w:r>
-      <w:r>
-        <w:t xml:space="preserve"> </w:t>
-      </w:r>
-      <w:r>
-        <w:t xml:space="preserve">“Long-Term Survival, Growth, and Reproduction of</w:t>
+        <w:t xml:space="preserve">Mendoza Quiroz S, Beltrán-Torres AU, Grosso-Becerra MV, et al (2023) Long-term survival, growth, and reproduction of</w:t>
       </w:r>
       <w:r>
         <w:t xml:space="preserve"> </w:t>
@@ -4404,7 +3876,7 @@
         <w:t xml:space="preserve"> </w:t>
       </w:r>
       <w:r>
-        <w:t xml:space="preserve">Sexual Recruits Outplanted onto</w:t>
+        <w:t xml:space="preserve">sexual recruits outplanted onto</w:t>
       </w:r>
       <w:r>
         <w:t xml:space="preserve"> </w:t>
@@ -4416,23 +3888,7 @@
         <w:t xml:space="preserve"> </w:t>
       </w:r>
       <w:r>
-        <w:t xml:space="preserve">Reefs.”</w:t>
-      </w:r>
-      <w:r>
-        <w:t xml:space="preserve"> </w:t>
-      </w:r>
-      <w:r>
-        <w:rPr>
-          <w:i/>
-          <w:iCs/>
-        </w:rPr>
-        <w:t xml:space="preserve">PeerJ</w:t>
-      </w:r>
-      <w:r>
-        <w:t xml:space="preserve"> </w:t>
-      </w:r>
-      <w:r>
-        <w:t xml:space="preserve">11: e15813.</w:t>
+        <w:t xml:space="preserve">reefs. PeerJ 11:e15813.</w:t>
       </w:r>
       <w:r>
         <w:t xml:space="preserve"> </w:t>
@@ -4445,9 +3901,6 @@
           <w:t xml:space="preserve">https://doi.org/10.7717/peerj.15813</w:t>
         </w:r>
       </w:hyperlink>
-      <w:r>
-        <w:t xml:space="preserve">.</w:t>
-      </w:r>
     </w:p>
     <w:bookmarkEnd w:id="93"/>
     <w:bookmarkStart w:id="95" w:name="ref-neely2022"/>
@@ -4456,13 +3909,7 @@
         <w:pStyle w:val="Bibliography"/>
       </w:pPr>
       <w:r>
-        <w:t xml:space="preserve">Neely, Karen L., Kevin A. Macaulay, and Kate S. Lunz. 2022.</w:t>
-      </w:r>
-      <w:r>
-        <w:t xml:space="preserve"> </w:t>
-      </w:r>
-      <w:r>
-        <w:t xml:space="preserve">“Population Trajectory and Stressors of</w:t>
+        <w:t xml:space="preserve">Neely KL, Macaulay KA, Lunz KS (2022) Population trajectory and stressors of</w:t>
       </w:r>
       <w:r>
         <w:t xml:space="preserve"> </w:t>
@@ -4474,7 +3921,7 @@
         <w:t xml:space="preserve"> </w:t>
       </w:r>
       <w:r>
-        <w:t xml:space="preserve">Sites in the</w:t>
+        <w:t xml:space="preserve">sites in the</w:t>
       </w:r>
       <w:r>
         <w:t xml:space="preserve"> </w:t>
@@ -4483,23 +3930,7 @@
         <w:t xml:space="preserve">Florida Keys</w:t>
       </w:r>
       <w:r>
-        <w:t xml:space="preserve">.”</w:t>
-      </w:r>
-      <w:r>
-        <w:t xml:space="preserve"> </w:t>
-      </w:r>
-      <w:r>
-        <w:rPr>
-          <w:i/>
-          <w:iCs/>
-        </w:rPr>
-        <w:t xml:space="preserve">Frontiers in Marine Science</w:t>
-      </w:r>
-      <w:r>
-        <w:t xml:space="preserve"> </w:t>
-      </w:r>
-      <w:r>
-        <w:t xml:space="preserve">9: 978785.</w:t>
+        <w:t xml:space="preserve">. Frontiers in Marine Science 9:978785.</w:t>
       </w:r>
       <w:r>
         <w:t xml:space="preserve"> </w:t>
@@ -4512,9 +3943,6 @@
           <w:t xml:space="preserve">https://doi.org/10.3389/fmars.2022.978785</w:t>
         </w:r>
       </w:hyperlink>
-      <w:r>
-        <w:t xml:space="preserve">.</w:t>
-      </w:r>
     </w:p>
     <w:bookmarkEnd w:id="95"/>
     <w:bookmarkStart w:id="96" w:name="ref-ortizprosper2005"/>
@@ -4523,13 +3951,7 @@
         <w:pStyle w:val="Bibliography"/>
       </w:pPr>
       <w:r>
-        <w:t xml:space="preserve">Ortiz Prosper, Antonio L. 2005.</w:t>
-      </w:r>
-      <w:r>
-        <w:t xml:space="preserve"> </w:t>
-      </w:r>
-      <w:r>
-        <w:t xml:space="preserve">“Population Dynamics of Hurricane-Generated Fragments of Elkhorn Coral</w:t>
+        <w:t xml:space="preserve">Ortiz Prosper AL (2005) Population dynamics of hurricane-generated fragments of elkhorn coral</w:t>
       </w:r>
       <w:r>
         <w:t xml:space="preserve"> </w:t>
@@ -4547,19 +3969,13 @@
         <w:t xml:space="preserve">Lamarck</w:t>
       </w:r>
       <w:r>
-        <w:t xml:space="preserve">, 1816).”</w:t>
-      </w:r>
-      <w:r>
-        <w:t xml:space="preserve"> </w:t>
-      </w:r>
-      <w:r>
-        <w:t xml:space="preserve">{PhD} dissertation, University of Puerto Rico, Mayag</w:t>
+        <w:t xml:space="preserve">, 1816). {PhD} dissertation, University of Puerto Rico, Mayag</w:t>
       </w:r>
       <w:r>
         <w:t xml:space="preserve">ü</w:t>
       </w:r>
       <w:r>
-        <w:t xml:space="preserve">ez.</w:t>
+        <w:t xml:space="preserve">ez</w:t>
       </w:r>
     </w:p>
     <w:bookmarkEnd w:id="96"/>
@@ -4569,29 +3985,7 @@
         <w:pStyle w:val="Bibliography"/>
       </w:pPr>
       <w:r>
-        <w:t xml:space="preserve">Pausch, Rachel E., Dana E. Williams, and Margaret W. Miller. 2018.</w:t>
-      </w:r>
-      <w:r>
-        <w:t xml:space="preserve"> </w:t>
-      </w:r>
-      <w:r>
-        <w:t xml:space="preserve">“Impacts of Fragment Genotype, Habitat, and Size on Outplanted Elkhorn Coral Success Under Thermal Stress.”</w:t>
-      </w:r>
-      <w:r>
-        <w:t xml:space="preserve"> </w:t>
-      </w:r>
-      <w:r>
-        <w:rPr>
-          <w:i/>
-          <w:iCs/>
-        </w:rPr>
-        <w:t xml:space="preserve">Marine Ecology Progress Series</w:t>
-      </w:r>
-      <w:r>
-        <w:t xml:space="preserve"> </w:t>
-      </w:r>
-      <w:r>
-        <w:t xml:space="preserve">592: 109–17.</w:t>
+        <w:t xml:space="preserve">Pausch RE, Williams DE, Miller MW (2018) Impacts of fragment genotype, habitat, and size on outplanted elkhorn coral success under thermal stress. Marine Ecology Progress Series 592:109–117.</w:t>
       </w:r>
       <w:r>
         <w:t xml:space="preserve"> </w:t>
@@ -4604,9 +3998,6 @@
           <w:t xml:space="preserve">https://doi.org/10.3354/meps12488</w:t>
         </w:r>
       </w:hyperlink>
-      <w:r>
-        <w:t xml:space="preserve">.</w:t>
-      </w:r>
     </w:p>
     <w:bookmarkEnd w:id="98"/>
     <w:bookmarkStart w:id="100" w:name="ref-pinongonzalez2018"/>
@@ -4615,13 +4006,7 @@
         <w:pStyle w:val="Bibliography"/>
       </w:pPr>
       <w:r>
-        <w:t xml:space="preserve">Piñón-González, Victor M., and Anastazia T. Banaszak. 2018.</w:t>
-      </w:r>
-      <w:r>
-        <w:t xml:space="preserve"> </w:t>
-      </w:r>
-      <w:r>
-        <w:t xml:space="preserve">“Effects of Partial Mortality on Growth, Reproduction and Total Lipid Content in the Elkhorn Coral</w:t>
+        <w:t xml:space="preserve">Piñón-González VM, Banaszak AT (2018) Effects of partial mortality on growth, reproduction and total lipid content in the elkhorn coral</w:t>
       </w:r>
       <w:r>
         <w:t xml:space="preserve"> </w:t>
@@ -4630,23 +4015,7 @@
         <w:t xml:space="preserve">Acropora palmata</w:t>
       </w:r>
       <w:r>
-        <w:t xml:space="preserve">.”</w:t>
-      </w:r>
-      <w:r>
-        <w:t xml:space="preserve"> </w:t>
-      </w:r>
-      <w:r>
-        <w:rPr>
-          <w:i/>
-          <w:iCs/>
-        </w:rPr>
-        <w:t xml:space="preserve">Frontiers in Marine Science</w:t>
-      </w:r>
-      <w:r>
-        <w:t xml:space="preserve"> </w:t>
-      </w:r>
-      <w:r>
-        <w:t xml:space="preserve">5: 396.</w:t>
+        <w:t xml:space="preserve">. Frontiers in Marine Science 5:396.</w:t>
       </w:r>
       <w:r>
         <w:t xml:space="preserve"> </w:t>
@@ -4659,9 +4028,6 @@
           <w:t xml:space="preserve">https://doi.org/10.3389/fmars.2018.00396</w:t>
         </w:r>
       </w:hyperlink>
-      <w:r>
-        <w:t xml:space="preserve">.</w:t>
-      </w:r>
     </w:p>
     <w:bookmarkEnd w:id="100"/>
     <w:bookmarkStart w:id="102" w:name="ref-ramosromero2025"/>
@@ -4670,13 +4036,7 @@
         <w:pStyle w:val="Bibliography"/>
       </w:pPr>
       <w:r>
-        <w:t xml:space="preserve">Ramos Romero, Amanda, Patricia González-Díaz, Gabriela Aguilera Pérez, and Anastazia T. Banaszak. 2025.</w:t>
-      </w:r>
-      <w:r>
-        <w:t xml:space="preserve"> </w:t>
-      </w:r>
-      <w:r>
-        <w:t xml:space="preserve">“Does Reef Crest Zone Selection Influence</w:t>
+        <w:t xml:space="preserve">Ramos Romero A, González-Díaz P, Aguilera Pérez G, Banaszak AT (2025) Does reef crest zone selection influence</w:t>
       </w:r>
       <w:r>
         <w:t xml:space="preserve"> </w:t>
@@ -4694,23 +4054,7 @@
         <w:t xml:space="preserve">Lamarck</w:t>
       </w:r>
       <w:r>
-        <w:t xml:space="preserve">, 1816) Fragment Survival and Growth?”</w:t>
-      </w:r>
-      <w:r>
-        <w:t xml:space="preserve"> </w:t>
-      </w:r>
-      <w:r>
-        <w:rPr>
-          <w:i/>
-          <w:iCs/>
-        </w:rPr>
-        <w:t xml:space="preserve">PeerJ</w:t>
-      </w:r>
-      <w:r>
-        <w:t xml:space="preserve"> </w:t>
-      </w:r>
-      <w:r>
-        <w:t xml:space="preserve">13: e20303.</w:t>
+        <w:t xml:space="preserve">, 1816) fragment survival and growth? PeerJ 13:e20303.</w:t>
       </w:r>
       <w:r>
         <w:t xml:space="preserve"> </w:t>
@@ -4723,9 +4067,6 @@
           <w:t xml:space="preserve">https://doi.org/10.7717/peerj.20303</w:t>
         </w:r>
       </w:hyperlink>
-      <w:r>
-        <w:t xml:space="preserve">.</w:t>
-      </w:r>
     </w:p>
     <w:bookmarkEnd w:id="102"/>
     <w:bookmarkStart w:id="104" w:name="ref-rogersmuller2012"/>
@@ -4734,13 +4075,7 @@
         <w:pStyle w:val="Bibliography"/>
       </w:pPr>
       <w:r>
-        <w:t xml:space="preserve">Rogers, C. S., and E. M. Muller. 2012.</w:t>
-      </w:r>
-      <w:r>
-        <w:t xml:space="preserve"> </w:t>
-      </w:r>
-      <w:r>
-        <w:t xml:space="preserve">“Bleaching, Disease and Recovery in the Threatened Scleractinian Coral</w:t>
+        <w:t xml:space="preserve">Rogers CS, Muller EM (2012) Bleaching, disease and recovery in the threatened scleractinian coral</w:t>
       </w:r>
       <w:r>
         <w:t xml:space="preserve"> </w:t>
@@ -4770,23 +4105,7 @@
         <w:t xml:space="preserve">US Virgin Islands</w:t>
       </w:r>
       <w:r>
-        <w:t xml:space="preserve">: 2003–2010.”</w:t>
-      </w:r>
-      <w:r>
-        <w:t xml:space="preserve"> </w:t>
-      </w:r>
-      <w:r>
-        <w:rPr>
-          <w:i/>
-          <w:iCs/>
-        </w:rPr>
-        <w:t xml:space="preserve">Coral Reefs</w:t>
-      </w:r>
-      <w:r>
-        <w:t xml:space="preserve"> </w:t>
-      </w:r>
-      <w:r>
-        <w:t xml:space="preserve">31: 807–19.</w:t>
+        <w:t xml:space="preserve">: 2003–2010. Coral Reefs 31:807–819.</w:t>
       </w:r>
       <w:r>
         <w:t xml:space="preserve"> </w:t>
@@ -4799,9 +4118,6 @@
           <w:t xml:space="preserve">https://doi.org/10.1007/s00338-012-0898-8</w:t>
         </w:r>
       </w:hyperlink>
-      <w:r>
-        <w:t xml:space="preserve">.</w:t>
-      </w:r>
     </w:p>
     <w:bookmarkEnd w:id="104"/>
     <w:bookmarkStart w:id="105" w:name="ref-rogers1982"/>
@@ -4810,13 +4126,7 @@
         <w:pStyle w:val="Bibliography"/>
       </w:pPr>
       <w:r>
-        <w:t xml:space="preserve">Rogers, Caroline S., Thomas H. Suchanek, and Frank A. Pecora. 1982.</w:t>
-      </w:r>
-      <w:r>
-        <w:t xml:space="preserve"> </w:t>
-      </w:r>
-      <w:r>
-        <w:t xml:space="preserve">“Effects of</w:t>
+        <w:t xml:space="preserve">Rogers CS, Suchanek TH, Pecora FA (1982) Effects of</w:t>
       </w:r>
       <w:r>
         <w:t xml:space="preserve"> </w:t>
@@ -4840,7 +4150,7 @@
         <w:t xml:space="preserve"> </w:t>
       </w:r>
       <w:r>
-        <w:t xml:space="preserve">(1979) on Shallow</w:t>
+        <w:t xml:space="preserve">(1979) on shallow</w:t>
       </w:r>
       <w:r>
         <w:t xml:space="preserve"> </w:t>
@@ -4852,7 +4162,7 @@
         <w:t xml:space="preserve"> </w:t>
       </w:r>
       <w:r>
-        <w:t xml:space="preserve">Reef Communities:</w:t>
+        <w:t xml:space="preserve">reef communities:</w:t>
       </w:r>
       <w:r>
         <w:t xml:space="preserve"> </w:t>
@@ -4870,23 +4180,7 @@
         <w:t xml:space="preserve">U.S. Virgin Islands</w:t>
       </w:r>
       <w:r>
-        <w:t xml:space="preserve">.”</w:t>
-      </w:r>
-      <w:r>
-        <w:t xml:space="preserve"> </w:t>
-      </w:r>
-      <w:r>
-        <w:rPr>
-          <w:i/>
-          <w:iCs/>
-        </w:rPr>
-        <w:t xml:space="preserve">Bulletin of Marine Science</w:t>
-      </w:r>
-      <w:r>
-        <w:t xml:space="preserve"> </w:t>
-      </w:r>
-      <w:r>
-        <w:t xml:space="preserve">32 (2): 532–48.</w:t>
+        <w:t xml:space="preserve">. Bulletin of Marine Science 32:532–548</w:t>
       </w:r>
     </w:p>
     <w:bookmarkEnd w:id="105"/>
@@ -4896,13 +4190,7 @@
         <w:pStyle w:val="Bibliography"/>
       </w:pPr>
       <w:r>
-        <w:t xml:space="preserve">Rosales, Stephanie M., Benjamin D. Young, Allan J. Bright, et al. 2024.</w:t>
-      </w:r>
-      <w:r>
-        <w:t xml:space="preserve"> </w:t>
-      </w:r>
-      <w:r>
-        <w:t xml:space="preserve">“Reef Site and Habitat Influence Effectiveness of</w:t>
+        <w:t xml:space="preserve">Rosales SM, Young BD, Bright AJ, et al (2024) Reef site and habitat influence effectiveness of</w:t>
       </w:r>
       <w:r>
         <w:t xml:space="preserve"> </w:t>
@@ -4914,7 +4202,7 @@
         <w:t xml:space="preserve"> </w:t>
       </w:r>
       <w:r>
-        <w:t xml:space="preserve">Restoration and Its Microbiome in the</w:t>
+        <w:t xml:space="preserve">restoration and its microbiome in the</w:t>
       </w:r>
       <w:r>
         <w:t xml:space="preserve"> </w:t>
@@ -4923,23 +4211,7 @@
         <w:t xml:space="preserve">Florida Keys</w:t>
       </w:r>
       <w:r>
-        <w:t xml:space="preserve">.”</w:t>
-      </w:r>
-      <w:r>
-        <w:t xml:space="preserve"> </w:t>
-      </w:r>
-      <w:r>
-        <w:rPr>
-          <w:i/>
-          <w:iCs/>
-        </w:rPr>
-        <w:t xml:space="preserve">Communications Earth &amp; Environment</w:t>
-      </w:r>
-      <w:r>
-        <w:t xml:space="preserve"> </w:t>
-      </w:r>
-      <w:r>
-        <w:t xml:space="preserve">5: 689.</w:t>
+        <w:t xml:space="preserve">. Communications Earth &amp; Environment 5:689.</w:t>
       </w:r>
       <w:r>
         <w:t xml:space="preserve"> </w:t>
@@ -4952,9 +4224,6 @@
           <w:t xml:space="preserve">https://doi.org/10.1038/s43247-024-01816-7</w:t>
         </w:r>
       </w:hyperlink>
-      <w:r>
-        <w:t xml:space="preserve">.</w:t>
-      </w:r>
     </w:p>
     <w:bookmarkEnd w:id="107"/>
     <w:bookmarkStart w:id="109" w:name="ref-schopmeyer2017"/>
@@ -4963,13 +4232,7 @@
         <w:pStyle w:val="Bibliography"/>
       </w:pPr>
       <w:r>
-        <w:t xml:space="preserve">Schopmeyer, Stephanie A., Diego Lirman, Erich Bartels, et al. 2017.</w:t>
-      </w:r>
-      <w:r>
-        <w:t xml:space="preserve"> </w:t>
-      </w:r>
-      <w:r>
-        <w:t xml:space="preserve">“Regional Restoration Benchmarks for</w:t>
+        <w:t xml:space="preserve">Schopmeyer SA, Lirman D, Bartels E, et al (2017) Regional restoration benchmarks for</w:t>
       </w:r>
       <w:r>
         <w:t xml:space="preserve"> </w:t>
@@ -4978,23 +4241,7 @@
         <w:t xml:space="preserve">Acropora cervicornis</w:t>
       </w:r>
       <w:r>
-        <w:t xml:space="preserve">.”</w:t>
-      </w:r>
-      <w:r>
-        <w:t xml:space="preserve"> </w:t>
-      </w:r>
-      <w:r>
-        <w:rPr>
-          <w:i/>
-          <w:iCs/>
-        </w:rPr>
-        <w:t xml:space="preserve">Coral Reefs</w:t>
-      </w:r>
-      <w:r>
-        <w:t xml:space="preserve"> </w:t>
-      </w:r>
-      <w:r>
-        <w:t xml:space="preserve">36: 1047–57.</w:t>
+        <w:t xml:space="preserve">. Coral Reefs 36:1047–1057.</w:t>
       </w:r>
       <w:r>
         <w:t xml:space="preserve"> </w:t>
@@ -5007,9 +4254,6 @@
           <w:t xml:space="preserve">https://doi.org/10.1007/s00338-017-1596-3</w:t>
         </w:r>
       </w:hyperlink>
-      <w:r>
-        <w:t xml:space="preserve">.</w:t>
-      </w:r>
     </w:p>
     <w:bookmarkEnd w:id="109"/>
     <w:bookmarkStart w:id="110" w:name="ref-vardi2011"/>
@@ -5018,13 +4262,7 @@
         <w:pStyle w:val="Bibliography"/>
       </w:pPr>
       <w:r>
-        <w:t xml:space="preserve">Vardi, Tali. 2011.</w:t>
-      </w:r>
-      <w:r>
-        <w:t xml:space="preserve"> </w:t>
-      </w:r>
-      <w:r>
-        <w:t xml:space="preserve">“The Threatened</w:t>
+        <w:t xml:space="preserve">Vardi T (2011) The threatened</w:t>
       </w:r>
       <w:r>
         <w:t xml:space="preserve"> </w:t>
@@ -5036,7 +4274,7 @@
         <w:t xml:space="preserve"> </w:t>
       </w:r>
       <w:r>
-        <w:t xml:space="preserve">Elkhorn Coral,</w:t>
+        <w:t xml:space="preserve">elkhorn coral,</w:t>
       </w:r>
       <w:r>
         <w:t xml:space="preserve"> </w:t>
@@ -5045,13 +4283,7 @@
         <w:t xml:space="preserve">Acropora palmata</w:t>
       </w:r>
       <w:r>
-        <w:t xml:space="preserve">: Population Dynamics and Their Policy Implications.”</w:t>
-      </w:r>
-      <w:r>
-        <w:t xml:space="preserve"> </w:t>
-      </w:r>
-      <w:r>
-        <w:t xml:space="preserve">{PhD} dissertation, University of California, San Diego.</w:t>
+        <w:t xml:space="preserve">: Population dynamics and their policy implications. {PhD} dissertation, University of California, San Diego</w:t>
       </w:r>
     </w:p>
     <w:bookmarkEnd w:id="110"/>
@@ -5061,13 +4293,7 @@
         <w:pStyle w:val="Bibliography"/>
       </w:pPr>
       <w:r>
-        <w:t xml:space="preserve">Vardi, Tali, Dana E. Williams, and Stuart A. Sandin. 2012.</w:t>
-      </w:r>
-      <w:r>
-        <w:t xml:space="preserve"> </w:t>
-      </w:r>
-      <w:r>
-        <w:t xml:space="preserve">“Population Dynamics of Threatened Elkhorn Coral in the Northern</w:t>
+        <w:t xml:space="preserve">Vardi T, Williams DE, Sandin SA (2012) Population dynamics of threatened elkhorn coral in the northern</w:t>
       </w:r>
       <w:r>
         <w:t xml:space="preserve"> </w:t>
@@ -5085,23 +4311,7 @@
         <w:t xml:space="preserve">USA</w:t>
       </w:r>
       <w:r>
-        <w:t xml:space="preserve">.”</w:t>
-      </w:r>
-      <w:r>
-        <w:t xml:space="preserve"> </w:t>
-      </w:r>
-      <w:r>
-        <w:rPr>
-          <w:i/>
-          <w:iCs/>
-        </w:rPr>
-        <w:t xml:space="preserve">Endangered Species Research</w:t>
-      </w:r>
-      <w:r>
-        <w:t xml:space="preserve"> </w:t>
-      </w:r>
-      <w:r>
-        <w:t xml:space="preserve">19: 157–69.</w:t>
+        <w:t xml:space="preserve">. Endangered Species Research 19:157–169.</w:t>
       </w:r>
       <w:r>
         <w:t xml:space="preserve"> </w:t>
@@ -5114,9 +4324,6 @@
           <w:t xml:space="preserve">https://doi.org/10.3354/esr00475</w:t>
         </w:r>
       </w:hyperlink>
-      <w:r>
-        <w:t xml:space="preserve">.</w:t>
-      </w:r>
     </w:p>
     <w:bookmarkEnd w:id="112"/>
     <w:bookmarkStart w:id="114" w:name="ref-viechtbauer2010"/>
@@ -5125,13 +4332,7 @@
         <w:pStyle w:val="Bibliography"/>
       </w:pPr>
       <w:r>
-        <w:t xml:space="preserve">Viechtbauer, Wolfgang. 2010.</w:t>
-      </w:r>
-      <w:r>
-        <w:t xml:space="preserve"> </w:t>
-      </w:r>
-      <w:r>
-        <w:t xml:space="preserve">“Conducting Meta-Analyses in</w:t>
+        <w:t xml:space="preserve">Viechtbauer W (2010) Conducting meta-analyses in</w:t>
       </w:r>
       <w:r>
         <w:t xml:space="preserve"> </w:t>
@@ -5143,23 +4344,7 @@
         <w:t xml:space="preserve"> </w:t>
       </w:r>
       <w:r>
-        <w:t xml:space="preserve">with the Metafor Package.”</w:t>
-      </w:r>
-      <w:r>
-        <w:t xml:space="preserve"> </w:t>
-      </w:r>
-      <w:r>
-        <w:rPr>
-          <w:i/>
-          <w:iCs/>
-        </w:rPr>
-        <w:t xml:space="preserve">Journal of Statistical Software</w:t>
-      </w:r>
-      <w:r>
-        <w:t xml:space="preserve"> </w:t>
-      </w:r>
-      <w:r>
-        <w:t xml:space="preserve">36 (3): 1–48.</w:t>
+        <w:t xml:space="preserve">with the metafor package. Journal of Statistical Software 36:1–48.</w:t>
       </w:r>
       <w:r>
         <w:t xml:space="preserve"> </w:t>
@@ -5172,24 +4357,21 @@
           <w:t xml:space="preserve">https://doi.org/10.18637/jss.v036.i03</w:t>
         </w:r>
       </w:hyperlink>
-      <w:r>
-        <w:t xml:space="preserve">.</w:t>
-      </w:r>
     </w:p>
     <w:bookmarkEnd w:id="114"/>
-    <w:bookmarkStart w:id="116" w:name="ref-williams2008"/>
+    <w:bookmarkStart w:id="116" w:name="ref-williams2023"/>
     <w:p>
       <w:pPr>
         <w:pStyle w:val="Bibliography"/>
       </w:pPr>
       <w:r>
-        <w:t xml:space="preserve">Williams, D. E., M. W. Miller, and K. L. Kramer. 2008.</w:t>
-      </w:r>
-      <w:r>
-        <w:t xml:space="preserve"> </w:t>
-      </w:r>
-      <w:r>
-        <w:t xml:space="preserve">“Recruitment Failure in</w:t>
+        <w:t xml:space="preserve">Williams DE, Bright AJ, Williamson OM, et al (2023) Synchronous spawning of nursery-raised elkhorn coral (</w:t>
+      </w:r>
+      <w:r>
+        <w:t xml:space="preserve">Acropora palmata</w:t>
+      </w:r>
+      <w:r>
+        <w:t xml:space="preserve">) outplanted to reefs in the</w:t>
       </w:r>
       <w:r>
         <w:t xml:space="preserve"> </w:t>
@@ -5201,10 +4383,43 @@
         <w:t xml:space="preserve"> </w:t>
       </w:r>
       <w:r>
+        <w:t xml:space="preserve">(</w:t>
+      </w:r>
+      <w:r>
+        <w:t xml:space="preserve">United States</w:t>
+      </w:r>
+      <w:r>
+        <w:t xml:space="preserve">). Frontiers in Marine Science 10:1180996.</w:t>
+      </w:r>
+      <w:r>
+        <w:t xml:space="preserve"> </w:t>
+      </w:r>
+      <w:hyperlink r:id="rId115">
+        <w:r>
+          <w:rPr>
+            <w:rStyle w:val="Hyperlink"/>
+          </w:rPr>
+          <w:t xml:space="preserve">https://doi.org/10.3389/fmars.2023.1180996</w:t>
+        </w:r>
+      </w:hyperlink>
+    </w:p>
+    <w:bookmarkEnd w:id="116"/>
+    <w:bookmarkStart w:id="118" w:name="ref-williamsmiller2010"/>
+    <w:p>
+      <w:pPr>
+        <w:pStyle w:val="Bibliography"/>
+      </w:pPr>
+      <w:r>
+        <w:t xml:space="preserve">Williams DE, Miller MW (2010) Stabilization of fragments to enhance asexual recruitment in</w:t>
+      </w:r>
+      <w:r>
+        <w:t xml:space="preserve"> </w:t>
+      </w:r>
+      <w:r>
         <w:t xml:space="preserve">Acropora palmata</w:t>
       </w:r>
       <w:r>
-        <w:t xml:space="preserve">, a Threatened</w:t>
+        <w:t xml:space="preserve">, a threatened</w:t>
       </w:r>
       <w:r>
         <w:t xml:space="preserve"> </w:t>
@@ -5216,28 +4431,60 @@
         <w:t xml:space="preserve"> </w:t>
       </w:r>
       <w:r>
-        <w:t xml:space="preserve">Coral.”</w:t>
-      </w:r>
-      <w:r>
-        <w:t xml:space="preserve"> </w:t>
-      </w:r>
-      <w:r>
-        <w:rPr>
-          <w:i/>
-          <w:iCs/>
-        </w:rPr>
-        <w:t xml:space="preserve">Coral Reefs</w:t>
-      </w:r>
-      <w:r>
-        <w:t xml:space="preserve"> </w:t>
-      </w:r>
-      <w:r>
-        <w:t xml:space="preserve">27: 697–705.</w:t>
-      </w:r>
-      <w:r>
-        <w:t xml:space="preserve"> </w:t>
-      </w:r>
-      <w:hyperlink r:id="rId115">
+        <w:t xml:space="preserve">coral. Restoration Ecology 18:446–451.</w:t>
+      </w:r>
+      <w:r>
+        <w:t xml:space="preserve"> </w:t>
+      </w:r>
+      <w:hyperlink r:id="rId117">
+        <w:r>
+          <w:rPr>
+            <w:rStyle w:val="Hyperlink"/>
+          </w:rPr>
+          <w:t xml:space="preserve">https://doi.org/10.1111/j.1526-100X.2009.00579.x</w:t>
+        </w:r>
+      </w:hyperlink>
+    </w:p>
+    <w:bookmarkEnd w:id="118"/>
+    <w:bookmarkStart w:id="120" w:name="ref-williams2008"/>
+    <w:p>
+      <w:pPr>
+        <w:pStyle w:val="Bibliography"/>
+      </w:pPr>
+      <w:r>
+        <w:t xml:space="preserve">Williams DE, Miller MW, Kramer KL (2008) Recruitment failure in</w:t>
+      </w:r>
+      <w:r>
+        <w:t xml:space="preserve"> </w:t>
+      </w:r>
+      <w:r>
+        <w:t xml:space="preserve">Florida Keys</w:t>
+      </w:r>
+      <w:r>
+        <w:t xml:space="preserve"> </w:t>
+      </w:r>
+      <w:r>
+        <w:t xml:space="preserve">Acropora palmata</w:t>
+      </w:r>
+      <w:r>
+        <w:t xml:space="preserve">, a threatened</w:t>
+      </w:r>
+      <w:r>
+        <w:t xml:space="preserve"> </w:t>
+      </w:r>
+      <w:r>
+        <w:t xml:space="preserve">Caribbean</w:t>
+      </w:r>
+      <w:r>
+        <w:t xml:space="preserve"> </w:t>
+      </w:r>
+      <w:r>
+        <w:t xml:space="preserve">coral. Coral Reefs 27:697–705.</w:t>
+      </w:r>
+      <w:r>
+        <w:t xml:space="preserve"> </w:t>
+      </w:r>
+      <w:hyperlink r:id="rId119">
         <w:r>
           <w:rPr>
             <w:rStyle w:val="Hyperlink"/>
@@ -5245,146 +4492,6 @@
           <w:t xml:space="preserve">https://doi.org/10.1007/s00338-008-0386-3</w:t>
         </w:r>
       </w:hyperlink>
-      <w:r>
-        <w:t xml:space="preserve">.</w:t>
-      </w:r>
-    </w:p>
-    <w:bookmarkEnd w:id="116"/>
-    <w:bookmarkStart w:id="118" w:name="ref-williams2023"/>
-    <w:p>
-      <w:pPr>
-        <w:pStyle w:val="Bibliography"/>
-      </w:pPr>
-      <w:r>
-        <w:t xml:space="preserve">Williams, Dana E., Allan J. Bright, Olivia M. Williamson, Amelia Moura, and Mark C. Ladd. 2023.</w:t>
-      </w:r>
-      <w:r>
-        <w:t xml:space="preserve"> </w:t>
-      </w:r>
-      <w:r>
-        <w:t xml:space="preserve">“Synchronous Spawning of Nursery-Raised Elkhorn Coral (</w:t>
-      </w:r>
-      <w:r>
-        <w:t xml:space="preserve">Acropora palmata</w:t>
-      </w:r>
-      <w:r>
-        <w:t xml:space="preserve">) Outplanted to Reefs in the</w:t>
-      </w:r>
-      <w:r>
-        <w:t xml:space="preserve"> </w:t>
-      </w:r>
-      <w:r>
-        <w:t xml:space="preserve">Florida Keys</w:t>
-      </w:r>
-      <w:r>
-        <w:t xml:space="preserve"> </w:t>
-      </w:r>
-      <w:r>
-        <w:t xml:space="preserve">(</w:t>
-      </w:r>
-      <w:r>
-        <w:t xml:space="preserve">United States</w:t>
-      </w:r>
-      <w:r>
-        <w:t xml:space="preserve">).”</w:t>
-      </w:r>
-      <w:r>
-        <w:t xml:space="preserve"> </w:t>
-      </w:r>
-      <w:r>
-        <w:rPr>
-          <w:i/>
-          <w:iCs/>
-        </w:rPr>
-        <w:t xml:space="preserve">Frontiers in Marine Science</w:t>
-      </w:r>
-      <w:r>
-        <w:t xml:space="preserve"> </w:t>
-      </w:r>
-      <w:r>
-        <w:t xml:space="preserve">10: 1180996.</w:t>
-      </w:r>
-      <w:r>
-        <w:t xml:space="preserve"> </w:t>
-      </w:r>
-      <w:hyperlink r:id="rId117">
-        <w:r>
-          <w:rPr>
-            <w:rStyle w:val="Hyperlink"/>
-          </w:rPr>
-          <w:t xml:space="preserve">https://doi.org/10.3389/fmars.2023.1180996</w:t>
-        </w:r>
-      </w:hyperlink>
-      <w:r>
-        <w:t xml:space="preserve">.</w:t>
-      </w:r>
-    </w:p>
-    <w:bookmarkEnd w:id="118"/>
-    <w:bookmarkStart w:id="120" w:name="ref-williamsmiller2010"/>
-    <w:p>
-      <w:pPr>
-        <w:pStyle w:val="Bibliography"/>
-      </w:pPr>
-      <w:r>
-        <w:t xml:space="preserve">Williams, Dana E., and Margaret W. Miller. 2010.</w:t>
-      </w:r>
-      <w:r>
-        <w:t xml:space="preserve"> </w:t>
-      </w:r>
-      <w:r>
-        <w:t xml:space="preserve">“Stabilization of Fragments to Enhance Asexual Recruitment in</w:t>
-      </w:r>
-      <w:r>
-        <w:t xml:space="preserve"> </w:t>
-      </w:r>
-      <w:r>
-        <w:t xml:space="preserve">Acropora palmata</w:t>
-      </w:r>
-      <w:r>
-        <w:t xml:space="preserve">, a Threatened</w:t>
-      </w:r>
-      <w:r>
-        <w:t xml:space="preserve"> </w:t>
-      </w:r>
-      <w:r>
-        <w:t xml:space="preserve">Caribbean</w:t>
-      </w:r>
-      <w:r>
-        <w:t xml:space="preserve"> </w:t>
-      </w:r>
-      <w:r>
-        <w:t xml:space="preserve">Coral.”</w:t>
-      </w:r>
-      <w:r>
-        <w:t xml:space="preserve"> </w:t>
-      </w:r>
-      <w:r>
-        <w:rPr>
-          <w:i/>
-          <w:iCs/>
-        </w:rPr>
-        <w:t xml:space="preserve">Restoration Ecology</w:t>
-      </w:r>
-      <w:r>
-        <w:t xml:space="preserve"> </w:t>
-      </w:r>
-      <w:r>
-        <w:t xml:space="preserve">18 (S2): 446–51.</w:t>
-      </w:r>
-      <w:r>
-        <w:t xml:space="preserve"> </w:t>
-      </w:r>
-      <w:hyperlink r:id="rId119">
-        <w:r>
-          <w:rPr>
-            <w:rStyle w:val="Hyperlink"/>
-          </w:rPr>
-          <w:t xml:space="preserve">https://doi.org/10.1111/j.1526-100X.2009.00579.x</w:t>
-        </w:r>
-      </w:hyperlink>
-      <w:r>
-        <w:t xml:space="preserve">.</w:t>
-      </w:r>
     </w:p>
     <w:bookmarkEnd w:id="120"/>
     <w:bookmarkEnd w:id="121"/>

</xml_diff>

<commit_message>
Finalize palmata synthesis manuscript package
</commit_message>
<xml_diff>
--- a/paper/output/acropora_palmata_demography_manuscript.docx
+++ b/paper/output/acropora_palmata_demography_manuscript.docx
@@ -37,28 +37,87 @@
         <w:rPr>
           <w:vertAlign w:val="superscript"/>
         </w:rPr>
+        <w:t xml:space="preserve">1,2,</w:t>
+      </w:r>
+      <w:r>
+        <w:t xml:space="preserve">*, A. Raine Detmer</w:t>
+      </w:r>
+      <w:r>
+        <w:rPr>
+          <w:vertAlign w:val="superscript"/>
+        </w:rPr>
         <w:t xml:space="preserve">1</w:t>
       </w:r>
       <w:r>
-        <w:t xml:space="preserve">, A. Raine Detmer</w:t>
+        <w:t xml:space="preserve">, Jameal F. Samhouri</w:t>
       </w:r>
       <w:r>
         <w:rPr>
           <w:vertAlign w:val="superscript"/>
         </w:rPr>
-        <w:t xml:space="preserve">1,</w:t>
-      </w:r>
-      <w:r>
-        <w:t xml:space="preserve">*, Jameal F. Samhouri</w:t>
+        <w:t xml:space="preserve">3</w:t>
+      </w:r>
+      <w:r>
+        <w:t xml:space="preserve">, Darcy Bradley</w:t>
       </w:r>
       <w:r>
         <w:rPr>
           <w:vertAlign w:val="superscript"/>
         </w:rPr>
+        <w:t xml:space="preserve">4</w:t>
+      </w:r>
+      <w:r>
+        <w:t xml:space="preserve">, Aldo Croquer</w:t>
+      </w:r>
+      <w:r>
+        <w:rPr>
+          <w:vertAlign w:val="superscript"/>
+        </w:rPr>
+        <w:t xml:space="preserve">5</w:t>
+      </w:r>
+      <w:r>
+        <w:t xml:space="preserve">, and Rita I. Sellares-Blasco</w:t>
+      </w:r>
+      <w:r>
+        <w:rPr>
+          <w:vertAlign w:val="superscript"/>
+        </w:rPr>
+        <w:t xml:space="preserve">6</w:t>
+      </w:r>
+    </w:p>
+    <w:p>
+      <w:pPr>
+        <w:pStyle w:val="BodyText"/>
+      </w:pPr>
+      <w:r>
+        <w:rPr>
+          <w:vertAlign w:val="superscript"/>
+        </w:rPr>
+        <w:t xml:space="preserve">1</w:t>
+      </w:r>
+      <w:r>
+        <w:t xml:space="preserve"> </w:t>
+      </w:r>
+      <w:r>
+        <w:t xml:space="preserve">Department of Ecology, Evolution, and Marine Biology, University of California, Santa Barbara, California, USA</w:t>
+      </w:r>
+      <w:r>
+        <w:br/>
+      </w:r>
+      <w:r>
+        <w:rPr>
+          <w:vertAlign w:val="superscript"/>
+        </w:rPr>
         <w:t xml:space="preserve">2</w:t>
       </w:r>
       <w:r>
-        <w:t xml:space="preserve">, Darcy Bradley</w:t>
+        <w:t xml:space="preserve"> </w:t>
+      </w:r>
+      <w:r>
+        <w:t xml:space="preserve">Marine Science Institute, University of California, Santa Barbara, CA 93106, USA</w:t>
+      </w:r>
+      <w:r>
+        <w:br/>
       </w:r>
       <w:r>
         <w:rPr>
@@ -67,7 +126,13 @@
         <w:t xml:space="preserve">3</w:t>
       </w:r>
       <w:r>
-        <w:t xml:space="preserve">, Aldo Croquer</w:t>
+        <w:t xml:space="preserve"> </w:t>
+      </w:r>
+      <w:r>
+        <w:t xml:space="preserve">Conservation Biology Division, Northwest Fisheries Science Center, National Marine Fisheries Service, National Oceanic and Atmospheric Administration, Seattle, Washington, USA</w:t>
+      </w:r>
+      <w:r>
+        <w:br/>
       </w:r>
       <w:r>
         <w:rPr>
@@ -76,7 +141,13 @@
         <w:t xml:space="preserve">4</w:t>
       </w:r>
       <w:r>
-        <w:t xml:space="preserve">, and Rita I. Sellares-Blasco</w:t>
+        <w:t xml:space="preserve"> </w:t>
+      </w:r>
+      <w:r>
+        <w:t xml:space="preserve">California Oceans Program, The Nature Conservancy, Sacramento, California, USA</w:t>
+      </w:r>
+      <w:r>
+        <w:br/>
       </w:r>
       <w:r>
         <w:rPr>
@@ -84,105 +155,49 @@
         </w:rPr>
         <w:t xml:space="preserve">5</w:t>
       </w:r>
+      <w:r>
+        <w:t xml:space="preserve"> </w:t>
+      </w:r>
+      <w:r>
+        <w:t xml:space="preserve">The Nature Conservancy, Caribbean Division, Punta Cana, Dominican Republic</w:t>
+      </w:r>
+      <w:r>
+        <w:br/>
+      </w:r>
+      <w:r>
+        <w:rPr>
+          <w:vertAlign w:val="superscript"/>
+        </w:rPr>
+        <w:t xml:space="preserve">6</w:t>
+      </w:r>
+      <w:r>
+        <w:t xml:space="preserve"> </w:t>
+      </w:r>
+      <w:r>
+        <w:t xml:space="preserve">Fundación Dominicana de Estudios Marinos (FUNDEMAR), Bayahibe, Dominican Republic</w:t>
+      </w:r>
+      <w:r>
+        <w:br/>
+      </w:r>
+      <w:r>
+        <w:rPr>
+          <w:vertAlign w:val="superscript"/>
+        </w:rPr>
+        <w:t xml:space="preserve">*</w:t>
+      </w:r>
+      <w:r>
+        <w:t xml:space="preserve"> </w:t>
+      </w:r>
+      <w:r>
+        <w:t xml:space="preserve">Correspondence: Adrian C. Stier</w:t>
+      </w:r>
     </w:p>
     <w:p>
       <w:pPr>
         <w:pStyle w:val="BodyText"/>
       </w:pPr>
       <w:r>
-        <w:rPr>
-          <w:vertAlign w:val="superscript"/>
-        </w:rPr>
-        <w:t xml:space="preserve">1</w:t>
-      </w:r>
-      <w:r>
-        <w:t xml:space="preserve"> </w:t>
-      </w:r>
-      <w:r>
-        <w:t xml:space="preserve">Department of Ecology, Evolution, and Marine Biology, University of California, Santa Barbara, California, USA</w:t>
-      </w:r>
-      <w:r>
-        <w:br/>
-      </w:r>
-      <w:r>
-        <w:rPr>
-          <w:vertAlign w:val="superscript"/>
-        </w:rPr>
-        <w:t xml:space="preserve">2</w:t>
-      </w:r>
-      <w:r>
-        <w:t xml:space="preserve"> </w:t>
-      </w:r>
-      <w:r>
-        <w:t xml:space="preserve">Conservation Biology Division, Northwest Fisheries Science Center, National Marine Fisheries Service, National Oceanic and Atmospheric Administration, Seattle, Washington, USA</w:t>
-      </w:r>
-      <w:r>
-        <w:br/>
-      </w:r>
-      <w:r>
-        <w:rPr>
-          <w:vertAlign w:val="superscript"/>
-        </w:rPr>
-        <w:t xml:space="preserve">3</w:t>
-      </w:r>
-      <w:r>
-        <w:t xml:space="preserve"> </w:t>
-      </w:r>
-      <w:r>
-        <w:t xml:space="preserve">California Oceans Program, The Nature Conservancy, Sacramento, California, USA</w:t>
-      </w:r>
-      <w:r>
-        <w:br/>
-      </w:r>
-      <w:r>
-        <w:rPr>
-          <w:vertAlign w:val="superscript"/>
-        </w:rPr>
-        <w:t xml:space="preserve">4</w:t>
-      </w:r>
-      <w:r>
-        <w:t xml:space="preserve"> </w:t>
-      </w:r>
-      <w:r>
-        <w:t xml:space="preserve">The Nature Conservancy, Caribbean Division, Punta Cana, Dominican Republic</w:t>
-      </w:r>
-      <w:r>
-        <w:br/>
-      </w:r>
-      <w:r>
-        <w:rPr>
-          <w:vertAlign w:val="superscript"/>
-        </w:rPr>
-        <w:t xml:space="preserve">5</w:t>
-      </w:r>
-      <w:r>
-        <w:t xml:space="preserve"> </w:t>
-      </w:r>
-      <w:r>
-        <w:t xml:space="preserve">Fundación Dominicana de Estudios Marinos (FUNDEMAR), Bayahibe, Dominican Republic</w:t>
-      </w:r>
-      <w:r>
-        <w:br/>
-      </w:r>
-      <w:r>
-        <w:rPr>
-          <w:vertAlign w:val="superscript"/>
-        </w:rPr>
-        <w:t xml:space="preserve">*</w:t>
-      </w:r>
-      <w:r>
-        <w:t xml:space="preserve"> </w:t>
-      </w:r>
-      <w:r>
-        <w:t xml:space="preserve">Correspondence: A. Raine Detmer</w:t>
-      </w:r>
-    </w:p>
-    <w:p>
-      <w:pPr>
-        <w:pStyle w:val="BodyText"/>
-      </w:pPr>
-      <w:r>
-        <w:t xml:space="preserve">Corresponding author email: [insert corresponding-author email]</w:t>
+        <w:t xml:space="preserve">Corresponding author email: astier@ucsb.edu</w:t>
       </w:r>
       <w:r>
         <w:t xml:space="preserve"> </w:t>
@@ -221,7 +236,29 @@
         <w:t xml:space="preserve"> </w:t>
       </w:r>
       <w:r>
-        <w:t xml:space="preserve">depends on demographic rates that vary with colony size, location, and disturbance history, yet those rates have not been synthesized in a form that identifies which size classes and transitions limit persistence. Here, we compiled longitudinal survival, growth, and fragmentation records from 18 studies across the Caribbean, standardized colony size to live planar area, and linked size-dependent vital rates to a five-class, recruitment-free transition matrix. Pooled annual survival was 78.7% (95% CI 70.4–85.1%), but heterogeneity was extreme (I² = 97.6%) and the 95% prediction interval spanned 37.4–95.8%. Survival rose with colony size, whereas relative growth changed most sharply near 37 cm². Partial mortality was pervasive: 39.4% of surviving colonies lost live tissue during an interval, and 9–17% of colonies in each non-recruit size class moved to a smaller class. The post-settlement subsystem had a deterministic population growth rate (λ) of 0.961 (bootstrap interval 0.816–1.010), and stasis of the largest colonies accounted for 58.9% of matrix elasticity. Survival of broadly defined restoration fragments (74.5%) did not differ statistically from that of natural colonies (85.4%), but survival ranged from 58.7% to 81.1% among restoration subtypes. Recurrence of Florida-scale heatwave mortality every 5–50 years reduced effective λ to 0.36–0.85. Recovery of</w:t>
+        <w:t xml:space="preserve">depends on demographic rates that vary with colony size, location, and disturbance history, yet those rates have not been synthesized in a form that identifies which size classes and transitions limit persistence. Here, we compiled longitudinal survival, growth, and fragmentation records from 18 studies across the Caribbean, standardized colony size to live planar area, and linked size-dependent vital rates to a five-class, recruitment-free transition matrix. Pooled annual survival was 78.7% (95% CI 70.4–85.1%), but heterogeneity was extreme (I² = 97.6%) and the 95% prediction interval spanned 37.4–95.8%. Survival rose with colony size, whereas relative growth changed most sharply near 37 cm². Partial mortality was pervasive: 39.4% of surviving colonies lost live tissue during an interval, and 9–17% of colonies in each non-recruit size class moved to a smaller class. The post-settlement subsystem had a deterministic population growth rate (</w:t>
+      </w:r>
+      <m:oMath>
+        <m:r>
+          <m:t>λ</m:t>
+        </m:r>
+      </m:oMath>
+      <w:r>
+        <w:t xml:space="preserve">) of 0.961 (bootstrap interval 0.816–1.010), and stasis of the largest colonies accounted for 58.9% of matrix elasticity. Survival of broadly defined restoration fragments (74.5%) did not differ statistically from that of natural colonies (85.4%), but survival ranged from 58.7% to 81.1% among restoration subtypes. Recurrence of Florida-scale heatwave mortality every 5–50 years reduced effective</w:t>
+      </w:r>
+      <w:r>
+        <w:t xml:space="preserve"> </w:t>
+      </w:r>
+      <m:oMath>
+        <m:r>
+          <m:t>λ</m:t>
+        </m:r>
+      </m:oMath>
+      <w:r>
+        <w:t xml:space="preserve"> </w:t>
+      </w:r>
+      <w:r>
+        <w:t xml:space="preserve">to 0.36–0.85. Recovery of</w:t>
       </w:r>
       <w:r>
         <w:t xml:space="preserve"> </w:t>
@@ -263,7 +300,7 @@
         <w:pStyle w:val="FirstParagraph"/>
       </w:pPr>
       <w:r>
-        <w:t xml:space="preserve">Foundation species create the structure on which ecological communities depend, but their recovery requires more than replacing individuals that have been lost. For colonial organisms, the demographic consequences of loss depend on which colonies die, which survive after partial mortality, and which transitions move colonies toward or away from reproductive size. These processes are particularly consequential for Caribbean acroporids, whose regional declines have reduced both coral cover and the three-dimensional habitat that elkhorn coral once provided</w:t>
+        <w:t xml:space="preserve">Urgently understanding the demography of endangered foundation corals is essential because their loss erodes the habitat that supports reef communities and the coastal economies built around them. Foundation species create the structure on which ecological communities depend, but their recovery requires more than replacing individuals that have been lost. For colonial organisms, the demographic consequences of loss depend on which colonies die, which survive after partial mortality, and which transitions move colonies toward or away from reproductive size. These processes are particularly consequential for Caribbean acroporids, whose regional declines have reduced both coral cover and the three-dimensional habitat that elkhorn coral once provided</w:t>
       </w:r>
       <w:r>
         <w:t xml:space="preserve"> </w:t>
@@ -297,7 +334,7 @@
         <w:t xml:space="preserve">)</w:t>
       </w:r>
       <w:r>
-        <w:t xml:space="preserve">. Restoration programs increasingly propagate and outplant</w:t>
+        <w:t xml:space="preserve">. White-band disease, storms, predation, and chronic loss of live tissue have each altered</w:t>
       </w:r>
       <w:r>
         <w:t xml:space="preserve"> </w:t>
@@ -307,10 +344,13 @@
           <w:i/>
           <w:iCs/>
         </w:rPr>
-        <w:t xml:space="preserve">Acropora palmata</w:t>
-      </w:r>
-      <w:r>
-        <w:t xml:space="preserve">, but the demographic information used to choose target sizes, sites, and intervention schedules remains fragmented among studies and regions</w:t>
+        <w:t xml:space="preserve">A. palmata</w:t>
+      </w:r>
+      <w:r>
+        <w:t xml:space="preserve"> </w:t>
+      </w:r>
+      <w:r>
+        <w:t xml:space="preserve">populations and reef structure at local scales</w:t>
       </w:r>
       <w:r>
         <w:t xml:space="preserve"> </w:t>
@@ -318,19 +358,47 @@
       <w:r>
         <w:t xml:space="preserve">(</w:t>
       </w:r>
-      <w:hyperlink w:anchor="ref-edmundsriegl2020">
-        <w:r>
-          <w:rPr>
-            <w:rStyle w:val="Hyperlink"/>
-          </w:rPr>
-          <w:t xml:space="preserve">Edmunds and Riegl 2020</w:t>
+      <w:hyperlink w:anchor="ref-gladfelter1982">
+        <w:r>
+          <w:rPr>
+            <w:rStyle w:val="Hyperlink"/>
+          </w:rPr>
+          <w:t xml:space="preserve">Gladfelter 1982</w:t>
+        </w:r>
+      </w:hyperlink>
+      <w:r>
+        <w:t xml:space="preserve">;</w:t>
+      </w:r>
+      <w:r>
+        <w:t xml:space="preserve"> </w:t>
+      </w:r>
+      <w:hyperlink w:anchor="ref-rogersmuller2012">
+        <w:r>
+          <w:rPr>
+            <w:rStyle w:val="Hyperlink"/>
+          </w:rPr>
+          <w:t xml:space="preserve">Rogers and Muller 2012</w:t>
+        </w:r>
+      </w:hyperlink>
+      <w:r>
+        <w:t xml:space="preserve">;</w:t>
+      </w:r>
+      <w:r>
+        <w:t xml:space="preserve"> </w:t>
+      </w:r>
+      <w:hyperlink w:anchor="ref-williamsmiller2012">
+        <w:r>
+          <w:rPr>
+            <w:rStyle w:val="Hyperlink"/>
+          </w:rPr>
+          <w:t xml:space="preserve">Williams and Miller 2012</w:t>
         </w:r>
       </w:hyperlink>
       <w:r>
         <w:t xml:space="preserve">)</w:t>
       </w:r>
       <w:r>
-        <w:t xml:space="preserve">. The most widely used size-structured model for the species was parameterized from tagged colonies in the northern Florida Keys</w:t>
+        <w:t xml:space="preserve">. White-band disease outbreaks can also be spatially clustered within local populations, an important caution when interpreting site-level demographic records</w:t>
       </w:r>
       <w:r>
         <w:t xml:space="preserve"> </w:t>
@@ -338,143 +406,19 @@
       <w:r>
         <w:t xml:space="preserve">(</w:t>
       </w:r>
-      <w:hyperlink w:anchor="ref-vardi2012">
-        <w:r>
-          <w:rPr>
-            <w:rStyle w:val="Hyperlink"/>
-          </w:rPr>
-          <w:t xml:space="preserve">Vardi et al. 2012</w:t>
+      <w:hyperlink w:anchor="ref-lentz2011">
+        <w:r>
+          <w:rPr>
+            <w:rStyle w:val="Hyperlink"/>
+          </w:rPr>
+          <w:t xml:space="preserve">Lentz et al. 2011</w:t>
         </w:r>
       </w:hyperlink>
       <w:r>
         <w:t xml:space="preserve">)</w:t>
       </w:r>
       <w:r>
-        <w:t xml:space="preserve">, a single region whose rates may not transfer to the rest of the Caribbean.</w:t>
-      </w:r>
-    </w:p>
-    <w:p>
-      <w:pPr>
-        <w:pStyle w:val="BodyText"/>
-      </w:pPr>
-      <w:r>
-        <w:t xml:space="preserve">Colony size is a central axis of coral demography</w:t>
-      </w:r>
-      <w:r>
-        <w:t xml:space="preserve"> </w:t>
-      </w:r>
-      <w:r>
-        <w:t xml:space="preserve">(</w:t>
-      </w:r>
-      <w:hyperlink w:anchor="ref-hughes1984">
-        <w:r>
-          <w:rPr>
-            <w:rStyle w:val="Hyperlink"/>
-          </w:rPr>
-          <w:t xml:space="preserve">Hughes 1984</w:t>
-        </w:r>
-      </w:hyperlink>
-      <w:r>
-        <w:t xml:space="preserve">;</w:t>
-      </w:r>
-      <w:r>
-        <w:t xml:space="preserve"> </w:t>
-      </w:r>
-      <w:hyperlink w:anchor="ref-hughesjackson1985">
-        <w:r>
-          <w:rPr>
-            <w:rStyle w:val="Hyperlink"/>
-          </w:rPr>
-          <w:t xml:space="preserve">Hughes and Jackson 1985</w:t>
-        </w:r>
-      </w:hyperlink>
-      <w:r>
-        <w:t xml:space="preserve">)</w:t>
-      </w:r>
-      <w:r>
-        <w:t xml:space="preserve">. Small colonies may grow rapidly in proportional terms but are exposed to high mortality, whereas large colonies can persist, reproduce, and fragment</w:t>
-      </w:r>
-      <w:r>
-        <w:t xml:space="preserve"> </w:t>
-      </w:r>
-      <w:r>
-        <w:t xml:space="preserve">(</w:t>
-      </w:r>
-      <w:hyperlink w:anchor="ref-highsmith1982">
-        <w:r>
-          <w:rPr>
-            <w:rStyle w:val="Hyperlink"/>
-          </w:rPr>
-          <w:t xml:space="preserve">Highsmith 1982</w:t>
-        </w:r>
-      </w:hyperlink>
-      <w:r>
-        <w:t xml:space="preserve">;</w:t>
-      </w:r>
-      <w:r>
-        <w:t xml:space="preserve"> </w:t>
-      </w:r>
-      <w:hyperlink w:anchor="ref-lirman2000">
-        <w:r>
-          <w:rPr>
-            <w:rStyle w:val="Hyperlink"/>
-          </w:rPr>
-          <w:t xml:space="preserve">Lirman 2000</w:t>
-        </w:r>
-      </w:hyperlink>
-      <w:r>
-        <w:t xml:space="preserve">;</w:t>
-      </w:r>
-      <w:r>
-        <w:t xml:space="preserve"> </w:t>
-      </w:r>
-      <w:hyperlink w:anchor="ref-madin2014">
-        <w:r>
-          <w:rPr>
-            <w:rStyle w:val="Hyperlink"/>
-          </w:rPr>
-          <w:t xml:space="preserve">Madin et al. 2014</w:t>
-        </w:r>
-      </w:hyperlink>
-      <w:r>
-        <w:t xml:space="preserve">)</w:t>
-      </w:r>
-      <w:r>
-        <w:t xml:space="preserve">. However, colonies do not move through size structure only by growing or dying. Storm damage, disease, predation, and tissue loss can reduce the live area of colonies that remain alive, producing shrinkage and retrogression rather than immediate whole-colony mortality</w:t>
-      </w:r>
-      <w:r>
-        <w:t xml:space="preserve"> </w:t>
-      </w:r>
-      <w:r>
-        <w:t xml:space="preserve">(</w:t>
-      </w:r>
-      <w:hyperlink w:anchor="ref-lirman1997">
-        <w:r>
-          <w:rPr>
-            <w:rStyle w:val="Hyperlink"/>
-          </w:rPr>
-          <w:t xml:space="preserve">Lirman and Fong 1997</w:t>
-        </w:r>
-      </w:hyperlink>
-      <w:r>
-        <w:t xml:space="preserve">;</w:t>
-      </w:r>
-      <w:r>
-        <w:t xml:space="preserve"> </w:t>
-      </w:r>
-      <w:hyperlink w:anchor="ref-madin2020">
-        <w:r>
-          <w:rPr>
-            <w:rStyle w:val="Hyperlink"/>
-          </w:rPr>
-          <w:t xml:space="preserve">Madin et al. 2020</w:t>
-        </w:r>
-      </w:hyperlink>
-      <w:r>
-        <w:t xml:space="preserve">)</w:t>
-      </w:r>
-      <w:r>
-        <w:t xml:space="preserve">. Partial mortality can also carry a reproductive cost:</w:t>
+        <w:t xml:space="preserve">. Restoration programs increasingly propagate and outplant</w:t>
       </w:r>
       <w:r>
         <w:t xml:space="preserve"> </w:t>
@@ -484,13 +428,10 @@
           <w:i/>
           <w:iCs/>
         </w:rPr>
-        <w:t xml:space="preserve">A. palmata</w:t>
-      </w:r>
-      <w:r>
-        <w:t xml:space="preserve"> </w:t>
-      </w:r>
-      <w:r>
-        <w:t xml:space="preserve">colonies with unhealed lesions produced smaller eggs than apparently healthy colonies, and the lesions did not regenerate over a four-month season</w:t>
+        <w:t xml:space="preserve">Acropora palmata</w:t>
+      </w:r>
+      <w:r>
+        <w:t xml:space="preserve">, but the demographic information used to choose target sizes, sites, and intervention schedules remains fragmented among studies and regions</w:t>
       </w:r>
       <w:r>
         <w:t xml:space="preserve"> </w:t>
@@ -498,19 +439,39 @@
       <w:r>
         <w:t xml:space="preserve">(</w:t>
       </w:r>
-      <w:hyperlink w:anchor="ref-pinongonzalez2018">
-        <w:r>
-          <w:rPr>
-            <w:rStyle w:val="Hyperlink"/>
-          </w:rPr>
-          <w:t xml:space="preserve">Piñón-González and Banaszak 2018</w:t>
+      <w:hyperlink w:anchor="ref-edmundsriegl2020">
+        <w:r>
+          <w:rPr>
+            <w:rStyle w:val="Hyperlink"/>
+          </w:rPr>
+          <w:t xml:space="preserve">Edmunds and Riegl 2020</w:t>
         </w:r>
       </w:hyperlink>
       <w:r>
         <w:t xml:space="preserve">)</w:t>
       </w:r>
       <w:r>
-        <w:t xml:space="preserve">. A demographic analysis that treats all surviving colonies as stable therefore risks obscuring the processes that determine whether individuals eventually contribute to adult population structure.</w:t>
+        <w:t xml:space="preserve">. The most widely used size-structured model for the species was parameterized from tagged colonies in the northern Florida Keys</w:t>
+      </w:r>
+      <w:r>
+        <w:t xml:space="preserve"> </w:t>
+      </w:r>
+      <w:r>
+        <w:t xml:space="preserve">(</w:t>
+      </w:r>
+      <w:hyperlink w:anchor="ref-vardi2012">
+        <w:r>
+          <w:rPr>
+            <w:rStyle w:val="Hyperlink"/>
+          </w:rPr>
+          <w:t xml:space="preserve">Vardi et al. 2012</w:t>
+        </w:r>
+      </w:hyperlink>
+      <w:r>
+        <w:t xml:space="preserve">)</w:t>
+      </w:r>
+      <w:r>
+        <w:t xml:space="preserve">, a single region whose rates may not transfer to the rest of the Caribbean.</w:t>
       </w:r>
     </w:p>
     <w:p>
@@ -518,7 +479,123 @@
         <w:pStyle w:val="BodyText"/>
       </w:pPr>
       <w:r>
-        <w:t xml:space="preserve">The Caribbean setting adds a second complication: demographic records were collected across populations that experienced different histories of storms, disease, bleaching, and chronic environmental stress. These events are often treated as inconvenient variation to remove before estimating a baseline vital rate. Yet disturbance is part of the regime in which</w:t>
+        <w:t xml:space="preserve">Colony size is a central axis of coral demography</w:t>
+      </w:r>
+      <w:r>
+        <w:t xml:space="preserve"> </w:t>
+      </w:r>
+      <w:r>
+        <w:t xml:space="preserve">(</w:t>
+      </w:r>
+      <w:hyperlink w:anchor="ref-hughes1984">
+        <w:r>
+          <w:rPr>
+            <w:rStyle w:val="Hyperlink"/>
+          </w:rPr>
+          <w:t xml:space="preserve">Hughes 1984</w:t>
+        </w:r>
+      </w:hyperlink>
+      <w:r>
+        <w:t xml:space="preserve">;</w:t>
+      </w:r>
+      <w:r>
+        <w:t xml:space="preserve"> </w:t>
+      </w:r>
+      <w:hyperlink w:anchor="ref-hughesjackson1985">
+        <w:r>
+          <w:rPr>
+            <w:rStyle w:val="Hyperlink"/>
+          </w:rPr>
+          <w:t xml:space="preserve">Hughes and Jackson 1985</w:t>
+        </w:r>
+      </w:hyperlink>
+      <w:r>
+        <w:t xml:space="preserve">)</w:t>
+      </w:r>
+      <w:r>
+        <w:t xml:space="preserve">. Small colonies may grow rapidly in proportional terms but are exposed to high mortality, whereas large colonies can persist, reproduce, and fragment</w:t>
+      </w:r>
+      <w:r>
+        <w:t xml:space="preserve"> </w:t>
+      </w:r>
+      <w:r>
+        <w:t xml:space="preserve">(</w:t>
+      </w:r>
+      <w:hyperlink w:anchor="ref-highsmith1982">
+        <w:r>
+          <w:rPr>
+            <w:rStyle w:val="Hyperlink"/>
+          </w:rPr>
+          <w:t xml:space="preserve">Highsmith 1982</w:t>
+        </w:r>
+      </w:hyperlink>
+      <w:r>
+        <w:t xml:space="preserve">;</w:t>
+      </w:r>
+      <w:r>
+        <w:t xml:space="preserve"> </w:t>
+      </w:r>
+      <w:hyperlink w:anchor="ref-lirman2000">
+        <w:r>
+          <w:rPr>
+            <w:rStyle w:val="Hyperlink"/>
+          </w:rPr>
+          <w:t xml:space="preserve">Lirman 2000</w:t>
+        </w:r>
+      </w:hyperlink>
+      <w:r>
+        <w:t xml:space="preserve">;</w:t>
+      </w:r>
+      <w:r>
+        <w:t xml:space="preserve"> </w:t>
+      </w:r>
+      <w:hyperlink w:anchor="ref-madin2014">
+        <w:r>
+          <w:rPr>
+            <w:rStyle w:val="Hyperlink"/>
+          </w:rPr>
+          <w:t xml:space="preserve">Madin et al. 2014</w:t>
+        </w:r>
+      </w:hyperlink>
+      <w:r>
+        <w:t xml:space="preserve">)</w:t>
+      </w:r>
+      <w:r>
+        <w:t xml:space="preserve">. However, colonies do not move through size structure only by growing or dying. Storm damage, disease, predation, and tissue loss can reduce the live area of colonies that remain alive, producing shrinkage and retrogression rather than immediate whole-colony mortality</w:t>
+      </w:r>
+      <w:r>
+        <w:t xml:space="preserve"> </w:t>
+      </w:r>
+      <w:r>
+        <w:t xml:space="preserve">(</w:t>
+      </w:r>
+      <w:hyperlink w:anchor="ref-lirman1997">
+        <w:r>
+          <w:rPr>
+            <w:rStyle w:val="Hyperlink"/>
+          </w:rPr>
+          <w:t xml:space="preserve">Lirman and Fong 1997</w:t>
+        </w:r>
+      </w:hyperlink>
+      <w:r>
+        <w:t xml:space="preserve">;</w:t>
+      </w:r>
+      <w:r>
+        <w:t xml:space="preserve"> </w:t>
+      </w:r>
+      <w:hyperlink w:anchor="ref-madin2020">
+        <w:r>
+          <w:rPr>
+            <w:rStyle w:val="Hyperlink"/>
+          </w:rPr>
+          <w:t xml:space="preserve">Madin et al. 2020</w:t>
+        </w:r>
+      </w:hyperlink>
+      <w:r>
+        <w:t xml:space="preserve">)</w:t>
+      </w:r>
+      <w:r>
+        <w:t xml:space="preserve">. Partial mortality can also carry a reproductive cost:</w:t>
       </w:r>
       <w:r>
         <w:t xml:space="preserve"> </w:t>
@@ -534,7 +611,35 @@
         <w:t xml:space="preserve"> </w:t>
       </w:r>
       <w:r>
-        <w:t xml:space="preserve">populations persist or decline. The 2023 marine heatwave, which caused functional extinction of</w:t>
+        <w:t xml:space="preserve">colonies with unhealed lesions produced smaller eggs than apparently healthy colonies, and the lesions did not regenerate over a four-month season</w:t>
+      </w:r>
+      <w:r>
+        <w:t xml:space="preserve"> </w:t>
+      </w:r>
+      <w:r>
+        <w:t xml:space="preserve">(</w:t>
+      </w:r>
+      <w:hyperlink w:anchor="ref-pinongonzalez2018">
+        <w:r>
+          <w:rPr>
+            <w:rStyle w:val="Hyperlink"/>
+          </w:rPr>
+          <w:t xml:space="preserve">Piñón-González and Banaszak 2018</w:t>
+        </w:r>
+      </w:hyperlink>
+      <w:r>
+        <w:t xml:space="preserve">)</w:t>
+      </w:r>
+      <w:r>
+        <w:t xml:space="preserve">. A demographic analysis that treats all surviving colonies as stable therefore risks obscuring the processes that determine whether individuals eventually contribute to adult population structure.</w:t>
+      </w:r>
+    </w:p>
+    <w:p>
+      <w:pPr>
+        <w:pStyle w:val="BodyText"/>
+      </w:pPr>
+      <w:r>
+        <w:t xml:space="preserve">The Caribbean setting adds a second complication: demographic records were collected across populations that experienced different histories of storms, disease, bleaching, and chronic environmental stress. These events are often treated as inconvenient variation to remove before estimating a baseline vital rate. Yet disturbance is part of the regime in which</w:t>
       </w:r>
       <w:r>
         <w:t xml:space="preserve"> </w:t>
@@ -550,7 +655,7 @@
         <w:t xml:space="preserve"> </w:t>
       </w:r>
       <w:r>
-        <w:t xml:space="preserve">in Florida, makes this point especially clear: older demographic records describe an earlier chronic regime, not an enduring environmental baseline</w:t>
+        <w:t xml:space="preserve">populations persist or decline: a stage-structured simulation showed that storm frequency and intensity can alter population trajectories</w:t>
       </w:r>
       <w:r>
         <w:t xml:space="preserve"> </w:t>
@@ -558,27 +663,19 @@
       <w:r>
         <w:t xml:space="preserve">(</w:t>
       </w:r>
-      <w:hyperlink w:anchor="ref-manzello2025">
-        <w:r>
-          <w:rPr>
-            <w:rStyle w:val="Hyperlink"/>
-          </w:rPr>
-          <w:t xml:space="preserve">Manzello et al. 2025</w:t>
+      <w:hyperlink w:anchor="ref-lirman2003">
+        <w:r>
+          <w:rPr>
+            <w:rStyle w:val="Hyperlink"/>
+          </w:rPr>
+          <w:t xml:space="preserve">Lirman 2003</w:t>
         </w:r>
       </w:hyperlink>
       <w:r>
         <w:t xml:space="preserve">)</w:t>
       </w:r>
       <w:r>
-        <w:t xml:space="preserve">. A useful synthesis must therefore separate the question of a counterfactual low-disturbance estimate from the question of how colonies actually performed within their observed disturbance histories.</w:t>
-      </w:r>
-    </w:p>
-    <w:p>
-      <w:pPr>
-        <w:pStyle w:val="BodyText"/>
-      </w:pPr>
-      <w:r>
-        <w:t xml:space="preserve">Restoration introduces a third source of heterogeneity. Nursery outplants, colonies re-cemented after fragmentation, direct outplants, and naturally fragmented colonies differ in size, handling, environment, and likely mortality processes</w:t>
+        <w:t xml:space="preserve">, while long-term field monitoring and larval experiments show that different life stages encounter distinct environmental bottlenecks</w:t>
       </w:r>
       <w:r>
         <w:t xml:space="preserve"> </w:t>
@@ -586,12 +683,12 @@
       <w:r>
         <w:t xml:space="preserve">(</w:t>
       </w:r>
-      <w:hyperlink w:anchor="ref-forrester2012">
-        <w:r>
-          <w:rPr>
-            <w:rStyle w:val="Hyperlink"/>
-          </w:rPr>
-          <w:t xml:space="preserve">Forrester et al. 2012</w:t>
+      <w:hyperlink w:anchor="ref-randall2009">
+        <w:r>
+          <w:rPr>
+            <w:rStyle w:val="Hyperlink"/>
+          </w:rPr>
+          <w:t xml:space="preserve">Randall and Szmant 2009</w:t>
         </w:r>
       </w:hyperlink>
       <w:r>
@@ -600,99 +697,19 @@
       <w:r>
         <w:t xml:space="preserve"> </w:t>
       </w:r>
-      <w:hyperlink w:anchor="ref-banister2024">
-        <w:r>
-          <w:rPr>
-            <w:rStyle w:val="Hyperlink"/>
-          </w:rPr>
-          <w:t xml:space="preserve">Banister et al.</w:t>
-        </w:r>
-        <w:r>
-          <w:rPr>
-            <w:rStyle w:val="Hyperlink"/>
-          </w:rPr>
-          <w:t xml:space="preserve"> </w:t>
-        </w:r>
-        <w:r>
-          <w:rPr>
-            <w:rStyle w:val="Hyperlink"/>
-          </w:rPr>
-          <w:t xml:space="preserve">2024</w:t>
-        </w:r>
-      </w:hyperlink>
-      <w:r>
-        <w:t xml:space="preserve">;</w:t>
-      </w:r>
-      <w:r>
-        <w:t xml:space="preserve"> </w:t>
-      </w:r>
-      <w:hyperlink w:anchor="ref-ramosromero2025">
-        <w:r>
-          <w:rPr>
-            <w:rStyle w:val="Hyperlink"/>
-          </w:rPr>
-          <w:t xml:space="preserve">Ramos Romero et al. 2025</w:t>
+      <w:hyperlink w:anchor="ref-rogersmuller2012">
+        <w:r>
+          <w:rPr>
+            <w:rStyle w:val="Hyperlink"/>
+          </w:rPr>
+          <w:t xml:space="preserve">Rogers and Muller 2012</w:t>
         </w:r>
       </w:hyperlink>
       <w:r>
         <w:t xml:space="preserve">)</w:t>
       </w:r>
       <w:r>
-        <w:t xml:space="preserve">. Treating these materials as one</w:t>
-      </w:r>
-      <w:r>
-        <w:t xml:space="preserve"> </w:t>
-      </w:r>
-      <w:r>
-        <w:t xml:space="preserve">“restoration fragment”</w:t>
-      </w:r>
-      <w:r>
-        <w:t xml:space="preserve"> </w:t>
-      </w:r>
-      <w:r>
-        <w:t xml:space="preserve">category can yield a pooled comparison that is statistically convenient but biologically ambiguous. This distinction matters because early survival bottlenecks and later outplant performance need not be governed by the same processes</w:t>
-      </w:r>
-      <w:r>
-        <w:t xml:space="preserve"> </w:t>
-      </w:r>
-      <w:r>
-        <w:t xml:space="preserve">(</w:t>
-      </w:r>
-      <w:hyperlink w:anchor="ref-williams2008">
-        <w:r>
-          <w:rPr>
-            <w:rStyle w:val="Hyperlink"/>
-          </w:rPr>
-          <w:t xml:space="preserve">Williams et al. 2008</w:t>
-        </w:r>
-      </w:hyperlink>
-      <w:r>
-        <w:t xml:space="preserve">;</w:t>
-      </w:r>
-      <w:r>
-        <w:t xml:space="preserve"> </w:t>
-      </w:r>
-      <w:hyperlink w:anchor="ref-williams2023">
-        <w:r>
-          <w:rPr>
-            <w:rStyle w:val="Hyperlink"/>
-          </w:rPr>
-          <w:t xml:space="preserve">Williams et al. 2023</w:t>
-        </w:r>
-      </w:hyperlink>
-      <w:r>
-        <w:t xml:space="preserve">)</w:t>
-      </w:r>
-      <w:r>
-        <w:t xml:space="preserve">.</w:t>
-      </w:r>
-    </w:p>
-    <w:p>
-      <w:pPr>
-        <w:pStyle w:val="BodyText"/>
-      </w:pPr>
-      <w:r>
-        <w:t xml:space="preserve">Here, we synthesized the available longitudinal demographic evidence for</w:t>
+        <w:t xml:space="preserve">. The 2023 marine heatwave, which caused functional extinction of</w:t>
       </w:r>
       <w:r>
         <w:t xml:space="preserve"> </w:t>
@@ -708,7 +725,7 @@
         <w:t xml:space="preserve"> </w:t>
       </w:r>
       <w:r>
-        <w:t xml:space="preserve">across the Caribbean. We asked: (1) how do survival and growth vary with colony size; (2) how common are shrinkage and retrogression among surviving colonies; (3) how do disturbance histories and restoration subtypes change demographic interpretation; and (4) what do these vital rates imply for a recruitment-free post-settlement transition subsystem? We combined individual-level observations from seven studies with summary-level effects from eleven additional studies, standardized colony size to live planar area, and linked the resulting vital rates to a five-class transition model that updates the structure of Vardi et al.</w:t>
+        <w:t xml:space="preserve">in Florida, makes this point especially clear: older demographic records describe an earlier chronic regime, not an enduring environmental baseline</w:t>
       </w:r>
       <w:r>
         <w:t xml:space="preserve"> </w:t>
@@ -716,6 +733,164 @@
       <w:r>
         <w:t xml:space="preserve">(</w:t>
       </w:r>
+      <w:hyperlink w:anchor="ref-manzello2025">
+        <w:r>
+          <w:rPr>
+            <w:rStyle w:val="Hyperlink"/>
+          </w:rPr>
+          <w:t xml:space="preserve">Manzello et al. 2025</w:t>
+        </w:r>
+      </w:hyperlink>
+      <w:r>
+        <w:t xml:space="preserve">)</w:t>
+      </w:r>
+      <w:r>
+        <w:t xml:space="preserve">. A useful synthesis must therefore separate the question of a counterfactual low-disturbance estimate from the question of how colonies actually performed within their observed disturbance histories.</w:t>
+      </w:r>
+    </w:p>
+    <w:p>
+      <w:pPr>
+        <w:pStyle w:val="BodyText"/>
+      </w:pPr>
+      <w:r>
+        <w:t xml:space="preserve">Restoration introduces a third source of heterogeneity. Nursery outplants, colonies re-cemented after fragmentation, direct outplants, and naturally fragmented colonies differ in size, handling, environment, and likely mortality processes</w:t>
+      </w:r>
+      <w:r>
+        <w:t xml:space="preserve"> </w:t>
+      </w:r>
+      <w:r>
+        <w:t xml:space="preserve">(</w:t>
+      </w:r>
+      <w:hyperlink w:anchor="ref-forrester2012">
+        <w:r>
+          <w:rPr>
+            <w:rStyle w:val="Hyperlink"/>
+          </w:rPr>
+          <w:t xml:space="preserve">Forrester et al. 2012</w:t>
+        </w:r>
+      </w:hyperlink>
+      <w:r>
+        <w:t xml:space="preserve">;</w:t>
+      </w:r>
+      <w:r>
+        <w:t xml:space="preserve"> </w:t>
+      </w:r>
+      <w:hyperlink w:anchor="ref-banister2024">
+        <w:r>
+          <w:rPr>
+            <w:rStyle w:val="Hyperlink"/>
+          </w:rPr>
+          <w:t xml:space="preserve">Banister et al.</w:t>
+        </w:r>
+        <w:r>
+          <w:rPr>
+            <w:rStyle w:val="Hyperlink"/>
+          </w:rPr>
+          <w:t xml:space="preserve"> </w:t>
+        </w:r>
+        <w:r>
+          <w:rPr>
+            <w:rStyle w:val="Hyperlink"/>
+          </w:rPr>
+          <w:t xml:space="preserve">2024</w:t>
+        </w:r>
+      </w:hyperlink>
+      <w:r>
+        <w:t xml:space="preserve">;</w:t>
+      </w:r>
+      <w:r>
+        <w:t xml:space="preserve"> </w:t>
+      </w:r>
+      <w:hyperlink w:anchor="ref-ramosromero2025">
+        <w:r>
+          <w:rPr>
+            <w:rStyle w:val="Hyperlink"/>
+          </w:rPr>
+          <w:t xml:space="preserve">Ramos Romero et al. 2025</w:t>
+        </w:r>
+      </w:hyperlink>
+      <w:r>
+        <w:t xml:space="preserve">)</w:t>
+      </w:r>
+      <w:r>
+        <w:t xml:space="preserve">. Treating these materials as one</w:t>
+      </w:r>
+      <w:r>
+        <w:t xml:space="preserve"> </w:t>
+      </w:r>
+      <w:r>
+        <w:t xml:space="preserve">“restoration fragment”</w:t>
+      </w:r>
+      <w:r>
+        <w:t xml:space="preserve"> </w:t>
+      </w:r>
+      <w:r>
+        <w:t xml:space="preserve">category can yield a pooled comparison that is statistically convenient but biologically ambiguous. This distinction matters because early survival bottlenecks and later outplant performance need not be governed by the same processes</w:t>
+      </w:r>
+      <w:r>
+        <w:t xml:space="preserve"> </w:t>
+      </w:r>
+      <w:r>
+        <w:t xml:space="preserve">(</w:t>
+      </w:r>
+      <w:hyperlink w:anchor="ref-williams2008">
+        <w:r>
+          <w:rPr>
+            <w:rStyle w:val="Hyperlink"/>
+          </w:rPr>
+          <w:t xml:space="preserve">Williams et al. 2008</w:t>
+        </w:r>
+      </w:hyperlink>
+      <w:r>
+        <w:t xml:space="preserve">;</w:t>
+      </w:r>
+      <w:r>
+        <w:t xml:space="preserve"> </w:t>
+      </w:r>
+      <w:hyperlink w:anchor="ref-williams2023">
+        <w:r>
+          <w:rPr>
+            <w:rStyle w:val="Hyperlink"/>
+          </w:rPr>
+          <w:t xml:space="preserve">Williams et al. 2023</w:t>
+        </w:r>
+      </w:hyperlink>
+      <w:r>
+        <w:t xml:space="preserve">)</w:t>
+      </w:r>
+      <w:r>
+        <w:t xml:space="preserve">. However, the available evidence has not been synthesized in a way that retains colony size, partial mortality, observed disturbance history, and restoration material subtype while linking those data to post-settlement population dynamics.</w:t>
+      </w:r>
+    </w:p>
+    <w:p>
+      <w:pPr>
+        <w:pStyle w:val="BodyText"/>
+      </w:pPr>
+      <w:r>
+        <w:t xml:space="preserve">Here, we synthesized longitudinal demographic evidence for</w:t>
+      </w:r>
+      <w:r>
+        <w:t xml:space="preserve"> </w:t>
+      </w:r>
+      <w:r>
+        <w:rPr>
+          <w:i/>
+          <w:iCs/>
+        </w:rPr>
+        <w:t xml:space="preserve">A. palmata</w:t>
+      </w:r>
+      <w:r>
+        <w:t xml:space="preserve"> </w:t>
+      </w:r>
+      <w:r>
+        <w:t xml:space="preserve">across the Caribbean. We first combined individual-level observations from seven studies with summary-level effects from eleven additional studies and standardized colony size to live planar area. We then quantified size-dependent survival, growth, shrinkage, retrogression, and variation associated with observed exposure categories and restoration subtypes. Finally, we linked the resulting vital rates to a five-class, recruitment-free transition model that updates the structure of Vardi et al.</w:t>
+      </w:r>
+      <w:r>
+        <w:t xml:space="preserve"> </w:t>
+      </w:r>
+      <w:r>
+        <w:t xml:space="preserve">(</w:t>
+      </w:r>
       <w:hyperlink w:anchor="ref-vardi2012">
         <w:r>
           <w:rPr>
@@ -728,7 +903,7 @@
         <w:t xml:space="preserve">)</w:t>
       </w:r>
       <w:r>
-        <w:t xml:space="preserve">. We expected size to structure both survival and growth, size–survival associations to differ among observed exposure categories, and large-adult persistence to exert disproportionate influence on conditional transition dynamics. Our goal was not to produce a universal Caribbean rate for a heterogeneous species, but to identify the patterns that are robust across the available evidence and the uncertainties that should bound restoration decisions.</w:t>
+        <w:t xml:space="preserve">. We expected size to structure both survival and growth, size–survival associations to differ among observed exposure categories, and large-adult persistence to exert disproportionate influence on conditional transition dynamics. Our goal was not to produce a universal Caribbean rate for a heterogeneous species, but to identify the recurring patterns and uncertainties that should bound restoration decisions.</w:t>
       </w:r>
     </w:p>
     <w:bookmarkEnd w:id="10"/>
@@ -755,7 +930,7 @@
         <w:pStyle w:val="FirstParagraph"/>
       </w:pPr>
       <w:r>
-        <w:t xml:space="preserve">We conducted a systematic compilation of published</w:t>
+        <w:t xml:space="preserve">To synthesize published</w:t>
       </w:r>
       <w:r>
         <w:t xml:space="preserve"> </w:t>
@@ -771,7 +946,7 @@
         <w:t xml:space="preserve"> </w:t>
       </w:r>
       <w:r>
-        <w:t xml:space="preserve">demographic data. The original search was conducted from June through December 2025 and drew on four sources: repositories maintained by NOAA and the US Geological Survey, structured Google Scholar searches, backward and forward citation searching from focal demographic studies, and data shared by restoration practitioners. We then completed an expanded audit in March 2026 using PubMed, Web of Science, Semantic Scholar/Elicit, targeted citation searches, and the project literature library. Search terms combined</w:t>
+        <w:t xml:space="preserve">demographic data, we conducted a systematic literature search and data compilation. From June through December 2025, we searched four sources: repositories maintained by NOAA and the US Geological Survey, structured Google Scholar searches, backward and forward citation searching from focal demographic studies, and data shared by restoration practitioners. In March 2026, we expanded that search through PubMed, Web of Science, Semantic Scholar/Elicit, targeted citation searches, and the project literature library. Search terms combined</w:t>
       </w:r>
       <w:r>
         <w:t xml:space="preserve"> </w:t>
@@ -787,7 +962,7 @@
         <w:t xml:space="preserve"> </w:t>
       </w:r>
       <w:r>
-        <w:t xml:space="preserve">or elkhorn coral with survival, mortality, growth, recruitment, restoration, and long-term monitoring terms. Detailed search strings, screening logic, and study-level exclusions are retained with the project documentation.</w:t>
+        <w:t xml:space="preserve">or elkhorn coral with survival, mortality, growth, recruitment, restoration, and long-term monitoring terms. The project documentation retains the complete search strings, screening logic, and study-level exclusions.</w:t>
       </w:r>
     </w:p>
     <w:p>
@@ -1308,7 +1483,27 @@
         <w:t xml:space="preserve">)</w:t>
       </w:r>
       <w:r>
-        <w:t xml:space="preserve">. We retained each study’s definition rather than imposing a common one, so part of the among-study variation reflects measurement rather than biology.</w:t>
+        <w:t xml:space="preserve">. We retained each study’s definition rather than imposing a common one, so part of the among-study variation reflects measurement rather than biology. Because demographic observations alone cannot identify the sexual versus clonal origin of colonies, they should be interpreted alongside—not as a substitute for—genetic information when the recovery question concerns population persistence</w:t>
+      </w:r>
+      <w:r>
+        <w:t xml:space="preserve"> </w:t>
+      </w:r>
+      <w:r>
+        <w:t xml:space="preserve">(</w:t>
+      </w:r>
+      <w:hyperlink w:anchor="ref-groberdunsmore2007">
+        <w:r>
+          <w:rPr>
+            <w:rStyle w:val="Hyperlink"/>
+          </w:rPr>
+          <w:t xml:space="preserve">Grober-Dunsmore et al. 2007</w:t>
+        </w:r>
+      </w:hyperlink>
+      <w:r>
+        <w:t xml:space="preserve">)</w:t>
+      </w:r>
+      <w:r>
+        <w:t xml:space="preserve">.</w:t>
       </w:r>
     </w:p>
     <w:p>
@@ -1370,7 +1565,7 @@
         <w:pStyle w:val="FirstParagraph"/>
       </w:pPr>
       <w:r>
-        <w:t xml:space="preserve">We retained all intervals in primary analyses because observed storms, disease, bleaching, cold events, and chronic stressors comprise the demographic context experienced by the study populations. We then linked each interval to a curated Caribbean disturbance timeline. The timeline distinguished acute events used in baseline-exclusion sensitivity analyses from chronic or indirect pressures retained as contextual exposure. We independently rebuilt the interval-to-event linkage and summarized it as a study-window audit (Online Resource 1, Table S2). We fitted size-by-disturbance interaction models to natural-colony records, thereby avoiding the confounding of disturbance context with restoration material and handling history.</w:t>
+        <w:t xml:space="preserve">We retained all intervals in primary analyses because observed storms, disease, bleaching, cold events, and chronic stressors comprise the demographic context experienced by the study populations. We linked each monitoring interval to a curated Caribbean disturbance timeline that distinguished acute events used in baseline-exclusion sensitivity analyses from chronic or indirect pressures retained as contextual exposure. We verified the interval-to-event linkage independently and report the resulting study-window summary in Online Resource 1, Table S2. We fitted size-by-disturbance interaction models to natural-colony records, thereby avoiding the confounding of disturbance context with restoration material and handling history.</w:t>
       </w:r>
     </w:p>
     <w:p>
@@ -1408,7 +1603,7 @@
         <w:pStyle w:val="FirstParagraph"/>
       </w:pPr>
       <w:r>
-        <w:t xml:space="preserve">We modeled annual survival as a function of log-transformed colony size using binomial generalized additive models and modeled relative growth rate with Gaussian generalized additive models. These main-figure curves are unadjusted descriptive GAMs; mixed-effect models accounting for study were used as diagnostics and sensitivity analyses rather than as the source of their displayed intervals. We used a pre-specified GAM threshold analysis</w:t>
+        <w:t xml:space="preserve">We modeled annual survival as a function of log-transformed colony size using binomial generalized additive models and modeled relative growth rate with Gaussian generalized additive models. These main-figure curves are unadjusted descriptive GAMs; mixed-effect models accounting for study served as diagnostics and sensitivity analyses rather than as the source of their displayed intervals. We used a pre-specified GAM threshold analysis</w:t>
       </w:r>
       <w:r>
         <w:t xml:space="preserve"> </w:t>
@@ -1431,7 +1626,7 @@
         <w:t xml:space="preserve"> </w:t>
       </w:r>
       <w:r>
-        <w:t xml:space="preserve">to evaluate nonlinear functional form and identify supported inflection points. A threshold was reported only when the GAM outperformed a linear model by at least 2 AICc units, and was located from the derivatives of the fitted curve. We interpreted thresholds as data- and study-composition-dependent features rather than fixed biological boundaries. We assessed model diagnostics and study dependence with the pre-specified verification and leave-one-study-out procedures documented in the project repository.</w:t>
+        <w:t xml:space="preserve">to evaluate nonlinear functional form and identify supported inflection points. We reported a threshold only when the GAM outperformed a linear model by at least 2 AICc units, then located it from derivatives of the fitted curve. We interpreted thresholds as features of the available data and study composition rather than fixed biological boundaries. We evaluated model fit and dependence on individual studies with the project’s verification and leave-one-study-out procedures.</w:t>
       </w:r>
     </w:p>
     <w:p>
@@ -1709,7 +1904,52 @@
         <w:pStyle w:val="FirstParagraph"/>
       </w:pPr>
       <w:r>
-        <w:t xml:space="preserve">All data processing, analysis, figures, and manuscript-facing tables are maintained in the accompanying public repository. The analysis workflow, canonical output inventory, claim-to-output crosswalk, and figure map identify the script and output underlying each main-text claim (Data availability statement below). A versioned archival release will be deposited upon acceptance.</w:t>
+        <w:t xml:space="preserve">We conducted analyses in R 4.5.2 under the project’s locked computational environment; the central workflow uses</w:t>
+      </w:r>
+      <w:r>
+        <w:t xml:space="preserve"> </w:t>
+      </w:r>
+      <w:r>
+        <w:rPr>
+          <w:rStyle w:val="VerbatimChar"/>
+        </w:rPr>
+        <w:t xml:space="preserve">mgcv</w:t>
+      </w:r>
+      <w:r>
+        <w:t xml:space="preserve"> </w:t>
+      </w:r>
+      <w:r>
+        <w:t xml:space="preserve">for generalized additive models,</w:t>
+      </w:r>
+      <w:r>
+        <w:t xml:space="preserve"> </w:t>
+      </w:r>
+      <w:r>
+        <w:rPr>
+          <w:rStyle w:val="VerbatimChar"/>
+        </w:rPr>
+        <w:t xml:space="preserve">metafor</w:t>
+      </w:r>
+      <w:r>
+        <w:t xml:space="preserve"> </w:t>
+      </w:r>
+      <w:r>
+        <w:t xml:space="preserve">for meta-analysis, and</w:t>
+      </w:r>
+      <w:r>
+        <w:t xml:space="preserve"> </w:t>
+      </w:r>
+      <w:r>
+        <w:rPr>
+          <w:rStyle w:val="VerbatimChar"/>
+        </w:rPr>
+        <w:t xml:space="preserve">lme4</w:t>
+      </w:r>
+      <w:r>
+        <w:t xml:space="preserve"> </w:t>
+      </w:r>
+      <w:r>
+        <w:t xml:space="preserve">for mixed-effect diagnostic models. All data processing, analysis scripts, figures, and manuscript-facing tables are maintained in the accompanying public repository. The repository documents the workflow, output inventory, and figure map that connect each main-text result to its generating script and output (Data availability statement below). A versioned archival release will be deposited upon acceptance.</w:t>
       </w:r>
     </w:p>
     <w:bookmarkEnd w:id="15"/>
@@ -1723,13 +1963,13 @@
         <w:t xml:space="preserve">Results</w:t>
       </w:r>
     </w:p>
-    <w:bookmarkStart w:id="17" w:name="Xa3ee855dd0bf9666d1211e07686904df75f0707"/>
+    <w:bookmarkStart w:id="17" w:name="Xffb17af034a8e728377d5805c2bff6c755d5b63"/>
     <w:p>
       <w:pPr>
         <w:pStyle w:val="Heading3"/>
       </w:pPr>
       <w:r>
-        <w:t xml:space="preserve">The available evidence is Caribbean-wide but unevenly distributed</w:t>
+        <w:t xml:space="preserve">Evidence spanned the Caribbean but was geographically uneven</w:t>
       </w:r>
     </w:p>
     <w:p>
@@ -1737,17 +1977,17 @@
         <w:pStyle w:val="FirstParagraph"/>
       </w:pPr>
       <w:r>
-        <w:t xml:space="preserve">The synthesis combined individual-level monitoring with study-level records across 13 Caribbean regions (Fig. 1). Coverage was geographically uneven: the Florida Keys supplied 6,222 observations, more than all other regions combined, whereas several non-Florida regions contributed data from only a subset of size classes. Large adults outside Florida, Curaçao, and Navassa were particularly sparse. This imbalance matters because large colonies have the greatest demographic leverage in the projection model, while the regional settings in which they are best represented do not encompass the full Caribbean range.</w:t>
+        <w:t xml:space="preserve">The synthesis combined individual-level monitoring with study-level records across 13 Caribbean regions (Fig. 1). The Florida Keys supplied 6,222 observations, more than all other regions combined, whereas several non-Florida regions contributed data from only a subset of size classes. Large adults outside Florida, Curaçao, and Navassa were particularly sparse. This imbalance matters because large colonies had the greatest demographic leverage in the projection model, but the regions in which they were best represented did not encompass the full Caribbean range.</w:t>
       </w:r>
     </w:p>
     <w:bookmarkEnd w:id="17"/>
-    <w:bookmarkStart w:id="18" w:name="X3de654a6897e16198f7e69980345ce99dc783a3"/>
+    <w:bookmarkStart w:id="18" w:name="X2191c30e706c5da7bdbc4b67cd0cf2b4ba90f9a"/>
     <w:p>
       <w:pPr>
         <w:pStyle w:val="Heading3"/>
       </w:pPr>
       <w:r>
-        <w:t xml:space="preserve">Survival and growth were nonlinear functions of colony size</w:t>
+        <w:t xml:space="preserve">Colony size structured survival and growth nonlinearly</w:t>
       </w:r>
     </w:p>
     <w:p>
@@ -1767,13 +2007,13 @@
       </w:r>
     </w:p>
     <w:bookmarkEnd w:id="18"/>
-    <w:bookmarkStart w:id="19" w:name="Xd5064d053de423912b99e0f116caac926b13028"/>
+    <w:bookmarkStart w:id="19" w:name="Xbc74a816a9f58856df9aec7e950739f9d730495"/>
     <w:p>
       <w:pPr>
         <w:pStyle w:val="Heading3"/>
       </w:pPr>
       <w:r>
-        <w:t xml:space="preserve">Caribbean-wide survival was heterogeneous</w:t>
+        <w:t xml:space="preserve">Annual survival varied widely among Caribbean studies</w:t>
       </w:r>
     </w:p>
     <w:p>
@@ -1781,7 +2021,30 @@
         <w:pStyle w:val="FirstParagraph"/>
       </w:pPr>
       <w:r>
-        <w:t xml:space="preserve">The expanded synthesis estimated pooled annual survival at 78.7% (95% CI: 70.4–85.1%; 95% prediction interval: 37.4–95.8%) across 17 studies and 22 study-region effects (Fig. 3a). Tier 1 and Tier 2 effects were both annualized before aggregation. Heterogeneity was high (I² = 97.6%; τ² = 0.72, of which 0.29 was between studies and 0.44 within studies), so the pooled value summarizes the assembled evidence rather than a Caribbean-wide constant. No single study moved the independent-effect estimate by more than 2.6 percentage points in leave-one-out analyses, and restricting the synthesis to the 13 studies with the highest methodological-quality scores changed it by less than 1 point. Evidence for small-study asymmetry was mixed: the Egger-type test was not significant for the independent-effect model (</w:t>
+        <w:t xml:space="preserve">The expanded synthesis estimated pooled annual survival at 78.7% (95% CI: 70.4–85.1%; 95% prediction interval: 37.4–95.8%) across 17 studies and 22 study-region effects (Fig. 3a). Tier 1 and Tier 2 effects were both annualized before aggregation. Heterogeneity was high (I² = 97.6%;</w:t>
+      </w:r>
+      <w:r>
+        <w:t xml:space="preserve"> </w:t>
+      </w:r>
+      <m:oMath>
+        <m:sSup>
+          <m:e>
+            <m:r>
+              <m:t>τ</m:t>
+            </m:r>
+          </m:e>
+          <m:sup>
+            <m:r>
+              <m:t>2</m:t>
+            </m:r>
+          </m:sup>
+        </m:sSup>
+      </m:oMath>
+      <w:r>
+        <w:t xml:space="preserve"> </w:t>
+      </w:r>
+      <w:r>
+        <w:t xml:space="preserve">= 0.72, of which 0.29 was between studies and 0.44 within studies), so the pooled value summarizes the assembled evidence rather than a Caribbean-wide constant. No single study moved the independent-effect estimate by more than 2.6 percentage points in leave-one-out analyses, and restricting the synthesis to the 13 studies with the highest methodological-quality scores changed it by less than 1 point. Evidence for small-study asymmetry was mixed: the Egger-type test was not significant for the independent-effect model (</w:t>
       </w:r>
       <w:r>
         <w:rPr>
@@ -1864,13 +2127,13 @@
       </w:r>
     </w:p>
     <w:bookmarkEnd w:id="19"/>
-    <w:bookmarkStart w:id="20" w:name="Xd195730a07184e430c9e1aca0dcbae7b7ee35f0"/>
+    <w:bookmarkStart w:id="20" w:name="Xe7c168ff09160b1b164e04c569880117a24e7fb"/>
     <w:p>
       <w:pPr>
         <w:pStyle w:val="Heading3"/>
       </w:pPr>
       <w:r>
-        <w:t xml:space="preserve">Shrinkage and retrogression were common components of demographic performance</w:t>
+        <w:t xml:space="preserve">Shrinkage and retrogression accompanied colony survival</w:t>
       </w:r>
     </w:p>
     <w:p>
@@ -1882,13 +2145,13 @@
       </w:r>
     </w:p>
     <w:bookmarkEnd w:id="20"/>
-    <w:bookmarkStart w:id="21" w:name="X3e8670df5f5ab485f133de90398649ce8d0d454"/>
+    <w:bookmarkStart w:id="21" w:name="X31e25a3a51a2e2a086a1a081ccd2860357d6f93"/>
     <w:p>
       <w:pPr>
         <w:pStyle w:val="Heading3"/>
       </w:pPr>
       <w:r>
-        <w:t xml:space="preserve">Size–survival associations differed among exposure categories</w:t>
+        <w:t xml:space="preserve">Size–survival associations differed across exposure categories</w:t>
       </w:r>
     </w:p>
     <w:p>
@@ -1896,7 +2159,7 @@
         <w:pStyle w:val="FirstParagraph"/>
       </w:pPr>
       <w:r>
-        <w:t xml:space="preserve">The study-window audit covered 1,072 demographic intervals, 95.1% of which overlapped at least one curated disturbance or chronic-pressure record (Online Resource 1, Table S2). Only 353 of 6,141 natural-colony survival records came from intervals with no curated disturbance, and 193 of those were SC5 colonies. The survival relationship with colony size differed among intervals with no curated disturbance, context-only pressure, and acute baseline-exclusion exposure (likelihood-ratio test,</w:t>
+        <w:t xml:space="preserve">The study-window linkage covered 1,072 demographic intervals, 95.1% of which overlapped at least one curated disturbance or chronic-pressure record (Online Resource 1, Table S2). Only 353 of 6,141 natural-colony survival records came from intervals with no curated disturbance, and 193 of those were SC5 colonies. The survival relationship with colony size differed among intervals with no curated disturbance, context-only pressure, and acute baseline-exclusion exposure (likelihood-ratio test,</w:t>
       </w:r>
       <w:r>
         <w:t xml:space="preserve"> </w:t>
@@ -1993,13 +2256,13 @@
       </w:r>
     </w:p>
     <w:bookmarkEnd w:id="21"/>
-    <w:bookmarkStart w:id="22" w:name="X6ac30dfb32f0d550f2656fa310e92a1bbb5ffbd"/>
+    <w:bookmarkStart w:id="22" w:name="X7f238287742fa18fb45de48ed65cf9d569b8102"/>
     <w:p>
       <w:pPr>
         <w:pStyle w:val="Heading3"/>
       </w:pPr>
       <w:r>
-        <w:t xml:space="preserve">Restoration performance depended on subtype</w:t>
+        <w:t xml:space="preserve">Restoration survival varied among material subtypes</w:t>
       </w:r>
     </w:p>
     <w:p>
@@ -2011,13 +2274,13 @@
       </w:r>
     </w:p>
     <w:bookmarkEnd w:id="22"/>
-    <w:bookmarkStart w:id="23" w:name="X521076fc5bf250362fcd9624379224b68723b84"/>
+    <w:bookmarkStart w:id="23" w:name="X6321192b47eb219af68a80ecc7d2737113bf60d"/>
     <w:p>
       <w:pPr>
         <w:pStyle w:val="Heading3"/>
       </w:pPr>
       <w:r>
-        <w:t xml:space="preserve">Large-adult persistence dominated conditional transition dynamics</w:t>
+        <w:t xml:space="preserve">Large-adult stasis dominated conditional transition dynamics</w:t>
       </w:r>
     </w:p>
     <w:p>
@@ -2049,13 +2312,13 @@
       </w:r>
     </w:p>
     <w:bookmarkEnd w:id="23"/>
-    <w:bookmarkStart w:id="24" w:name="X7ebd0a5d040b16158344b984013688c3b87d306"/>
+    <w:bookmarkStart w:id="24" w:name="X8db1308ec1789a7f8e8f47eeed0ff48fb843777"/>
     <w:p>
       <w:pPr>
         <w:pStyle w:val="Heading3"/>
       </w:pPr>
       <w:r>
-        <w:t xml:space="preserve">Florida-scale heatwaves sharply reduced effective lambda</w:t>
+        <w:t xml:space="preserve">Florida-scale heatwaves reduced effective lambda</w:t>
       </w:r>
     </w:p>
     <w:p>
@@ -2068,7 +2331,7 @@
     </w:p>
     <w:bookmarkEnd w:id="24"/>
     <w:bookmarkEnd w:id="25"/>
-    <w:bookmarkStart w:id="26" w:name="discussion"/>
+    <w:bookmarkStart w:id="29" w:name="discussion"/>
     <w:p>
       <w:pPr>
         <w:pStyle w:val="Heading2"/>
@@ -2098,15 +2361,24 @@
         <w:t xml:space="preserve"> </w:t>
       </w:r>
       <w:r>
-        <w:t xml:space="preserve">demography is structured not only by whether colonies survive, but by how colony size, partial mortality, and disturbance determine the transitions that survivors make. Three conclusions follow. First, survival and growth change nonlinearly with size, with early growth transitions and large-adult persistence playing different demographic roles. Second, shrinkage and retrogression are common enough that a live/dead framing misses a central route by which colonies lose future reproductive and structural value. Third, the heterogeneity among studies is not a nuisance to average away: it defines the limits of any regional estimate and the conditions under which restoration comparisons can be interpreted.</w:t>
-      </w:r>
-    </w:p>
-    <w:p>
-      <w:pPr>
-        <w:pStyle w:val="BodyText"/>
-      </w:pPr>
-      <w:r>
-        <w:t xml:space="preserve">Large colonies carried the greatest leverage for population growth because their stasis had the highest elasticity. This result is consistent with size-structured coral demography, in which large colonies combine higher survival, reproductive potential, and the capacity to produce fragments</w:t>
+        <w:t xml:space="preserve">recovery depends less on a single average survival rate than on the size-dependent transitions that keep colonies alive, intact, and capable of becoming persistent adults. We extend the available demographic evidence in three ways. First, survival and growth change nonlinearly with colony size, so early growth and large-adult persistence make different contributions to the post-settlement subsystem. Second, shrinkage and retrogression are common enough that a live/dead framing misses a principal route by which colonies lose future reproductive and structural value. Third, the heterogeneity among studies is not variation to average away: it defines the conditions under which regional estimates and restoration comparisons can be interpreted.</w:t>
+      </w:r>
+    </w:p>
+    <w:bookmarkStart w:id="26" w:name="Xcbe83bde2807881d3fa62ac46a4900c4d7f612c"/>
+    <w:p>
+      <w:pPr>
+        <w:pStyle w:val="Heading3"/>
+      </w:pPr>
+      <w:r>
+        <w:t xml:space="preserve">Size-dependent transitions determine demographic leverage</w:t>
+      </w:r>
+    </w:p>
+    <w:p>
+      <w:pPr>
+        <w:pStyle w:val="FirstParagraph"/>
+      </w:pPr>
+      <w:r>
+        <w:t xml:space="preserve">Large colonies carried the greatest leverage for population growth because their stasis had the highest elasticity. This pattern is consistent with Lirman’s</w:t>
       </w:r>
       <w:r>
         <w:t xml:space="preserve"> </w:t>
@@ -2119,106 +2391,17 @@
           <w:rPr>
             <w:rStyle w:val="Hyperlink"/>
           </w:rPr>
-          <w:t xml:space="preserve">Lirman 2000</w:t>
-        </w:r>
-      </w:hyperlink>
-      <w:r>
-        <w:t xml:space="preserve">;</w:t>
-      </w:r>
-      <w:r>
-        <w:t xml:space="preserve"> </w:t>
-      </w:r>
-      <w:hyperlink w:anchor="ref-vardi2012">
-        <w:r>
-          <w:rPr>
-            <w:rStyle w:val="Hyperlink"/>
-          </w:rPr>
-          <w:t xml:space="preserve">Vardi et al. 2012</w:t>
-        </w:r>
-      </w:hyperlink>
-      <w:r>
-        <w:t xml:space="preserve">;</w:t>
-      </w:r>
-      <w:r>
-        <w:t xml:space="preserve"> </w:t>
-      </w:r>
-      <w:hyperlink w:anchor="ref-madin2025">
-        <w:r>
-          <w:rPr>
-            <w:rStyle w:val="Hyperlink"/>
-          </w:rPr>
-          <w:t xml:space="preserve">Madin et al. 2025</w:t>
+          <w:t xml:space="preserve">2000</w:t>
         </w:r>
       </w:hyperlink>
       <w:r>
         <w:t xml:space="preserve">)</w:t>
       </w:r>
       <w:r>
-        <w:t xml:space="preserve">. It also matches the earlier Florida matrix, in which stasis of the largest class had the highest elasticity</w:t>
-      </w:r>
-      <w:r>
-        <w:t xml:space="preserve"> </w:t>
-      </w:r>
-      <w:r>
-        <w:t xml:space="preserve">(</w:t>
-      </w:r>
-      <w:hyperlink w:anchor="ref-vardi2012">
-        <w:r>
-          <w:rPr>
-            <w:rStyle w:val="Hyperlink"/>
-          </w:rPr>
-          <w:t xml:space="preserve">Vardi et al. 2012</w:t>
-        </w:r>
-      </w:hyperlink>
-      <w:r>
-        <w:t xml:space="preserve">)</w:t>
-      </w:r>
-      <w:r>
-        <w:t xml:space="preserve">. That matrix drew on the same northern Florida Keys monitoring that dominates our SC5 data, however, so the agreement is expected rather than independent confirmation. However, large colonies were not invulnerable. Tissue loss was frequent even in the largest class, and colonies in every non-recruit class sometimes retrogressed. The implication is not simply that restoration should make colonies larger. Rather, strategies should be evaluated by whether they keep colonies alive and prevent the backward transitions that erode the adult size structure.</w:t>
-      </w:r>
-    </w:p>
-    <w:p>
-      <w:pPr>
-        <w:pStyle w:val="BodyText"/>
-      </w:pPr>
-      <w:r>
-        <w:t xml:space="preserve">The nonlinear growth pattern clarifies why size-based restoration targets cannot be inferred from a single average growth rate. Relative growth changed most rapidly at small sizes, while survival increased across a much larger size range. Those patterns create a demographic tradeoff: retaining corals through early size classes may yield large proportional gains, but maintaining existing adults can contribute more directly to persistence. The exact size thresholds should not be treated as universal biological cutoffs because they varied with the study composition and measurement context. Their value is instead diagnostic: they identify where marginal improvements in growth or survival could have the largest demographic consequences in the current evidence base.</w:t>
-      </w:r>
-    </w:p>
-    <w:p>
-      <w:pPr>
-        <w:pStyle w:val="BodyText"/>
-      </w:pPr>
-      <w:r>
-        <w:t xml:space="preserve">Most intervals in the synthesis overlapped a documented event or chronic pressure, and the size–survival relationship differed among disturbance states. The direction of that difference is the more instructive result. Large colonies survived better in intervals flagged for acute events than in the few intervals with no curated event, which is the opposite of a disturbance penalty. We interpret this as evidence that exposure categories track study, site, and survey period at least as closely as they track realized disturbance intensity: the undisturbed category was small and drawn from a narrow set of studies and years. The disturbance layer therefore does not identify a causal effect of storms, disease, or heat, because the underlying studies were not designed as a common experiment and their event histories differed. The evidence supports a narrower conclusion: transition analyses should retain disturbance history as part of the context in which observed size-dependent rates were generated. The 2023 heatwave makes this boundary especially important. Our chronic-regime matrix is not a forecast under severe contemporary thermal stress; the separate Florida event-pulse scenarios show how quickly its conditional trajectories deteriorate when Florida-scale mortality recurs</w:t>
-      </w:r>
-      <w:r>
-        <w:t xml:space="preserve"> </w:t>
-      </w:r>
-      <w:r>
-        <w:t xml:space="preserve">(</w:t>
-      </w:r>
-      <w:hyperlink w:anchor="ref-manzello2025">
-        <w:r>
-          <w:rPr>
-            <w:rStyle w:val="Hyperlink"/>
-          </w:rPr>
-          <w:t xml:space="preserve">Manzello et al. 2025</w:t>
-        </w:r>
-      </w:hyperlink>
-      <w:r>
-        <w:t xml:space="preserve">)</w:t>
-      </w:r>
-      <w:r>
-        <w:t xml:space="preserve">.</w:t>
-      </w:r>
-    </w:p>
-    <w:p>
-      <w:pPr>
-        <w:pStyle w:val="BodyText"/>
-      </w:pPr>
-      <w:r>
-        <w:t xml:space="preserve">The restoration comparison likewise requires a constrained interpretation. Natural-colony and broad restoration-fragment effects overlapped in the expanded meta-analysis, but the subtype decomposition showed marked variation among nursery outplants, re-cemented colonies, direct outplants, and natural fragments. These materials differ in handling, age, size, substrate, and exposure; the present data do not isolate any one of those mechanisms. However, the result does show that average restoration survival is not a transferable property of a generic fragment. This is an important distinction for programs that use benchmarks from related species or later life stages, such as the first-year survival targets developed for</w:t>
+        <w:t xml:space="preserve"> </w:t>
+      </w:r>
+      <w:r>
+        <w:t xml:space="preserve">demonstration that large</w:t>
       </w:r>
       <w:r>
         <w:t xml:space="preserve"> </w:t>
@@ -2228,7 +2411,13 @@
           <w:i/>
           <w:iCs/>
         </w:rPr>
-        <w:t xml:space="preserve">Acropora cervicornis</w:t>
+        <w:t xml:space="preserve">A. palmata</w:t>
+      </w:r>
+      <w:r>
+        <w:t xml:space="preserve"> </w:t>
+      </w:r>
+      <w:r>
+        <w:t xml:space="preserve">colonies combine persistence, reproduction, and fragment production, and with the northern Florida Keys matrix of Vardi et al.</w:t>
       </w:r>
       <w:r>
         <w:t xml:space="preserve"> </w:t>
@@ -2236,19 +2425,19 @@
       <w:r>
         <w:t xml:space="preserve">(</w:t>
       </w:r>
-      <w:hyperlink w:anchor="ref-schopmeyer2017">
-        <w:r>
-          <w:rPr>
-            <w:rStyle w:val="Hyperlink"/>
-          </w:rPr>
-          <w:t xml:space="preserve">Schopmeyer et al. 2017</w:t>
+      <w:hyperlink w:anchor="ref-vardi2012">
+        <w:r>
+          <w:rPr>
+            <w:rStyle w:val="Hyperlink"/>
+          </w:rPr>
+          <w:t xml:space="preserve">2012</w:t>
         </w:r>
       </w:hyperlink>
       <w:r>
         <w:t xml:space="preserve">)</w:t>
       </w:r>
       <w:r>
-        <w:t xml:space="preserve">. A target that is realistic for established outplants may be inappropriate for the earliest steps of sexual propagation, when survival of settlers and recruits is typically far lower</w:t>
+        <w:t xml:space="preserve">, in which the largest size class also had the highest elasticity. Those matrices are not independent tests: the same northern Florida Keys monitoring dominates our SC5 data. However, our results also show why large colony size cannot be treated as a sufficient restoration endpoint. Tissue loss was frequent even in SC5, and every non-recruit class retrogressed. Grober-Dunsmore et al.</w:t>
       </w:r>
       <w:r>
         <w:t xml:space="preserve"> </w:t>
@@ -2256,33 +2445,48 @@
       <w:r>
         <w:t xml:space="preserve">(</w:t>
       </w:r>
-      <w:hyperlink w:anchor="ref-chamberland2015">
-        <w:r>
-          <w:rPr>
-            <w:rStyle w:val="Hyperlink"/>
-          </w:rPr>
-          <w:t xml:space="preserve">Chamberland et al. 2015</w:t>
-        </w:r>
-      </w:hyperlink>
-      <w:r>
-        <w:t xml:space="preserve">;</w:t>
-      </w:r>
-      <w:r>
-        <w:t xml:space="preserve"> </w:t>
-      </w:r>
-      <w:hyperlink w:anchor="ref-mendozaquiroz2023">
-        <w:r>
-          <w:rPr>
-            <w:rStyle w:val="Hyperlink"/>
-          </w:rPr>
-          <w:t xml:space="preserve">Mendoza Quiroz et al. 2023</w:t>
+      <w:hyperlink w:anchor="ref-groberdunsmore2006">
+        <w:r>
+          <w:rPr>
+            <w:rStyle w:val="Hyperlink"/>
+          </w:rPr>
+          <w:t xml:space="preserve">2006</w:t>
         </w:r>
       </w:hyperlink>
       <w:r>
         <w:t xml:space="preserve">)</w:t>
       </w:r>
       <w:r>
-        <w:t xml:space="preserve">. Monitoring windows compound the problem: 60% of coral restoration projects reported less than 18 months of monitoring</w:t>
+        <w:t xml:space="preserve"> </w:t>
+      </w:r>
+      <w:r>
+        <w:t xml:space="preserve">similarly found that disease and corallivore stress were concentrated on large colonies in St. John. Thus, restoration strategies should be evaluated by whether they maintain live tissue and prevent backward transitions, not simply by whether they produce larger colonies.</w:t>
+      </w:r>
+    </w:p>
+    <w:p>
+      <w:pPr>
+        <w:pStyle w:val="BodyText"/>
+      </w:pPr>
+      <w:r>
+        <w:t xml:space="preserve">The nonlinear growth pattern clarifies why size-based restoration targets cannot be inferred from a single average growth rate. Relative growth changed most rapidly at small sizes, whereas survival increased across a much larger size range. Retaining colonies through early size classes may therefore yield large proportional gains, but maintaining existing adults contributes more directly to persistence in the compiled matrix. The thresholds themselves are not universal biological cutoffs: they vary with study composition and measurement context. Their value is diagnostic. They identify where an intervention that improves growth or survival is most likely to alter the transition structure represented by the current evidence.</w:t>
+      </w:r>
+    </w:p>
+    <w:bookmarkEnd w:id="26"/>
+    <w:bookmarkStart w:id="27" w:name="X3b273719e71271e341538f4adfc3b2a31e2b5d5"/>
+    <w:p>
+      <w:pPr>
+        <w:pStyle w:val="Heading3"/>
+      </w:pPr>
+      <w:r>
+        <w:t xml:space="preserve">Disturbance and restoration context constrain transferability</w:t>
+      </w:r>
+    </w:p>
+    <w:p>
+      <w:pPr>
+        <w:pStyle w:val="FirstParagraph"/>
+      </w:pPr>
+      <w:r>
+        <w:t xml:space="preserve">Disturbance history is part of the demographic regime, but the available studies do not identify a common causal disturbance effect. Most intervals overlapped a documented event or chronic pressure, and large colonies survived better in intervals flagged for acute events than in the few intervals without a curated event. That counterintuitive pattern indicates that the exposure categories track study, site, and survey period at least as closely as they track realized disturbance intensity. The undisturbed category was small and drawn from a narrow set of studies and years. We therefore retain disturbance history as context for the observed transitions rather than interpreting it as a treatment effect. This distinction is consequential under contemporary heat stress: Manzello et al.</w:t>
       </w:r>
       <w:r>
         <w:t xml:space="preserve"> </w:t>
@@ -2290,43 +2494,22 @@
       <w:r>
         <w:t xml:space="preserve">(</w:t>
       </w:r>
-      <w:hyperlink w:anchor="ref-bostromeinarsson2020">
-        <w:r>
-          <w:rPr>
-            <w:rStyle w:val="Hyperlink"/>
-          </w:rPr>
-          <w:t xml:space="preserve">Boström-Einarsson et al. 2020</w:t>
+      <w:hyperlink w:anchor="ref-manzello2025">
+        <w:r>
+          <w:rPr>
+            <w:rStyle w:val="Hyperlink"/>
+          </w:rPr>
+          <w:t xml:space="preserve">2025</w:t>
         </w:r>
       </w:hyperlink>
       <w:r>
         <w:t xml:space="preserve">)</w:t>
       </w:r>
       <w:r>
-        <w:t xml:space="preserve">, too short to observe the adult transitions that carried the most weight in our matrix.</w:t>
-      </w:r>
-    </w:p>
-    <w:p>
-      <w:pPr>
-        <w:pStyle w:val="BodyText"/>
-      </w:pPr>
-      <w:r>
-        <w:t xml:space="preserve">Extreme heterogeneity is the central limitation and the central contribution of this synthesis. The prediction interval spanned most of the probability scale, mortality definitions and monitoring intervals varied among source studies, NOAA monitoring supplied 78% of the individual-level records, and the three-level model showed evidence of small-study asymmetry. Large adults outside a few regions remained poorly represented, even though they had the greatest elasticity. These limitations constrain the precision of absolute regional estimates and the generality of the projected lambda. However, they do not erase the recurring patterns: size dependence, frequent partial mortality, large-adult leverage, and the importance of disturbance and intervention context. By retaining study identity, reporting prediction intervals, and distinguishing material subtypes, the synthesis makes these limitations visible rather than embedding them in an apparently precise pooled rate.</w:t>
-      </w:r>
-    </w:p>
-    <w:p>
-      <w:pPr>
-        <w:pStyle w:val="BodyText"/>
-      </w:pPr>
-      <w:r>
-        <w:t xml:space="preserve">The next empirical priority is therefore not another undifferentiated estimate of average survival. Three gaps limit inference most. (1) Survival and retrogression of large adults outside Florida: SC5 carried 60% of the aggregated survival elasticity but was supported mainly by NOAA monitoring, and excluding that one dataset lowered lambda from 0.961 to 0.882. (2) Early post-outplant survival for defined restoration materials, reported by subtype, size at outplanting, and time since outplanting, so that nursery outplants, re-cemented fragments, and sexual recruits are no longer pooled. (3) Fragmentation and sexual recruitment: fragment production rested on a single study yet contributed about 0.07 to lambda, and sexual recruitment was fixed at zero, so a full Caribbean population model still requires field estimates of both. Across all three, comparable measurements of live area, mortality definition, monitoring interval, colony origin, and disturbance exposure would allow future syntheses to separate biological variation from measurement variation.</w:t>
-      </w:r>
-    </w:p>
-    <w:p>
-      <w:pPr>
-        <w:pStyle w:val="BodyText"/>
-      </w:pPr>
-      <w:r>
-        <w:t xml:space="preserve">Recovery of a foundation species depends on rebuilding the demographic pathways that create durable ecological structure. For</w:t>
+        <w:t xml:space="preserve"> </w:t>
+      </w:r>
+      <w:r>
+        <w:t xml:space="preserve">documented 97.8–100% mortality of</w:t>
       </w:r>
       <w:r>
         <w:t xml:space="preserve"> </w:t>
@@ -2339,11 +2522,397 @@
         <w:t xml:space="preserve">A. palmata</w:t>
       </w:r>
       <w:r>
-        <w:t xml:space="preserve">, that pathway cannot be represented by outplant counts or average survival alone. It is shaped by the size of colonies, the tissue they retain after disturbance, and the environmental and restoration contexts in which they move through the population. A transparent synthesis of those processes provides a defensible starting point for conditional transition analysis and for restoration strategies that seek persistent coral habitat rather than short-lived planting records.</w:t>
-      </w:r>
-    </w:p>
-    <w:bookmarkEnd w:id="26"/>
-    <w:bookmarkStart w:id="27" w:name="acknowledgements"/>
+        <w:t xml:space="preserve"> </w:t>
+      </w:r>
+      <w:r>
+        <w:t xml:space="preserve">in the Florida Keys and Dry Tortugas during the 2023 heatwave. Our chronic-regime matrix is not a forecast under that regime; the event-pulse scenarios instead show how quickly its conditional trajectories deteriorate when Florida-scale mortality recurs.</w:t>
+      </w:r>
+    </w:p>
+    <w:p>
+      <w:pPr>
+        <w:pStyle w:val="BodyText"/>
+      </w:pPr>
+      <w:r>
+        <w:t xml:space="preserve">Restoration survival is not a transferable property of a generic fragment. In the subtype-coded records, nursery outplants, re-cemented nursery outplants, direct outplants, and natural fragments differed markedly in survival, and removing natural fragments lowered the record-weighted mean from 81.2% to 60.0%. This is not evidence that any one material is intrinsically superior: each subtype is entangled with colony size, nursery history, attachment method, substrate, site, and study. It is, however, sufficient evidence to reject a single</w:t>
+      </w:r>
+      <w:r>
+        <w:t xml:space="preserve"> </w:t>
+      </w:r>
+      <w:r>
+        <w:t xml:space="preserve">“restoration survival”</w:t>
+      </w:r>
+      <w:r>
+        <w:t xml:space="preserve"> </w:t>
+      </w:r>
+      <w:r>
+        <w:t xml:space="preserve">benchmark. A project that plants nursery fragments should be compared with other nursery-fragment cohorts of known initial size and time since outplanting, rather than with natural fragments or sexually propagated recruits. Similarly, a re-cementation intervention should be evaluated against broken colonies that were not re-cemented, with live tissue loss and subsequent size-class transition recorded alongside survival. Pausch et al.</w:t>
+      </w:r>
+      <w:r>
+        <w:t xml:space="preserve"> </w:t>
+      </w:r>
+      <w:r>
+        <w:t xml:space="preserve">(</w:t>
+      </w:r>
+      <w:hyperlink w:anchor="ref-pausch2018">
+        <w:r>
+          <w:rPr>
+            <w:rStyle w:val="Hyperlink"/>
+          </w:rPr>
+          <w:t xml:space="preserve">2018</w:t>
+        </w:r>
+      </w:hyperlink>
+      <w:r>
+        <w:t xml:space="preserve">)</w:t>
+      </w:r>
+      <w:r>
+        <w:t xml:space="preserve"> </w:t>
+      </w:r>
+      <w:r>
+        <w:t xml:space="preserve">showed that fragment genotype, habitat, and size can jointly shape</w:t>
+      </w:r>
+      <w:r>
+        <w:t xml:space="preserve"> </w:t>
+      </w:r>
+      <w:r>
+        <w:rPr>
+          <w:i/>
+          <w:iCs/>
+        </w:rPr>
+        <w:t xml:space="preserve">A. palmata</w:t>
+      </w:r>
+      <w:r>
+        <w:t xml:space="preserve"> </w:t>
+      </w:r>
+      <w:r>
+        <w:t xml:space="preserve">outplant performance, and Kuffner et al.</w:t>
+      </w:r>
+      <w:r>
+        <w:t xml:space="preserve"> </w:t>
+      </w:r>
+      <w:r>
+        <w:t xml:space="preserve">(</w:t>
+      </w:r>
+      <w:hyperlink w:anchor="ref-kuffner2020">
+        <w:r>
+          <w:rPr>
+            <w:rStyle w:val="Hyperlink"/>
+          </w:rPr>
+          <w:t xml:space="preserve">2020</w:t>
+        </w:r>
+      </w:hyperlink>
+      <w:r>
+        <w:t xml:space="preserve">)</w:t>
+      </w:r>
+      <w:r>
+        <w:t xml:space="preserve"> </w:t>
+      </w:r>
+      <w:r>
+        <w:t xml:space="preserve">documented recovery of a stepping-stone population through site-specific restoration. Those studies underscore the point: the intervention is a material-by-site combination, not the word</w:t>
+      </w:r>
+      <w:r>
+        <w:t xml:space="preserve"> </w:t>
+      </w:r>
+      <w:r>
+        <w:t xml:space="preserve">“outplant.”</w:t>
+      </w:r>
+    </w:p>
+    <w:p>
+      <w:pPr>
+        <w:pStyle w:val="BodyText"/>
+      </w:pPr>
+      <w:r>
+        <w:t xml:space="preserve">This distinction changes what restoration programs should measure. Each outplant cohort should report its source material, initial live planar area, attachment or re-cementation treatment, site, survey interval, and fate at each resurvey. Fate should include mortality, positive growth, stasis, and retrogression, because a surviving colony that loses tissue can leave the demographic pathway to a persistent adult. The appropriate primary endpoint is therefore not the proportion of colonies alive after a planting campaign. It is the fraction of the cohort that remains in, or advances to, the next relevant size class while retaining live tissue. This endpoint also makes programs comparable without pretending that a 5-cm nursery fragment, a reattached fragment, and a sexual recruit represent the same biological starting state. Schopmeyer et al.</w:t>
+      </w:r>
+      <w:r>
+        <w:t xml:space="preserve"> </w:t>
+      </w:r>
+      <w:r>
+        <w:t xml:space="preserve">(</w:t>
+      </w:r>
+      <w:hyperlink w:anchor="ref-schopmeyer2017">
+        <w:r>
+          <w:rPr>
+            <w:rStyle w:val="Hyperlink"/>
+          </w:rPr>
+          <w:t xml:space="preserve">2017</w:t>
+        </w:r>
+      </w:hyperlink>
+      <w:r>
+        <w:t xml:space="preserve">)</w:t>
+      </w:r>
+      <w:r>
+        <w:t xml:space="preserve"> </w:t>
+      </w:r>
+      <w:r>
+        <w:t xml:space="preserve">developed first-year benchmarks for established</w:t>
+      </w:r>
+      <w:r>
+        <w:t xml:space="preserve"> </w:t>
+      </w:r>
+      <w:r>
+        <w:rPr>
+          <w:i/>
+          <w:iCs/>
+        </w:rPr>
+        <w:t xml:space="preserve">Acropora cervicornis</w:t>
+      </w:r>
+      <w:r>
+        <w:t xml:space="preserve"> </w:t>
+      </w:r>
+      <w:r>
+        <w:t xml:space="preserve">outplants, whereas Chamberland et al.</w:t>
+      </w:r>
+      <w:r>
+        <w:t xml:space="preserve"> </w:t>
+      </w:r>
+      <w:r>
+        <w:t xml:space="preserve">(</w:t>
+      </w:r>
+      <w:hyperlink w:anchor="ref-chamberland2015">
+        <w:r>
+          <w:rPr>
+            <w:rStyle w:val="Hyperlink"/>
+          </w:rPr>
+          <w:t xml:space="preserve">2015</w:t>
+        </w:r>
+      </w:hyperlink>
+      <w:r>
+        <w:t xml:space="preserve">)</w:t>
+      </w:r>
+      <w:r>
+        <w:t xml:space="preserve"> </w:t>
+      </w:r>
+      <w:r>
+        <w:t xml:space="preserve">and Mendoza Quiroz et al.</w:t>
+      </w:r>
+      <w:r>
+        <w:t xml:space="preserve"> </w:t>
+      </w:r>
+      <w:r>
+        <w:t xml:space="preserve">(</w:t>
+      </w:r>
+      <w:hyperlink w:anchor="ref-mendozaquiroz2023">
+        <w:r>
+          <w:rPr>
+            <w:rStyle w:val="Hyperlink"/>
+          </w:rPr>
+          <w:t xml:space="preserve">2023</w:t>
+        </w:r>
+      </w:hyperlink>
+      <w:r>
+        <w:t xml:space="preserve">)</w:t>
+      </w:r>
+      <w:r>
+        <w:t xml:space="preserve"> </w:t>
+      </w:r>
+      <w:r>
+        <w:t xml:space="preserve">documented more stringent bottlenecks during sexual propagation of</w:t>
+      </w:r>
+      <w:r>
+        <w:t xml:space="preserve"> </w:t>
+      </w:r>
+      <w:r>
+        <w:rPr>
+          <w:i/>
+          <w:iCs/>
+        </w:rPr>
+        <w:t xml:space="preserve">A. palmata</w:t>
+      </w:r>
+      <w:r>
+        <w:t xml:space="preserve">. Species, material, and life stage must therefore be retained in the benchmark itself.</w:t>
+      </w:r>
+    </w:p>
+    <w:p>
+      <w:pPr>
+        <w:pStyle w:val="BodyText"/>
+      </w:pPr>
+      <w:r>
+        <w:t xml:space="preserve">The results also separate two restoration objectives that are often combined. Maintaining large existing</w:t>
+      </w:r>
+      <w:r>
+        <w:t xml:space="preserve"> </w:t>
+      </w:r>
+      <w:r>
+        <w:rPr>
+          <w:i/>
+          <w:iCs/>
+        </w:rPr>
+        <w:t xml:space="preserve">A. palmata</w:t>
+      </w:r>
+      <w:r>
+        <w:t xml:space="preserve"> </w:t>
+      </w:r>
+      <w:r>
+        <w:t xml:space="preserve">colonies can have more immediate demographic leverage than increasing the count of small outplants, because large-adult stasis dominated the compiled matrix. That inference supports a complementary investment in retaining live tissue on existing large colonies through disease response, corallivore management where locally justified, physical stabilization after damage, or other site-specific actions that reduce backward transitions. It does not imply that planting small colonies is unimportant. Early size classes are the point at which relative growth changed most rapidly, so improving the transition of a new cohort through those classes remains necessary to build the next generation of adults. The decision is not adults</w:t>
+      </w:r>
+      <w:r>
+        <w:t xml:space="preserve"> </w:t>
+      </w:r>
+      <w:r>
+        <w:rPr>
+          <w:i/>
+          <w:iCs/>
+        </w:rPr>
+        <w:t xml:space="preserve">or</w:t>
+      </w:r>
+      <w:r>
+        <w:t xml:space="preserve"> </w:t>
+      </w:r>
+      <w:r>
+        <w:t xml:space="preserve">recruits; it is whether a limited budget is buying adult tissue retention, passage through early size classes, or both, and whether the program measures the transition each action was intended to improve.</w:t>
+      </w:r>
+    </w:p>
+    <w:p>
+      <w:pPr>
+        <w:pStyle w:val="BodyText"/>
+      </w:pPr>
+      <w:r>
+        <w:t xml:space="preserve">Settlement-based restoration requires an additional, explicit habitat criterion. The synthesis does not estimate settlement probability, but sexual recruits enter the population through a different bottleneck from fragments. Ritson-Williams et al.</w:t>
+      </w:r>
+      <w:r>
+        <w:t xml:space="preserve"> </w:t>
+      </w:r>
+      <w:r>
+        <w:t xml:space="preserve">(</w:t>
+      </w:r>
+      <w:hyperlink w:anchor="ref-ritsonwilliams2013">
+        <w:r>
+          <w:rPr>
+            <w:rStyle w:val="Hyperlink"/>
+          </w:rPr>
+          <w:t xml:space="preserve">2014</w:t>
+        </w:r>
+      </w:hyperlink>
+      <w:r>
+        <w:t xml:space="preserve">;</w:t>
+      </w:r>
+      <w:r>
+        <w:t xml:space="preserve"> </w:t>
+      </w:r>
+      <w:hyperlink w:anchor="ref-ritsonwilliams2020">
+        <w:r>
+          <w:rPr>
+            <w:rStyle w:val="Hyperlink"/>
+          </w:rPr>
+          <w:t xml:space="preserve">2020</w:t>
+        </w:r>
+      </w:hyperlink>
+      <w:r>
+        <w:t xml:space="preserve">)</w:t>
+      </w:r>
+      <w:r>
+        <w:t xml:space="preserve"> </w:t>
+      </w:r>
+      <w:r>
+        <w:t xml:space="preserve">showed that red algae, macroalgae, and cyanobacteria can alter settlement or larval survival. Thus, a sexual-propagation program should not interpret failure after outplanting as a property of the recruit alone; it should record the settlement surface and early benthic context. Conversely, the available data cannot yet identify a universal initial size at which sexual recruits should be transferred or a universal substrate that guarantees success. Those are site-specific comparisons that need to be built into restoration trials, not assumed from a pooled survival estimate.</w:t>
+      </w:r>
+    </w:p>
+    <w:p>
+      <w:pPr>
+        <w:pStyle w:val="BodyText"/>
+      </w:pPr>
+      <w:r>
+        <w:t xml:space="preserve">Extreme heterogeneity is both the central limitation and the central contribution of this synthesis. The prediction interval spanned most of the probability scale, mortality definitions and monitoring intervals varied among source studies, NOAA monitoring supplied 78% of individual-level records, and the three-level model showed evidence of small-study asymmetry. Large adults outside a few regions remained poorly represented even though they had the greatest elasticity. These features limit the precision of regional rates and the generality of projected</w:t>
+      </w:r>
+      <w:r>
+        <w:t xml:space="preserve"> </w:t>
+      </w:r>
+      <m:oMath>
+        <m:r>
+          <m:t>λ</m:t>
+        </m:r>
+      </m:oMath>
+      <w:r>
+        <w:t xml:space="preserve">. However, they do not erase the recurring patterns: size dependence, frequent partial mortality, large-adult leverage, and the importance of disturbance and intervention context. Retaining study identity, prediction intervals, and material subtypes makes those limits visible rather than embedding them in an apparently precise pooled rate.</w:t>
+      </w:r>
+    </w:p>
+    <w:bookmarkEnd w:id="27"/>
+    <w:bookmarkStart w:id="28" w:name="priorities-for-demographic-restoration"/>
+    <w:p>
+      <w:pPr>
+        <w:pStyle w:val="Heading3"/>
+      </w:pPr>
+      <w:r>
+        <w:t xml:space="preserve">Priorities for demographic restoration</w:t>
+      </w:r>
+    </w:p>
+    <w:p>
+      <w:pPr>
+        <w:pStyle w:val="FirstParagraph"/>
+      </w:pPr>
+      <w:r>
+        <w:t xml:space="preserve">The next empirical priority is not another undifferentiated estimate of average survival. Three targeted gaps limit inference. (1) Large-adult survival and retrogression outside Florida: SC5 carried 60% of aggregated survival elasticity but was supported mainly by NOAA monitoring, and excluding that dataset lowered</w:t>
+      </w:r>
+      <w:r>
+        <w:t xml:space="preserve"> </w:t>
+      </w:r>
+      <m:oMath>
+        <m:r>
+          <m:t>λ</m:t>
+        </m:r>
+      </m:oMath>
+      <w:r>
+        <w:t xml:space="preserve"> </w:t>
+      </w:r>
+      <w:r>
+        <w:t xml:space="preserve">from 0.961 to 0.882. (2) Early survival of defined restoration materials, reported by subtype, size at outplanting, and time since outplanting, so that nursery outplants, re-cemented fragments, and sexual recruits are no longer pooled. (3) Fragmentation and sexual recruitment: fragment production rested on one study yet contributed about 0.07 to</w:t>
+      </w:r>
+      <w:r>
+        <w:t xml:space="preserve"> </w:t>
+      </w:r>
+      <m:oMath>
+        <m:r>
+          <m:t>λ</m:t>
+        </m:r>
+      </m:oMath>
+      <w:r>
+        <w:t xml:space="preserve">, whereas sexual recruitment was fixed at zero. Comparable measurements of live area, mortality definition, monitoring interval, colony origin, and disturbance exposure would allow future syntheses to separate biological variation from measurement variation.</w:t>
+      </w:r>
+    </w:p>
+    <w:p>
+      <w:pPr>
+        <w:pStyle w:val="BodyText"/>
+      </w:pPr>
+      <w:r>
+        <w:t xml:space="preserve">Recovery of a foundation species depends on rebuilding the demographic pathways that create durable ecological structure. For</w:t>
+      </w:r>
+      <w:r>
+        <w:t xml:space="preserve"> </w:t>
+      </w:r>
+      <w:r>
+        <w:rPr>
+          <w:i/>
+          <w:iCs/>
+        </w:rPr>
+        <w:t xml:space="preserve">A. palmata</w:t>
+      </w:r>
+      <w:r>
+        <w:t xml:space="preserve">, outplant counts and average survival cannot identify whether restoration produces persistent adults or merely short-lived planting records. Decisions that protect live tissue, retain colonies through damaging events, and evaluate performance by material subtype will be more informative than a single regional benchmark. This is the demographic information needed to connect restoration actions to population outcomes</w:t>
+      </w:r>
+      <w:r>
+        <w:t xml:space="preserve"> </w:t>
+      </w:r>
+      <w:r>
+        <w:t xml:space="preserve">(</w:t>
+      </w:r>
+      <w:hyperlink w:anchor="ref-madin2025">
+        <w:r>
+          <w:rPr>
+            <w:rStyle w:val="Hyperlink"/>
+          </w:rPr>
+          <w:t xml:space="preserve">Madin et al. 2025</w:t>
+        </w:r>
+      </w:hyperlink>
+      <w:r>
+        <w:t xml:space="preserve">)</w:t>
+      </w:r>
+      <w:r>
+        <w:t xml:space="preserve">. As heatwaves and other disturbances continue to reshape Caribbean reefs, demographic synthesis can make those decisions explicit and direct restoration toward persistent coral habitat.</w:t>
+      </w:r>
+    </w:p>
+    <w:bookmarkEnd w:id="28"/>
+    <w:bookmarkEnd w:id="29"/>
+    <w:bookmarkStart w:id="30" w:name="acknowledgements"/>
     <w:p>
       <w:pPr>
         <w:pStyle w:val="Heading2"/>
@@ -2360,8 +2929,8 @@
         <w:t xml:space="preserve">We thank the NOAA Southeast Fisheries Science Center, K. Neely, the US Geological Survey, and FUNDEMAR for sharing monitoring data, and the authors of the published studies whose summaries made this synthesis possible. [Authors to confirm the individuals and programs to acknowledge.]</w:t>
       </w:r>
     </w:p>
-    <w:bookmarkEnd w:id="27"/>
-    <w:bookmarkStart w:id="36" w:name="statements-and-declarations"/>
+    <w:bookmarkEnd w:id="30"/>
+    <w:bookmarkStart w:id="39" w:name="statements-and-declarations"/>
     <w:p>
       <w:pPr>
         <w:pStyle w:val="Heading2"/>
@@ -2370,7 +2939,7 @@
         <w:t xml:space="preserve">Statements and Declarations</w:t>
       </w:r>
     </w:p>
-    <w:bookmarkStart w:id="28" w:name="funding"/>
+    <w:bookmarkStart w:id="31" w:name="funding"/>
     <w:p>
       <w:pPr>
         <w:pStyle w:val="Heading3"/>
@@ -2387,8 +2956,8 @@
         <w:t xml:space="preserve">This work was supported by The Nature Conservancy.</w:t>
       </w:r>
     </w:p>
-    <w:bookmarkEnd w:id="28"/>
-    <w:bookmarkStart w:id="29" w:name="competing-interests"/>
+    <w:bookmarkEnd w:id="31"/>
+    <w:bookmarkStart w:id="32" w:name="competing-interests"/>
     <w:p>
       <w:pPr>
         <w:pStyle w:val="Heading3"/>
@@ -2405,8 +2974,8 @@
         <w:t xml:space="preserve">The authors declare no competing interests.</w:t>
       </w:r>
     </w:p>
-    <w:bookmarkEnd w:id="29"/>
-    <w:bookmarkStart w:id="30" w:name="ethics-approval-and-permits"/>
+    <w:bookmarkEnd w:id="32"/>
+    <w:bookmarkStart w:id="33" w:name="ethics-approval-and-permits"/>
     <w:p>
       <w:pPr>
         <w:pStyle w:val="Heading3"/>
@@ -2435,8 +3004,8 @@
         <w:t xml:space="preserve">field collection requiring ethical approval or permits.</w:t>
       </w:r>
     </w:p>
-    <w:bookmarkEnd w:id="30"/>
-    <w:bookmarkStart w:id="31" w:name="consent-to-participate"/>
+    <w:bookmarkEnd w:id="33"/>
+    <w:bookmarkStart w:id="34" w:name="consent-to-participate"/>
     <w:p>
       <w:pPr>
         <w:pStyle w:val="Heading3"/>
@@ -2453,8 +3022,8 @@
         <w:t xml:space="preserve">Not applicable.</w:t>
       </w:r>
     </w:p>
-    <w:bookmarkEnd w:id="31"/>
-    <w:bookmarkStart w:id="32" w:name="consent-to-publish"/>
+    <w:bookmarkEnd w:id="34"/>
+    <w:bookmarkStart w:id="35" w:name="consent-to-publish"/>
     <w:p>
       <w:pPr>
         <w:pStyle w:val="Heading3"/>
@@ -2471,8 +3040,8 @@
         <w:t xml:space="preserve">Not applicable.</w:t>
       </w:r>
     </w:p>
-    <w:bookmarkEnd w:id="32"/>
-    <w:bookmarkStart w:id="34" w:name="data-availability"/>
+    <w:bookmarkEnd w:id="35"/>
+    <w:bookmarkStart w:id="37" w:name="data-availability"/>
     <w:p>
       <w:pPr>
         <w:pStyle w:val="Heading3"/>
@@ -2491,7 +3060,7 @@
       <w:r>
         <w:t xml:space="preserve"> </w:t>
       </w:r>
-      <w:hyperlink r:id="rId33">
+      <w:hyperlink r:id="rId36">
         <w:r>
           <w:rPr>
             <w:rStyle w:val="Hyperlink"/>
@@ -2509,8 +3078,8 @@
         <w:t xml:space="preserve">archival release will be deposited upon acceptance.</w:t>
       </w:r>
     </w:p>
-    <w:bookmarkEnd w:id="34"/>
-    <w:bookmarkStart w:id="35" w:name="author-contributions"/>
+    <w:bookmarkEnd w:id="37"/>
+    <w:bookmarkStart w:id="38" w:name="author-contributions"/>
     <w:p>
       <w:pPr>
         <w:pStyle w:val="Heading3"/>
@@ -2545,9 +3114,9 @@
         <w:t xml:space="preserve">approved the manuscript.</w:t>
       </w:r>
     </w:p>
-    <w:bookmarkEnd w:id="35"/>
-    <w:bookmarkEnd w:id="36"/>
-    <w:bookmarkStart w:id="37" w:name="online-resources"/>
+    <w:bookmarkEnd w:id="38"/>
+    <w:bookmarkEnd w:id="39"/>
+    <w:bookmarkStart w:id="40" w:name="online-resources"/>
     <w:p>
       <w:pPr>
         <w:pStyle w:val="Heading2"/>
@@ -2587,11 +3156,11 @@
         <w:t xml:space="preserve"> </w:t>
       </w:r>
       <w:r>
-        <w:t xml:space="preserve">demographic synthesis: a table of contributing studies, the study-window disturbance audit, and six supplementary figures. Extended diagnostics and source outputs remain available in the public repository.</w:t>
-      </w:r>
-    </w:p>
-    <w:bookmarkEnd w:id="37"/>
-    <w:bookmarkStart w:id="38" w:name="figure-legends"/>
+        <w:t xml:space="preserve">demographic synthesis: two supporting tables, including a study-window disturbance summary, and six supplementary figures. Extended diagnostics and source outputs remain available in the public repository.</w:t>
+      </w:r>
+    </w:p>
+    <w:bookmarkEnd w:id="40"/>
+    <w:bookmarkStart w:id="41" w:name="figure-legends"/>
     <w:p>
       <w:pPr>
         <w:pStyle w:val="Heading2"/>
@@ -2818,8 +3387,8 @@
         <w:t xml:space="preserve">. (b) Elasticity decomposition by source size class. Stacked bars show stasis, growth, and retrogression; orange points show fragmentation elasticity, which is displayed separately because it is a component of retrogression rather than an additional transition class. (c) Distribution of lambda from 2,000 hierarchical-bootstrap replicates. Orange bars denote replicates with lambda &lt; 1 and blue bars replicates with lambda at least 1; the distribution characterizes uncertainty in the compiled transition rates, not the probability of real-world decline. The dashed line is the deterministic estimate and the solid line marks replacement. (d) Leave-one-study-out lambda estimates. The dashed and dotted lines mark the full-data estimate and replacement, respectively; orange identifies exclusion of the NOAA survey.</w:t>
       </w:r>
     </w:p>
-    <w:bookmarkEnd w:id="38"/>
-    <w:bookmarkStart w:id="51" w:name="figures"/>
+    <w:bookmarkEnd w:id="41"/>
+    <w:bookmarkStart w:id="54" w:name="figures"/>
     <w:p>
       <w:pPr>
         <w:pStyle w:val="Heading2"/>
@@ -2837,18 +3406,18 @@
           <wp:inline>
             <wp:extent cx="5334000" cy="5363849"/>
             <wp:effectExtent b="0" l="0" r="0" t="0"/>
-            <wp:docPr descr="" title="" id="40" name="Picture"/>
+            <wp:docPr descr="" title="" id="43" name="Picture"/>
             <a:graphic>
               <a:graphicData uri="http://schemas.openxmlformats.org/drawingml/2006/picture">
                 <pic:pic>
                   <pic:nvPicPr>
-                    <pic:cNvPr descr="06_analysis/figures/manuscript/Fig1_study_landscape.png" id="41" name="Picture"/>
+                    <pic:cNvPr descr="06_analysis/figures/manuscript/Fig1_study_landscape.png" id="44" name="Picture"/>
                     <pic:cNvPicPr>
                       <a:picLocks noChangeArrowheads="1" noChangeAspect="1"/>
                     </pic:cNvPicPr>
                   </pic:nvPicPr>
                   <pic:blipFill>
-                    <a:blip r:embed="rId39"/>
+                    <a:blip r:embed="rId42"/>
                     <a:stretch>
                       <a:fillRect/>
                     </a:stretch>
@@ -2926,18 +3495,18 @@
           <wp:inline>
             <wp:extent cx="5334000" cy="6743421"/>
             <wp:effectExtent b="0" l="0" r="0" t="0"/>
-            <wp:docPr descr="" title="" id="43" name="Picture"/>
+            <wp:docPr descr="" title="" id="46" name="Picture"/>
             <a:graphic>
               <a:graphicData uri="http://schemas.openxmlformats.org/drawingml/2006/picture">
                 <pic:pic>
                   <pic:nvPicPr>
-                    <pic:cNvPr descr="06_analysis/figures/manuscript/Fig2_demographic_rates.png" id="44" name="Picture"/>
+                    <pic:cNvPr descr="06_analysis/figures/manuscript/Fig2_demographic_rates.png" id="47" name="Picture"/>
                     <pic:cNvPicPr>
                       <a:picLocks noChangeArrowheads="1" noChangeAspect="1"/>
                     </pic:cNvPicPr>
                   </pic:nvPicPr>
                   <pic:blipFill>
-                    <a:blip r:embed="rId42"/>
+                    <a:blip r:embed="rId45"/>
                     <a:stretch>
                       <a:fillRect/>
                     </a:stretch>
@@ -3008,18 +3577,18 @@
           <wp:inline>
             <wp:extent cx="5334000" cy="7051002"/>
             <wp:effectExtent b="0" l="0" r="0" t="0"/>
-            <wp:docPr descr="" title="" id="46" name="Picture"/>
+            <wp:docPr descr="" title="" id="49" name="Picture"/>
             <a:graphic>
               <a:graphicData uri="http://schemas.openxmlformats.org/drawingml/2006/picture">
                 <pic:pic>
                   <pic:nvPicPr>
-                    <pic:cNvPr descr="06_analysis/figures/manuscript/Fig3_caribbean_synthesis.png" id="47" name="Picture"/>
+                    <pic:cNvPr descr="06_analysis/figures/manuscript/Fig3_caribbean_synthesis.png" id="50" name="Picture"/>
                     <pic:cNvPicPr>
                       <a:picLocks noChangeArrowheads="1" noChangeAspect="1"/>
                     </pic:cNvPicPr>
                   </pic:nvPicPr>
                   <pic:blipFill>
-                    <a:blip r:embed="rId45"/>
+                    <a:blip r:embed="rId48"/>
                     <a:stretch>
                       <a:fillRect/>
                     </a:stretch>
@@ -3090,18 +3659,18 @@
           <wp:inline>
             <wp:extent cx="5334000" cy="5516991"/>
             <wp:effectExtent b="0" l="0" r="0" t="0"/>
-            <wp:docPr descr="" title="" id="49" name="Picture"/>
+            <wp:docPr descr="" title="" id="52" name="Picture"/>
             <a:graphic>
               <a:graphicData uri="http://schemas.openxmlformats.org/drawingml/2006/picture">
                 <pic:pic>
                   <pic:nvPicPr>
-                    <pic:cNvPr descr="06_analysis/figures/manuscript/Fig4_population_model.png" id="50" name="Picture"/>
+                    <pic:cNvPr descr="06_analysis/figures/manuscript/Fig4_population_model.png" id="53" name="Picture"/>
                     <pic:cNvPicPr>
                       <a:picLocks noChangeArrowheads="1" noChangeAspect="1"/>
                     </pic:cNvPicPr>
                   </pic:nvPicPr>
                   <pic:blipFill>
-                    <a:blip r:embed="rId48"/>
+                    <a:blip r:embed="rId51"/>
                     <a:stretch>
                       <a:fillRect/>
                     </a:stretch>
@@ -3163,8 +3732,8 @@
         <w:t xml:space="preserve">.</w:t>
       </w:r>
     </w:p>
-    <w:bookmarkEnd w:id="51"/>
-    <w:bookmarkStart w:id="122" w:name="refs"/>
+    <w:bookmarkEnd w:id="54"/>
+    <w:bookmarkStart w:id="140" w:name="refs"/>
     <w:p>
       <w:pPr>
         <w:pStyle w:val="Heading2"/>
@@ -3173,8 +3742,8 @@
         <w:t xml:space="preserve">References</w:t>
       </w:r>
     </w:p>
-    <w:bookmarkStart w:id="121" w:name="refs"/>
-    <w:bookmarkStart w:id="52" w:name="ref-aronsonprecht2001"/>
+    <w:bookmarkStart w:id="139" w:name="refs"/>
+    <w:bookmarkStart w:id="55" w:name="ref-aronsonprecht2001"/>
     <w:p>
       <w:pPr>
         <w:pStyle w:val="Bibliography"/>
@@ -3195,8 +3764,8 @@
         <w:t xml:space="preserve">coral reefs. Hydrobiologia 460:25–38</w:t>
       </w:r>
     </w:p>
-    <w:bookmarkEnd w:id="52"/>
-    <w:bookmarkStart w:id="54" w:name="ref-banister2024"/>
+    <w:bookmarkEnd w:id="55"/>
+    <w:bookmarkStart w:id="57" w:name="ref-banister2024"/>
     <w:p>
       <w:pPr>
         <w:pStyle w:val="Bibliography"/>
@@ -3234,7 +3803,7 @@
       <w:r>
         <w:t xml:space="preserve"> </w:t>
       </w:r>
-      <w:hyperlink r:id="rId53">
+      <w:hyperlink r:id="rId56">
         <w:r>
           <w:rPr>
             <w:rStyle w:val="Hyperlink"/>
@@ -3243,14 +3812,245 @@
         </w:r>
       </w:hyperlink>
     </w:p>
-    <w:bookmarkEnd w:id="54"/>
-    <w:bookmarkStart w:id="56" w:name="ref-bostromeinarsson2020"/>
+    <w:bookmarkEnd w:id="57"/>
+    <w:bookmarkStart w:id="59" w:name="ref-bruckner2001"/>
     <w:p>
       <w:pPr>
         <w:pStyle w:val="Bibliography"/>
       </w:pPr>
       <w:r>
-        <w:t xml:space="preserve">Boström-Einarsson L, Babcock RC, Bayraktarov E, et al (2020) Coral restoration –</w:t>
+        <w:t xml:space="preserve">Bruckner AW, Bruckner RJ (2001) Condition of restored</w:t>
+      </w:r>
+      <w:r>
+        <w:t xml:space="preserve"> </w:t>
+      </w:r>
+      <w:r>
+        <w:t xml:space="preserve">Acropora palmata</w:t>
+      </w:r>
+      <w:r>
+        <w:t xml:space="preserve"> </w:t>
+      </w:r>
+      <w:r>
+        <w:t xml:space="preserve">fragments off</w:t>
+      </w:r>
+      <w:r>
+        <w:t xml:space="preserve"> </w:t>
+      </w:r>
+      <w:r>
+        <w:t xml:space="preserve">Mona Island</w:t>
+      </w:r>
+      <w:r>
+        <w:t xml:space="preserve">,</w:t>
+      </w:r>
+      <w:r>
+        <w:t xml:space="preserve"> </w:t>
+      </w:r>
+      <w:r>
+        <w:t xml:space="preserve">Puerto Rico</w:t>
+      </w:r>
+      <w:r>
+        <w:t xml:space="preserve">, 2 years after the</w:t>
+      </w:r>
+      <w:r>
+        <w:t xml:space="preserve"> </w:t>
+      </w:r>
+      <w:r>
+        <w:t xml:space="preserve">Fortuna Reefer</w:t>
+      </w:r>
+      <w:r>
+        <w:t xml:space="preserve"> </w:t>
+      </w:r>
+      <w:r>
+        <w:t xml:space="preserve">ship grounding. Coral Reefs 20:235–243.</w:t>
+      </w:r>
+      <w:r>
+        <w:t xml:space="preserve"> </w:t>
+      </w:r>
+      <w:hyperlink r:id="rId58">
+        <w:r>
+          <w:rPr>
+            <w:rStyle w:val="Hyperlink"/>
+          </w:rPr>
+          <w:t xml:space="preserve">https://doi.org/10.1007/s003380100164</w:t>
+        </w:r>
+      </w:hyperlink>
+    </w:p>
+    <w:bookmarkEnd w:id="59"/>
+    <w:bookmarkStart w:id="61" w:name="ref-chamberland2015"/>
+    <w:p>
+      <w:pPr>
+        <w:pStyle w:val="Bibliography"/>
+      </w:pPr>
+      <w:r>
+        <w:t xml:space="preserve">Chamberland VF, Vermeij MJA, Brittsan M, et al (2015) Restoration of critically endangered elkhorn coral (</w:t>
+      </w:r>
+      <w:r>
+        <w:t xml:space="preserve">Acropora palmata</w:t>
+      </w:r>
+      <w:r>
+        <w:t xml:space="preserve">) populations using larvae reared from wild-caught gametes. Global Ecology and Conservation 4:526–537.</w:t>
+      </w:r>
+      <w:r>
+        <w:t xml:space="preserve"> </w:t>
+      </w:r>
+      <w:hyperlink r:id="rId60">
+        <w:r>
+          <w:rPr>
+            <w:rStyle w:val="Hyperlink"/>
+          </w:rPr>
+          <w:t xml:space="preserve">https://doi.org/10.1016/j.gecco.2015.10.005</w:t>
+        </w:r>
+      </w:hyperlink>
+    </w:p>
+    <w:bookmarkEnd w:id="61"/>
+    <w:bookmarkStart w:id="63" w:name="ref-detmer2025"/>
+    <w:p>
+      <w:pPr>
+        <w:pStyle w:val="Bibliography"/>
+      </w:pPr>
+      <w:r>
+        <w:t xml:space="preserve">Detmer AR, Ward EJ, Hunsicker ME, et al (2025) Evaluating the robustness of generalized additive models as a tool for threshold detection in variable environments. Ecosphere 16:e70117.</w:t>
+      </w:r>
+      <w:r>
+        <w:t xml:space="preserve"> </w:t>
+      </w:r>
+      <w:hyperlink r:id="rId62">
+        <w:r>
+          <w:rPr>
+            <w:rStyle w:val="Hyperlink"/>
+          </w:rPr>
+          <w:t xml:space="preserve">https://doi.org/10.1002/ecs2.70117</w:t>
+        </w:r>
+      </w:hyperlink>
+    </w:p>
+    <w:bookmarkEnd w:id="63"/>
+    <w:bookmarkStart w:id="65" w:name="ref-edmundsriegl2020"/>
+    <w:p>
+      <w:pPr>
+        <w:pStyle w:val="Bibliography"/>
+      </w:pPr>
+      <w:r>
+        <w:t xml:space="preserve">Edmunds PJ, Riegl B (2020) Urgent need for coral demography in a world where corals are disappearing. Marine Ecology Progress Series 635:233–242.</w:t>
+      </w:r>
+      <w:r>
+        <w:t xml:space="preserve"> </w:t>
+      </w:r>
+      <w:hyperlink r:id="rId64">
+        <w:r>
+          <w:rPr>
+            <w:rStyle w:val="Hyperlink"/>
+          </w:rPr>
+          <w:t xml:space="preserve">https://doi.org/10.3354/meps13205</w:t>
+        </w:r>
+      </w:hyperlink>
+    </w:p>
+    <w:bookmarkEnd w:id="65"/>
+    <w:bookmarkStart w:id="67" w:name="ref-forrester2013"/>
+    <w:p>
+      <w:pPr>
+        <w:pStyle w:val="Bibliography"/>
+      </w:pPr>
+      <w:r>
+        <w:t xml:space="preserve">Forrester GE, Ferguson MA, O’Connell-Rodwell CE, Jarecki LL (2014) Long-term survival and colony growth of</w:t>
+      </w:r>
+      <w:r>
+        <w:t xml:space="preserve"> </w:t>
+      </w:r>
+      <w:r>
+        <w:t xml:space="preserve">Acropora palmata</w:t>
+      </w:r>
+      <w:r>
+        <w:t xml:space="preserve"> </w:t>
+      </w:r>
+      <w:r>
+        <w:t xml:space="preserve">fragments transplanted by volunteers for restoration. Aquatic Conservation: Marine and Freshwater Ecosystems 24:81–91.</w:t>
+      </w:r>
+      <w:r>
+        <w:t xml:space="preserve"> </w:t>
+      </w:r>
+      <w:hyperlink r:id="rId66">
+        <w:r>
+          <w:rPr>
+            <w:rStyle w:val="Hyperlink"/>
+          </w:rPr>
+          <w:t xml:space="preserve">https://doi.org/10.1002/aqc.2374</w:t>
+        </w:r>
+      </w:hyperlink>
+    </w:p>
+    <w:bookmarkEnd w:id="67"/>
+    <w:bookmarkStart w:id="69" w:name="ref-forrester2012"/>
+    <w:p>
+      <w:pPr>
+        <w:pStyle w:val="Bibliography"/>
+      </w:pPr>
+      <w:r>
+        <w:t xml:space="preserve">Forrester GE, Maynard A, Schofield S, Taylor K (2012) Evaluating causes of transplant stress in fragments of</w:t>
+      </w:r>
+      <w:r>
+        <w:t xml:space="preserve"> </w:t>
+      </w:r>
+      <w:r>
+        <w:t xml:space="preserve">Acropora palmata</w:t>
+      </w:r>
+      <w:r>
+        <w:t xml:space="preserve"> </w:t>
+      </w:r>
+      <w:r>
+        <w:t xml:space="preserve">used for coral reef restoration. Bulletin of Marine Science 88:1099–1113.</w:t>
+      </w:r>
+      <w:r>
+        <w:t xml:space="preserve"> </w:t>
+      </w:r>
+      <w:hyperlink r:id="rId68">
+        <w:r>
+          <w:rPr>
+            <w:rStyle w:val="Hyperlink"/>
+          </w:rPr>
+          <w:t xml:space="preserve">https://doi.org/10.5343/bms.2012.1016</w:t>
+        </w:r>
+      </w:hyperlink>
+    </w:p>
+    <w:bookmarkEnd w:id="69"/>
+    <w:bookmarkStart w:id="71" w:name="ref-gardner2003"/>
+    <w:p>
+      <w:pPr>
+        <w:pStyle w:val="Bibliography"/>
+      </w:pPr>
+      <w:r>
+        <w:t xml:space="preserve">Gardner TA, Côté IM, Gill JA, et al (2003) Long-term region-wide declines in</w:t>
+      </w:r>
+      <w:r>
+        <w:t xml:space="preserve"> </w:t>
+      </w:r>
+      <w:r>
+        <w:t xml:space="preserve">Caribbean</w:t>
+      </w:r>
+      <w:r>
+        <w:t xml:space="preserve"> </w:t>
+      </w:r>
+      <w:r>
+        <w:t xml:space="preserve">corals. Science 301:958–960.</w:t>
+      </w:r>
+      <w:r>
+        <w:t xml:space="preserve"> </w:t>
+      </w:r>
+      <w:hyperlink r:id="rId70">
+        <w:r>
+          <w:rPr>
+            <w:rStyle w:val="Hyperlink"/>
+          </w:rPr>
+          <w:t xml:space="preserve">https://doi.org/10.1126/science.1086050</w:t>
+        </w:r>
+      </w:hyperlink>
+    </w:p>
+    <w:bookmarkEnd w:id="71"/>
+    <w:bookmarkStart w:id="73" w:name="ref-garrison2008"/>
+    <w:p>
+      <w:pPr>
+        <w:pStyle w:val="Bibliography"/>
+      </w:pPr>
+      <w:r>
+        <w:t xml:space="preserve">Garrison V, Ward G (2008) Storm-generated coral fragments –</w:t>
       </w:r>
       <w:r>
         <w:t xml:space="preserve"> </w:t>
@@ -3262,28 +4062,28 @@
         <w:t xml:space="preserve"> </w:t>
       </w:r>
       <w:r>
-        <w:t xml:space="preserve">systematic review of current methods, successes, failures and future directions. PLoS ONE 15:e0226631.</w:t>
-      </w:r>
-      <w:r>
-        <w:t xml:space="preserve"> </w:t>
-      </w:r>
-      <w:hyperlink r:id="rId55">
-        <w:r>
-          <w:rPr>
-            <w:rStyle w:val="Hyperlink"/>
-          </w:rPr>
-          <w:t xml:space="preserve">https://doi.org/10.1371/journal.pone.0226631</w:t>
-        </w:r>
-      </w:hyperlink>
-    </w:p>
-    <w:bookmarkEnd w:id="56"/>
-    <w:bookmarkStart w:id="58" w:name="ref-bruckner2001"/>
+        <w:t xml:space="preserve">viable source of transplants for reef rehabilitation. Biological Conservation 141:3089–3100.</w:t>
+      </w:r>
+      <w:r>
+        <w:t xml:space="preserve"> </w:t>
+      </w:r>
+      <w:hyperlink r:id="rId72">
+        <w:r>
+          <w:rPr>
+            <w:rStyle w:val="Hyperlink"/>
+          </w:rPr>
+          <w:t xml:space="preserve">https://doi.org/10.1016/j.biocon.2008.09.020</w:t>
+        </w:r>
+      </w:hyperlink>
+    </w:p>
+    <w:bookmarkEnd w:id="73"/>
+    <w:bookmarkStart w:id="74" w:name="ref-gladfelter1982"/>
     <w:p>
       <w:pPr>
         <w:pStyle w:val="Bibliography"/>
       </w:pPr>
       <w:r>
-        <w:t xml:space="preserve">Bruckner AW, Bruckner RJ (2001) Condition of restored</w:t>
+        <w:t xml:space="preserve">Gladfelter WB (1982) White-band disease in</w:t>
       </w:r>
       <w:r>
         <w:t xml:space="preserve"> </w:t>
@@ -3292,16 +4092,35 @@
         <w:t xml:space="preserve">Acropora palmata</w:t>
       </w:r>
       <w:r>
-        <w:t xml:space="preserve"> </w:t>
-      </w:r>
-      <w:r>
-        <w:t xml:space="preserve">fragments off</w:t>
-      </w:r>
-      <w:r>
-        <w:t xml:space="preserve"> </w:t>
-      </w:r>
-      <w:r>
-        <w:t xml:space="preserve">Mona Island</w:t>
+        <w:t xml:space="preserve">: Implications for the structure and growth of shallow reefs. Bulletin of Marine Science 32:639–643</w:t>
+      </w:r>
+    </w:p>
+    <w:bookmarkEnd w:id="74"/>
+    <w:bookmarkStart w:id="76" w:name="ref-groberdunsmore2006"/>
+    <w:p>
+      <w:pPr>
+        <w:pStyle w:val="Bibliography"/>
+      </w:pPr>
+      <w:r>
+        <w:t xml:space="preserve">Grober-Dunsmore R, Bonito V, Frazer TK (2006) Potential inhibitors to recovery of</w:t>
+      </w:r>
+      <w:r>
+        <w:t xml:space="preserve"> </w:t>
+      </w:r>
+      <w:r>
+        <w:t xml:space="preserve">Acropora palmata</w:t>
+      </w:r>
+      <w:r>
+        <w:t xml:space="preserve"> </w:t>
+      </w:r>
+      <w:r>
+        <w:t xml:space="preserve">populations in</w:t>
+      </w:r>
+      <w:r>
+        <w:t xml:space="preserve"> </w:t>
+      </w:r>
+      <w:r>
+        <w:t xml:space="preserve">St. John</w:t>
       </w:r>
       <w:r>
         <w:t xml:space="preserve">,</w:t>
@@ -3310,112 +4129,112 @@
         <w:t xml:space="preserve"> </w:t>
       </w:r>
       <w:r>
-        <w:t xml:space="preserve">Puerto Rico</w:t>
-      </w:r>
-      <w:r>
-        <w:t xml:space="preserve">, 2 years after the</w:t>
-      </w:r>
-      <w:r>
-        <w:t xml:space="preserve"> </w:t>
-      </w:r>
-      <w:r>
-        <w:t xml:space="preserve">Fortuna Reefer</w:t>
-      </w:r>
-      <w:r>
-        <w:t xml:space="preserve"> </w:t>
-      </w:r>
-      <w:r>
-        <w:t xml:space="preserve">ship grounding. Coral Reefs 20:235–243.</w:t>
-      </w:r>
-      <w:r>
-        <w:t xml:space="preserve"> </w:t>
-      </w:r>
-      <w:hyperlink r:id="rId57">
-        <w:r>
-          <w:rPr>
-            <w:rStyle w:val="Hyperlink"/>
-          </w:rPr>
-          <w:t xml:space="preserve">https://doi.org/10.1007/s003380100164</w:t>
-        </w:r>
-      </w:hyperlink>
-    </w:p>
-    <w:bookmarkEnd w:id="58"/>
-    <w:bookmarkStart w:id="60" w:name="ref-chamberland2015"/>
+        <w:t xml:space="preserve">US Virgin Islands</w:t>
+      </w:r>
+      <w:r>
+        <w:t xml:space="preserve">. Marine Ecology Progress Series 321:123–132.</w:t>
+      </w:r>
+      <w:r>
+        <w:t xml:space="preserve"> </w:t>
+      </w:r>
+      <w:hyperlink r:id="rId75">
+        <w:r>
+          <w:rPr>
+            <w:rStyle w:val="Hyperlink"/>
+          </w:rPr>
+          <w:t xml:space="preserve">https://doi.org/10.3354/meps321123</w:t>
+        </w:r>
+      </w:hyperlink>
+    </w:p>
+    <w:bookmarkEnd w:id="76"/>
+    <w:bookmarkStart w:id="78" w:name="ref-groberdunsmore2007"/>
     <w:p>
       <w:pPr>
         <w:pStyle w:val="Bibliography"/>
       </w:pPr>
       <w:r>
-        <w:t xml:space="preserve">Chamberland VF, Vermeij MJA, Brittsan M, et al (2015) Restoration of critically endangered elkhorn coral (</w:t>
+        <w:t xml:space="preserve">Grober-Dunsmore R, Bonito V, Frazer TK (2007) Discernment of sexual recruits is not critical for assessing population recovery of</w:t>
+      </w:r>
+      <w:r>
+        <w:t xml:space="preserve"> </w:t>
       </w:r>
       <w:r>
         <w:t xml:space="preserve">Acropora palmata</w:t>
       </w:r>
       <w:r>
-        <w:t xml:space="preserve">) populations using larvae reared from wild-caught gametes. Global Ecology and Conservation 4:526–537.</w:t>
-      </w:r>
-      <w:r>
-        <w:t xml:space="preserve"> </w:t>
-      </w:r>
-      <w:hyperlink r:id="rId59">
-        <w:r>
-          <w:rPr>
-            <w:rStyle w:val="Hyperlink"/>
-          </w:rPr>
-          <w:t xml:space="preserve">https://doi.org/10.1016/j.gecco.2015.10.005</w:t>
-        </w:r>
-      </w:hyperlink>
-    </w:p>
-    <w:bookmarkEnd w:id="60"/>
-    <w:bookmarkStart w:id="62" w:name="ref-detmer2025"/>
+        <w:t xml:space="preserve">. Marine Ecology Progress Series 335:233–237.</w:t>
+      </w:r>
+      <w:r>
+        <w:t xml:space="preserve"> </w:t>
+      </w:r>
+      <w:hyperlink r:id="rId77">
+        <w:r>
+          <w:rPr>
+            <w:rStyle w:val="Hyperlink"/>
+          </w:rPr>
+          <w:t xml:space="preserve">https://doi.org/10.3354/meps335233</w:t>
+        </w:r>
+      </w:hyperlink>
+    </w:p>
+    <w:bookmarkEnd w:id="78"/>
+    <w:bookmarkStart w:id="79" w:name="ref-highsmith1982"/>
     <w:p>
       <w:pPr>
         <w:pStyle w:val="Bibliography"/>
       </w:pPr>
       <w:r>
-        <w:t xml:space="preserve">Detmer AR, Ward EJ, Hunsicker ME, et al (2025) Evaluating the robustness of generalized additive models as a tool for threshold detection in variable environments. Ecosphere 16:e70117.</w:t>
-      </w:r>
-      <w:r>
-        <w:t xml:space="preserve"> </w:t>
-      </w:r>
-      <w:hyperlink r:id="rId61">
-        <w:r>
-          <w:rPr>
-            <w:rStyle w:val="Hyperlink"/>
-          </w:rPr>
-          <w:t xml:space="preserve">https://doi.org/10.1002/ecs2.70117</w:t>
-        </w:r>
-      </w:hyperlink>
-    </w:p>
-    <w:bookmarkEnd w:id="62"/>
-    <w:bookmarkStart w:id="64" w:name="ref-edmundsriegl2020"/>
+        <w:t xml:space="preserve">Highsmith RC (1982) Reproduction by fragmentation in corals. Marine Ecology Progress Series 7:207–226</w:t>
+      </w:r>
+    </w:p>
+    <w:bookmarkEnd w:id="79"/>
+    <w:bookmarkStart w:id="80" w:name="ref-hughes1984"/>
     <w:p>
       <w:pPr>
         <w:pStyle w:val="Bibliography"/>
       </w:pPr>
       <w:r>
-        <w:t xml:space="preserve">Edmunds PJ, Riegl B (2020) Urgent need for coral demography in a world where corals are disappearing. Marine Ecology Progress Series 635:233–242.</w:t>
-      </w:r>
-      <w:r>
-        <w:t xml:space="preserve"> </w:t>
-      </w:r>
-      <w:hyperlink r:id="rId63">
-        <w:r>
-          <w:rPr>
-            <w:rStyle w:val="Hyperlink"/>
-          </w:rPr>
-          <w:t xml:space="preserve">https://doi.org/10.3354/meps13205</w:t>
-        </w:r>
-      </w:hyperlink>
-    </w:p>
-    <w:bookmarkEnd w:id="64"/>
-    <w:bookmarkStart w:id="66" w:name="ref-forrester2013"/>
+        <w:t xml:space="preserve">Hughes TP (1984) Population dynamics based on individual size rather than age: A general model with a reef coral example. The American Naturalist 123:778–795</w:t>
+      </w:r>
+    </w:p>
+    <w:bookmarkEnd w:id="80"/>
+    <w:bookmarkStart w:id="81" w:name="ref-hughesjackson1985"/>
     <w:p>
       <w:pPr>
         <w:pStyle w:val="Bibliography"/>
       </w:pPr>
       <w:r>
-        <w:t xml:space="preserve">Forrester GE, Ferguson MA, O’Connell-Rodwell CE, Jarecki LL (2014) Long-term survival and colony growth of</w:t>
+        <w:t xml:space="preserve">Hughes TP, Jackson JBC (1985) Population dynamics and life histories of foliaceous corals. Ecological Monographs 55:141–166</w:t>
+      </w:r>
+    </w:p>
+    <w:bookmarkEnd w:id="81"/>
+    <w:bookmarkStart w:id="83" w:name="ref-knapp2003"/>
+    <w:p>
+      <w:pPr>
+        <w:pStyle w:val="Bibliography"/>
+      </w:pPr>
+      <w:r>
+        <w:t xml:space="preserve">Knapp G, Hartung J (2003) Improved tests for a random effects meta-regression with a single covariate. Statistics in Medicine 22:2693–2710.</w:t>
+      </w:r>
+      <w:r>
+        <w:t xml:space="preserve"> </w:t>
+      </w:r>
+      <w:hyperlink r:id="rId82">
+        <w:r>
+          <w:rPr>
+            <w:rStyle w:val="Hyperlink"/>
+          </w:rPr>
+          <w:t xml:space="preserve">https://doi.org/10.1002/sim.1482</w:t>
+        </w:r>
+      </w:hyperlink>
+    </w:p>
+    <w:bookmarkEnd w:id="83"/>
+    <w:bookmarkStart w:id="85" w:name="ref-kuffner2020"/>
+    <w:p>
+      <w:pPr>
+        <w:pStyle w:val="Bibliography"/>
+      </w:pPr>
+      <w:r>
+        <w:t xml:space="preserve">Kuffner IB, Stathakopoulos A, Toth LT, Bartlett LA (2020) Reestablishing a stepping-stone population of the threatened elkhorn coral</w:t>
       </w:r>
       <w:r>
         <w:t xml:space="preserve"> </w:t>
@@ -3427,28 +4246,28 @@
         <w:t xml:space="preserve"> </w:t>
       </w:r>
       <w:r>
-        <w:t xml:space="preserve">fragments transplanted by volunteers for restoration. Aquatic Conservation: Marine and Freshwater Ecosystems 24:81–91.</w:t>
-      </w:r>
-      <w:r>
-        <w:t xml:space="preserve"> </w:t>
-      </w:r>
-      <w:hyperlink r:id="rId65">
-        <w:r>
-          <w:rPr>
-            <w:rStyle w:val="Hyperlink"/>
-          </w:rPr>
-          <w:t xml:space="preserve">https://doi.org/10.1002/aqc.2374</w:t>
-        </w:r>
-      </w:hyperlink>
-    </w:p>
-    <w:bookmarkEnd w:id="66"/>
-    <w:bookmarkStart w:id="68" w:name="ref-forrester2012"/>
+        <w:t xml:space="preserve">to aid regional recovery. Endangered Species Research 43:461–473.</w:t>
+      </w:r>
+      <w:r>
+        <w:t xml:space="preserve"> </w:t>
+      </w:r>
+      <w:hyperlink r:id="rId84">
+        <w:r>
+          <w:rPr>
+            <w:rStyle w:val="Hyperlink"/>
+          </w:rPr>
+          <w:t xml:space="preserve">https://doi.org/10.3354/esr01083</w:t>
+        </w:r>
+      </w:hyperlink>
+    </w:p>
+    <w:bookmarkEnd w:id="85"/>
+    <w:bookmarkStart w:id="87" w:name="ref-lentz2011"/>
     <w:p>
       <w:pPr>
         <w:pStyle w:val="Bibliography"/>
       </w:pPr>
       <w:r>
-        <w:t xml:space="preserve">Forrester GE, Maynard A, Schofield S, Taylor K (2012) Evaluating causes of transplant stress in fragments of</w:t>
+        <w:t xml:space="preserve">Lentz JA, Blackburn JK, Curtis AJ (2011) Evaluating patterns of a white-band disease outbreak in</w:t>
       </w:r>
       <w:r>
         <w:t xml:space="preserve"> </w:t>
@@ -3460,28 +4279,192 @@
         <w:t xml:space="preserve"> </w:t>
       </w:r>
       <w:r>
-        <w:t xml:space="preserve">used for coral reef restoration. Bulletin of Marine Science 88:1099–1113.</w:t>
-      </w:r>
-      <w:r>
-        <w:t xml:space="preserve"> </w:t>
-      </w:r>
-      <w:hyperlink r:id="rId67">
-        <w:r>
-          <w:rPr>
-            <w:rStyle w:val="Hyperlink"/>
-          </w:rPr>
-          <w:t xml:space="preserve">https://doi.org/10.5343/bms.2012.1016</w:t>
-        </w:r>
-      </w:hyperlink>
-    </w:p>
-    <w:bookmarkEnd w:id="68"/>
-    <w:bookmarkStart w:id="70" w:name="ref-gardner2003"/>
+        <w:t xml:space="preserve">using spatial analysis:</w:t>
+      </w:r>
+      <w:r>
+        <w:t xml:space="preserve"> </w:t>
+      </w:r>
+      <w:r>
+        <w:t xml:space="preserve">A</w:t>
+      </w:r>
+      <w:r>
+        <w:t xml:space="preserve"> </w:t>
+      </w:r>
+      <w:r>
+        <w:t xml:space="preserve">comparison of transect and colony clustering. PLoS ONE 6:e21830.</w:t>
+      </w:r>
+      <w:r>
+        <w:t xml:space="preserve"> </w:t>
+      </w:r>
+      <w:hyperlink r:id="rId86">
+        <w:r>
+          <w:rPr>
+            <w:rStyle w:val="Hyperlink"/>
+          </w:rPr>
+          <w:t xml:space="preserve">https://doi.org/10.1371/journal.pone.0021830</w:t>
+        </w:r>
+      </w:hyperlink>
+    </w:p>
+    <w:bookmarkEnd w:id="87"/>
+    <w:bookmarkStart w:id="88" w:name="ref-lirman2000"/>
     <w:p>
       <w:pPr>
         <w:pStyle w:val="Bibliography"/>
       </w:pPr>
       <w:r>
-        <w:t xml:space="preserve">Gardner TA, Côté IM, Gill JA, et al (2003) Long-term region-wide declines in</w:t>
+        <w:t xml:space="preserve">Lirman D (2000) Fragmentation in the branching coral</w:t>
+      </w:r>
+      <w:r>
+        <w:t xml:space="preserve"> </w:t>
+      </w:r>
+      <w:r>
+        <w:t xml:space="preserve">Acropora palmata</w:t>
+      </w:r>
+      <w:r>
+        <w:t xml:space="preserve"> </w:t>
+      </w:r>
+      <w:r>
+        <w:t xml:space="preserve">(</w:t>
+      </w:r>
+      <w:r>
+        <w:t xml:space="preserve">Lamarck</w:t>
+      </w:r>
+      <w:r>
+        <w:t xml:space="preserve">): Growth, survivorship, and reproduction of colonies and fragments. Journal of Experimental Marine Biology and Ecology 251:41–57</w:t>
+      </w:r>
+    </w:p>
+    <w:bookmarkEnd w:id="88"/>
+    <w:bookmarkStart w:id="90" w:name="ref-lirman2003"/>
+    <w:p>
+      <w:pPr>
+        <w:pStyle w:val="Bibliography"/>
+      </w:pPr>
+      <w:r>
+        <w:t xml:space="preserve">Lirman D (2003) A simulation model of the population dynamics of the branching coral</w:t>
+      </w:r>
+      <w:r>
+        <w:t xml:space="preserve"> </w:t>
+      </w:r>
+      <w:r>
+        <w:t xml:space="preserve">Acropora palmata</w:t>
+      </w:r>
+      <w:r>
+        <w:t xml:space="preserve">: Effects of storm intensity and frequency. Ecological Modelling 161:169–182.</w:t>
+      </w:r>
+      <w:r>
+        <w:t xml:space="preserve"> </w:t>
+      </w:r>
+      <w:hyperlink r:id="rId89">
+        <w:r>
+          <w:rPr>
+            <w:rStyle w:val="Hyperlink"/>
+          </w:rPr>
+          <w:t xml:space="preserve">https://doi.org/10.1016/S0304-3800(02)00346-0</w:t>
+        </w:r>
+      </w:hyperlink>
+    </w:p>
+    <w:bookmarkEnd w:id="90"/>
+    <w:bookmarkStart w:id="91" w:name="ref-lirman1997"/>
+    <w:p>
+      <w:pPr>
+        <w:pStyle w:val="Bibliography"/>
+      </w:pPr>
+      <w:r>
+        <w:t xml:space="preserve">Lirman D, Fong P (1997) Patterns of damage to the branching coral</w:t>
+      </w:r>
+      <w:r>
+        <w:t xml:space="preserve"> </w:t>
+      </w:r>
+      <w:r>
+        <w:t xml:space="preserve">Acropora palmata</w:t>
+      </w:r>
+      <w:r>
+        <w:t xml:space="preserve"> </w:t>
+      </w:r>
+      <w:r>
+        <w:t xml:space="preserve">following</w:t>
+      </w:r>
+      <w:r>
+        <w:t xml:space="preserve"> </w:t>
+      </w:r>
+      <w:r>
+        <w:t xml:space="preserve">Hurricane Andrew</w:t>
+      </w:r>
+      <w:r>
+        <w:t xml:space="preserve">: Damage and survivorship of hurricane-generated asexual recruits. Journal of Coastal Research 13:67–72</w:t>
+      </w:r>
+    </w:p>
+    <w:bookmarkEnd w:id="91"/>
+    <w:bookmarkStart w:id="93" w:name="ref-madin2020"/>
+    <w:p>
+      <w:pPr>
+        <w:pStyle w:val="Bibliography"/>
+      </w:pPr>
+      <w:r>
+        <w:t xml:space="preserve">Madin JS, Baird AH, Baskett ML, et al (2020) Partitioning colony size variation into growth and partial mortality. Biology Letters 16:20190727.</w:t>
+      </w:r>
+      <w:r>
+        <w:t xml:space="preserve"> </w:t>
+      </w:r>
+      <w:hyperlink r:id="rId92">
+        <w:r>
+          <w:rPr>
+            <w:rStyle w:val="Hyperlink"/>
+          </w:rPr>
+          <w:t xml:space="preserve">https://doi.org/10.1098/rsbl.2019.0727</w:t>
+        </w:r>
+      </w:hyperlink>
+    </w:p>
+    <w:bookmarkEnd w:id="93"/>
+    <w:bookmarkStart w:id="95" w:name="ref-madin2014"/>
+    <w:p>
+      <w:pPr>
+        <w:pStyle w:val="Bibliography"/>
+      </w:pPr>
+      <w:r>
+        <w:t xml:space="preserve">Madin JS, Baird AH, Dornelas M, Connolly SR (2014) Mechanical vulnerability explains size-dependent mortality of reef corals. Ecology Letters 17:1008–1015.</w:t>
+      </w:r>
+      <w:r>
+        <w:t xml:space="preserve"> </w:t>
+      </w:r>
+      <w:hyperlink r:id="rId94">
+        <w:r>
+          <w:rPr>
+            <w:rStyle w:val="Hyperlink"/>
+          </w:rPr>
+          <w:t xml:space="preserve">https://doi.org/10.1111/ele.12306</w:t>
+        </w:r>
+      </w:hyperlink>
+    </w:p>
+    <w:bookmarkEnd w:id="95"/>
+    <w:bookmarkStart w:id="97" w:name="ref-madin2025"/>
+    <w:p>
+      <w:pPr>
+        <w:pStyle w:val="Bibliography"/>
+      </w:pPr>
+      <w:r>
+        <w:t xml:space="preserve">Madin JS, Oliver T, McWilliam M, et al (2025)</w:t>
+      </w:r>
+      <w:r>
+        <w:t xml:space="preserve"> </w:t>
+      </w:r>
+      <w:hyperlink r:id="rId96">
+        <w:r>
+          <w:rPr>
+            <w:rStyle w:val="Hyperlink"/>
+          </w:rPr>
+          <w:t xml:space="preserve">Demographic insights for coral restoration</w:t>
+        </w:r>
+      </w:hyperlink>
+    </w:p>
+    <w:bookmarkEnd w:id="97"/>
+    <w:bookmarkStart w:id="99" w:name="ref-manzello2025"/>
+    <w:p>
+      <w:pPr>
+        <w:pStyle w:val="Bibliography"/>
+      </w:pPr>
+      <w:r>
+        <w:t xml:space="preserve">Manzello DP, Cunning R, Karp RF, et al (2025) Heat-driven functional extinction of</w:t>
       </w:r>
       <w:r>
         <w:t xml:space="preserve"> </w:t>
@@ -3493,112 +4476,248 @@
         <w:t xml:space="preserve"> </w:t>
       </w:r>
       <w:r>
-        <w:t xml:space="preserve">corals. Science 301:958–960.</w:t>
-      </w:r>
-      <w:r>
-        <w:t xml:space="preserve"> </w:t>
-      </w:r>
-      <w:hyperlink r:id="rId69">
-        <w:r>
-          <w:rPr>
-            <w:rStyle w:val="Hyperlink"/>
-          </w:rPr>
-          <w:t xml:space="preserve">https://doi.org/10.1126/science.1086050</w:t>
-        </w:r>
-      </w:hyperlink>
-    </w:p>
-    <w:bookmarkEnd w:id="70"/>
-    <w:bookmarkStart w:id="72" w:name="ref-garrison2008"/>
+        <w:t xml:space="preserve">Acropora</w:t>
+      </w:r>
+      <w:r>
+        <w:t xml:space="preserve"> </w:t>
+      </w:r>
+      <w:r>
+        <w:t xml:space="preserve">corals from</w:t>
+      </w:r>
+      <w:r>
+        <w:t xml:space="preserve"> </w:t>
+      </w:r>
+      <w:r>
+        <w:t xml:space="preserve">Florida</w:t>
+      </w:r>
+      <w:r>
+        <w:t xml:space="preserve">’s</w:t>
+      </w:r>
+      <w:r>
+        <w:t xml:space="preserve"> </w:t>
+      </w:r>
+      <w:r>
+        <w:t xml:space="preserve">Coral Reef</w:t>
+      </w:r>
+      <w:r>
+        <w:t xml:space="preserve">. Science 390:361–366.</w:t>
+      </w:r>
+      <w:r>
+        <w:t xml:space="preserve"> </w:t>
+      </w:r>
+      <w:hyperlink r:id="rId98">
+        <w:r>
+          <w:rPr>
+            <w:rStyle w:val="Hyperlink"/>
+          </w:rPr>
+          <w:t xml:space="preserve">https://doi.org/10.1126/science.adx7825</w:t>
+        </w:r>
+      </w:hyperlink>
+    </w:p>
+    <w:bookmarkEnd w:id="99"/>
+    <w:bookmarkStart w:id="101" w:name="ref-maurer2022"/>
     <w:p>
       <w:pPr>
         <w:pStyle w:val="Bibliography"/>
       </w:pPr>
       <w:r>
-        <w:t xml:space="preserve">Garrison V, Ward G (2008) Storm-generated coral fragments –</w:t>
-      </w:r>
-      <w:r>
-        <w:t xml:space="preserve"> </w:t>
-      </w:r>
-      <w:r>
-        <w:t xml:space="preserve">A</w:t>
-      </w:r>
-      <w:r>
-        <w:t xml:space="preserve"> </w:t>
-      </w:r>
-      <w:r>
-        <w:t xml:space="preserve">viable source of transplants for reef rehabilitation. Biological Conservation 141:3089–3100.</w:t>
-      </w:r>
-      <w:r>
-        <w:t xml:space="preserve"> </w:t>
-      </w:r>
-      <w:hyperlink r:id="rId71">
-        <w:r>
-          <w:rPr>
-            <w:rStyle w:val="Hyperlink"/>
-          </w:rPr>
-          <w:t xml:space="preserve">https://doi.org/10.1016/j.biocon.2008.09.020</w:t>
-        </w:r>
-      </w:hyperlink>
-    </w:p>
-    <w:bookmarkEnd w:id="72"/>
-    <w:bookmarkStart w:id="73" w:name="ref-highsmith1982"/>
+        <w:t xml:space="preserve">Maurer L, Puishys L, Ho NKP, et al (2022)</w:t>
+      </w:r>
+      <w:r>
+        <w:t xml:space="preserve"> </w:t>
+      </w:r>
+      <w:r>
+        <w:t xml:space="preserve">Acropora cervicornis</w:t>
+      </w:r>
+      <w:r>
+        <w:t xml:space="preserve"> </w:t>
+      </w:r>
+      <w:r>
+        <w:t xml:space="preserve">and</w:t>
+      </w:r>
+      <w:r>
+        <w:t xml:space="preserve"> </w:t>
+      </w:r>
+      <w:r>
+        <w:t xml:space="preserve">Acropora palmata</w:t>
+      </w:r>
+      <w:r>
+        <w:t xml:space="preserve"> </w:t>
+      </w:r>
+      <w:r>
+        <w:t xml:space="preserve">cultured on a low maintenance line nursery design in</w:t>
+      </w:r>
+      <w:r>
+        <w:t xml:space="preserve"> </w:t>
+      </w:r>
+      <w:r>
+        <w:t xml:space="preserve">The Bahamas</w:t>
+      </w:r>
+      <w:r>
+        <w:t xml:space="preserve">. PLoS ONE 17:e0267034.</w:t>
+      </w:r>
+      <w:r>
+        <w:t xml:space="preserve"> </w:t>
+      </w:r>
+      <w:hyperlink r:id="rId100">
+        <w:r>
+          <w:rPr>
+            <w:rStyle w:val="Hyperlink"/>
+          </w:rPr>
+          <w:t xml:space="preserve">https://doi.org/10.1371/journal.pone.0267034</w:t>
+        </w:r>
+      </w:hyperlink>
+    </w:p>
+    <w:bookmarkEnd w:id="101"/>
+    <w:bookmarkStart w:id="103" w:name="ref-mendozaquiroz2023"/>
     <w:p>
       <w:pPr>
         <w:pStyle w:val="Bibliography"/>
       </w:pPr>
       <w:r>
-        <w:t xml:space="preserve">Highsmith RC (1982) Reproduction by fragmentation in corals. Marine Ecology Progress Series 7:207–226</w:t>
-      </w:r>
-    </w:p>
-    <w:bookmarkEnd w:id="73"/>
-    <w:bookmarkStart w:id="74" w:name="ref-hughes1984"/>
+        <w:t xml:space="preserve">Mendoza Quiroz S, Beltrán-Torres AU, Grosso-Becerra MV, et al (2023) Long-term survival, growth, and reproduction of</w:t>
+      </w:r>
+      <w:r>
+        <w:t xml:space="preserve"> </w:t>
+      </w:r>
+      <w:r>
+        <w:t xml:space="preserve">Acropora palmata</w:t>
+      </w:r>
+      <w:r>
+        <w:t xml:space="preserve"> </w:t>
+      </w:r>
+      <w:r>
+        <w:t xml:space="preserve">sexual recruits outplanted onto</w:t>
+      </w:r>
+      <w:r>
+        <w:t xml:space="preserve"> </w:t>
+      </w:r>
+      <w:r>
+        <w:t xml:space="preserve">Mexican Caribbean</w:t>
+      </w:r>
+      <w:r>
+        <w:t xml:space="preserve"> </w:t>
+      </w:r>
+      <w:r>
+        <w:t xml:space="preserve">reefs. PeerJ 11:e15813.</w:t>
+      </w:r>
+      <w:r>
+        <w:t xml:space="preserve"> </w:t>
+      </w:r>
+      <w:hyperlink r:id="rId102">
+        <w:r>
+          <w:rPr>
+            <w:rStyle w:val="Hyperlink"/>
+          </w:rPr>
+          <w:t xml:space="preserve">https://doi.org/10.7717/peerj.15813</w:t>
+        </w:r>
+      </w:hyperlink>
+    </w:p>
+    <w:bookmarkEnd w:id="103"/>
+    <w:bookmarkStart w:id="105" w:name="ref-neely2022"/>
     <w:p>
       <w:pPr>
         <w:pStyle w:val="Bibliography"/>
       </w:pPr>
       <w:r>
-        <w:t xml:space="preserve">Hughes TP (1984) Population dynamics based on individual size rather than age: A general model with a reef coral example. The American Naturalist 123:778–795</w:t>
-      </w:r>
-    </w:p>
-    <w:bookmarkEnd w:id="74"/>
-    <w:bookmarkStart w:id="75" w:name="ref-hughesjackson1985"/>
+        <w:t xml:space="preserve">Neely KL, Macaulay KA, Lunz KS (2022) Population trajectory and stressors of</w:t>
+      </w:r>
+      <w:r>
+        <w:t xml:space="preserve"> </w:t>
+      </w:r>
+      <w:r>
+        <w:t xml:space="preserve">Acropora palmata</w:t>
+      </w:r>
+      <w:r>
+        <w:t xml:space="preserve"> </w:t>
+      </w:r>
+      <w:r>
+        <w:t xml:space="preserve">sites in the</w:t>
+      </w:r>
+      <w:r>
+        <w:t xml:space="preserve"> </w:t>
+      </w:r>
+      <w:r>
+        <w:t xml:space="preserve">Florida Keys</w:t>
+      </w:r>
+      <w:r>
+        <w:t xml:space="preserve">. Frontiers in Marine Science 9:978785.</w:t>
+      </w:r>
+      <w:r>
+        <w:t xml:space="preserve"> </w:t>
+      </w:r>
+      <w:hyperlink r:id="rId104">
+        <w:r>
+          <w:rPr>
+            <w:rStyle w:val="Hyperlink"/>
+          </w:rPr>
+          <w:t xml:space="preserve">https://doi.org/10.3389/fmars.2022.978785</w:t>
+        </w:r>
+      </w:hyperlink>
+    </w:p>
+    <w:bookmarkEnd w:id="105"/>
+    <w:bookmarkStart w:id="106" w:name="ref-ortizprosper2005"/>
     <w:p>
       <w:pPr>
         <w:pStyle w:val="Bibliography"/>
       </w:pPr>
       <w:r>
-        <w:t xml:space="preserve">Hughes TP, Jackson JBC (1985) Population dynamics and life histories of foliaceous corals. Ecological Monographs 55:141–166</w:t>
-      </w:r>
-    </w:p>
-    <w:bookmarkEnd w:id="75"/>
-    <w:bookmarkStart w:id="77" w:name="ref-knapp2003"/>
+        <w:t xml:space="preserve">Ortiz Prosper AL (2005) Population dynamics of hurricane-generated fragments of elkhorn coral</w:t>
+      </w:r>
+      <w:r>
+        <w:t xml:space="preserve"> </w:t>
+      </w:r>
+      <w:r>
+        <w:t xml:space="preserve">Acropora palmata</w:t>
+      </w:r>
+      <w:r>
+        <w:t xml:space="preserve"> </w:t>
+      </w:r>
+      <w:r>
+        <w:t xml:space="preserve">(</w:t>
+      </w:r>
+      <w:r>
+        <w:t xml:space="preserve">Lamarck</w:t>
+      </w:r>
+      <w:r>
+        <w:t xml:space="preserve">, 1816). {PhD} dissertation, University of Puerto Rico, Mayag</w:t>
+      </w:r>
+      <w:r>
+        <w:t xml:space="preserve">ü</w:t>
+      </w:r>
+      <w:r>
+        <w:t xml:space="preserve">ez</w:t>
+      </w:r>
+    </w:p>
+    <w:bookmarkEnd w:id="106"/>
+    <w:bookmarkStart w:id="108" w:name="ref-pausch2018"/>
     <w:p>
       <w:pPr>
         <w:pStyle w:val="Bibliography"/>
       </w:pPr>
       <w:r>
-        <w:t xml:space="preserve">Knapp G, Hartung J (2003) Improved tests for a random effects meta-regression with a single covariate. Statistics in Medicine 22:2693–2710.</w:t>
-      </w:r>
-      <w:r>
-        <w:t xml:space="preserve"> </w:t>
-      </w:r>
-      <w:hyperlink r:id="rId76">
-        <w:r>
-          <w:rPr>
-            <w:rStyle w:val="Hyperlink"/>
-          </w:rPr>
-          <w:t xml:space="preserve">https://doi.org/10.1002/sim.1482</w:t>
-        </w:r>
-      </w:hyperlink>
-    </w:p>
-    <w:bookmarkEnd w:id="77"/>
-    <w:bookmarkStart w:id="79" w:name="ref-kuffner2020"/>
+        <w:t xml:space="preserve">Pausch RE, Williams DE, Miller MW (2018) Impacts of fragment genotype, habitat, and size on outplanted elkhorn coral success under thermal stress. Marine Ecology Progress Series 592:109–117.</w:t>
+      </w:r>
+      <w:r>
+        <w:t xml:space="preserve"> </w:t>
+      </w:r>
+      <w:hyperlink r:id="rId107">
+        <w:r>
+          <w:rPr>
+            <w:rStyle w:val="Hyperlink"/>
+          </w:rPr>
+          <w:t xml:space="preserve">https://doi.org/10.3354/meps12488</w:t>
+        </w:r>
+      </w:hyperlink>
+    </w:p>
+    <w:bookmarkEnd w:id="108"/>
+    <w:bookmarkStart w:id="110" w:name="ref-pinongonzalez2018"/>
     <w:p>
       <w:pPr>
         <w:pStyle w:val="Bibliography"/>
       </w:pPr>
       <w:r>
-        <w:t xml:space="preserve">Kuffner IB, Stathakopoulos A, Toth LT, Bartlett LA (2020) Reestablishing a stepping-stone population of the threatened elkhorn coral</w:t>
+        <w:t xml:space="preserve">Piñón-González VM, Banaszak AT (2018) Effects of partial mortality on growth, reproduction and total lipid content in the elkhorn coral</w:t>
       </w:r>
       <w:r>
         <w:t xml:space="preserve"> </w:t>
@@ -3607,31 +4726,28 @@
         <w:t xml:space="preserve">Acropora palmata</w:t>
       </w:r>
       <w:r>
-        <w:t xml:space="preserve"> </w:t>
-      </w:r>
-      <w:r>
-        <w:t xml:space="preserve">to aid regional recovery. Endangered Species Research 43:461–473.</w:t>
-      </w:r>
-      <w:r>
-        <w:t xml:space="preserve"> </w:t>
-      </w:r>
-      <w:hyperlink r:id="rId78">
-        <w:r>
-          <w:rPr>
-            <w:rStyle w:val="Hyperlink"/>
-          </w:rPr>
-          <w:t xml:space="preserve">https://doi.org/10.3354/esr01083</w:t>
-        </w:r>
-      </w:hyperlink>
-    </w:p>
-    <w:bookmarkEnd w:id="79"/>
-    <w:bookmarkStart w:id="80" w:name="ref-lirman2000"/>
+        <w:t xml:space="preserve">. Frontiers in Marine Science 5:396.</w:t>
+      </w:r>
+      <w:r>
+        <w:t xml:space="preserve"> </w:t>
+      </w:r>
+      <w:hyperlink r:id="rId109">
+        <w:r>
+          <w:rPr>
+            <w:rStyle w:val="Hyperlink"/>
+          </w:rPr>
+          <w:t xml:space="preserve">https://doi.org/10.3389/fmars.2018.00396</w:t>
+        </w:r>
+      </w:hyperlink>
+    </w:p>
+    <w:bookmarkEnd w:id="110"/>
+    <w:bookmarkStart w:id="112" w:name="ref-ramosromero2025"/>
     <w:p>
       <w:pPr>
         <w:pStyle w:val="Bibliography"/>
       </w:pPr>
       <w:r>
-        <w:t xml:space="preserve">Lirman D (2000) Fragmentation in the branching coral</w:t>
+        <w:t xml:space="preserve">Ramos Romero A, González-Díaz P, Aguilera Pérez G, Banaszak AT (2025) Does reef crest zone selection influence</w:t>
       </w:r>
       <w:r>
         <w:t xml:space="preserve"> </w:t>
@@ -3649,17 +4765,28 @@
         <w:t xml:space="preserve">Lamarck</w:t>
       </w:r>
       <w:r>
-        <w:t xml:space="preserve">): Growth, survivorship, and reproduction of colonies and fragments. Journal of Experimental Marine Biology and Ecology 251:41–57</w:t>
-      </w:r>
-    </w:p>
-    <w:bookmarkEnd w:id="80"/>
-    <w:bookmarkStart w:id="81" w:name="ref-lirman1997"/>
+        <w:t xml:space="preserve">, 1816) fragment survival and growth? PeerJ 13:e20303.</w:t>
+      </w:r>
+      <w:r>
+        <w:t xml:space="preserve"> </w:t>
+      </w:r>
+      <w:hyperlink r:id="rId111">
+        <w:r>
+          <w:rPr>
+            <w:rStyle w:val="Hyperlink"/>
+          </w:rPr>
+          <w:t xml:space="preserve">https://doi.org/10.7717/peerj.20303</w:t>
+        </w:r>
+      </w:hyperlink>
+    </w:p>
+    <w:bookmarkEnd w:id="112"/>
+    <w:bookmarkStart w:id="114" w:name="ref-randall2009"/>
     <w:p>
       <w:pPr>
         <w:pStyle w:val="Bibliography"/>
       </w:pPr>
       <w:r>
-        <w:t xml:space="preserve">Lirman D, Fong P (1997) Patterns of damage to the branching coral</w:t>
+        <w:t xml:space="preserve">Randall CJ, Szmant AM (2009) Elevated temperature affects development, survivorship, and settlement of the elkhorn coral,</w:t>
       </w:r>
       <w:r>
         <w:t xml:space="preserve"> </w:t>
@@ -3671,89 +4798,528 @@
         <w:t xml:space="preserve"> </w:t>
       </w:r>
       <w:r>
-        <w:t xml:space="preserve">following</w:t>
-      </w:r>
-      <w:r>
-        <w:t xml:space="preserve"> </w:t>
-      </w:r>
-      <w:r>
-        <w:t xml:space="preserve">Hurricane Andrew</w:t>
-      </w:r>
-      <w:r>
-        <w:t xml:space="preserve">: Damage and survivorship of hurricane-generated asexual recruits. Journal of Coastal Research 13:67–72</w:t>
-      </w:r>
-    </w:p>
-    <w:bookmarkEnd w:id="81"/>
-    <w:bookmarkStart w:id="83" w:name="ref-madin2020"/>
+        <w:t xml:space="preserve">(</w:t>
+      </w:r>
+      <w:r>
+        <w:t xml:space="preserve">Lamarck</w:t>
+      </w:r>
+      <w:r>
+        <w:t xml:space="preserve"> </w:t>
+      </w:r>
+      <w:r>
+        <w:t xml:space="preserve">1816). The Biological Bulletin 217:269–282.</w:t>
+      </w:r>
+      <w:r>
+        <w:t xml:space="preserve"> </w:t>
+      </w:r>
+      <w:hyperlink r:id="rId113">
+        <w:r>
+          <w:rPr>
+            <w:rStyle w:val="Hyperlink"/>
+          </w:rPr>
+          <w:t xml:space="preserve">https://doi.org/10.1086/BBLv217n3p269</w:t>
+        </w:r>
+      </w:hyperlink>
+    </w:p>
+    <w:bookmarkEnd w:id="114"/>
+    <w:bookmarkStart w:id="116" w:name="ref-ritsonwilliams2020"/>
     <w:p>
       <w:pPr>
         <w:pStyle w:val="Bibliography"/>
       </w:pPr>
       <w:r>
-        <w:t xml:space="preserve">Madin JS, Baird AH, Baskett ML, et al (2020) Partitioning colony size variation into growth and partial mortality. Biology Letters 16:20190727.</w:t>
-      </w:r>
-      <w:r>
-        <w:t xml:space="preserve"> </w:t>
-      </w:r>
-      <w:hyperlink r:id="rId82">
-        <w:r>
-          <w:rPr>
-            <w:rStyle w:val="Hyperlink"/>
-          </w:rPr>
-          <w:t xml:space="preserve">https://doi.org/10.1098/rsbl.2019.0727</w:t>
-        </w:r>
-      </w:hyperlink>
-    </w:p>
-    <w:bookmarkEnd w:id="83"/>
-    <w:bookmarkStart w:id="85" w:name="ref-madin2014"/>
+        <w:t xml:space="preserve">Ritson-Williams R, Arnold SN, Paul VJ (2020) The impact of macroalgae and cyanobacteria on larval survival and settlement of the scleractinian corals</w:t>
+      </w:r>
+      <w:r>
+        <w:t xml:space="preserve"> </w:t>
+      </w:r>
+      <w:r>
+        <w:t xml:space="preserve">Acropora palmata</w:t>
+      </w:r>
+      <w:r>
+        <w:t xml:space="preserve">,</w:t>
+      </w:r>
+      <w:r>
+        <w:t xml:space="preserve"> </w:t>
+      </w:r>
+      <w:r>
+        <w:t xml:space="preserve">A. cervicornis</w:t>
+      </w:r>
+      <w:r>
+        <w:t xml:space="preserve"> </w:t>
+      </w:r>
+      <w:r>
+        <w:t xml:space="preserve">and</w:t>
+      </w:r>
+      <w:r>
+        <w:t xml:space="preserve"> </w:t>
+      </w:r>
+      <w:r>
+        <w:t xml:space="preserve">Pseudodiploria strigosa</w:t>
+      </w:r>
+      <w:r>
+        <w:t xml:space="preserve">. Marine Biology 167:31.</w:t>
+      </w:r>
+      <w:r>
+        <w:t xml:space="preserve"> </w:t>
+      </w:r>
+      <w:hyperlink r:id="rId115">
+        <w:r>
+          <w:rPr>
+            <w:rStyle w:val="Hyperlink"/>
+          </w:rPr>
+          <w:t xml:space="preserve">https://doi.org/10.1007/s00227-019-3639-5</w:t>
+        </w:r>
+      </w:hyperlink>
+    </w:p>
+    <w:bookmarkEnd w:id="116"/>
+    <w:bookmarkStart w:id="118" w:name="ref-ritsonwilliams2013"/>
     <w:p>
       <w:pPr>
         <w:pStyle w:val="Bibliography"/>
       </w:pPr>
       <w:r>
-        <w:t xml:space="preserve">Madin JS, Baird AH, Dornelas M, Connolly SR (2014) Mechanical vulnerability explains size-dependent mortality of reef corals. Ecology Letters 17:1008–1015.</w:t>
-      </w:r>
-      <w:r>
-        <w:t xml:space="preserve"> </w:t>
-      </w:r>
-      <w:hyperlink r:id="rId84">
-        <w:r>
-          <w:rPr>
-            <w:rStyle w:val="Hyperlink"/>
-          </w:rPr>
-          <w:t xml:space="preserve">https://doi.org/10.1111/ele.12306</w:t>
-        </w:r>
-      </w:hyperlink>
-    </w:p>
-    <w:bookmarkEnd w:id="85"/>
-    <w:bookmarkStart w:id="87" w:name="ref-madin2025"/>
+        <w:t xml:space="preserve">Ritson-Williams R, Arnold SN, Paul VJ, Steneck RS (2014) Larval settlement preferences of</w:t>
+      </w:r>
+      <w:r>
+        <w:t xml:space="preserve"> </w:t>
+      </w:r>
+      <w:r>
+        <w:t xml:space="preserve">Acropora palmata</w:t>
+      </w:r>
+      <w:r>
+        <w:t xml:space="preserve"> </w:t>
+      </w:r>
+      <w:r>
+        <w:t xml:space="preserve">and</w:t>
+      </w:r>
+      <w:r>
+        <w:t xml:space="preserve"> </w:t>
+      </w:r>
+      <w:r>
+        <w:t xml:space="preserve">Montastraea faveolata</w:t>
+      </w:r>
+      <w:r>
+        <w:t xml:space="preserve"> </w:t>
+      </w:r>
+      <w:r>
+        <w:t xml:space="preserve">in response to diverse red algae. Coral Reefs 33:59–66.</w:t>
+      </w:r>
+      <w:r>
+        <w:t xml:space="preserve"> </w:t>
+      </w:r>
+      <w:hyperlink r:id="rId117">
+        <w:r>
+          <w:rPr>
+            <w:rStyle w:val="Hyperlink"/>
+          </w:rPr>
+          <w:t xml:space="preserve">https://doi.org/10.1007/s00338-013-1113-2</w:t>
+        </w:r>
+      </w:hyperlink>
+    </w:p>
+    <w:bookmarkEnd w:id="118"/>
+    <w:bookmarkStart w:id="120" w:name="ref-rogersmuller2012"/>
     <w:p>
       <w:pPr>
         <w:pStyle w:val="Bibliography"/>
       </w:pPr>
       <w:r>
-        <w:t xml:space="preserve">Madin JS, Oliver T, McWilliam M, et al (2025)</w:t>
-      </w:r>
-      <w:r>
-        <w:t xml:space="preserve"> </w:t>
-      </w:r>
-      <w:hyperlink r:id="rId86">
-        <w:r>
-          <w:rPr>
-            <w:rStyle w:val="Hyperlink"/>
-          </w:rPr>
-          <w:t xml:space="preserve">Demographic insights for coral restoration</w:t>
-        </w:r>
-      </w:hyperlink>
-    </w:p>
-    <w:bookmarkEnd w:id="87"/>
-    <w:bookmarkStart w:id="89" w:name="ref-manzello2025"/>
+        <w:t xml:space="preserve">Rogers CS, Muller EM (2012) Bleaching, disease and recovery in the threatened scleractinian coral</w:t>
+      </w:r>
+      <w:r>
+        <w:t xml:space="preserve"> </w:t>
+      </w:r>
+      <w:r>
+        <w:t xml:space="preserve">Acropora palmata</w:t>
+      </w:r>
+      <w:r>
+        <w:t xml:space="preserve"> </w:t>
+      </w:r>
+      <w:r>
+        <w:t xml:space="preserve">in</w:t>
+      </w:r>
+      <w:r>
+        <w:t xml:space="preserve"> </w:t>
+      </w:r>
+      <w:r>
+        <w:t xml:space="preserve">St. John</w:t>
+      </w:r>
+      <w:r>
+        <w:t xml:space="preserve">,</w:t>
+      </w:r>
+      <w:r>
+        <w:t xml:space="preserve"> </w:t>
+      </w:r>
+      <w:r>
+        <w:t xml:space="preserve">US Virgin Islands</w:t>
+      </w:r>
+      <w:r>
+        <w:t xml:space="preserve">: 2003–2010. Coral Reefs 31:807–819.</w:t>
+      </w:r>
+      <w:r>
+        <w:t xml:space="preserve"> </w:t>
+      </w:r>
+      <w:hyperlink r:id="rId119">
+        <w:r>
+          <w:rPr>
+            <w:rStyle w:val="Hyperlink"/>
+          </w:rPr>
+          <w:t xml:space="preserve">https://doi.org/10.1007/s00338-012-0898-8</w:t>
+        </w:r>
+      </w:hyperlink>
+    </w:p>
+    <w:bookmarkEnd w:id="120"/>
+    <w:bookmarkStart w:id="121" w:name="ref-rogers1982"/>
     <w:p>
       <w:pPr>
         <w:pStyle w:val="Bibliography"/>
       </w:pPr>
       <w:r>
-        <w:t xml:space="preserve">Manzello DP, Cunning R, Karp RF, et al (2025) Heat-driven functional extinction of</w:t>
+        <w:t xml:space="preserve">Rogers CS, Suchanek TH, Pecora FA (1982) Effects of</w:t>
+      </w:r>
+      <w:r>
+        <w:t xml:space="preserve"> </w:t>
+      </w:r>
+      <w:r>
+        <w:t xml:space="preserve">Hurricanes David</w:t>
+      </w:r>
+      <w:r>
+        <w:t xml:space="preserve"> </w:t>
+      </w:r>
+      <w:r>
+        <w:t xml:space="preserve">and</w:t>
+      </w:r>
+      <w:r>
+        <w:t xml:space="preserve"> </w:t>
+      </w:r>
+      <w:r>
+        <w:t xml:space="preserve">Frederic</w:t>
+      </w:r>
+      <w:r>
+        <w:t xml:space="preserve"> </w:t>
+      </w:r>
+      <w:r>
+        <w:t xml:space="preserve">(1979) on shallow</w:t>
+      </w:r>
+      <w:r>
+        <w:t xml:space="preserve"> </w:t>
+      </w:r>
+      <w:r>
+        <w:t xml:space="preserve">Acropora palmata</w:t>
+      </w:r>
+      <w:r>
+        <w:t xml:space="preserve"> </w:t>
+      </w:r>
+      <w:r>
+        <w:t xml:space="preserve">reef communities:</w:t>
+      </w:r>
+      <w:r>
+        <w:t xml:space="preserve"> </w:t>
+      </w:r>
+      <w:r>
+        <w:t xml:space="preserve">St. Croix</w:t>
+      </w:r>
+      <w:r>
+        <w:t xml:space="preserve">,</w:t>
+      </w:r>
+      <w:r>
+        <w:t xml:space="preserve"> </w:t>
+      </w:r>
+      <w:r>
+        <w:t xml:space="preserve">U.S. Virgin Islands</w:t>
+      </w:r>
+      <w:r>
+        <w:t xml:space="preserve">. Bulletin of Marine Science 32:532–548</w:t>
+      </w:r>
+    </w:p>
+    <w:bookmarkEnd w:id="121"/>
+    <w:bookmarkStart w:id="123" w:name="ref-rosales2024"/>
+    <w:p>
+      <w:pPr>
+        <w:pStyle w:val="Bibliography"/>
+      </w:pPr>
+      <w:r>
+        <w:t xml:space="preserve">Rosales SM, Young BD, Bright AJ, et al (2024) Reef site and habitat influence effectiveness of</w:t>
+      </w:r>
+      <w:r>
+        <w:t xml:space="preserve"> </w:t>
+      </w:r>
+      <w:r>
+        <w:t xml:space="preserve">Acropora palmata</w:t>
+      </w:r>
+      <w:r>
+        <w:t xml:space="preserve"> </w:t>
+      </w:r>
+      <w:r>
+        <w:t xml:space="preserve">restoration and its microbiome in the</w:t>
+      </w:r>
+      <w:r>
+        <w:t xml:space="preserve"> </w:t>
+      </w:r>
+      <w:r>
+        <w:t xml:space="preserve">Florida Keys</w:t>
+      </w:r>
+      <w:r>
+        <w:t xml:space="preserve">. Communications Earth &amp; Environment 5:689.</w:t>
+      </w:r>
+      <w:r>
+        <w:t xml:space="preserve"> </w:t>
+      </w:r>
+      <w:hyperlink r:id="rId122">
+        <w:r>
+          <w:rPr>
+            <w:rStyle w:val="Hyperlink"/>
+          </w:rPr>
+          <w:t xml:space="preserve">https://doi.org/10.1038/s43247-024-01816-7</w:t>
+        </w:r>
+      </w:hyperlink>
+    </w:p>
+    <w:bookmarkEnd w:id="123"/>
+    <w:bookmarkStart w:id="125" w:name="ref-schopmeyer2017"/>
+    <w:p>
+      <w:pPr>
+        <w:pStyle w:val="Bibliography"/>
+      </w:pPr>
+      <w:r>
+        <w:t xml:space="preserve">Schopmeyer SA, Lirman D, Bartels E, et al (2017) Regional restoration benchmarks for</w:t>
+      </w:r>
+      <w:r>
+        <w:t xml:space="preserve"> </w:t>
+      </w:r>
+      <w:r>
+        <w:t xml:space="preserve">Acropora cervicornis</w:t>
+      </w:r>
+      <w:r>
+        <w:t xml:space="preserve">. Coral Reefs 36:1047–1057.</w:t>
+      </w:r>
+      <w:r>
+        <w:t xml:space="preserve"> </w:t>
+      </w:r>
+      <w:hyperlink r:id="rId124">
+        <w:r>
+          <w:rPr>
+            <w:rStyle w:val="Hyperlink"/>
+          </w:rPr>
+          <w:t xml:space="preserve">https://doi.org/10.1007/s00338-017-1596-3</w:t>
+        </w:r>
+      </w:hyperlink>
+    </w:p>
+    <w:bookmarkEnd w:id="125"/>
+    <w:bookmarkStart w:id="126" w:name="ref-vardi2011"/>
+    <w:p>
+      <w:pPr>
+        <w:pStyle w:val="Bibliography"/>
+      </w:pPr>
+      <w:r>
+        <w:t xml:space="preserve">Vardi T (2011) The threatened</w:t>
+      </w:r>
+      <w:r>
+        <w:t xml:space="preserve"> </w:t>
+      </w:r>
+      <w:r>
+        <w:t xml:space="preserve">Atlantic</w:t>
+      </w:r>
+      <w:r>
+        <w:t xml:space="preserve"> </w:t>
+      </w:r>
+      <w:r>
+        <w:t xml:space="preserve">elkhorn coral,</w:t>
+      </w:r>
+      <w:r>
+        <w:t xml:space="preserve"> </w:t>
+      </w:r>
+      <w:r>
+        <w:t xml:space="preserve">Acropora palmata</w:t>
+      </w:r>
+      <w:r>
+        <w:t xml:space="preserve">: Population dynamics and their policy implications. {PhD} dissertation, University of California, San Diego</w:t>
+      </w:r>
+    </w:p>
+    <w:bookmarkEnd w:id="126"/>
+    <w:bookmarkStart w:id="128" w:name="ref-vardi2012"/>
+    <w:p>
+      <w:pPr>
+        <w:pStyle w:val="Bibliography"/>
+      </w:pPr>
+      <w:r>
+        <w:t xml:space="preserve">Vardi T, Williams DE, Sandin SA (2012) Population dynamics of threatened elkhorn coral in the northern</w:t>
+      </w:r>
+      <w:r>
+        <w:t xml:space="preserve"> </w:t>
+      </w:r>
+      <w:r>
+        <w:t xml:space="preserve">Florida Keys</w:t>
+      </w:r>
+      <w:r>
+        <w:t xml:space="preserve">,</w:t>
+      </w:r>
+      <w:r>
+        <w:t xml:space="preserve"> </w:t>
+      </w:r>
+      <w:r>
+        <w:t xml:space="preserve">USA</w:t>
+      </w:r>
+      <w:r>
+        <w:t xml:space="preserve">. Endangered Species Research 19:157–169.</w:t>
+      </w:r>
+      <w:r>
+        <w:t xml:space="preserve"> </w:t>
+      </w:r>
+      <w:hyperlink r:id="rId127">
+        <w:r>
+          <w:rPr>
+            <w:rStyle w:val="Hyperlink"/>
+          </w:rPr>
+          <w:t xml:space="preserve">https://doi.org/10.3354/esr00475</w:t>
+        </w:r>
+      </w:hyperlink>
+    </w:p>
+    <w:bookmarkEnd w:id="128"/>
+    <w:bookmarkStart w:id="130" w:name="ref-viechtbauer2010"/>
+    <w:p>
+      <w:pPr>
+        <w:pStyle w:val="Bibliography"/>
+      </w:pPr>
+      <w:r>
+        <w:t xml:space="preserve">Viechtbauer W (2010) Conducting meta-analyses in</w:t>
+      </w:r>
+      <w:r>
+        <w:t xml:space="preserve"> </w:t>
+      </w:r>
+      <w:r>
+        <w:t xml:space="preserve">R</w:t>
+      </w:r>
+      <w:r>
+        <w:t xml:space="preserve"> </w:t>
+      </w:r>
+      <w:r>
+        <w:t xml:space="preserve">with the metafor package. Journal of Statistical Software 36:1–48.</w:t>
+      </w:r>
+      <w:r>
+        <w:t xml:space="preserve"> </w:t>
+      </w:r>
+      <w:hyperlink r:id="rId129">
+        <w:r>
+          <w:rPr>
+            <w:rStyle w:val="Hyperlink"/>
+          </w:rPr>
+          <w:t xml:space="preserve">https://doi.org/10.18637/jss.v036.i03</w:t>
+        </w:r>
+      </w:hyperlink>
+    </w:p>
+    <w:bookmarkEnd w:id="130"/>
+    <w:bookmarkStart w:id="132" w:name="ref-williams2023"/>
+    <w:p>
+      <w:pPr>
+        <w:pStyle w:val="Bibliography"/>
+      </w:pPr>
+      <w:r>
+        <w:t xml:space="preserve">Williams DE, Bright AJ, Williamson OM, et al (2023) Synchronous spawning of nursery-raised elkhorn coral (</w:t>
+      </w:r>
+      <w:r>
+        <w:t xml:space="preserve">Acropora palmata</w:t>
+      </w:r>
+      <w:r>
+        <w:t xml:space="preserve">) outplanted to reefs in the</w:t>
+      </w:r>
+      <w:r>
+        <w:t xml:space="preserve"> </w:t>
+      </w:r>
+      <w:r>
+        <w:t xml:space="preserve">Florida Keys</w:t>
+      </w:r>
+      <w:r>
+        <w:t xml:space="preserve"> </w:t>
+      </w:r>
+      <w:r>
+        <w:t xml:space="preserve">(</w:t>
+      </w:r>
+      <w:r>
+        <w:t xml:space="preserve">United States</w:t>
+      </w:r>
+      <w:r>
+        <w:t xml:space="preserve">). Frontiers in Marine Science 10:1180996.</w:t>
+      </w:r>
+      <w:r>
+        <w:t xml:space="preserve"> </w:t>
+      </w:r>
+      <w:hyperlink r:id="rId131">
+        <w:r>
+          <w:rPr>
+            <w:rStyle w:val="Hyperlink"/>
+          </w:rPr>
+          <w:t xml:space="preserve">https://doi.org/10.3389/fmars.2023.1180996</w:t>
+        </w:r>
+      </w:hyperlink>
+    </w:p>
+    <w:bookmarkEnd w:id="132"/>
+    <w:bookmarkStart w:id="134" w:name="ref-williamsmiller2012"/>
+    <w:p>
+      <w:pPr>
+        <w:pStyle w:val="Bibliography"/>
+      </w:pPr>
+      <w:r>
+        <w:t xml:space="preserve">Williams DE, Miller MW (2012) Attributing mortality among drivers of population decline in</w:t>
+      </w:r>
+      <w:r>
+        <w:t xml:space="preserve"> </w:t>
+      </w:r>
+      <w:r>
+        <w:t xml:space="preserve">Acropora palmata</w:t>
+      </w:r>
+      <w:r>
+        <w:t xml:space="preserve"> </w:t>
+      </w:r>
+      <w:r>
+        <w:t xml:space="preserve">in the</w:t>
+      </w:r>
+      <w:r>
+        <w:t xml:space="preserve"> </w:t>
+      </w:r>
+      <w:r>
+        <w:t xml:space="preserve">Florida Keys</w:t>
+      </w:r>
+      <w:r>
+        <w:t xml:space="preserve"> </w:t>
+      </w:r>
+      <w:r>
+        <w:t xml:space="preserve">(</w:t>
+      </w:r>
+      <w:r>
+        <w:t xml:space="preserve">USA</w:t>
+      </w:r>
+      <w:r>
+        <w:t xml:space="preserve">). Coral Reefs 31:369–382.</w:t>
+      </w:r>
+      <w:r>
+        <w:t xml:space="preserve"> </w:t>
+      </w:r>
+      <w:hyperlink r:id="rId133">
+        <w:r>
+          <w:rPr>
+            <w:rStyle w:val="Hyperlink"/>
+          </w:rPr>
+          <w:t xml:space="preserve">https://doi.org/10.1007/s00338-011-0847-y</w:t>
+        </w:r>
+      </w:hyperlink>
+    </w:p>
+    <w:bookmarkEnd w:id="134"/>
+    <w:bookmarkStart w:id="136" w:name="ref-williamsmiller2010"/>
+    <w:p>
+      <w:pPr>
+        <w:pStyle w:val="Bibliography"/>
+      </w:pPr>
+      <w:r>
+        <w:t xml:space="preserve">Williams DE, Miller MW (2010) Stabilization of fragments to enhance asexual recruitment in</w:t>
+      </w:r>
+      <w:r>
+        <w:t xml:space="preserve"> </w:t>
+      </w:r>
+      <w:r>
+        <w:t xml:space="preserve">Acropora palmata</w:t>
+      </w:r>
+      <w:r>
+        <w:t xml:space="preserve">, a threatened</w:t>
       </w:r>
       <w:r>
         <w:t xml:space="preserve"> </w:t>
@@ -3765,64 +5331,34 @@
         <w:t xml:space="preserve"> </w:t>
       </w:r>
       <w:r>
-        <w:t xml:space="preserve">Acropora</w:t>
-      </w:r>
-      <w:r>
-        <w:t xml:space="preserve"> </w:t>
-      </w:r>
-      <w:r>
-        <w:t xml:space="preserve">corals from</w:t>
-      </w:r>
-      <w:r>
-        <w:t xml:space="preserve"> </w:t>
-      </w:r>
-      <w:r>
-        <w:t xml:space="preserve">Florida</w:t>
-      </w:r>
-      <w:r>
-        <w:t xml:space="preserve">’s</w:t>
-      </w:r>
-      <w:r>
-        <w:t xml:space="preserve"> </w:t>
-      </w:r>
-      <w:r>
-        <w:t xml:space="preserve">Coral Reef</w:t>
-      </w:r>
-      <w:r>
-        <w:t xml:space="preserve">. Science 390:361–366.</w:t>
-      </w:r>
-      <w:r>
-        <w:t xml:space="preserve"> </w:t>
-      </w:r>
-      <w:hyperlink r:id="rId88">
-        <w:r>
-          <w:rPr>
-            <w:rStyle w:val="Hyperlink"/>
-          </w:rPr>
-          <w:t xml:space="preserve">https://doi.org/10.1126/science.adx7825</w:t>
-        </w:r>
-      </w:hyperlink>
-    </w:p>
-    <w:bookmarkEnd w:id="89"/>
-    <w:bookmarkStart w:id="91" w:name="ref-maurer2022"/>
+        <w:t xml:space="preserve">coral. Restoration Ecology 18:446–451.</w:t>
+      </w:r>
+      <w:r>
+        <w:t xml:space="preserve"> </w:t>
+      </w:r>
+      <w:hyperlink r:id="rId135">
+        <w:r>
+          <w:rPr>
+            <w:rStyle w:val="Hyperlink"/>
+          </w:rPr>
+          <w:t xml:space="preserve">https://doi.org/10.1111/j.1526-100X.2009.00579.x</w:t>
+        </w:r>
+      </w:hyperlink>
+    </w:p>
+    <w:bookmarkEnd w:id="136"/>
+    <w:bookmarkStart w:id="138" w:name="ref-williams2008"/>
     <w:p>
       <w:pPr>
         <w:pStyle w:val="Bibliography"/>
       </w:pPr>
       <w:r>
-        <w:t xml:space="preserve">Maurer L, Puishys L, Ho NKP, et al (2022)</w:t>
-      </w:r>
-      <w:r>
-        <w:t xml:space="preserve"> </w:t>
-      </w:r>
-      <w:r>
-        <w:t xml:space="preserve">Acropora cervicornis</w:t>
-      </w:r>
-      <w:r>
-        <w:t xml:space="preserve"> </w:t>
-      </w:r>
-      <w:r>
-        <w:t xml:space="preserve">and</w:t>
+        <w:t xml:space="preserve">Williams DE, Miller MW, Kramer KL (2008) Recruitment failure in</w:t>
+      </w:r>
+      <w:r>
+        <w:t xml:space="preserve"> </w:t>
+      </w:r>
+      <w:r>
+        <w:t xml:space="preserve">Florida Keys</w:t>
       </w:r>
       <w:r>
         <w:t xml:space="preserve"> </w:t>
@@ -3831,594 +5367,6 @@
         <w:t xml:space="preserve">Acropora palmata</w:t>
       </w:r>
       <w:r>
-        <w:t xml:space="preserve"> </w:t>
-      </w:r>
-      <w:r>
-        <w:t xml:space="preserve">cultured on a low maintenance line nursery design in</w:t>
-      </w:r>
-      <w:r>
-        <w:t xml:space="preserve"> </w:t>
-      </w:r>
-      <w:r>
-        <w:t xml:space="preserve">The Bahamas</w:t>
-      </w:r>
-      <w:r>
-        <w:t xml:space="preserve">. PLoS ONE 17:e0267034.</w:t>
-      </w:r>
-      <w:r>
-        <w:t xml:space="preserve"> </w:t>
-      </w:r>
-      <w:hyperlink r:id="rId90">
-        <w:r>
-          <w:rPr>
-            <w:rStyle w:val="Hyperlink"/>
-          </w:rPr>
-          <w:t xml:space="preserve">https://doi.org/10.1371/journal.pone.0267034</w:t>
-        </w:r>
-      </w:hyperlink>
-    </w:p>
-    <w:bookmarkEnd w:id="91"/>
-    <w:bookmarkStart w:id="93" w:name="ref-mendozaquiroz2023"/>
-    <w:p>
-      <w:pPr>
-        <w:pStyle w:val="Bibliography"/>
-      </w:pPr>
-      <w:r>
-        <w:t xml:space="preserve">Mendoza Quiroz S, Beltrán-Torres AU, Grosso-Becerra MV, et al (2023) Long-term survival, growth, and reproduction of</w:t>
-      </w:r>
-      <w:r>
-        <w:t xml:space="preserve"> </w:t>
-      </w:r>
-      <w:r>
-        <w:t xml:space="preserve">Acropora palmata</w:t>
-      </w:r>
-      <w:r>
-        <w:t xml:space="preserve"> </w:t>
-      </w:r>
-      <w:r>
-        <w:t xml:space="preserve">sexual recruits outplanted onto</w:t>
-      </w:r>
-      <w:r>
-        <w:t xml:space="preserve"> </w:t>
-      </w:r>
-      <w:r>
-        <w:t xml:space="preserve">Mexican Caribbean</w:t>
-      </w:r>
-      <w:r>
-        <w:t xml:space="preserve"> </w:t>
-      </w:r>
-      <w:r>
-        <w:t xml:space="preserve">reefs. PeerJ 11:e15813.</w:t>
-      </w:r>
-      <w:r>
-        <w:t xml:space="preserve"> </w:t>
-      </w:r>
-      <w:hyperlink r:id="rId92">
-        <w:r>
-          <w:rPr>
-            <w:rStyle w:val="Hyperlink"/>
-          </w:rPr>
-          <w:t xml:space="preserve">https://doi.org/10.7717/peerj.15813</w:t>
-        </w:r>
-      </w:hyperlink>
-    </w:p>
-    <w:bookmarkEnd w:id="93"/>
-    <w:bookmarkStart w:id="95" w:name="ref-neely2022"/>
-    <w:p>
-      <w:pPr>
-        <w:pStyle w:val="Bibliography"/>
-      </w:pPr>
-      <w:r>
-        <w:t xml:space="preserve">Neely KL, Macaulay KA, Lunz KS (2022) Population trajectory and stressors of</w:t>
-      </w:r>
-      <w:r>
-        <w:t xml:space="preserve"> </w:t>
-      </w:r>
-      <w:r>
-        <w:t xml:space="preserve">Acropora palmata</w:t>
-      </w:r>
-      <w:r>
-        <w:t xml:space="preserve"> </w:t>
-      </w:r>
-      <w:r>
-        <w:t xml:space="preserve">sites in the</w:t>
-      </w:r>
-      <w:r>
-        <w:t xml:space="preserve"> </w:t>
-      </w:r>
-      <w:r>
-        <w:t xml:space="preserve">Florida Keys</w:t>
-      </w:r>
-      <w:r>
-        <w:t xml:space="preserve">. Frontiers in Marine Science 9:978785.</w:t>
-      </w:r>
-      <w:r>
-        <w:t xml:space="preserve"> </w:t>
-      </w:r>
-      <w:hyperlink r:id="rId94">
-        <w:r>
-          <w:rPr>
-            <w:rStyle w:val="Hyperlink"/>
-          </w:rPr>
-          <w:t xml:space="preserve">https://doi.org/10.3389/fmars.2022.978785</w:t>
-        </w:r>
-      </w:hyperlink>
-    </w:p>
-    <w:bookmarkEnd w:id="95"/>
-    <w:bookmarkStart w:id="96" w:name="ref-ortizprosper2005"/>
-    <w:p>
-      <w:pPr>
-        <w:pStyle w:val="Bibliography"/>
-      </w:pPr>
-      <w:r>
-        <w:t xml:space="preserve">Ortiz Prosper AL (2005) Population dynamics of hurricane-generated fragments of elkhorn coral</w:t>
-      </w:r>
-      <w:r>
-        <w:t xml:space="preserve"> </w:t>
-      </w:r>
-      <w:r>
-        <w:t xml:space="preserve">Acropora palmata</w:t>
-      </w:r>
-      <w:r>
-        <w:t xml:space="preserve"> </w:t>
-      </w:r>
-      <w:r>
-        <w:t xml:space="preserve">(</w:t>
-      </w:r>
-      <w:r>
-        <w:t xml:space="preserve">Lamarck</w:t>
-      </w:r>
-      <w:r>
-        <w:t xml:space="preserve">, 1816). {PhD} dissertation, University of Puerto Rico, Mayag</w:t>
-      </w:r>
-      <w:r>
-        <w:t xml:space="preserve">ü</w:t>
-      </w:r>
-      <w:r>
-        <w:t xml:space="preserve">ez</w:t>
-      </w:r>
-    </w:p>
-    <w:bookmarkEnd w:id="96"/>
-    <w:bookmarkStart w:id="98" w:name="ref-pausch2018"/>
-    <w:p>
-      <w:pPr>
-        <w:pStyle w:val="Bibliography"/>
-      </w:pPr>
-      <w:r>
-        <w:t xml:space="preserve">Pausch RE, Williams DE, Miller MW (2018) Impacts of fragment genotype, habitat, and size on outplanted elkhorn coral success under thermal stress. Marine Ecology Progress Series 592:109–117.</w:t>
-      </w:r>
-      <w:r>
-        <w:t xml:space="preserve"> </w:t>
-      </w:r>
-      <w:hyperlink r:id="rId97">
-        <w:r>
-          <w:rPr>
-            <w:rStyle w:val="Hyperlink"/>
-          </w:rPr>
-          <w:t xml:space="preserve">https://doi.org/10.3354/meps12488</w:t>
-        </w:r>
-      </w:hyperlink>
-    </w:p>
-    <w:bookmarkEnd w:id="98"/>
-    <w:bookmarkStart w:id="100" w:name="ref-pinongonzalez2018"/>
-    <w:p>
-      <w:pPr>
-        <w:pStyle w:val="Bibliography"/>
-      </w:pPr>
-      <w:r>
-        <w:t xml:space="preserve">Piñón-González VM, Banaszak AT (2018) Effects of partial mortality on growth, reproduction and total lipid content in the elkhorn coral</w:t>
-      </w:r>
-      <w:r>
-        <w:t xml:space="preserve"> </w:t>
-      </w:r>
-      <w:r>
-        <w:t xml:space="preserve">Acropora palmata</w:t>
-      </w:r>
-      <w:r>
-        <w:t xml:space="preserve">. Frontiers in Marine Science 5:396.</w:t>
-      </w:r>
-      <w:r>
-        <w:t xml:space="preserve"> </w:t>
-      </w:r>
-      <w:hyperlink r:id="rId99">
-        <w:r>
-          <w:rPr>
-            <w:rStyle w:val="Hyperlink"/>
-          </w:rPr>
-          <w:t xml:space="preserve">https://doi.org/10.3389/fmars.2018.00396</w:t>
-        </w:r>
-      </w:hyperlink>
-    </w:p>
-    <w:bookmarkEnd w:id="100"/>
-    <w:bookmarkStart w:id="102" w:name="ref-ramosromero2025"/>
-    <w:p>
-      <w:pPr>
-        <w:pStyle w:val="Bibliography"/>
-      </w:pPr>
-      <w:r>
-        <w:t xml:space="preserve">Ramos Romero A, González-Díaz P, Aguilera Pérez G, Banaszak AT (2025) Does reef crest zone selection influence</w:t>
-      </w:r>
-      <w:r>
-        <w:t xml:space="preserve"> </w:t>
-      </w:r>
-      <w:r>
-        <w:t xml:space="preserve">Acropora palmata</w:t>
-      </w:r>
-      <w:r>
-        <w:t xml:space="preserve"> </w:t>
-      </w:r>
-      <w:r>
-        <w:t xml:space="preserve">(</w:t>
-      </w:r>
-      <w:r>
-        <w:t xml:space="preserve">Lamarck</w:t>
-      </w:r>
-      <w:r>
-        <w:t xml:space="preserve">, 1816) fragment survival and growth? PeerJ 13:e20303.</w:t>
-      </w:r>
-      <w:r>
-        <w:t xml:space="preserve"> </w:t>
-      </w:r>
-      <w:hyperlink r:id="rId101">
-        <w:r>
-          <w:rPr>
-            <w:rStyle w:val="Hyperlink"/>
-          </w:rPr>
-          <w:t xml:space="preserve">https://doi.org/10.7717/peerj.20303</w:t>
-        </w:r>
-      </w:hyperlink>
-    </w:p>
-    <w:bookmarkEnd w:id="102"/>
-    <w:bookmarkStart w:id="104" w:name="ref-rogersmuller2012"/>
-    <w:p>
-      <w:pPr>
-        <w:pStyle w:val="Bibliography"/>
-      </w:pPr>
-      <w:r>
-        <w:t xml:space="preserve">Rogers CS, Muller EM (2012) Bleaching, disease and recovery in the threatened scleractinian coral</w:t>
-      </w:r>
-      <w:r>
-        <w:t xml:space="preserve"> </w:t>
-      </w:r>
-      <w:r>
-        <w:t xml:space="preserve">Acropora palmata</w:t>
-      </w:r>
-      <w:r>
-        <w:t xml:space="preserve"> </w:t>
-      </w:r>
-      <w:r>
-        <w:t xml:space="preserve">in</w:t>
-      </w:r>
-      <w:r>
-        <w:t xml:space="preserve"> </w:t>
-      </w:r>
-      <w:r>
-        <w:t xml:space="preserve">St. John</w:t>
-      </w:r>
-      <w:r>
-        <w:t xml:space="preserve">,</w:t>
-      </w:r>
-      <w:r>
-        <w:t xml:space="preserve"> </w:t>
-      </w:r>
-      <w:r>
-        <w:t xml:space="preserve">US Virgin Islands</w:t>
-      </w:r>
-      <w:r>
-        <w:t xml:space="preserve">: 2003–2010. Coral Reefs 31:807–819.</w:t>
-      </w:r>
-      <w:r>
-        <w:t xml:space="preserve"> </w:t>
-      </w:r>
-      <w:hyperlink r:id="rId103">
-        <w:r>
-          <w:rPr>
-            <w:rStyle w:val="Hyperlink"/>
-          </w:rPr>
-          <w:t xml:space="preserve">https://doi.org/10.1007/s00338-012-0898-8</w:t>
-        </w:r>
-      </w:hyperlink>
-    </w:p>
-    <w:bookmarkEnd w:id="104"/>
-    <w:bookmarkStart w:id="105" w:name="ref-rogers1982"/>
-    <w:p>
-      <w:pPr>
-        <w:pStyle w:val="Bibliography"/>
-      </w:pPr>
-      <w:r>
-        <w:t xml:space="preserve">Rogers CS, Suchanek TH, Pecora FA (1982) Effects of</w:t>
-      </w:r>
-      <w:r>
-        <w:t xml:space="preserve"> </w:t>
-      </w:r>
-      <w:r>
-        <w:t xml:space="preserve">Hurricanes David</w:t>
-      </w:r>
-      <w:r>
-        <w:t xml:space="preserve"> </w:t>
-      </w:r>
-      <w:r>
-        <w:t xml:space="preserve">and</w:t>
-      </w:r>
-      <w:r>
-        <w:t xml:space="preserve"> </w:t>
-      </w:r>
-      <w:r>
-        <w:t xml:space="preserve">Frederic</w:t>
-      </w:r>
-      <w:r>
-        <w:t xml:space="preserve"> </w:t>
-      </w:r>
-      <w:r>
-        <w:t xml:space="preserve">(1979) on shallow</w:t>
-      </w:r>
-      <w:r>
-        <w:t xml:space="preserve"> </w:t>
-      </w:r>
-      <w:r>
-        <w:t xml:space="preserve">Acropora palmata</w:t>
-      </w:r>
-      <w:r>
-        <w:t xml:space="preserve"> </w:t>
-      </w:r>
-      <w:r>
-        <w:t xml:space="preserve">reef communities:</w:t>
-      </w:r>
-      <w:r>
-        <w:t xml:space="preserve"> </w:t>
-      </w:r>
-      <w:r>
-        <w:t xml:space="preserve">St. Croix</w:t>
-      </w:r>
-      <w:r>
-        <w:t xml:space="preserve">,</w:t>
-      </w:r>
-      <w:r>
-        <w:t xml:space="preserve"> </w:t>
-      </w:r>
-      <w:r>
-        <w:t xml:space="preserve">U.S. Virgin Islands</w:t>
-      </w:r>
-      <w:r>
-        <w:t xml:space="preserve">. Bulletin of Marine Science 32:532–548</w:t>
-      </w:r>
-    </w:p>
-    <w:bookmarkEnd w:id="105"/>
-    <w:bookmarkStart w:id="107" w:name="ref-rosales2024"/>
-    <w:p>
-      <w:pPr>
-        <w:pStyle w:val="Bibliography"/>
-      </w:pPr>
-      <w:r>
-        <w:t xml:space="preserve">Rosales SM, Young BD, Bright AJ, et al (2024) Reef site and habitat influence effectiveness of</w:t>
-      </w:r>
-      <w:r>
-        <w:t xml:space="preserve"> </w:t>
-      </w:r>
-      <w:r>
-        <w:t xml:space="preserve">Acropora palmata</w:t>
-      </w:r>
-      <w:r>
-        <w:t xml:space="preserve"> </w:t>
-      </w:r>
-      <w:r>
-        <w:t xml:space="preserve">restoration and its microbiome in the</w:t>
-      </w:r>
-      <w:r>
-        <w:t xml:space="preserve"> </w:t>
-      </w:r>
-      <w:r>
-        <w:t xml:space="preserve">Florida Keys</w:t>
-      </w:r>
-      <w:r>
-        <w:t xml:space="preserve">. Communications Earth &amp; Environment 5:689.</w:t>
-      </w:r>
-      <w:r>
-        <w:t xml:space="preserve"> </w:t>
-      </w:r>
-      <w:hyperlink r:id="rId106">
-        <w:r>
-          <w:rPr>
-            <w:rStyle w:val="Hyperlink"/>
-          </w:rPr>
-          <w:t xml:space="preserve">https://doi.org/10.1038/s43247-024-01816-7</w:t>
-        </w:r>
-      </w:hyperlink>
-    </w:p>
-    <w:bookmarkEnd w:id="107"/>
-    <w:bookmarkStart w:id="109" w:name="ref-schopmeyer2017"/>
-    <w:p>
-      <w:pPr>
-        <w:pStyle w:val="Bibliography"/>
-      </w:pPr>
-      <w:r>
-        <w:t xml:space="preserve">Schopmeyer SA, Lirman D, Bartels E, et al (2017) Regional restoration benchmarks for</w:t>
-      </w:r>
-      <w:r>
-        <w:t xml:space="preserve"> </w:t>
-      </w:r>
-      <w:r>
-        <w:t xml:space="preserve">Acropora cervicornis</w:t>
-      </w:r>
-      <w:r>
-        <w:t xml:space="preserve">. Coral Reefs 36:1047–1057.</w:t>
-      </w:r>
-      <w:r>
-        <w:t xml:space="preserve"> </w:t>
-      </w:r>
-      <w:hyperlink r:id="rId108">
-        <w:r>
-          <w:rPr>
-            <w:rStyle w:val="Hyperlink"/>
-          </w:rPr>
-          <w:t xml:space="preserve">https://doi.org/10.1007/s00338-017-1596-3</w:t>
-        </w:r>
-      </w:hyperlink>
-    </w:p>
-    <w:bookmarkEnd w:id="109"/>
-    <w:bookmarkStart w:id="110" w:name="ref-vardi2011"/>
-    <w:p>
-      <w:pPr>
-        <w:pStyle w:val="Bibliography"/>
-      </w:pPr>
-      <w:r>
-        <w:t xml:space="preserve">Vardi T (2011) The threatened</w:t>
-      </w:r>
-      <w:r>
-        <w:t xml:space="preserve"> </w:t>
-      </w:r>
-      <w:r>
-        <w:t xml:space="preserve">Atlantic</w:t>
-      </w:r>
-      <w:r>
-        <w:t xml:space="preserve"> </w:t>
-      </w:r>
-      <w:r>
-        <w:t xml:space="preserve">elkhorn coral,</w:t>
-      </w:r>
-      <w:r>
-        <w:t xml:space="preserve"> </w:t>
-      </w:r>
-      <w:r>
-        <w:t xml:space="preserve">Acropora palmata</w:t>
-      </w:r>
-      <w:r>
-        <w:t xml:space="preserve">: Population dynamics and their policy implications. {PhD} dissertation, University of California, San Diego</w:t>
-      </w:r>
-    </w:p>
-    <w:bookmarkEnd w:id="110"/>
-    <w:bookmarkStart w:id="112" w:name="ref-vardi2012"/>
-    <w:p>
-      <w:pPr>
-        <w:pStyle w:val="Bibliography"/>
-      </w:pPr>
-      <w:r>
-        <w:t xml:space="preserve">Vardi T, Williams DE, Sandin SA (2012) Population dynamics of threatened elkhorn coral in the northern</w:t>
-      </w:r>
-      <w:r>
-        <w:t xml:space="preserve"> </w:t>
-      </w:r>
-      <w:r>
-        <w:t xml:space="preserve">Florida Keys</w:t>
-      </w:r>
-      <w:r>
-        <w:t xml:space="preserve">,</w:t>
-      </w:r>
-      <w:r>
-        <w:t xml:space="preserve"> </w:t>
-      </w:r>
-      <w:r>
-        <w:t xml:space="preserve">USA</w:t>
-      </w:r>
-      <w:r>
-        <w:t xml:space="preserve">. Endangered Species Research 19:157–169.</w:t>
-      </w:r>
-      <w:r>
-        <w:t xml:space="preserve"> </w:t>
-      </w:r>
-      <w:hyperlink r:id="rId111">
-        <w:r>
-          <w:rPr>
-            <w:rStyle w:val="Hyperlink"/>
-          </w:rPr>
-          <w:t xml:space="preserve">https://doi.org/10.3354/esr00475</w:t>
-        </w:r>
-      </w:hyperlink>
-    </w:p>
-    <w:bookmarkEnd w:id="112"/>
-    <w:bookmarkStart w:id="114" w:name="ref-viechtbauer2010"/>
-    <w:p>
-      <w:pPr>
-        <w:pStyle w:val="Bibliography"/>
-      </w:pPr>
-      <w:r>
-        <w:t xml:space="preserve">Viechtbauer W (2010) Conducting meta-analyses in</w:t>
-      </w:r>
-      <w:r>
-        <w:t xml:space="preserve"> </w:t>
-      </w:r>
-      <w:r>
-        <w:t xml:space="preserve">R</w:t>
-      </w:r>
-      <w:r>
-        <w:t xml:space="preserve"> </w:t>
-      </w:r>
-      <w:r>
-        <w:t xml:space="preserve">with the metafor package. Journal of Statistical Software 36:1–48.</w:t>
-      </w:r>
-      <w:r>
-        <w:t xml:space="preserve"> </w:t>
-      </w:r>
-      <w:hyperlink r:id="rId113">
-        <w:r>
-          <w:rPr>
-            <w:rStyle w:val="Hyperlink"/>
-          </w:rPr>
-          <w:t xml:space="preserve">https://doi.org/10.18637/jss.v036.i03</w:t>
-        </w:r>
-      </w:hyperlink>
-    </w:p>
-    <w:bookmarkEnd w:id="114"/>
-    <w:bookmarkStart w:id="116" w:name="ref-williams2023"/>
-    <w:p>
-      <w:pPr>
-        <w:pStyle w:val="Bibliography"/>
-      </w:pPr>
-      <w:r>
-        <w:t xml:space="preserve">Williams DE, Bright AJ, Williamson OM, et al (2023) Synchronous spawning of nursery-raised elkhorn coral (</w:t>
-      </w:r>
-      <w:r>
-        <w:t xml:space="preserve">Acropora palmata</w:t>
-      </w:r>
-      <w:r>
-        <w:t xml:space="preserve">) outplanted to reefs in the</w:t>
-      </w:r>
-      <w:r>
-        <w:t xml:space="preserve"> </w:t>
-      </w:r>
-      <w:r>
-        <w:t xml:space="preserve">Florida Keys</w:t>
-      </w:r>
-      <w:r>
-        <w:t xml:space="preserve"> </w:t>
-      </w:r>
-      <w:r>
-        <w:t xml:space="preserve">(</w:t>
-      </w:r>
-      <w:r>
-        <w:t xml:space="preserve">United States</w:t>
-      </w:r>
-      <w:r>
-        <w:t xml:space="preserve">). Frontiers in Marine Science 10:1180996.</w:t>
-      </w:r>
-      <w:r>
-        <w:t xml:space="preserve"> </w:t>
-      </w:r>
-      <w:hyperlink r:id="rId115">
-        <w:r>
-          <w:rPr>
-            <w:rStyle w:val="Hyperlink"/>
-          </w:rPr>
-          <w:t xml:space="preserve">https://doi.org/10.3389/fmars.2023.1180996</w:t>
-        </w:r>
-      </w:hyperlink>
-    </w:p>
-    <w:bookmarkEnd w:id="116"/>
-    <w:bookmarkStart w:id="118" w:name="ref-williamsmiller2010"/>
-    <w:p>
-      <w:pPr>
-        <w:pStyle w:val="Bibliography"/>
-      </w:pPr>
-      <w:r>
-        <w:t xml:space="preserve">Williams DE, Miller MW (2010) Stabilization of fragments to enhance asexual recruitment in</w:t>
-      </w:r>
-      <w:r>
-        <w:t xml:space="preserve"> </w:t>
-      </w:r>
-      <w:r>
-        <w:t xml:space="preserve">Acropora palmata</w:t>
-      </w:r>
-      <w:r>
         <w:t xml:space="preserve">, a threatened</w:t>
       </w:r>
       <w:r>
@@ -4431,60 +5379,12 @@
         <w:t xml:space="preserve"> </w:t>
       </w:r>
       <w:r>
-        <w:t xml:space="preserve">coral. Restoration Ecology 18:446–451.</w:t>
-      </w:r>
-      <w:r>
-        <w:t xml:space="preserve"> </w:t>
-      </w:r>
-      <w:hyperlink r:id="rId117">
-        <w:r>
-          <w:rPr>
-            <w:rStyle w:val="Hyperlink"/>
-          </w:rPr>
-          <w:t xml:space="preserve">https://doi.org/10.1111/j.1526-100X.2009.00579.x</w:t>
-        </w:r>
-      </w:hyperlink>
-    </w:p>
-    <w:bookmarkEnd w:id="118"/>
-    <w:bookmarkStart w:id="120" w:name="ref-williams2008"/>
-    <w:p>
-      <w:pPr>
-        <w:pStyle w:val="Bibliography"/>
-      </w:pPr>
-      <w:r>
-        <w:t xml:space="preserve">Williams DE, Miller MW, Kramer KL (2008) Recruitment failure in</w:t>
-      </w:r>
-      <w:r>
-        <w:t xml:space="preserve"> </w:t>
-      </w:r>
-      <w:r>
-        <w:t xml:space="preserve">Florida Keys</w:t>
-      </w:r>
-      <w:r>
-        <w:t xml:space="preserve"> </w:t>
-      </w:r>
-      <w:r>
-        <w:t xml:space="preserve">Acropora palmata</w:t>
-      </w:r>
-      <w:r>
-        <w:t xml:space="preserve">, a threatened</w:t>
-      </w:r>
-      <w:r>
-        <w:t xml:space="preserve"> </w:t>
-      </w:r>
-      <w:r>
-        <w:t xml:space="preserve">Caribbean</w:t>
-      </w:r>
-      <w:r>
-        <w:t xml:space="preserve"> </w:t>
-      </w:r>
-      <w:r>
         <w:t xml:space="preserve">coral. Coral Reefs 27:697–705.</w:t>
       </w:r>
       <w:r>
         <w:t xml:space="preserve"> </w:t>
       </w:r>
-      <w:hyperlink r:id="rId119">
+      <w:hyperlink r:id="rId137">
         <w:r>
           <w:rPr>
             <w:rStyle w:val="Hyperlink"/>
@@ -4493,9 +5393,9 @@
         </w:r>
       </w:hyperlink>
     </w:p>
-    <w:bookmarkEnd w:id="120"/>
-    <w:bookmarkEnd w:id="121"/>
-    <w:bookmarkEnd w:id="122"/>
+    <w:bookmarkEnd w:id="138"/>
+    <w:bookmarkEnd w:id="139"/>
+    <w:bookmarkEnd w:id="140"/>
     <w:sectPr>
       <w:footnotePr>
         <w:numRestart w:val="eachSect"/>

</xml_diff>